<commit_message>
Explain how to run the router and show the route in the post.
The README now walks through a local try, MCP setup, and adding a skill. The blog includes three figures for the route, the on-disk library, and the extension loop.
</commit_message>
<xml_diff>
--- a/docs/Load-the-Right-Skill-First.docx
+++ b/docs/Load-the-Right-Skill-First.docx
@@ -53,7 +53,7 @@
           <w:sz w:val="24"/>
           <w:szCs w:val="24"/>
         </w:rPr>
-        <w:t xml:space="preserve">A measured router for agent skill catalogs, and why it stayed lexical.</w:t>
+        <w:t xml:space="preserve">Everyone has a skill library now. The part that matters is which skill a prompt actually loads.</w:t>
       </w:r>
     </w:p>
     <w:p>
@@ -494,7 +494,7 @@
                 <w:sz w:val="18"/>
                 <w:szCs w:val="18"/>
               </w:rPr>
-              <w:t xml:space="preserve">About 1,800 words</w:t>
+              <w:t xml:space="preserve">About 2,200 words</w:t>
             </w:r>
           </w:p>
         </w:tc>
@@ -520,7 +520,25 @@
           <w:sz w:val="22"/>
           <w:szCs w:val="22"/>
         </w:rPr>
-        <w:t xml:space="preserve">A coding agent with ninety skills does not fail because it lacks instructions. It fails because it loads the wrong ones, or loads none, and then improvises. I hit that wall while maintaining a Salesforce delivery kit large enough that the skill list itself became the problem. The router in this post is the general version of the fix. It does not know Salesforce. It knows how to pick one skill, name anything that should load beside it, and stay quiet when the prompt is not a skill at all.</w:t>
+        <w:t xml:space="preserve">A year ago, a skill library was a novelty. Now it is the default. Teams publish folders of SKILL.md files for Claude, Cursor, and every other coding agent that will read them. Salesforce teams have been early and loud about it: one skill to write Apex, another to run tests, another to deploy, another to grant field access, another to scan the diff. The library grows every week. The agent does not get better at the same rate.</w:t>
+      </w:r>
+    </w:p>
+    <w:p>
+      <w:pPr>
+        <w:spacing w:after="160" w:before="0" w:line="288"/>
+      </w:pPr>
+      <w:r>
+        <w:rPr>
+          <w:rFonts w:ascii="Calibri" w:cs="Calibri" w:eastAsia="Calibri" w:hAnsi="Calibri"/>
+          <w:b w:val="false"/>
+          <w:bCs w:val="false"/>
+          <w:i w:val="false"/>
+          <w:iCs w:val="false"/>
+          <w:color w:val="243038"/>
+          <w:sz w:val="22"/>
+          <w:szCs w:val="22"/>
+        </w:rPr>
+        <w:t xml:space="preserve">The miss is not the missing skill. The miss is the prompt. A person types “add a formula field and make sure the existing permission set can see it,” and the agent either loads nothing and improvises, or loads the nearest skill and follows the wrong procedure. Ninety good playbooks in a folder do not help if the turn loads zero of them, or loads the one that creates a new permission set when the task was to edit the set you already have.</w:t>
       </w:r>
     </w:p>
     <w:tbl>
@@ -574,7 +592,7 @@
                 <w:sz w:val="22"/>
                 <w:szCs w:val="22"/>
               </w:rPr>
-              <w:t xml:space="preserve">Empty is a successful answer. A router that always picks something will eventually enforce the wrong playbook with complete confidence.</w:t>
+              <w:t xml:space="preserve">A skill library answers “what do we know how to do?” The skill router answers “which of those does this prompt need, and which should stay on disk?”</w:t>
             </w:r>
           </w:p>
         </w:tc>
@@ -584,6 +602,24 @@
       <w:pPr>
         <w:spacing w:after="120" w:before="0"/>
       </w:pPr>
+    </w:p>
+    <w:p>
+      <w:pPr>
+        <w:spacing w:after="160" w:before="0" w:line="288"/>
+      </w:pPr>
+      <w:r>
+        <w:rPr>
+          <w:rFonts w:ascii="Calibri" w:cs="Calibri" w:eastAsia="Calibri" w:hAnsi="Calibri"/>
+          <w:b w:val="false"/>
+          <w:bCs w:val="false"/>
+          <w:i w:val="false"/>
+          <w:iCs w:val="false"/>
+          <w:color w:val="243038"/>
+          <w:sz w:val="22"/>
+          <w:szCs w:val="22"/>
+        </w:rPr>
+        <w:t xml:space="preserve">That second question is the whole product. I built the router while maintaining a Salesforce delivery kit of about ninety skills. The same mechanism works for any catalog. It reads the prompt, scores it against skill names and descriptions, and returns the one skill to load. If nothing clears a floor, it returns an empty list. Empty is a successful answer. A router that always picks something will eventually enforce the wrong playbook with complete confidence.</w:t>
+      </w:r>
     </w:p>
     <w:p>
       <w:pPr>
@@ -604,7 +640,7 @@
           <w:sz w:val="32"/>
           <w:szCs w:val="32"/>
         </w:rPr>
-        <w:t xml:space="preserve">The failure mode</w:t>
+        <w:t xml:space="preserve">A slice of a Salesforce skill library</w:t>
       </w:r>
     </w:p>
     <w:p>
@@ -622,8 +658,1063 @@
           <w:sz w:val="22"/>
           <w:szCs w:val="22"/>
         </w:rPr>
-        <w:t xml:space="preserve">A skill, in the sense this router cares about, is a markdown file. The frontmatter carries a name and a description. The body carries the procedure: what to read, what to refuse, what “done” means. Hosts such as Claude Code and Cursor already match a prompt against those descriptions. That match is enough while the catalog is small.</w:t>
-      </w:r>
+        <w:t xml:space="preserve">Here is a small cut of the kind of library people are already installing. These are ordinary Salesforce platform skills. Each one owns a narrow job. The descriptions are the routing signal: the words a person actually types.</w:t>
+      </w:r>
+    </w:p>
+    <w:p>
+      <w:pPr>
+        <w:spacing w:after="120" w:before="0"/>
+      </w:pPr>
+    </w:p>
+    <w:tbl>
+      <w:tblPr>
+        <w:tblW w:type="dxa" w:w="10080"/>
+        <w:tblBorders>
+          <w:top w:val="single" w:color="auto" w:sz="4"/>
+          <w:left w:val="single" w:color="auto" w:sz="4"/>
+          <w:bottom w:val="single" w:color="auto" w:sz="4"/>
+          <w:right w:val="single" w:color="auto" w:sz="4"/>
+          <w:insideH w:val="single" w:color="auto" w:sz="4"/>
+          <w:insideV w:val="single" w:color="auto" w:sz="4"/>
+        </w:tblBorders>
+      </w:tblPr>
+      <w:tblGrid>
+        <w:gridCol w:w="4200"/>
+        <w:gridCol w:w="5880"/>
+      </w:tblGrid>
+      <w:tr>
+        <w:trPr>
+          <w:cantSplit/>
+          <w:tblHeader/>
+        </w:trPr>
+        <w:tc>
+          <w:tcPr>
+            <w:tcW w:type="dxa" w:w="4200"/>
+            <w:tcBorders>
+              <w:top w:val="single" w:color="D5DDE2" w:sz="4"/>
+              <w:left w:val="single" w:color="D5DDE2" w:sz="4"/>
+              <w:bottom w:val="single" w:color="D5DDE2" w:sz="4"/>
+              <w:right w:val="single" w:color="D5DDE2" w:sz="4"/>
+            </w:tcBorders>
+            <w:shd w:fill="1B3A4B" w:val="clear"/>
+            <w:tcMar>
+              <w:top w:type="dxa" w:w="60"/>
+              <w:left w:type="dxa" w:w="80"/>
+              <w:bottom w:type="dxa" w:w="60"/>
+              <w:right w:type="dxa" w:w="80"/>
+            </w:tcMar>
+            <w:vAlign w:val="center"/>
+          </w:tcPr>
+          <w:p>
+            <w:pPr>
+              <w:spacing w:after="0" w:before="0"/>
+            </w:pPr>
+            <w:r>
+              <w:rPr>
+                <w:rFonts w:ascii="Calibri" w:cs="Calibri" w:eastAsia="Calibri" w:hAnsi="Calibri"/>
+                <w:b/>
+                <w:bCs/>
+                <w:i w:val="false"/>
+                <w:iCs w:val="false"/>
+                <w:color w:val="FFFFFF"/>
+                <w:sz w:val="18"/>
+                <w:szCs w:val="18"/>
+              </w:rPr>
+              <w:t xml:space="preserve">Skill</w:t>
+            </w:r>
+          </w:p>
+        </w:tc>
+        <w:tc>
+          <w:tcPr>
+            <w:tcW w:type="dxa" w:w="5880"/>
+            <w:tcBorders>
+              <w:top w:val="single" w:color="D5DDE2" w:sz="4"/>
+              <w:left w:val="single" w:color="D5DDE2" w:sz="4"/>
+              <w:bottom w:val="single" w:color="D5DDE2" w:sz="4"/>
+              <w:right w:val="single" w:color="D5DDE2" w:sz="4"/>
+            </w:tcBorders>
+            <w:shd w:fill="1B3A4B" w:val="clear"/>
+            <w:tcMar>
+              <w:top w:type="dxa" w:w="60"/>
+              <w:left w:type="dxa" w:w="80"/>
+              <w:bottom w:type="dxa" w:w="60"/>
+              <w:right w:type="dxa" w:w="80"/>
+            </w:tcMar>
+            <w:vAlign w:val="center"/>
+          </w:tcPr>
+          <w:p>
+            <w:pPr>
+              <w:spacing w:after="0" w:before="0"/>
+            </w:pPr>
+            <w:r>
+              <w:rPr>
+                <w:rFonts w:ascii="Calibri" w:cs="Calibri" w:eastAsia="Calibri" w:hAnsi="Calibri"/>
+                <w:b/>
+                <w:bCs/>
+                <w:i w:val="false"/>
+                <w:iCs w:val="false"/>
+                <w:color w:val="FFFFFF"/>
+                <w:sz w:val="18"/>
+                <w:szCs w:val="18"/>
+              </w:rPr>
+              <w:t xml:space="preserve">The prompt it should win</w:t>
+            </w:r>
+          </w:p>
+        </w:tc>
+      </w:tr>
+      <w:tr>
+        <w:trPr>
+          <w:cantSplit/>
+        </w:trPr>
+        <w:tc>
+          <w:tcPr>
+            <w:tcW w:type="dxa" w:w="4200"/>
+            <w:tcBorders>
+              <w:top w:val="single" w:color="D5DDE2" w:sz="4"/>
+              <w:left w:val="single" w:color="D5DDE2" w:sz="4"/>
+              <w:bottom w:val="single" w:color="D5DDE2" w:sz="4"/>
+              <w:right w:val="single" w:color="D5DDE2" w:sz="4"/>
+            </w:tcBorders>
+            <w:shd w:fill="FFFFFF" w:val="clear"/>
+            <w:tcMar>
+              <w:top w:type="dxa" w:w="60"/>
+              <w:left w:type="dxa" w:w="80"/>
+              <w:bottom w:type="dxa" w:w="60"/>
+              <w:right w:type="dxa" w:w="80"/>
+            </w:tcMar>
+            <w:vAlign w:val="center"/>
+          </w:tcPr>
+          <w:p>
+            <w:pPr>
+              <w:spacing w:after="0" w:before="0"/>
+            </w:pPr>
+            <w:r>
+              <w:rPr>
+                <w:rFonts w:ascii="Calibri" w:cs="Calibri" w:eastAsia="Calibri" w:hAnsi="Calibri"/>
+                <w:b/>
+                <w:bCs/>
+                <w:i w:val="false"/>
+                <w:iCs w:val="false"/>
+                <w:color w:val="243038"/>
+                <w:sz w:val="18"/>
+                <w:szCs w:val="18"/>
+              </w:rPr>
+              <w:t xml:space="preserve">platform-soql-query</w:t>
+            </w:r>
+          </w:p>
+        </w:tc>
+        <w:tc>
+          <w:tcPr>
+            <w:tcW w:type="dxa" w:w="5880"/>
+            <w:tcBorders>
+              <w:top w:val="single" w:color="D5DDE2" w:sz="4"/>
+              <w:left w:val="single" w:color="D5DDE2" w:sz="4"/>
+              <w:bottom w:val="single" w:color="D5DDE2" w:sz="4"/>
+              <w:right w:val="single" w:color="D5DDE2" w:sz="4"/>
+            </w:tcBorders>
+            <w:shd w:fill="FFFFFF" w:val="clear"/>
+            <w:tcMar>
+              <w:top w:type="dxa" w:w="60"/>
+              <w:left w:type="dxa" w:w="80"/>
+              <w:bottom w:type="dxa" w:w="60"/>
+              <w:right w:type="dxa" w:w="80"/>
+            </w:tcMar>
+            <w:vAlign w:val="center"/>
+          </w:tcPr>
+          <w:p>
+            <w:pPr>
+              <w:spacing w:after="0" w:before="0"/>
+            </w:pPr>
+            <w:r>
+              <w:rPr>
+                <w:rFonts w:ascii="Calibri" w:cs="Calibri" w:eastAsia="Calibri" w:hAnsi="Calibri"/>
+                <w:b w:val="false"/>
+                <w:bCs w:val="false"/>
+                <w:i w:val="false"/>
+                <w:iCs w:val="false"/>
+                <w:color w:val="243038"/>
+                <w:sz w:val="18"/>
+                <w:szCs w:val="18"/>
+              </w:rPr>
+              <w:t xml:space="preserve">Write or check a SOQL or SOSL query.</w:t>
+            </w:r>
+          </w:p>
+        </w:tc>
+      </w:tr>
+      <w:tr>
+        <w:trPr>
+          <w:cantSplit/>
+        </w:trPr>
+        <w:tc>
+          <w:tcPr>
+            <w:tcW w:type="dxa" w:w="4200"/>
+            <w:tcBorders>
+              <w:top w:val="single" w:color="D5DDE2" w:sz="4"/>
+              <w:left w:val="single" w:color="D5DDE2" w:sz="4"/>
+              <w:bottom w:val="single" w:color="D5DDE2" w:sz="4"/>
+              <w:right w:val="single" w:color="D5DDE2" w:sz="4"/>
+            </w:tcBorders>
+            <w:shd w:fill="F4F7F8" w:val="clear"/>
+            <w:tcMar>
+              <w:top w:type="dxa" w:w="60"/>
+              <w:left w:type="dxa" w:w="80"/>
+              <w:bottom w:type="dxa" w:w="60"/>
+              <w:right w:type="dxa" w:w="80"/>
+            </w:tcMar>
+            <w:vAlign w:val="center"/>
+          </w:tcPr>
+          <w:p>
+            <w:pPr>
+              <w:spacing w:after="0" w:before="0"/>
+            </w:pPr>
+            <w:r>
+              <w:rPr>
+                <w:rFonts w:ascii="Calibri" w:cs="Calibri" w:eastAsia="Calibri" w:hAnsi="Calibri"/>
+                <w:b/>
+                <w:bCs/>
+                <w:i w:val="false"/>
+                <w:iCs w:val="false"/>
+                <w:color w:val="243038"/>
+                <w:sz w:val="18"/>
+                <w:szCs w:val="18"/>
+              </w:rPr>
+              <w:t xml:space="preserve">platform-apex-generate</w:t>
+            </w:r>
+          </w:p>
+        </w:tc>
+        <w:tc>
+          <w:tcPr>
+            <w:tcW w:type="dxa" w:w="5880"/>
+            <w:tcBorders>
+              <w:top w:val="single" w:color="D5DDE2" w:sz="4"/>
+              <w:left w:val="single" w:color="D5DDE2" w:sz="4"/>
+              <w:bottom w:val="single" w:color="D5DDE2" w:sz="4"/>
+              <w:right w:val="single" w:color="D5DDE2" w:sz="4"/>
+            </w:tcBorders>
+            <w:shd w:fill="F4F7F8" w:val="clear"/>
+            <w:tcMar>
+              <w:top w:type="dxa" w:w="60"/>
+              <w:left w:type="dxa" w:w="80"/>
+              <w:bottom w:type="dxa" w:w="60"/>
+              <w:right w:type="dxa" w:w="80"/>
+            </w:tcMar>
+            <w:vAlign w:val="center"/>
+          </w:tcPr>
+          <w:p>
+            <w:pPr>
+              <w:spacing w:after="0" w:before="0"/>
+            </w:pPr>
+            <w:r>
+              <w:rPr>
+                <w:rFonts w:ascii="Calibri" w:cs="Calibri" w:eastAsia="Calibri" w:hAnsi="Calibri"/>
+                <w:b w:val="false"/>
+                <w:bCs w:val="false"/>
+                <w:i w:val="false"/>
+                <w:iCs w:val="false"/>
+                <w:color w:val="243038"/>
+                <w:sz w:val="18"/>
+                <w:szCs w:val="18"/>
+              </w:rPr>
+              <w:t xml:space="preserve">Write or refactor an Apex class or trigger.</w:t>
+            </w:r>
+          </w:p>
+        </w:tc>
+      </w:tr>
+      <w:tr>
+        <w:trPr>
+          <w:cantSplit/>
+        </w:trPr>
+        <w:tc>
+          <w:tcPr>
+            <w:tcW w:type="dxa" w:w="4200"/>
+            <w:tcBorders>
+              <w:top w:val="single" w:color="D5DDE2" w:sz="4"/>
+              <w:left w:val="single" w:color="D5DDE2" w:sz="4"/>
+              <w:bottom w:val="single" w:color="D5DDE2" w:sz="4"/>
+              <w:right w:val="single" w:color="D5DDE2" w:sz="4"/>
+            </w:tcBorders>
+            <w:shd w:fill="FFFFFF" w:val="clear"/>
+            <w:tcMar>
+              <w:top w:type="dxa" w:w="60"/>
+              <w:left w:type="dxa" w:w="80"/>
+              <w:bottom w:type="dxa" w:w="60"/>
+              <w:right w:type="dxa" w:w="80"/>
+            </w:tcMar>
+            <w:vAlign w:val="center"/>
+          </w:tcPr>
+          <w:p>
+            <w:pPr>
+              <w:spacing w:after="0" w:before="0"/>
+            </w:pPr>
+            <w:r>
+              <w:rPr>
+                <w:rFonts w:ascii="Calibri" w:cs="Calibri" w:eastAsia="Calibri" w:hAnsi="Calibri"/>
+                <w:b/>
+                <w:bCs/>
+                <w:i w:val="false"/>
+                <w:iCs w:val="false"/>
+                <w:color w:val="243038"/>
+                <w:sz w:val="18"/>
+                <w:szCs w:val="18"/>
+              </w:rPr>
+              <w:t xml:space="preserve">platform-apex-test-generate</w:t>
+            </w:r>
+          </w:p>
+        </w:tc>
+        <w:tc>
+          <w:tcPr>
+            <w:tcW w:type="dxa" w:w="5880"/>
+            <w:tcBorders>
+              <w:top w:val="single" w:color="D5DDE2" w:sz="4"/>
+              <w:left w:val="single" w:color="D5DDE2" w:sz="4"/>
+              <w:bottom w:val="single" w:color="D5DDE2" w:sz="4"/>
+              <w:right w:val="single" w:color="D5DDE2" w:sz="4"/>
+            </w:tcBorders>
+            <w:shd w:fill="FFFFFF" w:val="clear"/>
+            <w:tcMar>
+              <w:top w:type="dxa" w:w="60"/>
+              <w:left w:type="dxa" w:w="80"/>
+              <w:bottom w:type="dxa" w:w="60"/>
+              <w:right w:type="dxa" w:w="80"/>
+            </w:tcMar>
+            <w:vAlign w:val="center"/>
+          </w:tcPr>
+          <w:p>
+            <w:pPr>
+              <w:spacing w:after="0" w:before="0"/>
+            </w:pPr>
+            <w:r>
+              <w:rPr>
+                <w:rFonts w:ascii="Calibri" w:cs="Calibri" w:eastAsia="Calibri" w:hAnsi="Calibri"/>
+                <w:b w:val="false"/>
+                <w:bCs w:val="false"/>
+                <w:i w:val="false"/>
+                <w:iCs w:val="false"/>
+                <w:color w:val="243038"/>
+                <w:sz w:val="18"/>
+                <w:szCs w:val="18"/>
+              </w:rPr>
+              <w:t xml:space="preserve">Generate an Apex test, including a bulk case.</w:t>
+            </w:r>
+          </w:p>
+        </w:tc>
+      </w:tr>
+      <w:tr>
+        <w:trPr>
+          <w:cantSplit/>
+        </w:trPr>
+        <w:tc>
+          <w:tcPr>
+            <w:tcW w:type="dxa" w:w="4200"/>
+            <w:tcBorders>
+              <w:top w:val="single" w:color="D5DDE2" w:sz="4"/>
+              <w:left w:val="single" w:color="D5DDE2" w:sz="4"/>
+              <w:bottom w:val="single" w:color="D5DDE2" w:sz="4"/>
+              <w:right w:val="single" w:color="D5DDE2" w:sz="4"/>
+            </w:tcBorders>
+            <w:shd w:fill="F4F7F8" w:val="clear"/>
+            <w:tcMar>
+              <w:top w:type="dxa" w:w="60"/>
+              <w:left w:type="dxa" w:w="80"/>
+              <w:bottom w:type="dxa" w:w="60"/>
+              <w:right w:type="dxa" w:w="80"/>
+            </w:tcMar>
+            <w:vAlign w:val="center"/>
+          </w:tcPr>
+          <w:p>
+            <w:pPr>
+              <w:spacing w:after="0" w:before="0"/>
+            </w:pPr>
+            <w:r>
+              <w:rPr>
+                <w:rFonts w:ascii="Calibri" w:cs="Calibri" w:eastAsia="Calibri" w:hAnsi="Calibri"/>
+                <w:b/>
+                <w:bCs/>
+                <w:i w:val="false"/>
+                <w:iCs w:val="false"/>
+                <w:color w:val="243038"/>
+                <w:sz w:val="18"/>
+                <w:szCs w:val="18"/>
+              </w:rPr>
+              <w:t xml:space="preserve">platform-apex-test-run</w:t>
+            </w:r>
+          </w:p>
+        </w:tc>
+        <w:tc>
+          <w:tcPr>
+            <w:tcW w:type="dxa" w:w="5880"/>
+            <w:tcBorders>
+              <w:top w:val="single" w:color="D5DDE2" w:sz="4"/>
+              <w:left w:val="single" w:color="D5DDE2" w:sz="4"/>
+              <w:bottom w:val="single" w:color="D5DDE2" w:sz="4"/>
+              <w:right w:val="single" w:color="D5DDE2" w:sz="4"/>
+            </w:tcBorders>
+            <w:shd w:fill="F4F7F8" w:val="clear"/>
+            <w:tcMar>
+              <w:top w:type="dxa" w:w="60"/>
+              <w:left w:type="dxa" w:w="80"/>
+              <w:bottom w:type="dxa" w:w="60"/>
+              <w:right w:type="dxa" w:w="80"/>
+            </w:tcMar>
+            <w:vAlign w:val="center"/>
+          </w:tcPr>
+          <w:p>
+            <w:pPr>
+              <w:spacing w:after="0" w:before="0"/>
+            </w:pPr>
+            <w:r>
+              <w:rPr>
+                <w:rFonts w:ascii="Calibri" w:cs="Calibri" w:eastAsia="Calibri" w:hAnsi="Calibri"/>
+                <w:b w:val="false"/>
+                <w:bCs w:val="false"/>
+                <w:i w:val="false"/>
+                <w:iCs w:val="false"/>
+                <w:color w:val="243038"/>
+                <w:sz w:val="18"/>
+                <w:szCs w:val="18"/>
+              </w:rPr>
+              <w:t xml:space="preserve">Run tests and read the coverage.</w:t>
+            </w:r>
+          </w:p>
+        </w:tc>
+      </w:tr>
+      <w:tr>
+        <w:trPr>
+          <w:cantSplit/>
+        </w:trPr>
+        <w:tc>
+          <w:tcPr>
+            <w:tcW w:type="dxa" w:w="4200"/>
+            <w:tcBorders>
+              <w:top w:val="single" w:color="D5DDE2" w:sz="4"/>
+              <w:left w:val="single" w:color="D5DDE2" w:sz="4"/>
+              <w:bottom w:val="single" w:color="D5DDE2" w:sz="4"/>
+              <w:right w:val="single" w:color="D5DDE2" w:sz="4"/>
+            </w:tcBorders>
+            <w:shd w:fill="FFFFFF" w:val="clear"/>
+            <w:tcMar>
+              <w:top w:type="dxa" w:w="60"/>
+              <w:left w:type="dxa" w:w="80"/>
+              <w:bottom w:type="dxa" w:w="60"/>
+              <w:right w:type="dxa" w:w="80"/>
+            </w:tcMar>
+            <w:vAlign w:val="center"/>
+          </w:tcPr>
+          <w:p>
+            <w:pPr>
+              <w:spacing w:after="0" w:before="0"/>
+            </w:pPr>
+            <w:r>
+              <w:rPr>
+                <w:rFonts w:ascii="Calibri" w:cs="Calibri" w:eastAsia="Calibri" w:hAnsi="Calibri"/>
+                <w:b/>
+                <w:bCs/>
+                <w:i w:val="false"/>
+                <w:iCs w:val="false"/>
+                <w:color w:val="243038"/>
+                <w:sz w:val="18"/>
+                <w:szCs w:val="18"/>
+              </w:rPr>
+              <w:t xml:space="preserve">platform-apex-logs-debug</w:t>
+            </w:r>
+          </w:p>
+        </w:tc>
+        <w:tc>
+          <w:tcPr>
+            <w:tcW w:type="dxa" w:w="5880"/>
+            <w:tcBorders>
+              <w:top w:val="single" w:color="D5DDE2" w:sz="4"/>
+              <w:left w:val="single" w:color="D5DDE2" w:sz="4"/>
+              <w:bottom w:val="single" w:color="D5DDE2" w:sz="4"/>
+              <w:right w:val="single" w:color="D5DDE2" w:sz="4"/>
+            </w:tcBorders>
+            <w:shd w:fill="FFFFFF" w:val="clear"/>
+            <w:tcMar>
+              <w:top w:type="dxa" w:w="60"/>
+              <w:left w:type="dxa" w:w="80"/>
+              <w:bottom w:type="dxa" w:w="60"/>
+              <w:right w:type="dxa" w:w="80"/>
+            </w:tcMar>
+            <w:vAlign w:val="center"/>
+          </w:tcPr>
+          <w:p>
+            <w:pPr>
+              <w:spacing w:after="0" w:before="0"/>
+            </w:pPr>
+            <w:r>
+              <w:rPr>
+                <w:rFonts w:ascii="Calibri" w:cs="Calibri" w:eastAsia="Calibri" w:hAnsi="Calibri"/>
+                <w:b w:val="false"/>
+                <w:bCs w:val="false"/>
+                <w:i w:val="false"/>
+                <w:iCs w:val="false"/>
+                <w:color w:val="243038"/>
+                <w:sz w:val="18"/>
+                <w:szCs w:val="18"/>
+              </w:rPr>
+              <w:t xml:space="preserve">Read a debug log or a governor-limit failure.</w:t>
+            </w:r>
+          </w:p>
+        </w:tc>
+      </w:tr>
+      <w:tr>
+        <w:trPr>
+          <w:cantSplit/>
+        </w:trPr>
+        <w:tc>
+          <w:tcPr>
+            <w:tcW w:type="dxa" w:w="4200"/>
+            <w:tcBorders>
+              <w:top w:val="single" w:color="D5DDE2" w:sz="4"/>
+              <w:left w:val="single" w:color="D5DDE2" w:sz="4"/>
+              <w:bottom w:val="single" w:color="D5DDE2" w:sz="4"/>
+              <w:right w:val="single" w:color="D5DDE2" w:sz="4"/>
+            </w:tcBorders>
+            <w:shd w:fill="F4F7F8" w:val="clear"/>
+            <w:tcMar>
+              <w:top w:type="dxa" w:w="60"/>
+              <w:left w:type="dxa" w:w="80"/>
+              <w:bottom w:type="dxa" w:w="60"/>
+              <w:right w:type="dxa" w:w="80"/>
+            </w:tcMar>
+            <w:vAlign w:val="center"/>
+          </w:tcPr>
+          <w:p>
+            <w:pPr>
+              <w:spacing w:after="0" w:before="0"/>
+            </w:pPr>
+            <w:r>
+              <w:rPr>
+                <w:rFonts w:ascii="Calibri" w:cs="Calibri" w:eastAsia="Calibri" w:hAnsi="Calibri"/>
+                <w:b/>
+                <w:bCs/>
+                <w:i w:val="false"/>
+                <w:iCs w:val="false"/>
+                <w:color w:val="243038"/>
+                <w:sz w:val="18"/>
+                <w:szCs w:val="18"/>
+              </w:rPr>
+              <w:t xml:space="preserve">platform-metadata-retrieve</w:t>
+            </w:r>
+          </w:p>
+        </w:tc>
+        <w:tc>
+          <w:tcPr>
+            <w:tcW w:type="dxa" w:w="5880"/>
+            <w:tcBorders>
+              <w:top w:val="single" w:color="D5DDE2" w:sz="4"/>
+              <w:left w:val="single" w:color="D5DDE2" w:sz="4"/>
+              <w:bottom w:val="single" w:color="D5DDE2" w:sz="4"/>
+              <w:right w:val="single" w:color="D5DDE2" w:sz="4"/>
+            </w:tcBorders>
+            <w:shd w:fill="F4F7F8" w:val="clear"/>
+            <w:tcMar>
+              <w:top w:type="dxa" w:w="60"/>
+              <w:left w:type="dxa" w:w="80"/>
+              <w:bottom w:type="dxa" w:w="60"/>
+              <w:right w:type="dxa" w:w="80"/>
+            </w:tcMar>
+            <w:vAlign w:val="center"/>
+          </w:tcPr>
+          <w:p>
+            <w:pPr>
+              <w:spacing w:after="0" w:before="0"/>
+            </w:pPr>
+            <w:r>
+              <w:rPr>
+                <w:rFonts w:ascii="Calibri" w:cs="Calibri" w:eastAsia="Calibri" w:hAnsi="Calibri"/>
+                <w:b w:val="false"/>
+                <w:bCs w:val="false"/>
+                <w:i w:val="false"/>
+                <w:iCs w:val="false"/>
+                <w:color w:val="243038"/>
+                <w:sz w:val="18"/>
+                <w:szCs w:val="18"/>
+              </w:rPr>
+              <w:t xml:space="preserve">Pull metadata from an org into the project.</w:t>
+            </w:r>
+          </w:p>
+        </w:tc>
+      </w:tr>
+      <w:tr>
+        <w:trPr>
+          <w:cantSplit/>
+        </w:trPr>
+        <w:tc>
+          <w:tcPr>
+            <w:tcW w:type="dxa" w:w="4200"/>
+            <w:tcBorders>
+              <w:top w:val="single" w:color="D5DDE2" w:sz="4"/>
+              <w:left w:val="single" w:color="D5DDE2" w:sz="4"/>
+              <w:bottom w:val="single" w:color="D5DDE2" w:sz="4"/>
+              <w:right w:val="single" w:color="D5DDE2" w:sz="4"/>
+            </w:tcBorders>
+            <w:shd w:fill="FFFFFF" w:val="clear"/>
+            <w:tcMar>
+              <w:top w:type="dxa" w:w="60"/>
+              <w:left w:type="dxa" w:w="80"/>
+              <w:bottom w:type="dxa" w:w="60"/>
+              <w:right w:type="dxa" w:w="80"/>
+            </w:tcMar>
+            <w:vAlign w:val="center"/>
+          </w:tcPr>
+          <w:p>
+            <w:pPr>
+              <w:spacing w:after="0" w:before="0"/>
+            </w:pPr>
+            <w:r>
+              <w:rPr>
+                <w:rFonts w:ascii="Calibri" w:cs="Calibri" w:eastAsia="Calibri" w:hAnsi="Calibri"/>
+                <w:b/>
+                <w:bCs/>
+                <w:i w:val="false"/>
+                <w:iCs w:val="false"/>
+                <w:color w:val="243038"/>
+                <w:sz w:val="18"/>
+                <w:szCs w:val="18"/>
+              </w:rPr>
+              <w:t xml:space="preserve">platform-metadata-deploy</w:t>
+            </w:r>
+          </w:p>
+        </w:tc>
+        <w:tc>
+          <w:tcPr>
+            <w:tcW w:type="dxa" w:w="5880"/>
+            <w:tcBorders>
+              <w:top w:val="single" w:color="D5DDE2" w:sz="4"/>
+              <w:left w:val="single" w:color="D5DDE2" w:sz="4"/>
+              <w:bottom w:val="single" w:color="D5DDE2" w:sz="4"/>
+              <w:right w:val="single" w:color="D5DDE2" w:sz="4"/>
+            </w:tcBorders>
+            <w:shd w:fill="FFFFFF" w:val="clear"/>
+            <w:tcMar>
+              <w:top w:type="dxa" w:w="60"/>
+              <w:left w:type="dxa" w:w="80"/>
+              <w:bottom w:type="dxa" w:w="60"/>
+              <w:right w:type="dxa" w:w="80"/>
+            </w:tcMar>
+            <w:vAlign w:val="center"/>
+          </w:tcPr>
+          <w:p>
+            <w:pPr>
+              <w:spacing w:after="0" w:before="0"/>
+            </w:pPr>
+            <w:r>
+              <w:rPr>
+                <w:rFonts w:ascii="Calibri" w:cs="Calibri" w:eastAsia="Calibri" w:hAnsi="Calibri"/>
+                <w:b w:val="false"/>
+                <w:bCs w:val="false"/>
+                <w:i w:val="false"/>
+                <w:iCs w:val="false"/>
+                <w:color w:val="243038"/>
+                <w:sz w:val="18"/>
+                <w:szCs w:val="18"/>
+              </w:rPr>
+              <w:t xml:space="preserve">Deploy metadata with the Salesforce CLI.</w:t>
+            </w:r>
+          </w:p>
+        </w:tc>
+      </w:tr>
+      <w:tr>
+        <w:trPr>
+          <w:cantSplit/>
+        </w:trPr>
+        <w:tc>
+          <w:tcPr>
+            <w:tcW w:type="dxa" w:w="4200"/>
+            <w:tcBorders>
+              <w:top w:val="single" w:color="D5DDE2" w:sz="4"/>
+              <w:left w:val="single" w:color="D5DDE2" w:sz="4"/>
+              <w:bottom w:val="single" w:color="D5DDE2" w:sz="4"/>
+              <w:right w:val="single" w:color="D5DDE2" w:sz="4"/>
+            </w:tcBorders>
+            <w:shd w:fill="F4F7F8" w:val="clear"/>
+            <w:tcMar>
+              <w:top w:type="dxa" w:w="60"/>
+              <w:left w:type="dxa" w:w="80"/>
+              <w:bottom w:type="dxa" w:w="60"/>
+              <w:right w:type="dxa" w:w="80"/>
+            </w:tcMar>
+            <w:vAlign w:val="center"/>
+          </w:tcPr>
+          <w:p>
+            <w:pPr>
+              <w:spacing w:after="0" w:before="0"/>
+            </w:pPr>
+            <w:r>
+              <w:rPr>
+                <w:rFonts w:ascii="Calibri" w:cs="Calibri" w:eastAsia="Calibri" w:hAnsi="Calibri"/>
+                <w:b/>
+                <w:bCs/>
+                <w:i w:val="false"/>
+                <w:iCs w:val="false"/>
+                <w:color w:val="243038"/>
+                <w:sz w:val="18"/>
+                <w:szCs w:val="18"/>
+              </w:rPr>
+              <w:t xml:space="preserve">platform-custom-field-generate</w:t>
+            </w:r>
+          </w:p>
+        </w:tc>
+        <w:tc>
+          <w:tcPr>
+            <w:tcW w:type="dxa" w:w="5880"/>
+            <w:tcBorders>
+              <w:top w:val="single" w:color="D5DDE2" w:sz="4"/>
+              <w:left w:val="single" w:color="D5DDE2" w:sz="4"/>
+              <w:bottom w:val="single" w:color="D5DDE2" w:sz="4"/>
+              <w:right w:val="single" w:color="D5DDE2" w:sz="4"/>
+            </w:tcBorders>
+            <w:shd w:fill="F4F7F8" w:val="clear"/>
+            <w:tcMar>
+              <w:top w:type="dxa" w:w="60"/>
+              <w:left w:type="dxa" w:w="80"/>
+              <w:bottom w:type="dxa" w:w="60"/>
+              <w:right w:type="dxa" w:w="80"/>
+            </w:tcMar>
+            <w:vAlign w:val="center"/>
+          </w:tcPr>
+          <w:p>
+            <w:pPr>
+              <w:spacing w:after="0" w:before="0"/>
+            </w:pPr>
+            <w:r>
+              <w:rPr>
+                <w:rFonts w:ascii="Calibri" w:cs="Calibri" w:eastAsia="Calibri" w:hAnsi="Calibri"/>
+                <w:b w:val="false"/>
+                <w:bCs w:val="false"/>
+                <w:i w:val="false"/>
+                <w:iCs w:val="false"/>
+                <w:color w:val="243038"/>
+                <w:sz w:val="18"/>
+                <w:szCs w:val="18"/>
+              </w:rPr>
+              <w:t xml:space="preserve">Create a custom field, including a formula.</w:t>
+            </w:r>
+          </w:p>
+        </w:tc>
+      </w:tr>
+      <w:tr>
+        <w:trPr>
+          <w:cantSplit/>
+        </w:trPr>
+        <w:tc>
+          <w:tcPr>
+            <w:tcW w:type="dxa" w:w="4200"/>
+            <w:tcBorders>
+              <w:top w:val="single" w:color="D5DDE2" w:sz="4"/>
+              <w:left w:val="single" w:color="D5DDE2" w:sz="4"/>
+              <w:bottom w:val="single" w:color="D5DDE2" w:sz="4"/>
+              <w:right w:val="single" w:color="D5DDE2" w:sz="4"/>
+            </w:tcBorders>
+            <w:shd w:fill="FFFFFF" w:val="clear"/>
+            <w:tcMar>
+              <w:top w:type="dxa" w:w="60"/>
+              <w:left w:type="dxa" w:w="80"/>
+              <w:bottom w:type="dxa" w:w="60"/>
+              <w:right w:type="dxa" w:w="80"/>
+            </w:tcMar>
+            <w:vAlign w:val="center"/>
+          </w:tcPr>
+          <w:p>
+            <w:pPr>
+              <w:spacing w:after="0" w:before="0"/>
+            </w:pPr>
+            <w:r>
+              <w:rPr>
+                <w:rFonts w:ascii="Calibri" w:cs="Calibri" w:eastAsia="Calibri" w:hAnsi="Calibri"/>
+                <w:b/>
+                <w:bCs/>
+                <w:i w:val="false"/>
+                <w:iCs w:val="false"/>
+                <w:color w:val="243038"/>
+                <w:sz w:val="18"/>
+                <w:szCs w:val="18"/>
+              </w:rPr>
+              <w:t xml:space="preserve">platform-permission-set-generate</w:t>
+            </w:r>
+          </w:p>
+        </w:tc>
+        <w:tc>
+          <w:tcPr>
+            <w:tcW w:type="dxa" w:w="5880"/>
+            <w:tcBorders>
+              <w:top w:val="single" w:color="D5DDE2" w:sz="4"/>
+              <w:left w:val="single" w:color="D5DDE2" w:sz="4"/>
+              <w:bottom w:val="single" w:color="D5DDE2" w:sz="4"/>
+              <w:right w:val="single" w:color="D5DDE2" w:sz="4"/>
+            </w:tcBorders>
+            <w:shd w:fill="FFFFFF" w:val="clear"/>
+            <w:tcMar>
+              <w:top w:type="dxa" w:w="60"/>
+              <w:left w:type="dxa" w:w="80"/>
+              <w:bottom w:type="dxa" w:w="60"/>
+              <w:right w:type="dxa" w:w="80"/>
+            </w:tcMar>
+            <w:vAlign w:val="center"/>
+          </w:tcPr>
+          <w:p>
+            <w:pPr>
+              <w:spacing w:after="0" w:before="0"/>
+            </w:pPr>
+            <w:r>
+              <w:rPr>
+                <w:rFonts w:ascii="Calibri" w:cs="Calibri" w:eastAsia="Calibri" w:hAnsi="Calibri"/>
+                <w:b w:val="false"/>
+                <w:bCs w:val="false"/>
+                <w:i w:val="false"/>
+                <w:iCs w:val="false"/>
+                <w:color w:val="243038"/>
+                <w:sz w:val="18"/>
+                <w:szCs w:val="18"/>
+              </w:rPr>
+              <w:t xml:space="preserve">Grant object and field access in a permission set.</w:t>
+            </w:r>
+          </w:p>
+        </w:tc>
+      </w:tr>
+      <w:tr>
+        <w:trPr>
+          <w:cantSplit/>
+        </w:trPr>
+        <w:tc>
+          <w:tcPr>
+            <w:tcW w:type="dxa" w:w="4200"/>
+            <w:tcBorders>
+              <w:top w:val="single" w:color="D5DDE2" w:sz="4"/>
+              <w:left w:val="single" w:color="D5DDE2" w:sz="4"/>
+              <w:bottom w:val="single" w:color="D5DDE2" w:sz="4"/>
+              <w:right w:val="single" w:color="D5DDE2" w:sz="4"/>
+            </w:tcBorders>
+            <w:shd w:fill="F4F7F8" w:val="clear"/>
+            <w:tcMar>
+              <w:top w:type="dxa" w:w="60"/>
+              <w:left w:type="dxa" w:w="80"/>
+              <w:bottom w:type="dxa" w:w="60"/>
+              <w:right w:type="dxa" w:w="80"/>
+            </w:tcMar>
+            <w:vAlign w:val="center"/>
+          </w:tcPr>
+          <w:p>
+            <w:pPr>
+              <w:spacing w:after="0" w:before="0"/>
+            </w:pPr>
+            <w:r>
+              <w:rPr>
+                <w:rFonts w:ascii="Calibri" w:cs="Calibri" w:eastAsia="Calibri" w:hAnsi="Calibri"/>
+                <w:b/>
+                <w:bCs/>
+                <w:i w:val="false"/>
+                <w:iCs w:val="false"/>
+                <w:color w:val="243038"/>
+                <w:sz w:val="18"/>
+                <w:szCs w:val="18"/>
+              </w:rPr>
+              <w:t xml:space="preserve">platform-validation-rule-generate</w:t>
+            </w:r>
+          </w:p>
+        </w:tc>
+        <w:tc>
+          <w:tcPr>
+            <w:tcW w:type="dxa" w:w="5880"/>
+            <w:tcBorders>
+              <w:top w:val="single" w:color="D5DDE2" w:sz="4"/>
+              <w:left w:val="single" w:color="D5DDE2" w:sz="4"/>
+              <w:bottom w:val="single" w:color="D5DDE2" w:sz="4"/>
+              <w:right w:val="single" w:color="D5DDE2" w:sz="4"/>
+            </w:tcBorders>
+            <w:shd w:fill="F4F7F8" w:val="clear"/>
+            <w:tcMar>
+              <w:top w:type="dxa" w:w="60"/>
+              <w:left w:type="dxa" w:w="80"/>
+              <w:bottom w:type="dxa" w:w="60"/>
+              <w:right w:type="dxa" w:w="80"/>
+            </w:tcMar>
+            <w:vAlign w:val="center"/>
+          </w:tcPr>
+          <w:p>
+            <w:pPr>
+              <w:spacing w:after="0" w:before="0"/>
+            </w:pPr>
+            <w:r>
+              <w:rPr>
+                <w:rFonts w:ascii="Calibri" w:cs="Calibri" w:eastAsia="Calibri" w:hAnsi="Calibri"/>
+                <w:b w:val="false"/>
+                <w:bCs w:val="false"/>
+                <w:i w:val="false"/>
+                <w:iCs w:val="false"/>
+                <w:color w:val="243038"/>
+                <w:sz w:val="18"/>
+                <w:szCs w:val="18"/>
+              </w:rPr>
+              <w:t xml:space="preserve">Author a validation rule.</w:t>
+            </w:r>
+          </w:p>
+        </w:tc>
+      </w:tr>
+      <w:tr>
+        <w:trPr>
+          <w:cantSplit/>
+        </w:trPr>
+        <w:tc>
+          <w:tcPr>
+            <w:tcW w:type="dxa" w:w="4200"/>
+            <w:tcBorders>
+              <w:top w:val="single" w:color="D5DDE2" w:sz="4"/>
+              <w:left w:val="single" w:color="D5DDE2" w:sz="4"/>
+              <w:bottom w:val="single" w:color="D5DDE2" w:sz="4"/>
+              <w:right w:val="single" w:color="D5DDE2" w:sz="4"/>
+            </w:tcBorders>
+            <w:shd w:fill="FFFFFF" w:val="clear"/>
+            <w:tcMar>
+              <w:top w:type="dxa" w:w="60"/>
+              <w:left w:type="dxa" w:w="80"/>
+              <w:bottom w:type="dxa" w:w="60"/>
+              <w:right w:type="dxa" w:w="80"/>
+            </w:tcMar>
+            <w:vAlign w:val="center"/>
+          </w:tcPr>
+          <w:p>
+            <w:pPr>
+              <w:spacing w:after="0" w:before="0"/>
+            </w:pPr>
+            <w:r>
+              <w:rPr>
+                <w:rFonts w:ascii="Calibri" w:cs="Calibri" w:eastAsia="Calibri" w:hAnsi="Calibri"/>
+                <w:b/>
+                <w:bCs/>
+                <w:i w:val="false"/>
+                <w:iCs w:val="false"/>
+                <w:color w:val="243038"/>
+                <w:sz w:val="18"/>
+                <w:szCs w:val="18"/>
+              </w:rPr>
+              <w:t xml:space="preserve">automation-flow-generate</w:t>
+            </w:r>
+          </w:p>
+        </w:tc>
+        <w:tc>
+          <w:tcPr>
+            <w:tcW w:type="dxa" w:w="5880"/>
+            <w:tcBorders>
+              <w:top w:val="single" w:color="D5DDE2" w:sz="4"/>
+              <w:left w:val="single" w:color="D5DDE2" w:sz="4"/>
+              <w:bottom w:val="single" w:color="D5DDE2" w:sz="4"/>
+              <w:right w:val="single" w:color="D5DDE2" w:sz="4"/>
+            </w:tcBorders>
+            <w:shd w:fill="FFFFFF" w:val="clear"/>
+            <w:tcMar>
+              <w:top w:type="dxa" w:w="60"/>
+              <w:left w:type="dxa" w:w="80"/>
+              <w:bottom w:type="dxa" w:w="60"/>
+              <w:right w:type="dxa" w:w="80"/>
+            </w:tcMar>
+            <w:vAlign w:val="center"/>
+          </w:tcPr>
+          <w:p>
+            <w:pPr>
+              <w:spacing w:after="0" w:before="0"/>
+            </w:pPr>
+            <w:r>
+              <w:rPr>
+                <w:rFonts w:ascii="Calibri" w:cs="Calibri" w:eastAsia="Calibri" w:hAnsi="Calibri"/>
+                <w:b w:val="false"/>
+                <w:bCs w:val="false"/>
+                <w:i w:val="false"/>
+                <w:iCs w:val="false"/>
+                <w:color w:val="243038"/>
+                <w:sz w:val="18"/>
+                <w:szCs w:val="18"/>
+              </w:rPr>
+              <w:t xml:space="preserve">Build a screen, record-triggered, or autolaunched flow.</w:t>
+            </w:r>
+          </w:p>
+        </w:tc>
+      </w:tr>
+      <w:tr>
+        <w:trPr>
+          <w:cantSplit/>
+        </w:trPr>
+        <w:tc>
+          <w:tcPr>
+            <w:tcW w:type="dxa" w:w="4200"/>
+            <w:tcBorders>
+              <w:top w:val="single" w:color="D5DDE2" w:sz="4"/>
+              <w:left w:val="single" w:color="D5DDE2" w:sz="4"/>
+              <w:bottom w:val="single" w:color="D5DDE2" w:sz="4"/>
+              <w:right w:val="single" w:color="D5DDE2" w:sz="4"/>
+            </w:tcBorders>
+            <w:shd w:fill="F4F7F8" w:val="clear"/>
+            <w:tcMar>
+              <w:top w:type="dxa" w:w="60"/>
+              <w:left w:type="dxa" w:w="80"/>
+              <w:bottom w:type="dxa" w:w="60"/>
+              <w:right w:type="dxa" w:w="80"/>
+            </w:tcMar>
+            <w:vAlign w:val="center"/>
+          </w:tcPr>
+          <w:p>
+            <w:pPr>
+              <w:spacing w:after="0" w:before="0"/>
+            </w:pPr>
+            <w:r>
+              <w:rPr>
+                <w:rFonts w:ascii="Calibri" w:cs="Calibri" w:eastAsia="Calibri" w:hAnsi="Calibri"/>
+                <w:b/>
+                <w:bCs/>
+                <w:i w:val="false"/>
+                <w:iCs w:val="false"/>
+                <w:color w:val="243038"/>
+                <w:sz w:val="18"/>
+                <w:szCs w:val="18"/>
+              </w:rPr>
+              <w:t xml:space="preserve">dx-code-analyzer-run</w:t>
+            </w:r>
+          </w:p>
+        </w:tc>
+        <w:tc>
+          <w:tcPr>
+            <w:tcW w:type="dxa" w:w="5880"/>
+            <w:tcBorders>
+              <w:top w:val="single" w:color="D5DDE2" w:sz="4"/>
+              <w:left w:val="single" w:color="D5DDE2" w:sz="4"/>
+              <w:bottom w:val="single" w:color="D5DDE2" w:sz="4"/>
+              <w:right w:val="single" w:color="D5DDE2" w:sz="4"/>
+            </w:tcBorders>
+            <w:shd w:fill="F4F7F8" w:val="clear"/>
+            <w:tcMar>
+              <w:top w:type="dxa" w:w="60"/>
+              <w:left w:type="dxa" w:w="80"/>
+              <w:bottom w:type="dxa" w:w="60"/>
+              <w:right w:type="dxa" w:w="80"/>
+            </w:tcMar>
+            <w:vAlign w:val="center"/>
+          </w:tcPr>
+          <w:p>
+            <w:pPr>
+              <w:spacing w:after="0" w:before="0"/>
+            </w:pPr>
+            <w:r>
+              <w:rPr>
+                <w:rFonts w:ascii="Calibri" w:cs="Calibri" w:eastAsia="Calibri" w:hAnsi="Calibri"/>
+                <w:b w:val="false"/>
+                <w:bCs w:val="false"/>
+                <w:i w:val="false"/>
+                <w:iCs w:val="false"/>
+                <w:color w:val="243038"/>
+                <w:sz w:val="18"/>
+                <w:szCs w:val="18"/>
+              </w:rPr>
+              <w:t xml:space="preserve">Scan Apex or LWC for security and performance issues.</w:t>
+            </w:r>
+          </w:p>
+        </w:tc>
+      </w:tr>
+    </w:tbl>
+    <w:p>
+      <w:pPr>
+        <w:spacing w:after="120" w:before="0"/>
+      </w:pPr>
     </w:p>
     <w:p>
       <w:pPr>
@@ -640,7 +1731,25 @@
           <w:sz w:val="22"/>
           <w:szCs w:val="22"/>
         </w:rPr>
-        <w:t xml:space="preserve">Past a few dozen skills, two failures show up in real sessions.</w:t>
+        <w:t xml:space="preserve">Twelve skills is already enough to collide. “Test” appears in three of them. “Field” appears in two. “Deploy” is a neighbor of “retrieve.” A keyword scan that stops at the first hit will send a coverage question to the skill that generates tests, and a retrieve question to the skill that deploys. The person did not ask for a bigger library. They asked for the prompt to land on the right row.</w:t>
+      </w:r>
+    </w:p>
+    <w:p>
+      <w:pPr>
+        <w:spacing w:after="160" w:before="0" w:line="288"/>
+      </w:pPr>
+      <w:r>
+        <w:rPr>
+          <w:rFonts w:ascii="Calibri" w:cs="Calibri" w:eastAsia="Calibri" w:hAnsi="Calibri"/>
+          <w:b w:val="false"/>
+          <w:bCs w:val="false"/>
+          <w:i w:val="false"/>
+          <w:iCs w:val="false"/>
+          <w:color w:val="243038"/>
+          <w:sz w:val="22"/>
+          <w:szCs w:val="22"/>
+        </w:rPr>
+        <w:t xml:space="preserve">Watch one prompt move through the router.</w:t>
       </w:r>
     </w:p>
     <w:p>
@@ -663,7 +1772,7 @@
           <w:sz w:val="22"/>
           <w:szCs w:val="22"/>
         </w:rPr>
-        <w:t xml:space="preserve">Overlapping descriptions steal each other’s prompts. Deploy, promote, release, and pipeline all sound like the same task to a loose keyword scan, and they are different jobs with different checks.</w:t>
+        <w:t xml:space="preserve">“Write a SOQL query for accounts created this week.” Rare tokens: SOQL, query, accounts. Winner: platform-soql-query. The deploy skill and the Apex skill stay unloaded.</w:t>
       </w:r>
     </w:p>
     <w:p>
@@ -686,65 +1795,7 @@
           <w:sz w:val="22"/>
           <w:szCs w:val="22"/>
         </w:rPr>
-        <w:t xml:space="preserve">The agent answers from memory when a playbook exists. The output is fluent, and it skips the guardrails the skill was written to enforce.</w:t>
-      </w:r>
-    </w:p>
-    <w:p>
-      <w:pPr>
-        <w:spacing w:after="160" w:before="0" w:line="288"/>
-      </w:pPr>
-      <w:r>
-        <w:rPr>
-          <w:rFonts w:ascii="Calibri" w:cs="Calibri" w:eastAsia="Calibri" w:hAnsi="Calibri"/>
-          <w:b w:val="false"/>
-          <w:bCs w:val="false"/>
-          <w:i w:val="false"/>
-          <w:iCs w:val="false"/>
-          <w:color w:val="243038"/>
-          <w:sz w:val="22"/>
-          <w:szCs w:val="22"/>
-        </w:rPr>
-        <w:t xml:space="preserve">Putting every skill into the prompt does not fix this. The descriptions crowd each other, and the bodies blow the context window before the agent has done any work. What you want is a cheap step in front: return the one skill to load, or return nothing.</w:t>
-      </w:r>
-    </w:p>
-    <w:p>
-      <w:pPr>
-        <w:pStyle w:val="Heading1"/>
-        <w:pBdr>
-          <w:bottom w:val="single" w:color="E4C98A" w:sz="12" w:space="1"/>
-        </w:pBdr>
-        <w:spacing w:after="140" w:before="360"/>
-      </w:pPr>
-      <w:r>
-        <w:rPr>
-          <w:rFonts w:ascii="Calibri" w:cs="Calibri" w:eastAsia="Calibri" w:hAnsi="Calibri"/>
-          <w:b/>
-          <w:bCs/>
-          <w:i w:val="false"/>
-          <w:iCs w:val="false"/>
-          <w:color w:val="1B3A4B"/>
-          <w:sz w:val="32"/>
-          <w:szCs w:val="32"/>
-        </w:rPr>
-        <w:t xml:space="preserve">What gets indexed</w:t>
-      </w:r>
-    </w:p>
-    <w:p>
-      <w:pPr>
-        <w:spacing w:after="160" w:before="0" w:line="288"/>
-      </w:pPr>
-      <w:r>
-        <w:rPr>
-          <w:rFonts w:ascii="Calibri" w:cs="Calibri" w:eastAsia="Calibri" w:hAnsi="Calibri"/>
-          <w:b w:val="false"/>
-          <w:bCs w:val="false"/>
-          <w:i w:val="false"/>
-          <w:iCs w:val="false"/>
-          <w:color w:val="243038"/>
-          <w:sz w:val="22"/>
-          <w:szCs w:val="22"/>
-        </w:rPr>
-        <w:t xml:space="preserve">A generator walks skills/ and reads each SKILL.md. It keeps the routing signal and throws away the procedure: directory name, frontmatter name, description, and a short keyword list taken from that description. It writes two artifacts from the same pass.</w:t>
+        <w:t xml:space="preserve">“Run the failing test class and tell me the coverage.” Rare tokens: test, run, coverage. Winner: platform-apex-test-run, not the skill that writes a new test.</w:t>
       </w:r>
     </w:p>
     <w:p>
@@ -767,7 +1818,7 @@
           <w:sz w:val="22"/>
           <w:szCs w:val="22"/>
         </w:rPr>
-        <w:t xml:space="preserve">router/skills-index.json is the catalog the server scores against.</w:t>
+        <w:t xml:space="preserve">“Add a formula field for renewal date.” Winner: platform-custom-field-generate. If the same turn also says “grant access on the existing permission set,” the router can name platform-permission-set-generate as a companion. The companion is loaded with the winner. It does not steal the win.</w:t>
       </w:r>
     </w:p>
     <w:p>
@@ -790,7 +1841,7 @@
           <w:sz w:val="22"/>
           <w:szCs w:val="22"/>
         </w:rPr>
-        <w:t xml:space="preserve">ROUTER.md is the same catalog for a person, plus a companion table.</w:t>
+        <w:t xml:space="preserve">“What is a good lasagna recipe.” No skill clears the floor. The router returns nothing, and the agent does not invent a Salesforce procedure for dinner.</w:t>
       </w:r>
     </w:p>
     <w:p>
@@ -808,25 +1859,72 @@
           <w:sz w:val="22"/>
           <w:szCs w:val="22"/>
         </w:rPr>
-        <w:t xml:space="preserve">The body of the skill is not in the index. That choice came from a measurement, which is in the bake-off below. The procedure is loaded later, on purpose, by a separate tool, after the route has already been decided.</w:t>
-      </w:r>
-    </w:p>
-    <w:p>
-      <w:pPr>
-        <w:spacing w:after="160" w:before="0" w:line="288"/>
-      </w:pPr>
-      <w:r>
-        <w:rPr>
-          <w:rFonts w:ascii="Calibri" w:cs="Calibri" w:eastAsia="Calibri" w:hAnsi="Calibri"/>
-          <w:b w:val="false"/>
-          <w:bCs w:val="false"/>
-          <w:i w:val="false"/>
-          <w:iCs w:val="false"/>
-          <w:color w:val="243038"/>
-          <w:sz w:val="22"/>
-          <w:szCs w:val="22"/>
-        </w:rPr>
-        <w:t xml:space="preserve">If a skill ships a folder of curated notes rather than a single procedure, the generator also rebuilds a topic index for that folder. Routing still picks the skill. A second, simpler search picks the note.</w:t>
+        <w:t xml:space="preserve">That is the help. The library can hold dozens or hundreds of skills. The prompt pays for one of them. Context stays small, the guardrails in that skill actually run, and a prompt that is not yours does not get a random playbook stapled to it.</w:t>
+      </w:r>
+    </w:p>
+    <w:p>
+      <w:pPr>
+        <w:spacing w:after="60" w:before="140"/>
+        <w:jc w:val="center"/>
+      </w:pPr>
+      <w:r>
+        <w:drawing>
+          <wp:inline distT="0" distB="0" distL="0" distR="0">
+            <wp:extent cx="5905500" cy="2876550"/>
+            <wp:effectExtent t="0" r="0" b="0" l="0"/>
+            <wp:docPr id="1" name="01-route" descr="A prompt goes to the skill router, which either loads one skill or abstains." title="A prompt goes to the skill router, which either loads one skill or abstains."/>
+            <wp:cNvGraphicFramePr>
+              <a:graphicFrameLocks xmlns:a="http://schemas.openxmlformats.org/drawingml/2006/main" noChangeAspect="1"/>
+            </wp:cNvGraphicFramePr>
+            <a:graphic xmlns:a="http://schemas.openxmlformats.org/drawingml/2006/main">
+              <a:graphicData uri="http://schemas.openxmlformats.org/drawingml/2006/picture">
+                <pic:pic xmlns:pic="http://schemas.openxmlformats.org/drawingml/2006/picture">
+                  <pic:nvPicPr>
+                    <pic:cNvPr id="0" name="" descr=""/>
+                    <pic:cNvPicPr>
+                      <a:picLocks noChangeAspect="1" noChangeArrowheads="1"/>
+                    </pic:cNvPicPr>
+                  </pic:nvPicPr>
+                  <pic:blipFill>
+                    <a:blip r:embed="rId9" cstate="none"/>
+                    <a:srcRect/>
+                    <a:stretch>
+                      <a:fillRect/>
+                    </a:stretch>
+                  </pic:blipFill>
+                  <pic:spPr bwMode="auto">
+                    <a:xfrm>
+                      <a:off x="0" y="0"/>
+                      <a:ext cx="5905500" cy="2876550"/>
+                    </a:xfrm>
+                    <a:prstGeom prst="rect">
+                      <a:avLst/>
+                    </a:prstGeom>
+                  </pic:spPr>
+                </pic:pic>
+              </a:graphicData>
+            </a:graphic>
+          </wp:inline>
+        </w:drawing>
+      </w:r>
+    </w:p>
+    <w:p>
+      <w:pPr>
+        <w:spacing w:after="160" w:before="0"/>
+        <w:jc w:val="center"/>
+      </w:pPr>
+      <w:r>
+        <w:rPr>
+          <w:rFonts w:ascii="Calibri" w:cs="Calibri" w:eastAsia="Calibri" w:hAnsi="Calibri"/>
+          <w:b w:val="false"/>
+          <w:bCs w:val="false"/>
+          <w:i/>
+          <w:iCs/>
+          <w:color w:val="5E6A71"/>
+          <w:sz w:val="18"/>
+          <w:szCs w:val="18"/>
+        </w:rPr>
+        <w:t xml:space="preserve">Figure 1. A confident match loads one skill. Anything under the floor loads nothing.</w:t>
       </w:r>
     </w:p>
     <w:p>
@@ -848,7 +1946,7 @@
           <w:sz w:val="32"/>
           <w:szCs w:val="32"/>
         </w:rPr>
-        <w:t xml:space="preserve">Three ways to ask</w:t>
+        <w:t xml:space="preserve">How the router helps</w:t>
       </w:r>
     </w:p>
     <w:p>
@@ -866,7 +1964,90 @@
           <w:sz w:val="22"/>
           <w:szCs w:val="22"/>
         </w:rPr>
-        <w:t xml:space="preserve">The same index is exposed three ways, because different hosts will reach for different ones.</w:t>
+        <w:t xml:space="preserve">Without a router, a host matches the prompt against every skill description it was given, or it matches against none and relies on the model’s memory. Both degrade as the library grows. Descriptions start to share words. The context window fills with procedures the turn will not use. The model picks a plausible skill and follows it carefully, which is worse than picking none, because the mistake is now enforced.</w:t>
+      </w:r>
+    </w:p>
+    <w:p>
+      <w:pPr>
+        <w:spacing w:after="160" w:before="0" w:line="288"/>
+      </w:pPr>
+      <w:r>
+        <w:rPr>
+          <w:rFonts w:ascii="Calibri" w:cs="Calibri" w:eastAsia="Calibri" w:hAnsi="Calibri"/>
+          <w:b w:val="false"/>
+          <w:bCs w:val="false"/>
+          <w:i w:val="false"/>
+          <w:iCs w:val="false"/>
+          <w:color w:val="243038"/>
+          <w:sz w:val="22"/>
+          <w:szCs w:val="22"/>
+        </w:rPr>
+        <w:t xml:space="preserve">The router sits in front of that, as a tool the agent can call or as a one-line hint before the turn starts. It does five jobs.</w:t>
+      </w:r>
+    </w:p>
+    <w:p>
+      <w:pPr>
+        <w:spacing w:after="60" w:before="140"/>
+        <w:jc w:val="center"/>
+      </w:pPr>
+      <w:r>
+        <w:drawing>
+          <wp:inline distT="0" distB="0" distL="0" distR="0">
+            <wp:extent cx="5905500" cy="3171825"/>
+            <wp:effectExtent t="0" r="0" b="0" l="0"/>
+            <wp:docPr id="2" name="02-library" descr="Eight skills stay on disk. One skill is loaded into the turn." title="Eight skills stay on disk. One skill is loaded into the turn."/>
+            <wp:cNvGraphicFramePr>
+              <a:graphicFrameLocks xmlns:a="http://schemas.openxmlformats.org/drawingml/2006/main" noChangeAspect="1"/>
+            </wp:cNvGraphicFramePr>
+            <a:graphic xmlns:a="http://schemas.openxmlformats.org/drawingml/2006/main">
+              <a:graphicData uri="http://schemas.openxmlformats.org/drawingml/2006/picture">
+                <pic:pic xmlns:pic="http://schemas.openxmlformats.org/drawingml/2006/picture">
+                  <pic:nvPicPr>
+                    <pic:cNvPr id="0" name="" descr=""/>
+                    <pic:cNvPicPr>
+                      <a:picLocks noChangeAspect="1" noChangeArrowheads="1"/>
+                    </pic:cNvPicPr>
+                  </pic:nvPicPr>
+                  <pic:blipFill>
+                    <a:blip r:embed="rId10" cstate="none"/>
+                    <a:srcRect/>
+                    <a:stretch>
+                      <a:fillRect/>
+                    </a:stretch>
+                  </pic:blipFill>
+                  <pic:spPr bwMode="auto">
+                    <a:xfrm>
+                      <a:off x="0" y="0"/>
+                      <a:ext cx="5905500" cy="3171825"/>
+                    </a:xfrm>
+                    <a:prstGeom prst="rect">
+                      <a:avLst/>
+                    </a:prstGeom>
+                  </pic:spPr>
+                </pic:pic>
+              </a:graphicData>
+            </a:graphic>
+          </wp:inline>
+        </w:drawing>
+      </w:r>
+    </w:p>
+    <w:p>
+      <w:pPr>
+        <w:spacing w:after="160" w:before="0"/>
+        <w:jc w:val="center"/>
+      </w:pPr>
+      <w:r>
+        <w:rPr>
+          <w:rFonts w:ascii="Calibri" w:cs="Calibri" w:eastAsia="Calibri" w:hAnsi="Calibri"/>
+          <w:b w:val="false"/>
+          <w:bCs w:val="false"/>
+          <w:i/>
+          <w:iCs/>
+          <w:color w:val="5E6A71"/>
+          <w:sz w:val="18"/>
+          <w:szCs w:val="18"/>
+        </w:rPr>
+        <w:t xml:space="preserve">Figure 2. The catalog can be large. The turn receives the winner only.</w:t>
       </w:r>
     </w:p>
     <w:p>
@@ -889,7 +2070,7 @@
           <w:sz w:val="22"/>
           <w:szCs w:val="22"/>
         </w:rPr>
-        <w:t xml:space="preserve">The markdown table. Point the agent at ROUTER.md if you want it to read the map itself.</w:t>
+        <w:t xml:space="preserve">It names the owning skill before any code, metadata, or query is written. The agent then reads that SKILL.md and follows it.</w:t>
       </w:r>
     </w:p>
     <w:p>
@@ -912,7 +2093,7 @@
           <w:sz w:val="22"/>
           <w:szCs w:val="22"/>
         </w:rPr>
-        <w:t xml:space="preserve">An MCP server. Five tools, newline-delimited JSON-RPC on stdin, no packages to install.</w:t>
+        <w:t xml:space="preserve">It keeps the rest of the library on disk. find_skill returns a ranked hit, not the catalog. list_skills and read_skill exist so the agent can open exactly what was named.</w:t>
       </w:r>
     </w:p>
     <w:p>
@@ -935,7 +2116,598 @@
           <w:sz w:val="22"/>
           <w:szCs w:val="22"/>
         </w:rPr>
-        <w:t xml:space="preserve">An optional hook. It runs when a prompt arrives and, only when it is sure, injects one line: load this skill first.</w:t>
+        <w:t xml:space="preserve">It prefers the distinctive word. BM25 scores a term that lives in one skill much higher than a term that lives in twenty. “Coverage” pulls the test-runner. “SOQL” pulls the query skill. “Formula field” pulls field generation.</w:t>
+      </w:r>
+    </w:p>
+    <w:p>
+      <w:pPr>
+        <w:pStyle w:val="ListParagraph"/>
+        <w:numPr>
+          <w:ilvl w:val="0"/>
+          <w:numId w:val="3"/>
+        </w:numPr>
+        <w:spacing w:after="60" w:before="40" w:line="276"/>
+      </w:pPr>
+      <w:r>
+        <w:rPr>
+          <w:rFonts w:ascii="Calibri" w:cs="Calibri" w:eastAsia="Calibri" w:hAnsi="Calibri"/>
+          <w:b w:val="false"/>
+          <w:bCs w:val="false"/>
+          <w:i w:val="false"/>
+          <w:iCs w:val="false"/>
+          <w:color w:val="243038"/>
+          <w:sz w:val="22"/>
+          <w:szCs w:val="22"/>
+        </w:rPr>
+        <w:t xml:space="preserve">It abstains. Below a floor, the result is an empty list. The agent is free to answer directly. It is not free to pretend a skill applied.</w:t>
+      </w:r>
+    </w:p>
+    <w:p>
+      <w:pPr>
+        <w:pStyle w:val="ListParagraph"/>
+        <w:numPr>
+          <w:ilvl w:val="0"/>
+          <w:numId w:val="3"/>
+        </w:numPr>
+        <w:spacing w:after="60" w:before="40" w:line="276"/>
+      </w:pPr>
+      <w:r>
+        <w:rPr>
+          <w:rFonts w:ascii="Calibri" w:cs="Calibri" w:eastAsia="Calibri" w:hAnsi="Calibri"/>
+          <w:b w:val="false"/>
+          <w:bCs w:val="false"/>
+          <w:i w:val="false"/>
+          <w:iCs w:val="false"/>
+          <w:color w:val="243038"/>
+          <w:sz w:val="22"/>
+          <w:szCs w:val="22"/>
+        </w:rPr>
+        <w:t xml:space="preserve">It names companions after the winner is chosen. A field change that also needs access can load the permission-set skill in the same turn. The companion list never reorders the ranking.</w:t>
+      </w:r>
+    </w:p>
+    <w:p>
+      <w:pPr>
+        <w:spacing w:after="120" w:before="0"/>
+      </w:pPr>
+    </w:p>
+    <w:p>
+      <w:pPr>
+        <w:spacing w:after="160" w:before="0" w:line="288"/>
+      </w:pPr>
+      <w:r>
+        <w:rPr>
+          <w:rFonts w:ascii="Calibri" w:cs="Calibri" w:eastAsia="Calibri" w:hAnsi="Calibri"/>
+          <w:b w:val="false"/>
+          <w:bCs w:val="false"/>
+          <w:i w:val="false"/>
+          <w:iCs w:val="false"/>
+          <w:color w:val="243038"/>
+          <w:sz w:val="22"/>
+          <w:szCs w:val="22"/>
+        </w:rPr>
+        <w:t xml:space="preserve">The same index is available three ways, because hosts differ. ROUTER.md is the human table. An MCP server exposes find_skill, list_skills, read_skill, search_topics, and read_topic over stdin, with no packages to install. An optional hook prints “load this skill first” only when it is sure, and prints nothing otherwise.</w:t>
+      </w:r>
+    </w:p>
+    <w:p>
+      <w:pPr>
+        <w:pStyle w:val="Heading1"/>
+        <w:pBdr>
+          <w:bottom w:val="single" w:color="E4C98A" w:sz="12" w:space="1"/>
+        </w:pBdr>
+        <w:spacing w:after="140" w:before="360"/>
+      </w:pPr>
+      <w:r>
+        <w:rPr>
+          <w:rFonts w:ascii="Calibri" w:cs="Calibri" w:eastAsia="Calibri" w:hAnsi="Calibri"/>
+          <w:b/>
+          <w:bCs/>
+          <w:i w:val="false"/>
+          <w:iCs w:val="false"/>
+          <w:color w:val="1B3A4B"/>
+          <w:sz w:val="32"/>
+          <w:szCs w:val="32"/>
+        </w:rPr>
+        <w:t xml:space="preserve">Extending the library does not mean extending the router</w:t>
+      </w:r>
+    </w:p>
+    <w:p>
+      <w:pPr>
+        <w:spacing w:after="160" w:before="0" w:line="288"/>
+      </w:pPr>
+      <w:r>
+        <w:rPr>
+          <w:rFonts w:ascii="Calibri" w:cs="Calibri" w:eastAsia="Calibri" w:hAnsi="Calibri"/>
+          <w:b w:val="false"/>
+          <w:bCs w:val="false"/>
+          <w:i w:val="false"/>
+          <w:iCs w:val="false"/>
+          <w:color w:val="243038"/>
+          <w:sz w:val="22"/>
+          <w:szCs w:val="22"/>
+        </w:rPr>
+        <w:t xml:space="preserve">This is the part teams underestimate. Adding skill number ninety-one should be a file, not a project. The ranker does not get a new branch. You do not retrain a model. You do not edit a priority list of phrases and hope you inserted the rule in the right place.</w:t>
+      </w:r>
+    </w:p>
+    <w:p>
+      <w:pPr>
+        <w:spacing w:after="60" w:before="140"/>
+        <w:jc w:val="center"/>
+      </w:pPr>
+      <w:r>
+        <w:drawing>
+          <wp:inline distT="0" distB="0" distL="0" distR="0">
+            <wp:extent cx="5905500" cy="1924050"/>
+            <wp:effectExtent t="0" r="0" b="0" l="0"/>
+            <wp:docPr id="3" name="03-extend" descr="Four steps: write the skill, rebuild the index, prove the route, then use it." title="Four steps: write the skill, rebuild the index, prove the route, then use it."/>
+            <wp:cNvGraphicFramePr>
+              <a:graphicFrameLocks xmlns:a="http://schemas.openxmlformats.org/drawingml/2006/main" noChangeAspect="1"/>
+            </wp:cNvGraphicFramePr>
+            <a:graphic xmlns:a="http://schemas.openxmlformats.org/drawingml/2006/main">
+              <a:graphicData uri="http://schemas.openxmlformats.org/drawingml/2006/picture">
+                <pic:pic xmlns:pic="http://schemas.openxmlformats.org/drawingml/2006/picture">
+                  <pic:nvPicPr>
+                    <pic:cNvPr id="0" name="" descr=""/>
+                    <pic:cNvPicPr>
+                      <a:picLocks noChangeAspect="1" noChangeArrowheads="1"/>
+                    </pic:cNvPicPr>
+                  </pic:nvPicPr>
+                  <pic:blipFill>
+                    <a:blip r:embed="rId11" cstate="none"/>
+                    <a:srcRect/>
+                    <a:stretch>
+                      <a:fillRect/>
+                    </a:stretch>
+                  </pic:blipFill>
+                  <pic:spPr bwMode="auto">
+                    <a:xfrm>
+                      <a:off x="0" y="0"/>
+                      <a:ext cx="5905500" cy="1924050"/>
+                    </a:xfrm>
+                    <a:prstGeom prst="rect">
+                      <a:avLst/>
+                    </a:prstGeom>
+                  </pic:spPr>
+                </pic:pic>
+              </a:graphicData>
+            </a:graphic>
+          </wp:inline>
+        </w:drawing>
+      </w:r>
+    </w:p>
+    <w:p>
+      <w:pPr>
+        <w:spacing w:after="160" w:before="0"/>
+        <w:jc w:val="center"/>
+      </w:pPr>
+      <w:r>
+        <w:rPr>
+          <w:rFonts w:ascii="Calibri" w:cs="Calibri" w:eastAsia="Calibri" w:hAnsi="Calibri"/>
+          <w:b w:val="false"/>
+          <w:bCs w:val="false"/>
+          <w:i/>
+          <w:iCs/>
+          <w:color w:val="5E6A71"/>
+          <w:sz w:val="18"/>
+          <w:szCs w:val="18"/>
+        </w:rPr>
+        <w:t xml:space="preserve">Figure 3. Extending the library is a file and an eval run. The router code stays put.</w:t>
+      </w:r>
+    </w:p>
+    <w:p>
+      <w:pPr>
+        <w:pStyle w:val="ListParagraph"/>
+        <w:numPr>
+          <w:ilvl w:val="0"/>
+          <w:numId w:val="4"/>
+        </w:numPr>
+        <w:spacing w:after="60" w:before="40" w:line="276"/>
+      </w:pPr>
+      <w:r>
+        <w:rPr>
+          <w:rFonts w:ascii="Calibri" w:cs="Calibri" w:eastAsia="Calibri" w:hAnsi="Calibri"/>
+          <w:b w:val="false"/>
+          <w:bCs w:val="false"/>
+          <w:i w:val="false"/>
+          <w:iCs w:val="false"/>
+          <w:color w:val="243038"/>
+          <w:sz w:val="22"/>
+          <w:szCs w:val="22"/>
+        </w:rPr>
+        <w:t xml:space="preserve">Create skills/&lt;name&gt;/SKILL.md. Put the words a person would actually type into the description. That sentence is the routing signal. The body is the procedure, and it is loaded only after the skill wins.</w:t>
+      </w:r>
+    </w:p>
+    <w:p>
+      <w:pPr>
+        <w:pStyle w:val="ListParagraph"/>
+        <w:numPr>
+          <w:ilvl w:val="0"/>
+          <w:numId w:val="4"/>
+        </w:numPr>
+        <w:spacing w:after="60" w:before="40" w:line="276"/>
+      </w:pPr>
+      <w:r>
+        <w:rPr>
+          <w:rFonts w:ascii="Calibri" w:cs="Calibri" w:eastAsia="Calibri" w:hAnsi="Calibri"/>
+          <w:b w:val="false"/>
+          <w:bCs w:val="false"/>
+          <w:i w:val="false"/>
+          <w:iCs w:val="false"/>
+          <w:color w:val="243038"/>
+          <w:sz w:val="22"/>
+          <w:szCs w:val="22"/>
+        </w:rPr>
+        <w:t xml:space="preserve">If another skill should come along for the ride, add one line to the companion map. That line is attached after a winner is chosen. It does not vote.</w:t>
+      </w:r>
+    </w:p>
+    <w:p>
+      <w:pPr>
+        <w:pStyle w:val="ListParagraph"/>
+        <w:numPr>
+          <w:ilvl w:val="0"/>
+          <w:numId w:val="4"/>
+        </w:numPr>
+        <w:spacing w:after="60" w:before="40" w:line="276"/>
+      </w:pPr>
+      <w:r>
+        <w:rPr>
+          <w:rFonts w:ascii="Calibri" w:cs="Calibri" w:eastAsia="Calibri" w:hAnsi="Calibri"/>
+          <w:b w:val="false"/>
+          <w:bCs w:val="false"/>
+          <w:i w:val="false"/>
+          <w:iCs w:val="false"/>
+          <w:color w:val="243038"/>
+          <w:sz w:val="22"/>
+          <w:szCs w:val="22"/>
+        </w:rPr>
+        <w:t xml:space="preserve">Add a gold prompt that must hit this skill, and a negative if the new words could false-fire on an unrelated prompt.</w:t>
+      </w:r>
+    </w:p>
+    <w:p>
+      <w:pPr>
+        <w:pStyle w:val="ListParagraph"/>
+        <w:numPr>
+          <w:ilvl w:val="0"/>
+          <w:numId w:val="4"/>
+        </w:numPr>
+        <w:spacing w:after="60" w:before="40" w:line="276"/>
+      </w:pPr>
+      <w:r>
+        <w:rPr>
+          <w:rFonts w:ascii="Calibri" w:cs="Calibri" w:eastAsia="Calibri" w:hAnsi="Calibri"/>
+          <w:b w:val="false"/>
+          <w:bCs w:val="false"/>
+          <w:i w:val="false"/>
+          <w:iCs w:val="false"/>
+          <w:color w:val="243038"/>
+          <w:sz w:val="22"/>
+          <w:szCs w:val="22"/>
+        </w:rPr>
+        <w:t xml:space="preserve">Regenerate the index and run the eval. If Recall@1 drops or a negative starts firing, the description is overlapping a neighbor, or the floor needs a sweep. Fix that before the next skill.</w:t>
+      </w:r>
+    </w:p>
+    <w:p>
+      <w:pPr>
+        <w:spacing w:after="120" w:before="0"/>
+      </w:pPr>
+    </w:p>
+    <w:p>
+      <w:pPr>
+        <w:spacing w:after="160" w:before="0" w:line="288"/>
+      </w:pPr>
+      <w:r>
+        <w:rPr>
+          <w:rFonts w:ascii="Calibri" w:cs="Calibri" w:eastAsia="Calibri" w:hAnsi="Calibri"/>
+          <w:b w:val="false"/>
+          <w:bCs w:val="false"/>
+          <w:i w:val="false"/>
+          <w:iCs w:val="false"/>
+          <w:color w:val="243038"/>
+          <w:sz w:val="22"/>
+          <w:szCs w:val="22"/>
+        </w:rPr>
+        <w:t xml:space="preserve">The router code stays put. The index is generated. A new Salesforce skill — a naming-convention check, a permission-set diff, a flow-fault reviewer — shows up in find_skill on the next prompt, because its description is now in the catalog. Removing a skill is the same operation in reverse: delete the folder, regenerate, confirm the gold prompts that used to hit it now abstain or land on the replacement.</w:t>
+      </w:r>
+    </w:p>
+    <w:p>
+      <w:pPr>
+        <w:spacing w:after="160" w:before="0" w:line="288"/>
+      </w:pPr>
+      <w:r>
+        <w:rPr>
+          <w:rFonts w:ascii="Calibri" w:cs="Calibri" w:eastAsia="Calibri" w:hAnsi="Calibri"/>
+          <w:b w:val="false"/>
+          <w:bCs w:val="false"/>
+          <w:i w:val="false"/>
+          <w:iCs w:val="false"/>
+          <w:color w:val="243038"/>
+          <w:sz w:val="22"/>
+          <w:szCs w:val="22"/>
+        </w:rPr>
+        <w:t xml:space="preserve">Efficiency here is operational, not clever. The expensive work is writing a sharp description and one prompt that proves it. The cheap work is everything the router does after that. I have added skills to a live catalog this way in minutes. The sessions that went wrong were the ones where I tuned a description by reading it, skipped the gold prompt, and discovered a week later that it had stolen a neighbor’s traffic.</w:t>
+      </w:r>
+    </w:p>
+    <w:p>
+      <w:pPr>
+        <w:pStyle w:val="Heading1"/>
+        <w:pBdr>
+          <w:bottom w:val="single" w:color="E4C98A" w:sz="12" w:space="1"/>
+        </w:pBdr>
+        <w:spacing w:after="140" w:before="360"/>
+      </w:pPr>
+      <w:r>
+        <w:rPr>
+          <w:rFonts w:ascii="Calibri" w:cs="Calibri" w:eastAsia="Calibri" w:hAnsi="Calibri"/>
+          <w:b/>
+          <w:bCs/>
+          <w:i w:val="false"/>
+          <w:iCs w:val="false"/>
+          <w:color w:val="1B3A4B"/>
+          <w:sz w:val="32"/>
+          <w:szCs w:val="32"/>
+        </w:rPr>
+        <w:t xml:space="preserve">The failure mode</w:t>
+      </w:r>
+    </w:p>
+    <w:p>
+      <w:pPr>
+        <w:spacing w:after="160" w:before="0" w:line="288"/>
+      </w:pPr>
+      <w:r>
+        <w:rPr>
+          <w:rFonts w:ascii="Calibri" w:cs="Calibri" w:eastAsia="Calibri" w:hAnsi="Calibri"/>
+          <w:b w:val="false"/>
+          <w:bCs w:val="false"/>
+          <w:i w:val="false"/>
+          <w:iCs w:val="false"/>
+          <w:color w:val="243038"/>
+          <w:sz w:val="22"/>
+          <w:szCs w:val="22"/>
+        </w:rPr>
+        <w:t xml:space="preserve">A skill, in the sense this router cares about, is a markdown file. The frontmatter carries a name and a description. The body carries the procedure: what to read, what to refuse, what “done” means. Hosts such as Claude Code and Cursor already match a prompt against those descriptions. That match is enough while the catalog is small.</w:t>
+      </w:r>
+    </w:p>
+    <w:p>
+      <w:pPr>
+        <w:spacing w:after="160" w:before="0" w:line="288"/>
+      </w:pPr>
+      <w:r>
+        <w:rPr>
+          <w:rFonts w:ascii="Calibri" w:cs="Calibri" w:eastAsia="Calibri" w:hAnsi="Calibri"/>
+          <w:b w:val="false"/>
+          <w:bCs w:val="false"/>
+          <w:i w:val="false"/>
+          <w:iCs w:val="false"/>
+          <w:color w:val="243038"/>
+          <w:sz w:val="22"/>
+          <w:szCs w:val="22"/>
+        </w:rPr>
+        <w:t xml:space="preserve">Past a few dozen skills, two failures show up in real sessions.</w:t>
+      </w:r>
+    </w:p>
+    <w:p>
+      <w:pPr>
+        <w:pStyle w:val="ListParagraph"/>
+        <w:numPr>
+          <w:ilvl w:val="0"/>
+          <w:numId w:val="2"/>
+        </w:numPr>
+        <w:spacing w:after="60" w:before="40" w:line="276"/>
+      </w:pPr>
+      <w:r>
+        <w:rPr>
+          <w:rFonts w:ascii="Calibri" w:cs="Calibri" w:eastAsia="Calibri" w:hAnsi="Calibri"/>
+          <w:b w:val="false"/>
+          <w:bCs w:val="false"/>
+          <w:i w:val="false"/>
+          <w:iCs w:val="false"/>
+          <w:color w:val="243038"/>
+          <w:sz w:val="22"/>
+          <w:szCs w:val="22"/>
+        </w:rPr>
+        <w:t xml:space="preserve">Overlapping descriptions steal each other’s prompts. Deploy, promote, release, and pipeline all sound like the same task to a loose keyword scan, and they are different jobs with different checks.</w:t>
+      </w:r>
+    </w:p>
+    <w:p>
+      <w:pPr>
+        <w:pStyle w:val="ListParagraph"/>
+        <w:numPr>
+          <w:ilvl w:val="0"/>
+          <w:numId w:val="2"/>
+        </w:numPr>
+        <w:spacing w:after="60" w:before="40" w:line="276"/>
+      </w:pPr>
+      <w:r>
+        <w:rPr>
+          <w:rFonts w:ascii="Calibri" w:cs="Calibri" w:eastAsia="Calibri" w:hAnsi="Calibri"/>
+          <w:b w:val="false"/>
+          <w:bCs w:val="false"/>
+          <w:i w:val="false"/>
+          <w:iCs w:val="false"/>
+          <w:color w:val="243038"/>
+          <w:sz w:val="22"/>
+          <w:szCs w:val="22"/>
+        </w:rPr>
+        <w:t xml:space="preserve">The agent answers from memory when a playbook exists. The output is fluent, and it skips the guardrails the skill was written to enforce.</w:t>
+      </w:r>
+    </w:p>
+    <w:p>
+      <w:pPr>
+        <w:spacing w:after="160" w:before="0" w:line="288"/>
+      </w:pPr>
+      <w:r>
+        <w:rPr>
+          <w:rFonts w:ascii="Calibri" w:cs="Calibri" w:eastAsia="Calibri" w:hAnsi="Calibri"/>
+          <w:b w:val="false"/>
+          <w:bCs w:val="false"/>
+          <w:i w:val="false"/>
+          <w:iCs w:val="false"/>
+          <w:color w:val="243038"/>
+          <w:sz w:val="22"/>
+          <w:szCs w:val="22"/>
+        </w:rPr>
+        <w:t xml:space="preserve">Putting every skill into the prompt does not fix this. The descriptions crowd each other, and the bodies blow the context window before the agent has done any work. What you want is a cheap step in front: return the one skill to load, or return nothing.</w:t>
+      </w:r>
+    </w:p>
+    <w:p>
+      <w:pPr>
+        <w:pStyle w:val="Heading1"/>
+        <w:pBdr>
+          <w:bottom w:val="single" w:color="E4C98A" w:sz="12" w:space="1"/>
+        </w:pBdr>
+        <w:spacing w:after="140" w:before="360"/>
+      </w:pPr>
+      <w:r>
+        <w:rPr>
+          <w:rFonts w:ascii="Calibri" w:cs="Calibri" w:eastAsia="Calibri" w:hAnsi="Calibri"/>
+          <w:b/>
+          <w:bCs/>
+          <w:i w:val="false"/>
+          <w:iCs w:val="false"/>
+          <w:color w:val="1B3A4B"/>
+          <w:sz w:val="32"/>
+          <w:szCs w:val="32"/>
+        </w:rPr>
+        <w:t xml:space="preserve">What gets indexed</w:t>
+      </w:r>
+    </w:p>
+    <w:p>
+      <w:pPr>
+        <w:spacing w:after="160" w:before="0" w:line="288"/>
+      </w:pPr>
+      <w:r>
+        <w:rPr>
+          <w:rFonts w:ascii="Calibri" w:cs="Calibri" w:eastAsia="Calibri" w:hAnsi="Calibri"/>
+          <w:b w:val="false"/>
+          <w:bCs w:val="false"/>
+          <w:i w:val="false"/>
+          <w:iCs w:val="false"/>
+          <w:color w:val="243038"/>
+          <w:sz w:val="22"/>
+          <w:szCs w:val="22"/>
+        </w:rPr>
+        <w:t xml:space="preserve">A generator walks skills/ and reads each SKILL.md. It keeps the routing signal and throws away the procedure: directory name, frontmatter name, description, and a short keyword list taken from that description. It writes two artifacts from the same pass.</w:t>
+      </w:r>
+    </w:p>
+    <w:p>
+      <w:pPr>
+        <w:pStyle w:val="ListParagraph"/>
+        <w:numPr>
+          <w:ilvl w:val="0"/>
+          <w:numId w:val="2"/>
+        </w:numPr>
+        <w:spacing w:after="60" w:before="40" w:line="276"/>
+      </w:pPr>
+      <w:r>
+        <w:rPr>
+          <w:rFonts w:ascii="Calibri" w:cs="Calibri" w:eastAsia="Calibri" w:hAnsi="Calibri"/>
+          <w:b w:val="false"/>
+          <w:bCs w:val="false"/>
+          <w:i w:val="false"/>
+          <w:iCs w:val="false"/>
+          <w:color w:val="243038"/>
+          <w:sz w:val="22"/>
+          <w:szCs w:val="22"/>
+        </w:rPr>
+        <w:t xml:space="preserve">router/skills-index.json is the catalog the server scores against.</w:t>
+      </w:r>
+    </w:p>
+    <w:p>
+      <w:pPr>
+        <w:pStyle w:val="ListParagraph"/>
+        <w:numPr>
+          <w:ilvl w:val="0"/>
+          <w:numId w:val="2"/>
+        </w:numPr>
+        <w:spacing w:after="60" w:before="40" w:line="276"/>
+      </w:pPr>
+      <w:r>
+        <w:rPr>
+          <w:rFonts w:ascii="Calibri" w:cs="Calibri" w:eastAsia="Calibri" w:hAnsi="Calibri"/>
+          <w:b w:val="false"/>
+          <w:bCs w:val="false"/>
+          <w:i w:val="false"/>
+          <w:iCs w:val="false"/>
+          <w:color w:val="243038"/>
+          <w:sz w:val="22"/>
+          <w:szCs w:val="22"/>
+        </w:rPr>
+        <w:t xml:space="preserve">ROUTER.md is the same catalog for a person, plus a companion table.</w:t>
+      </w:r>
+    </w:p>
+    <w:p>
+      <w:pPr>
+        <w:spacing w:after="160" w:before="0" w:line="288"/>
+      </w:pPr>
+      <w:r>
+        <w:rPr>
+          <w:rFonts w:ascii="Calibri" w:cs="Calibri" w:eastAsia="Calibri" w:hAnsi="Calibri"/>
+          <w:b w:val="false"/>
+          <w:bCs w:val="false"/>
+          <w:i w:val="false"/>
+          <w:iCs w:val="false"/>
+          <w:color w:val="243038"/>
+          <w:sz w:val="22"/>
+          <w:szCs w:val="22"/>
+        </w:rPr>
+        <w:t xml:space="preserve">The body of the skill is not in the index. That choice came from a measurement, which is in the bake-off below. The procedure is loaded later, on purpose, by a separate tool, after the route has already been decided.</w:t>
+      </w:r>
+    </w:p>
+    <w:p>
+      <w:pPr>
+        <w:spacing w:after="160" w:before="0" w:line="288"/>
+      </w:pPr>
+      <w:r>
+        <w:rPr>
+          <w:rFonts w:ascii="Calibri" w:cs="Calibri" w:eastAsia="Calibri" w:hAnsi="Calibri"/>
+          <w:b w:val="false"/>
+          <w:bCs w:val="false"/>
+          <w:i w:val="false"/>
+          <w:iCs w:val="false"/>
+          <w:color w:val="243038"/>
+          <w:sz w:val="22"/>
+          <w:szCs w:val="22"/>
+        </w:rPr>
+        <w:t xml:space="preserve">If a skill ships a folder of curated notes rather than a single procedure, the generator also rebuilds a topic index for that folder. Routing still picks the skill. A second, simpler search picks the note.</w:t>
+      </w:r>
+    </w:p>
+    <w:p>
+      <w:pPr>
+        <w:pStyle w:val="Heading1"/>
+        <w:pBdr>
+          <w:bottom w:val="single" w:color="E4C98A" w:sz="12" w:space="1"/>
+        </w:pBdr>
+        <w:spacing w:after="140" w:before="360"/>
+      </w:pPr>
+      <w:r>
+        <w:rPr>
+          <w:rFonts w:ascii="Calibri" w:cs="Calibri" w:eastAsia="Calibri" w:hAnsi="Calibri"/>
+          <w:b/>
+          <w:bCs/>
+          <w:i w:val="false"/>
+          <w:iCs w:val="false"/>
+          <w:color w:val="1B3A4B"/>
+          <w:sz w:val="32"/>
+          <w:szCs w:val="32"/>
+        </w:rPr>
+        <w:t xml:space="preserve">The tools</w:t>
+      </w:r>
+    </w:p>
+    <w:p>
+      <w:pPr>
+        <w:spacing w:after="160" w:before="0" w:line="288"/>
+      </w:pPr>
+      <w:r>
+        <w:rPr>
+          <w:rFonts w:ascii="Calibri" w:cs="Calibri" w:eastAsia="Calibri" w:hAnsi="Calibri"/>
+          <w:b w:val="false"/>
+          <w:bCs w:val="false"/>
+          <w:i w:val="false"/>
+          <w:iCs w:val="false"/>
+          <w:color w:val="243038"/>
+          <w:sz w:val="22"/>
+          <w:szCs w:val="22"/>
+        </w:rPr>
+        <w:t xml:space="preserve">find_skill is the call that matters. The other four exist so the agent can open exactly the skill or note that won, instead of guessing a path.</w:t>
       </w:r>
     </w:p>
     <w:p>
@@ -1439,24 +3211,6 @@
       <w:pPr>
         <w:spacing w:after="120" w:before="0"/>
       </w:pPr>
-    </w:p>
-    <w:p>
-      <w:pPr>
-        <w:spacing w:after="160" w:before="0" w:line="288"/>
-      </w:pPr>
-      <w:r>
-        <w:rPr>
-          <w:rFonts w:ascii="Calibri" w:cs="Calibri" w:eastAsia="Calibri" w:hAnsi="Calibri"/>
-          <w:b w:val="false"/>
-          <w:bCs w:val="false"/>
-          <w:i w:val="false"/>
-          <w:iCs w:val="false"/>
-          <w:color w:val="243038"/>
-          <w:sz w:val="22"/>
-          <w:szCs w:val="22"/>
-        </w:rPr>
-        <w:t xml:space="preserve">find_skill is the tool that matters. The others exist so the agent can load what the router named, instead of guessing a path.</w:t>
-      </w:r>
     </w:p>
     <w:p>
       <w:pPr>
@@ -3314,7 +5068,7 @@
         </w:rPr>
         <w:t xml:space="preserve">The reference implementation is </w:t>
       </w:r>
-      <w:hyperlink w:history="1" r:id="rId7otwwy6lsb8h165ycfmmp">
+      <w:hyperlink w:history="1" r:id="rIdaykdlfsbizll0tefvs-f6">
         <w:r>
           <w:rPr>
             <w:rStyle w:val="Hyperlink"/>
@@ -3572,122 +5326,7 @@
           <w:sz w:val="22"/>
           <w:szCs w:val="22"/>
         </w:rPr>
-        <w:t xml:space="preserve">Adding a skill is four steps.</w:t>
-      </w:r>
-    </w:p>
-    <w:p>
-      <w:pPr>
-        <w:pStyle w:val="ListParagraph"/>
-        <w:numPr>
-          <w:ilvl w:val="0"/>
-          <w:numId w:val="3"/>
-        </w:numPr>
-        <w:spacing w:after="60" w:before="40" w:line="276"/>
-      </w:pPr>
-      <w:r>
-        <w:rPr>
-          <w:rFonts w:ascii="Calibri" w:cs="Calibri" w:eastAsia="Calibri" w:hAnsi="Calibri"/>
-          <w:b w:val="false"/>
-          <w:bCs w:val="false"/>
-          <w:i w:val="false"/>
-          <w:iCs w:val="false"/>
-          <w:color w:val="243038"/>
-          <w:sz w:val="22"/>
-          <w:szCs w:val="22"/>
-        </w:rPr>
-        <w:t xml:space="preserve">Create skills/&lt;name&gt;/SKILL.md. Put the words a person would actually type into the description. That sentence is the routing signal.</w:t>
-      </w:r>
-    </w:p>
-    <w:p>
-      <w:pPr>
-        <w:pStyle w:val="ListParagraph"/>
-        <w:numPr>
-          <w:ilvl w:val="0"/>
-          <w:numId w:val="3"/>
-        </w:numPr>
-        <w:spacing w:after="60" w:before="40" w:line="276"/>
-      </w:pPr>
-      <w:r>
-        <w:rPr>
-          <w:rFonts w:ascii="Calibri" w:cs="Calibri" w:eastAsia="Calibri" w:hAnsi="Calibri"/>
-          <w:b w:val="false"/>
-          <w:bCs w:val="false"/>
-          <w:i w:val="false"/>
-          <w:iCs w:val="false"/>
-          <w:color w:val="243038"/>
-          <w:sz w:val="22"/>
-          <w:szCs w:val="22"/>
-        </w:rPr>
-        <w:t xml:space="preserve">If another skill should come along, add it under also in router/intents.json. That entry is attached after a winner is chosen.</w:t>
-      </w:r>
-    </w:p>
-    <w:p>
-      <w:pPr>
-        <w:pStyle w:val="ListParagraph"/>
-        <w:numPr>
-          <w:ilvl w:val="0"/>
-          <w:numId w:val="3"/>
-        </w:numPr>
-        <w:spacing w:after="60" w:before="40" w:line="276"/>
-      </w:pPr>
-      <w:r>
-        <w:rPr>
-          <w:rFonts w:ascii="Calibri" w:cs="Calibri" w:eastAsia="Calibri" w:hAnsi="Calibri"/>
-          <w:b w:val="false"/>
-          <w:bCs w:val="false"/>
-          <w:i w:val="false"/>
-          <w:iCs w:val="false"/>
-          <w:color w:val="243038"/>
-          <w:sz w:val="22"/>
-          <w:szCs w:val="22"/>
-        </w:rPr>
-        <w:t xml:space="preserve">Add a gold prompt that must hit, and a negative if the new words could false-fire.</w:t>
-      </w:r>
-    </w:p>
-    <w:p>
-      <w:pPr>
-        <w:pStyle w:val="ListParagraph"/>
-        <w:numPr>
-          <w:ilvl w:val="0"/>
-          <w:numId w:val="3"/>
-        </w:numPr>
-        <w:spacing w:after="60" w:before="40" w:line="276"/>
-      </w:pPr>
-      <w:r>
-        <w:rPr>
-          <w:rFonts w:ascii="Calibri" w:cs="Calibri" w:eastAsia="Calibri" w:hAnsi="Calibri"/>
-          <w:b w:val="false"/>
-          <w:bCs w:val="false"/>
-          <w:i w:val="false"/>
-          <w:iCs w:val="false"/>
-          <w:color w:val="243038"/>
-          <w:sz w:val="22"/>
-          <w:szCs w:val="22"/>
-        </w:rPr>
-        <w:t xml:space="preserve">Regenerate the index and run the eval. If Recall@1 drops or a negative fires, fix the description or sweep the floor before you add the next skill.</w:t>
-      </w:r>
-    </w:p>
-    <w:p>
-      <w:pPr>
-        <w:spacing w:after="120" w:before="0"/>
-      </w:pPr>
-    </w:p>
-    <w:p>
-      <w:pPr>
-        <w:spacing w:after="160" w:before="0" w:line="288"/>
-      </w:pPr>
-      <w:r>
-        <w:rPr>
-          <w:rFonts w:ascii="Calibri" w:cs="Calibri" w:eastAsia="Calibri" w:hAnsi="Calibri"/>
-          <w:b w:val="false"/>
-          <w:bCs w:val="false"/>
-          <w:i w:val="false"/>
-          <w:iCs w:val="false"/>
-          <w:color w:val="243038"/>
-          <w:sz w:val="22"/>
-          <w:szCs w:val="22"/>
-        </w:rPr>
-        <w:t xml:space="preserve">Set SKILL_ROUTER_ROOT if the checkout is not the working directory, and SKILL_ROUTER_SKILLS_DIR if the skills live somewhere else, such as a user-level skills folder. Set SKILL_ROUTER_FLOOR when you retune.</w:t>
+        <w:t xml:space="preserve">Those two commands are the entire extension loop: regenerate the index, then prove the new skill did not steal a neighbor. Set SKILL_ROUTER_ROOT if the checkout is not the working directory, and SKILL_ROUTER_SKILLS_DIR if the skills live somewhere else, such as a user-level skills folder. Set SKILL_ROUTER_FLOOR when you retune.</w:t>
       </w:r>
     </w:p>
     <w:p>
@@ -3803,7 +5442,7 @@
           <w:sz w:val="22"/>
           <w:szCs w:val="22"/>
         </w:rPr>
-        <w:t xml:space="preserve">The useful shape of this system is small. A generated index. A lexical ranker. A floor you retune when the catalog changes. A gold set that fails the build when routing gets worse. A rule that an empty result is a valid result. The agent loads one skill and does the task that skill describes. When the prompt is not one of yours, the router gets out of the way.</w:t>
+        <w:t xml:space="preserve">Skill libraries are everywhere now. The useful next step is small. A generated index. A ranker that sends the prompt to one skill. A floor you retune when the catalog changes. A gold set that fails the build when a new skill steals a neighbor. The agent loads that skill and does the task it describes. The other eighty-nine stay on disk. When the prompt is not one of yours, the router gets out of the way.</w:t>
       </w:r>
     </w:p>
     <w:p>
@@ -3846,7 +5485,7 @@
         </w:rPr>
         <w:t xml:space="preserve">Reference code: </w:t>
       </w:r>
-      <w:hyperlink w:history="1" r:id="rIdxdpdm2yoykbbqgycmcfp3">
+      <w:hyperlink w:history="1" r:id="rIde_exw2yow-8hngbtu6tin">
         <w:r>
           <w:rPr>
             <w:rStyle w:val="Hyperlink"/>
@@ -4214,6 +5853,12 @@
     </w:lvlOverride>
   </w:num>
   <w:num w:numId="3">
+    <w:abstractNumId w:val="3"/>
+    <w:lvlOverride w:ilvl="0">
+      <w:startOverride w:val="1"/>
+    </w:lvlOverride>
+  </w:num>
+  <w:num w:numId="4">
     <w:abstractNumId w:val="3"/>
     <w:lvlOverride w:ilvl="0">
       <w:startOverride w:val="1"/>

</xml_diff>

<commit_message>
Make the blog numbers match the checked-in gold set.
eval/prompts.jsonl now has the 70 task prompts and 10 abstentions the post cites, and eval/results.json is what compare.mjs measured on the 19 skills in this repo.
</commit_message>
<xml_diff>
--- a/docs/Load-the-Right-Skill-First.docx
+++ b/docs/Load-the-Right-Skill-First.docx
@@ -618,7 +618,7 @@
           <w:sz w:val="22"/>
           <w:szCs w:val="22"/>
         </w:rPr>
-        <w:t xml:space="preserve">That second question is the whole product. I built the router while maintaining a Salesforce delivery kit of about ninety skills. The same mechanism works for any catalog. It reads the prompt, scores it against skill names and descriptions, and returns the one skill to load. If nothing clears a floor, it returns an empty list. Empty is a successful answer. A router that always picks something will eventually enforce the wrong playbook with complete confidence.</w:t>
+        <w:t xml:space="preserve">That second question is the whole product. The catalog measured in this repo is 19 skills. The router reads the prompt, scores it against skill names and descriptions, and returns the one skill to load. If nothing clears a floor, it returns an empty list. Empty is a successful answer. A router that always picks something will eventually enforce the wrong playbook with complete confidence.</w:t>
       </w:r>
     </w:p>
     <w:p>
@@ -2225,7 +2225,7 @@
           <w:sz w:val="22"/>
           <w:szCs w:val="22"/>
         </w:rPr>
-        <w:t xml:space="preserve">This is the part teams underestimate. Adding skill number ninety-one should be a file, not a project. The ranker does not get a new branch. You do not retrain a model. You do not edit a priority list of phrases and hope you inserted the rule in the right place.</w:t>
+        <w:t xml:space="preserve">This is the part teams underestimate. Adding the next skill should be a file, not a project. The ranker does not get a new branch. You do not retrain a model. You do not edit a priority list of phrases and hope you inserted the rule in the right place.</w:t>
       </w:r>
     </w:p>
     <w:p>
@@ -3395,7 +3395,7 @@
           <w:sz w:val="22"/>
           <w:szCs w:val="22"/>
         </w:rPr>
-        <w:t xml:space="preserve">There is a floor. If the top score is below it, find_skill returns an empty list. On the ninety-skill catalog that floor landed near 10, because a rare term scores higher as the catalog grows. On the seven-skill sample in the reference repo, the same idea is a floor of 1.5. Those two numbers are not interchangeable. When you add skills, sweep the floor against your gold set. Do not inherit one.</w:t>
+        <w:t xml:space="preserve">There is a floor. If the top score is below it, find_skill returns an empty list. Common words such as “the” and “for” are stripped before scoring, so they cannot decide a match. The floor checked into this repo is 1.5, which is the value in eval/results.json. A larger catalog changes the scores. Sweep the floor against your gold set when you add skills. Do not copy a floor from a different catalog.</w:t>
       </w:r>
     </w:p>
     <w:p>
@@ -3453,7 +3453,7 @@
           <w:sz w:val="22"/>
           <w:szCs w:val="22"/>
         </w:rPr>
-        <w:t xml:space="preserve">The first version also had a hand-written intent list. If the prompt contained certain phrases, a named skill owned the task, and a few other skills were supposed to load beside it. It felt like the precise part of the system. Measured against a gold set, it was the part that mis-routed.</w:t>
+        <w:t xml:space="preserve">A hand-written intent list is still in the repo, in router/intents.json. If the prompt contains one of its phrases, that rule names a skill. The first matching phrase wins. The production router does not use those phrases to rank. eval/compare.mjs scores them so the list can be compared with BM25 on the same prompts.</w:t>
       </w:r>
     </w:p>
     <w:p>
@@ -3471,7 +3471,7 @@
           <w:sz w:val="22"/>
           <w:szCs w:val="22"/>
         </w:rPr>
-        <w:t xml:space="preserve">Phrases overlap. “Validate” belongs to more than one workflow. The first matching rule won, which is a priority list pretending to be a judgment. That approach reached 58.6 percent Recall@1, and it still answered confidently on 10 percent of prompts that should have been refused.</w:t>
+        <w:t xml:space="preserve">On this gold set the intent list reaches 78.6% Recall@1 (55/70) and 0/10 false fires. It is silent on prompts that do not contain its phrase, which is why every paraphrase misses. It also misses a direct prompt that describes the job without using the exact words in the rule.</w:t>
       </w:r>
     </w:p>
     <w:p>
@@ -3529,7 +3529,7 @@
           <w:sz w:val="22"/>
           <w:szCs w:val="22"/>
         </w:rPr>
-        <w:t xml:space="preserve">I froze a gold set of 70 prompts taken from real tasks, spread across the kinds of work the catalog covered, plus 10 prompts that should abstain because they had nothing to do with any skill. Every scorer saw the same lines. The metrics were Recall@1 (the right skill is first), Recall@3 (the right skill is in the top three), mean reciprocal rank, and how often a scorer answered a prompt it should have refused.</w:t>
+        <w:t xml:space="preserve">The gold set is eval/prompts.jsonl in this repo: 70 prompts that name a skill, plus 10 prompts that should abstain. 12 of the in-scope prompts are paraphrases. They describe the job without the skill’s vocabulary. node eval/compare.mjs scores every row on those same lines and writes eval/results.json. The table below is that file. Recall@1 means the right skill is first. Recall@3 means it is in the top three. False fires are out-of-scope prompts that still returned a skill.</w:t>
       </w:r>
     </w:p>
     <w:p>
@@ -3742,7 +3742,7 @@
                 <w:sz w:val="18"/>
                 <w:szCs w:val="18"/>
               </w:rPr>
-              <w:t xml:space="preserve">False fire</w:t>
+              <w:t xml:space="preserve">False fires</w:t>
             </w:r>
           </w:p>
         </w:tc>
@@ -3784,7 +3784,7 @@
                 <w:sz w:val="18"/>
                 <w:szCs w:val="18"/>
               </w:rPr>
-              <w:t xml:space="preserve">Keyword rules + intent list</w:t>
+              <w:t xml:space="preserve">Intent list (first matching phrase)</w:t>
             </w:r>
           </w:p>
         </w:tc>
@@ -3821,7 +3821,7 @@
                 <w:sz w:val="18"/>
                 <w:szCs w:val="18"/>
               </w:rPr>
-              <w:t xml:space="preserve">58.6%</w:t>
+              <w:t xml:space="preserve">78.6%</w:t>
             </w:r>
           </w:p>
         </w:tc>
@@ -3858,7 +3858,7 @@
                 <w:sz w:val="18"/>
                 <w:szCs w:val="18"/>
               </w:rPr>
-              <w:t xml:space="preserve">80.0%</w:t>
+              <w:t xml:space="preserve">78.6%</w:t>
             </w:r>
           </w:p>
         </w:tc>
@@ -3895,7 +3895,7 @@
                 <w:sz w:val="18"/>
                 <w:szCs w:val="18"/>
               </w:rPr>
-              <w:t xml:space="preserve">0.687</w:t>
+              <w:t xml:space="preserve">0.786</w:t>
             </w:r>
           </w:p>
         </w:tc>
@@ -3932,7 +3932,7 @@
                 <w:sz w:val="18"/>
                 <w:szCs w:val="18"/>
               </w:rPr>
-              <w:t xml:space="preserve">10%</w:t>
+              <w:t xml:space="preserve">0/10</w:t>
             </w:r>
           </w:p>
         </w:tc>
@@ -3974,7 +3974,7 @@
                 <w:sz w:val="18"/>
                 <w:szCs w:val="18"/>
               </w:rPr>
-              <w:t xml:space="preserve">BM25 on name, description, keywords</w:t>
+              <w:t xml:space="preserve">Token overlap, no IDF</w:t>
             </w:r>
           </w:p>
         </w:tc>
@@ -4011,7 +4011,7 @@
                 <w:sz w:val="18"/>
                 <w:szCs w:val="18"/>
               </w:rPr>
-              <w:t xml:space="preserve">75.7%</w:t>
+              <w:t xml:space="preserve">82.9%</w:t>
             </w:r>
           </w:p>
         </w:tc>
@@ -4048,7 +4048,7 @@
                 <w:sz w:val="18"/>
                 <w:szCs w:val="18"/>
               </w:rPr>
-              <w:t xml:space="preserve">88.6%</w:t>
+              <w:t xml:space="preserve">85.7%</w:t>
             </w:r>
           </w:p>
         </w:tc>
@@ -4085,7 +4085,7 @@
                 <w:sz w:val="18"/>
                 <w:szCs w:val="18"/>
               </w:rPr>
-              <w:t xml:space="preserve">0.822</w:t>
+              <w:t xml:space="preserve">0.843</w:t>
             </w:r>
           </w:p>
         </w:tc>
@@ -4122,7 +4122,7 @@
                 <w:sz w:val="18"/>
                 <w:szCs w:val="18"/>
               </w:rPr>
-              <w:t xml:space="preserve">0%</w:t>
+              <w:t xml:space="preserve">0/10</w:t>
             </w:r>
           </w:p>
         </w:tc>
@@ -4164,7 +4164,7 @@
                 <w:sz w:val="18"/>
                 <w:szCs w:val="18"/>
               </w:rPr>
-              <w:t xml:space="preserve">BM25 plus the full skill body</w:t>
+              <w:t xml:space="preserve">BM25 on name, description, keywords</w:t>
             </w:r>
           </w:p>
         </w:tc>
@@ -4201,7 +4201,7 @@
                 <w:sz w:val="18"/>
                 <w:szCs w:val="18"/>
               </w:rPr>
-              <w:t xml:space="preserve">70.0%</w:t>
+              <w:t xml:space="preserve">82.9%</w:t>
             </w:r>
           </w:p>
         </w:tc>
@@ -4238,7 +4238,7 @@
                 <w:sz w:val="18"/>
                 <w:szCs w:val="18"/>
               </w:rPr>
-              <w:t xml:space="preserve">85.7%</w:t>
+              <w:t xml:space="preserve">84.3%</w:t>
             </w:r>
           </w:p>
         </w:tc>
@@ -4275,7 +4275,7 @@
                 <w:sz w:val="18"/>
                 <w:szCs w:val="18"/>
               </w:rPr>
-              <w:t xml:space="preserve">0.782</w:t>
+              <w:t xml:space="preserve">0.833</w:t>
             </w:r>
           </w:p>
         </w:tc>
@@ -4312,7 +4312,7 @@
                 <w:sz w:val="18"/>
                 <w:szCs w:val="18"/>
               </w:rPr>
-              <w:t xml:space="preserve">10%</w:t>
+              <w:t xml:space="preserve">0/10</w:t>
             </w:r>
           </w:p>
         </w:tc>
@@ -4354,7 +4354,7 @@
                 <w:sz w:val="18"/>
                 <w:szCs w:val="18"/>
               </w:rPr>
-              <w:t xml:space="preserve">Local embeddings (bge-small)</w:t>
+              <w:t xml:space="preserve">BM25 plus the full skill body</w:t>
             </w:r>
           </w:p>
         </w:tc>
@@ -4391,7 +4391,7 @@
                 <w:sz w:val="18"/>
                 <w:szCs w:val="18"/>
               </w:rPr>
-              <w:t xml:space="preserve">64.3%</w:t>
+              <w:t xml:space="preserve">80.0%</w:t>
             </w:r>
           </w:p>
         </w:tc>
@@ -4428,7 +4428,7 @@
                 <w:sz w:val="18"/>
                 <w:szCs w:val="18"/>
               </w:rPr>
-              <w:t xml:space="preserve">75.7%</w:t>
+              <w:t xml:space="preserve">84.3%</w:t>
             </w:r>
           </w:p>
         </w:tc>
@@ -4465,7 +4465,7 @@
                 <w:sz w:val="18"/>
                 <w:szCs w:val="18"/>
               </w:rPr>
-              <w:t xml:space="preserve">0.700</w:t>
+              <w:t xml:space="preserve">0.817</w:t>
             </w:r>
           </w:p>
         </w:tc>
@@ -4502,197 +4502,7 @@
                 <w:sz w:val="18"/>
                 <w:szCs w:val="18"/>
               </w:rPr>
-              <w:t xml:space="preserve">0%</w:t>
-            </w:r>
-          </w:p>
-        </w:tc>
-      </w:tr>
-      <w:tr>
-        <w:trPr>
-          <w:cantSplit/>
-        </w:trPr>
-        <w:tc>
-          <w:tcPr>
-            <w:tcW w:type="dxa" w:w="4680"/>
-            <w:tcBorders>
-              <w:top w:val="single" w:color="D5DDE2" w:sz="4"/>
-              <w:left w:val="single" w:color="D5DDE2" w:sz="4"/>
-              <w:bottom w:val="single" w:color="D5DDE2" w:sz="4"/>
-              <w:right w:val="single" w:color="D5DDE2" w:sz="4"/>
-            </w:tcBorders>
-            <w:shd w:fill="FFFFFF" w:val="clear"/>
-            <w:tcMar>
-              <w:top w:type="dxa" w:w="60"/>
-              <w:left w:type="dxa" w:w="80"/>
-              <w:bottom w:type="dxa" w:w="60"/>
-              <w:right w:type="dxa" w:w="80"/>
-            </w:tcMar>
-            <w:vAlign w:val="center"/>
-          </w:tcPr>
-          <w:p>
-            <w:pPr>
-              <w:spacing w:after="0" w:before="0"/>
-            </w:pPr>
-            <w:r>
-              <w:rPr>
-                <w:rFonts w:ascii="Calibri" w:cs="Calibri" w:eastAsia="Calibri" w:hAnsi="Calibri"/>
-                <w:b/>
-                <w:bCs/>
-                <w:i w:val="false"/>
-                <w:iCs w:val="false"/>
-                <w:color w:val="243038"/>
-                <w:sz w:val="18"/>
-                <w:szCs w:val="18"/>
-              </w:rPr>
-              <w:t xml:space="preserve">BM25 fused with embeddings</w:t>
-            </w:r>
-          </w:p>
-        </w:tc>
-        <w:tc>
-          <w:tcPr>
-            <w:tcW w:type="dxa" w:w="1300"/>
-            <w:tcBorders>
-              <w:top w:val="single" w:color="D5DDE2" w:sz="4"/>
-              <w:left w:val="single" w:color="D5DDE2" w:sz="4"/>
-              <w:bottom w:val="single" w:color="D5DDE2" w:sz="4"/>
-              <w:right w:val="single" w:color="D5DDE2" w:sz="4"/>
-            </w:tcBorders>
-            <w:shd w:fill="FFFFFF" w:val="clear"/>
-            <w:tcMar>
-              <w:top w:type="dxa" w:w="60"/>
-              <w:left w:type="dxa" w:w="80"/>
-              <w:bottom w:type="dxa" w:w="60"/>
-              <w:right w:type="dxa" w:w="80"/>
-            </w:tcMar>
-            <w:vAlign w:val="center"/>
-          </w:tcPr>
-          <w:p>
-            <w:pPr>
-              <w:spacing w:after="0" w:before="0"/>
-            </w:pPr>
-            <w:r>
-              <w:rPr>
-                <w:rFonts w:ascii="Calibri" w:cs="Calibri" w:eastAsia="Calibri" w:hAnsi="Calibri"/>
-                <w:b w:val="false"/>
-                <w:bCs w:val="false"/>
-                <w:i w:val="false"/>
-                <w:iCs w:val="false"/>
-                <w:color w:val="243038"/>
-                <w:sz w:val="18"/>
-                <w:szCs w:val="18"/>
-              </w:rPr>
-              <w:t xml:space="preserve">75.7%</w:t>
-            </w:r>
-          </w:p>
-        </w:tc>
-        <w:tc>
-          <w:tcPr>
-            <w:tcW w:type="dxa" w:w="1400"/>
-            <w:tcBorders>
-              <w:top w:val="single" w:color="D5DDE2" w:sz="4"/>
-              <w:left w:val="single" w:color="D5DDE2" w:sz="4"/>
-              <w:bottom w:val="single" w:color="D5DDE2" w:sz="4"/>
-              <w:right w:val="single" w:color="D5DDE2" w:sz="4"/>
-            </w:tcBorders>
-            <w:shd w:fill="FFFFFF" w:val="clear"/>
-            <w:tcMar>
-              <w:top w:type="dxa" w:w="60"/>
-              <w:left w:type="dxa" w:w="80"/>
-              <w:bottom w:type="dxa" w:w="60"/>
-              <w:right w:type="dxa" w:w="80"/>
-            </w:tcMar>
-            <w:vAlign w:val="center"/>
-          </w:tcPr>
-          <w:p>
-            <w:pPr>
-              <w:spacing w:after="0" w:before="0"/>
-            </w:pPr>
-            <w:r>
-              <w:rPr>
-                <w:rFonts w:ascii="Calibri" w:cs="Calibri" w:eastAsia="Calibri" w:hAnsi="Calibri"/>
-                <w:b w:val="false"/>
-                <w:bCs w:val="false"/>
-                <w:i w:val="false"/>
-                <w:iCs w:val="false"/>
-                <w:color w:val="243038"/>
-                <w:sz w:val="18"/>
-                <w:szCs w:val="18"/>
-              </w:rPr>
-              <w:t xml:space="preserve">84.3%</w:t>
-            </w:r>
-          </w:p>
-        </w:tc>
-        <w:tc>
-          <w:tcPr>
-            <w:tcW w:type="dxa" w:w="1100"/>
-            <w:tcBorders>
-              <w:top w:val="single" w:color="D5DDE2" w:sz="4"/>
-              <w:left w:val="single" w:color="D5DDE2" w:sz="4"/>
-              <w:bottom w:val="single" w:color="D5DDE2" w:sz="4"/>
-              <w:right w:val="single" w:color="D5DDE2" w:sz="4"/>
-            </w:tcBorders>
-            <w:shd w:fill="FFFFFF" w:val="clear"/>
-            <w:tcMar>
-              <w:top w:type="dxa" w:w="60"/>
-              <w:left w:type="dxa" w:w="80"/>
-              <w:bottom w:type="dxa" w:w="60"/>
-              <w:right w:type="dxa" w:w="80"/>
-            </w:tcMar>
-            <w:vAlign w:val="center"/>
-          </w:tcPr>
-          <w:p>
-            <w:pPr>
-              <w:spacing w:after="0" w:before="0"/>
-            </w:pPr>
-            <w:r>
-              <w:rPr>
-                <w:rFonts w:ascii="Calibri" w:cs="Calibri" w:eastAsia="Calibri" w:hAnsi="Calibri"/>
-                <w:b w:val="false"/>
-                <w:bCs w:val="false"/>
-                <w:i w:val="false"/>
-                <w:iCs w:val="false"/>
-                <w:color w:val="243038"/>
-                <w:sz w:val="18"/>
-                <w:szCs w:val="18"/>
-              </w:rPr>
-              <w:t xml:space="preserve">0.812</w:t>
-            </w:r>
-          </w:p>
-        </w:tc>
-        <w:tc>
-          <w:tcPr>
-            <w:tcW w:type="dxa" w:w="1600"/>
-            <w:tcBorders>
-              <w:top w:val="single" w:color="D5DDE2" w:sz="4"/>
-              <w:left w:val="single" w:color="D5DDE2" w:sz="4"/>
-              <w:bottom w:val="single" w:color="D5DDE2" w:sz="4"/>
-              <w:right w:val="single" w:color="D5DDE2" w:sz="4"/>
-            </w:tcBorders>
-            <w:shd w:fill="FFFFFF" w:val="clear"/>
-            <w:tcMar>
-              <w:top w:type="dxa" w:w="60"/>
-              <w:left w:type="dxa" w:w="80"/>
-              <w:bottom w:type="dxa" w:w="60"/>
-              <w:right w:type="dxa" w:w="80"/>
-            </w:tcMar>
-            <w:vAlign w:val="center"/>
-          </w:tcPr>
-          <w:p>
-            <w:pPr>
-              <w:spacing w:after="0" w:before="0"/>
-            </w:pPr>
-            <w:r>
-              <w:rPr>
-                <w:rFonts w:ascii="Calibri" w:cs="Calibri" w:eastAsia="Calibri" w:hAnsi="Calibri"/>
-                <w:b w:val="false"/>
-                <w:bCs w:val="false"/>
-                <w:i w:val="false"/>
-                <w:iCs w:val="false"/>
-                <w:color w:val="243038"/>
-                <w:sz w:val="18"/>
-                <w:szCs w:val="18"/>
-              </w:rPr>
-              <w:t xml:space="preserve">20%</w:t>
+              <w:t xml:space="preserve">3/10</w:t>
             </w:r>
           </w:p>
         </w:tc>
@@ -4718,7 +4528,7 @@
           <w:sz w:val="22"/>
           <w:szCs w:val="22"/>
         </w:rPr>
-        <w:t xml:space="preserve">Four results decided the design.</w:t>
+        <w:t xml:space="preserve">Frontmatter BM25 is the scorer the server ships. On this run it is 82.9% Recall@1 (58/70), MRR 0.833, and 0/10 false fires. Token overlap, which counts shared words and ignores how rare they are, ties that Recall@1 on this catalog. The two separate once the skill body is included.</w:t>
       </w:r>
     </w:p>
     <w:p>
@@ -4736,7 +4546,7 @@
           <w:sz w:val="22"/>
           <w:szCs w:val="22"/>
         </w:rPr>
-        <w:t xml:space="preserve">BM25 on the frontmatter won, and it refused every out-of-scope prompt in that set. That is the row that shipped.</w:t>
+        <w:t xml:space="preserve">BM25 plus the full SKILL.md body falls to 80.0% Recall@1 and fires on 3/10 out-of-scope prompts. Skill bodies share ordinary instructional prose. That prose is enough to pull the wrong skill up and to answer a prompt that should have been refused. The description already holds the distinctive words. The body belongs in read_skill, which runs after the route.</w:t>
       </w:r>
     </w:p>
     <w:p>
@@ -4754,43 +4564,7 @@
           <w:sz w:val="22"/>
           <w:szCs w:val="22"/>
         </w:rPr>
-        <w:t xml:space="preserve">Adding the skill body made routing worse, down to 70 percent Recall@1, and it started firing on a negative. Skill bodies share a lot of ordinary instructional prose. There is enough of that shared language to pull the wrong skill into first place. The distinctive words already live in the description. The body belongs in read_skill, which runs after the route.</w:t>
-      </w:r>
-    </w:p>
-    <w:p>
-      <w:pPr>
-        <w:spacing w:after="160" w:before="0" w:line="288"/>
-      </w:pPr>
-      <w:r>
-        <w:rPr>
-          <w:rFonts w:ascii="Calibri" w:cs="Calibri" w:eastAsia="Calibri" w:hAnsi="Calibri"/>
-          <w:b w:val="false"/>
-          <w:bCs w:val="false"/>
-          <w:i w:val="false"/>
-          <w:iCs w:val="false"/>
-          <w:color w:val="243038"/>
-          <w:sz w:val="22"/>
-          <w:szCs w:val="22"/>
-        </w:rPr>
-        <w:t xml:space="preserve">A small local embedding model, bge-small, on the order of a hundred megabytes, landed at 64.3 percent Recall@1. Better than the old keyword rules, worse than BM25, and it costs a model the rest of the system does not need. General embeddings are trained to treat paraphrases as the same idea. In a skill catalog the difference between two skills is often one exact term: a command, a metadata type, a filename. BM25 treats that term as rare and therefore decisive. The embedding model smooths it into a neighborhood.</w:t>
-      </w:r>
-    </w:p>
-    <w:p>
-      <w:pPr>
-        <w:spacing w:after="160" w:before="0" w:line="288"/>
-      </w:pPr>
-      <w:r>
-        <w:rPr>
-          <w:rFonts w:ascii="Calibri" w:cs="Calibri" w:eastAsia="Calibri" w:hAnsi="Calibri"/>
-          <w:b w:val="false"/>
-          <w:bCs w:val="false"/>
-          <w:i w:val="false"/>
-          <w:iCs w:val="false"/>
-          <w:color w:val="243038"/>
-          <w:sz w:val="22"/>
-          <w:szCs w:val="22"/>
-        </w:rPr>
-        <w:t xml:space="preserve">Fusing BM25 with embeddings by reciprocal rank kept the same 75.7 percent Recall@1 and raised false activations to 20 percent. The fusion was more willing to answer. That is the wrong direction for a component whose job includes refusing.</w:t>
+        <w:t xml:space="preserve">This repo does not ship an embedding model, so this post does not quote an embedding score. The four rows above are the comparison eval/compare.mjs can rerun from the files in the repo.</w:t>
       </w:r>
     </w:p>
     <w:tbl>
@@ -4874,7 +4648,7 @@
           <w:sz w:val="32"/>
           <w:szCs w:val="32"/>
         </w:rPr>
-        <w:t xml:space="preserve">What 76 percent hides</w:t>
+        <w:t xml:space="preserve">What the 82.9% hides</w:t>
       </w:r>
     </w:p>
     <w:p>
@@ -4892,7 +4666,7 @@
           <w:sz w:val="22"/>
           <w:szCs w:val="22"/>
         </w:rPr>
-        <w:t xml:space="preserve">A later run on the live index sat in the same band, about 76 percent Recall@1. That number is not “the router understands the work.” The weak slice was paraphrase: prompts that described the job without using the skill’s vocabulary. On that slice, Recall@1 was about 31 percent, and the embedding model did not rescue it either.</w:t>
+        <w:t xml:space="preserve">The 82.9% is not “the router understands the work.” All 58 direct prompts hit. All 12 paraphrases miss, so paraphrase Recall@1 is 0.0%. Those misses are listed in eval/results.md. “Show me customers we added in the last seven days” does not say SOQL, so platform-soql-query does not win.</w:t>
       </w:r>
     </w:p>
     <w:p>
@@ -4910,7 +4684,7 @@
           <w:sz w:val="22"/>
           <w:szCs w:val="22"/>
         </w:rPr>
-        <w:t xml:space="preserve">The fix is in the description. If people say “the calculator script” and the skill only says “quote plugin,” the router will miss, and it should, until their words are in the frontmatter. A description edit that helps one phrasing often steals another skill’s prompts. You will not see the theft by rereading the description. You see it when a gold prompt that used to pass starts landing on the neighbor.</w:t>
+        <w:t xml:space="preserve">The fix is in the description. If people say “customers we added” and the skill only says “SOQL,” the router will miss, and it should, until their words are in the frontmatter. A description edit that helps one phrasing often steals another skill’s prompts. You will not see the theft by rereading the description. You see it when a gold prompt that used to pass starts landing on the neighbor.</w:t>
       </w:r>
     </w:p>
     <w:p>
@@ -4928,7 +4702,7 @@
           <w:sz w:val="22"/>
           <w:szCs w:val="22"/>
         </w:rPr>
-        <w:t xml:space="preserve">That is the whole reason the eval exists. Every skill you add, and every description you tune, comes with at least one prompt that must hit and, if the new vocabulary is broad, one prompt that must abstain. The reference repo gates the sample catalog at 90 percent Recall@1 and zero false activations. On that toy set it currently scores 100 percent across 14 in-scope prompts and refuses all 4 negatives. Do not quote the 100 percent next to the 75.7 percent. The sample skills were written so their vocabularies barely overlap. A real catalog overlaps. Trust the eval on your prompts.</w:t>
+        <w:t xml:space="preserve">That is why the eval is in the repo. Every skill you add comes with at least one prompt that must hit and, if the new vocabulary is broad, one prompt that must abstain. node eval/run-eval.mjs drives the MCP server against the same prompts. The gate in this repo is 80 percent Recall@1 and zero false fires. The last run is 82.9% and 0/10. If you change a description, rerun compare.mjs and rebuild this post from eval/results.json. The file wins if the two disagree.</w:t>
       </w:r>
     </w:p>
     <w:p>
@@ -5068,7 +4842,7 @@
         </w:rPr>
         <w:t xml:space="preserve">The reference implementation is </w:t>
       </w:r>
-      <w:hyperlink w:history="1" r:id="rIdaykdlfsbizll0tefvs-f6">
+      <w:hyperlink w:history="1" r:id="rId2jikxmvmfijlk3k0q9-xp">
         <w:r>
           <w:rPr>
             <w:rStyle w:val="Hyperlink"/>
@@ -5090,7 +4864,7 @@
           <w:sz w:val="22"/>
           <w:szCs w:val="22"/>
         </w:rPr>
-        <w:t xml:space="preserve">. Seven sample skills, a companion map, the MCP server, the hook, and the eval. Wire the server into any MCP client:</w:t>
+        <w:t xml:space="preserve">. 19 skills, a companion map, the MCP server, the hook, and the eval in eval/prompts.jsonl. Wire the server into any MCP client:</w:t>
       </w:r>
     </w:p>
     <w:p>
@@ -5290,7 +5064,7 @@
     <w:p>
       <w:pPr>
         <w:shd w:fill="F3F1EC" w:val="clear"/>
-        <w:spacing w:after="80" w:before="0" w:line="240"/>
+        <w:spacing w:after="0" w:before="0" w:line="240"/>
       </w:pPr>
       <w:r>
         <w:rPr>
@@ -5303,7 +5077,26 @@
           <w:sz w:val="18"/>
           <w:szCs w:val="18"/>
         </w:rPr>
-        <w:t xml:space="preserve">node eval/run-eval.mjs --gate 90</w:t>
+        <w:t xml:space="preserve">node eval/compare.mjs</w:t>
+      </w:r>
+    </w:p>
+    <w:p>
+      <w:pPr>
+        <w:shd w:fill="F3F1EC" w:val="clear"/>
+        <w:spacing w:after="80" w:before="0" w:line="240"/>
+      </w:pPr>
+      <w:r>
+        <w:rPr>
+          <w:rFonts w:ascii="Consolas" w:cs="Consolas" w:eastAsia="Consolas" w:hAnsi="Consolas"/>
+          <w:b w:val="false"/>
+          <w:bCs w:val="false"/>
+          <w:i w:val="false"/>
+          <w:iCs w:val="false"/>
+          <w:color w:val="1A2830"/>
+          <w:sz w:val="18"/>
+          <w:szCs w:val="18"/>
+        </w:rPr>
+        <w:t xml:space="preserve">node eval/run-eval.mjs --gate 80</w:t>
       </w:r>
     </w:p>
     <w:p>
@@ -5366,7 +5159,7 @@
           <w:sz w:val="22"/>
           <w:szCs w:val="22"/>
         </w:rPr>
-        <w:t xml:space="preserve">I would leave out a vector index aimed at the last bit of paraphrase recall. The bake-off says the gain is not there, and the cost is a model, a dependency, and worse abstain behavior once you fuse the two scores.</w:t>
+        <w:t xml:space="preserve">I would leave an embedding model out until it is a scorer in eval/compare.mjs and beats the BM25 row on this gold set, including the false fires. This repo does not have that row.</w:t>
       </w:r>
     </w:p>
     <w:p>
@@ -5384,7 +5177,7 @@
           <w:sz w:val="22"/>
           <w:szCs w:val="22"/>
         </w:rPr>
-        <w:t xml:space="preserve">I would leave the intent list out of the vote. It is a good companion map and a good human index. It is a bad ranker, and we already measured that.</w:t>
+        <w:t xml:space="preserve">I would leave the intent list out of the vote. On the same prompts it scores 78.6%, below frontmatter BM25, because a prompt that skips the phrase never matches. It stays as the companion map.</w:t>
       </w:r>
     </w:p>
     <w:p>
@@ -5442,7 +5235,7 @@
           <w:sz w:val="22"/>
           <w:szCs w:val="22"/>
         </w:rPr>
-        <w:t xml:space="preserve">Skill libraries are everywhere now. The useful next step is small. A generated index. A ranker that sends the prompt to one skill. A floor you retune when the catalog changes. A gold set that fails the build when a new skill steals a neighbor. The agent loads that skill and does the task it describes. The other eighty-nine stay on disk. When the prompt is not one of yours, the router gets out of the way.</w:t>
+        <w:t xml:space="preserve">Skill libraries are everywhere now. The useful next step is small. A generated index. A ranker that sends the prompt to one skill. A floor you retune when the catalog changes. A gold set, checked in, that fails the build when a new skill steals a neighbor. The agent loads that skill and does the task it describes. The rest of the library stays on disk. When the prompt is not one of yours, the router gets out of the way.</w:t>
       </w:r>
     </w:p>
     <w:p>
@@ -5485,7 +5278,7 @@
         </w:rPr>
         <w:t xml:space="preserve">Reference code: </w:t>
       </w:r>
-      <w:hyperlink w:history="1" r:id="rIde_exw2yow-8hngbtu6tin">
+      <w:hyperlink w:history="1" r:id="rIdmonlbrmvkqijishldupvq">
         <w:r>
           <w:rPr>
             <w:rStyle w:val="Hyperlink"/>

</xml_diff>

<commit_message>
Explain the matcher in plain language in the blog.
Salesforce readers get the routing idea, the measured results, and one mention of BM25, without the formula.
</commit_message>
<xml_diff>
--- a/docs/Load-the-Right-Skill-First.docx
+++ b/docs/Load-the-Right-Skill-First.docx
@@ -336,7 +336,7 @@
                 <w:sz w:val="18"/>
                 <w:szCs w:val="18"/>
               </w:rPr>
-              <w:t xml:space="preserve">AI agents, MCP, BM25, developer tools, Claude, Cursor</w:t>
+              <w:t xml:space="preserve">AI agents, Salesforce, skill routing, developer tools, Claude, Cursor</w:t>
             </w:r>
           </w:p>
         </w:tc>
@@ -618,7 +618,7 @@
           <w:sz w:val="22"/>
           <w:szCs w:val="22"/>
         </w:rPr>
-        <w:t xml:space="preserve">That second question is the whole product. The catalog measured in this repo is 19 skills. The router reads the prompt, scores it against skill names and descriptions, and returns the one skill to load. If nothing clears a floor, it returns an empty list. Empty is a successful answer. A router that always picks something will eventually enforce the wrong playbook with complete confidence.</w:t>
+        <w:t xml:space="preserve">That second question is the whole product. The catalog measured in this repo is 19 skills. The router reads the prompt, compares it with skill names and descriptions, and returns the one skill to load. If the match is weak, it returns an empty list. Empty is a successful answer. A router that always picks something will eventually follow the wrong playbook with complete confidence.</w:t>
       </w:r>
     </w:p>
     <w:p>
@@ -1772,7 +1772,7 @@
           <w:sz w:val="22"/>
           <w:szCs w:val="22"/>
         </w:rPr>
-        <w:t xml:space="preserve">“Write a SOQL query for accounts created this week.” Rare tokens: SOQL, query, accounts. Winner: platform-soql-query. The deploy skill and the Apex skill stay unloaded.</w:t>
+        <w:t xml:space="preserve">“Write a SOQL query for accounts created this week.” SOQL is the query skill’s word. The deploy skill and the Apex skill stay unloaded. Winner: platform-soql-query.</w:t>
       </w:r>
     </w:p>
     <w:p>
@@ -1795,7 +1795,7 @@
           <w:sz w:val="22"/>
           <w:szCs w:val="22"/>
         </w:rPr>
-        <w:t xml:space="preserve">“Run the failing test class and tell me the coverage.” Rare tokens: test, run, coverage. Winner: platform-apex-test-run, not the skill that writes a new test.</w:t>
+        <w:t xml:space="preserve">“Run the failing test class and tell me the coverage.” Coverage belongs to the skill that runs tests, not the one that writes a new test. Winner: platform-apex-test-run.</w:t>
       </w:r>
     </w:p>
     <w:p>
@@ -1841,7 +1841,7 @@
           <w:sz w:val="22"/>
           <w:szCs w:val="22"/>
         </w:rPr>
-        <w:t xml:space="preserve">“What is a good lasagna recipe.” No skill clears the floor. The router returns nothing, and the agent does not invent a Salesforce procedure for dinner.</w:t>
+        <w:t xml:space="preserve">“What is a good lasagna recipe.” Nothing in the library is about dinner. The router returns nothing, and the agent does not invent an Apex procedure.</w:t>
       </w:r>
     </w:p>
     <w:p>
@@ -1924,7 +1924,7 @@
           <w:sz w:val="18"/>
           <w:szCs w:val="18"/>
         </w:rPr>
-        <w:t xml:space="preserve">Figure 1. A confident match loads one skill. Anything under the floor loads nothing.</w:t>
+        <w:t xml:space="preserve">Figure 1. A strong match loads one skill. A weak match loads nothing.</w:t>
       </w:r>
     </w:p>
     <w:p>
@@ -2116,7 +2116,7 @@
           <w:sz w:val="22"/>
           <w:szCs w:val="22"/>
         </w:rPr>
-        <w:t xml:space="preserve">It prefers the distinctive word. BM25 scores a term that lives in one skill much higher than a term that lives in twenty. “Coverage” pulls the test-runner. “SOQL” pulls the query skill. “Formula field” pulls field generation.</w:t>
+        <w:t xml:space="preserve">It prefers the word that only one skill uses. “Coverage” belongs to the test run. “SOQL” belongs to the query. “Formula field” belongs to field creation. A word that appears on many skills, such as “test,” counts for less.</w:t>
       </w:r>
     </w:p>
     <w:p>
@@ -2139,7 +2139,7 @@
           <w:sz w:val="22"/>
           <w:szCs w:val="22"/>
         </w:rPr>
-        <w:t xml:space="preserve">It abstains. Below a floor, the result is an empty list. The agent is free to answer directly. It is not free to pretend a skill applied.</w:t>
+        <w:t xml:space="preserve">It stays quiet when the match is weak. The result is an empty list. The agent may answer directly. It should not pretend a skill applied.</w:t>
       </w:r>
     </w:p>
     <w:p>
@@ -2382,7 +2382,7 @@
           <w:sz w:val="22"/>
           <w:szCs w:val="22"/>
         </w:rPr>
-        <w:t xml:space="preserve">Regenerate the index and run the eval. If Recall@1 drops or a negative starts firing, the description is overlapping a neighbor, or the floor needs a sweep. Fix that before the next skill.</w:t>
+        <w:t xml:space="preserve">Regenerate the index and run the eval. If the right skill stops coming first, or an unrelated prompt starts getting a skill, the new description is overlapping a neighbor. Fix that before the next skill.</w:t>
       </w:r>
     </w:p>
     <w:p>
@@ -2885,7 +2885,7 @@
                 <w:sz w:val="18"/>
                 <w:szCs w:val="18"/>
               </w:rPr>
-              <w:t xml:space="preserve">The ranked skill, the tokens that matched, a one-line why, and companions. An empty list when the router abstains.</w:t>
+              <w:t xml:space="preserve">The skill to load, the words that matched, a one-line why, and any companion skills. An empty list when nothing fits.</w:t>
             </w:r>
           </w:p>
         </w:tc>
@@ -3231,7 +3231,7 @@
           <w:sz w:val="32"/>
           <w:szCs w:val="32"/>
         </w:rPr>
-        <w:t xml:space="preserve">How a prompt is scored</w:t>
+        <w:t xml:space="preserve">How a prompt is matched</w:t>
       </w:r>
     </w:p>
     <w:p>
@@ -3249,7 +3249,7 @@
           <w:sz w:val="22"/>
           <w:szCs w:val="22"/>
         </w:rPr>
-        <w:t xml:space="preserve">The scorer is BM25, the ranking function behind a lot of ordinary search. There is no embedding model, no vector database, and no runtime dependency. Node 18 and the standard library are the whole stack.</w:t>
+        <w:t xml:space="preserve">The router does not read every skill from top to bottom before it chooses. It reads two things: the skill’s name, and the one-line description at the top of SKILL.md. That sentence is the routing signal. The rest of the file is the procedure, and it is loaded only after a skill has already won.</w:t>
       </w:r>
     </w:p>
     <w:p>
@@ -3267,99 +3267,7 @@
           <w:sz w:val="22"/>
           <w:szCs w:val="22"/>
         </w:rPr>
-        <w:t xml:space="preserve">Each skill becomes a short document, with repetition used as a field weight:</w:t>
-      </w:r>
-    </w:p>
-    <w:p>
-      <w:pPr>
-        <w:pStyle w:val="ListParagraph"/>
-        <w:numPr>
-          <w:ilvl w:val="0"/>
-          <w:numId w:val="2"/>
-        </w:numPr>
-        <w:spacing w:after="60" w:before="40" w:line="276"/>
-      </w:pPr>
-      <w:r>
-        <w:rPr>
-          <w:rFonts w:ascii="Calibri" w:cs="Calibri" w:eastAsia="Calibri" w:hAnsi="Calibri"/>
-          <w:b w:val="false"/>
-          <w:bCs w:val="false"/>
-          <w:i w:val="false"/>
-          <w:iCs w:val="false"/>
-          <w:color w:val="243038"/>
-          <w:sz w:val="22"/>
-          <w:szCs w:val="22"/>
-        </w:rPr>
-        <w:t xml:space="preserve">The name, three times.</w:t>
-      </w:r>
-    </w:p>
-    <w:p>
-      <w:pPr>
-        <w:pStyle w:val="ListParagraph"/>
-        <w:numPr>
-          <w:ilvl w:val="0"/>
-          <w:numId w:val="2"/>
-        </w:numPr>
-        <w:spacing w:after="60" w:before="40" w:line="276"/>
-      </w:pPr>
-      <w:r>
-        <w:rPr>
-          <w:rFonts w:ascii="Calibri" w:cs="Calibri" w:eastAsia="Calibri" w:hAnsi="Calibri"/>
-          <w:b w:val="false"/>
-          <w:bCs w:val="false"/>
-          <w:i w:val="false"/>
-          <w:iCs w:val="false"/>
-          <w:color w:val="243038"/>
-          <w:sz w:val="22"/>
-          <w:szCs w:val="22"/>
-        </w:rPr>
-        <w:t xml:space="preserve">The one-line description, twice.</w:t>
-      </w:r>
-    </w:p>
-    <w:p>
-      <w:pPr>
-        <w:pStyle w:val="ListParagraph"/>
-        <w:numPr>
-          <w:ilvl w:val="0"/>
-          <w:numId w:val="2"/>
-        </w:numPr>
-        <w:spacing w:after="60" w:before="40" w:line="276"/>
-      </w:pPr>
-      <w:r>
-        <w:rPr>
-          <w:rFonts w:ascii="Calibri" w:cs="Calibri" w:eastAsia="Calibri" w:hAnsi="Calibri"/>
-          <w:b w:val="false"/>
-          <w:bCs w:val="false"/>
-          <w:i w:val="false"/>
-          <w:iCs w:val="false"/>
-          <w:color w:val="243038"/>
-          <w:sz w:val="22"/>
-          <w:szCs w:val="22"/>
-        </w:rPr>
-        <w:t xml:space="preserve">The keywords, twice.</w:t>
-      </w:r>
-    </w:p>
-    <w:p>
-      <w:pPr>
-        <w:pStyle w:val="ListParagraph"/>
-        <w:numPr>
-          <w:ilvl w:val="0"/>
-          <w:numId w:val="2"/>
-        </w:numPr>
-        <w:spacing w:after="60" w:before="40" w:line="276"/>
-      </w:pPr>
-      <w:r>
-        <w:rPr>
-          <w:rFonts w:ascii="Calibri" w:cs="Calibri" w:eastAsia="Calibri" w:hAnsi="Calibri"/>
-          <w:b w:val="false"/>
-          <w:bCs w:val="false"/>
-          <w:i w:val="false"/>
-          <w:iCs w:val="false"/>
-          <w:color w:val="243038"/>
-          <w:sz w:val="22"/>
-          <w:szCs w:val="22"/>
-        </w:rPr>
-        <w:t xml:space="preserve">The directory name, with hyphens read as spaces.</w:t>
+        <w:t xml:space="preserve">The match itself is ordinary. Which description shares the distinctive words in the prompt? “SOQL” appears on the query skill and almost nowhere else, so a SOQL question goes there. “Test” appears on the skill that writes tests and the skill that runs them, so it is a weaker clue, and “coverage” is what separates them. Words such as “the” and “for” are ignored. They show up everywhere and do not tell you which skill the person wants.</w:t>
       </w:r>
     </w:p>
     <w:p>
@@ -3377,7 +3285,7 @@
           <w:sz w:val="22"/>
           <w:szCs w:val="22"/>
         </w:rPr>
-        <w:t xml:space="preserve">BM25 then does the usual thing. A term that appears in one skill and almost nowhere else is worth more than a term that appears everywhere. “Select” is cheap if half the catalog is about queries. “Idempotency” is expensive if only one skill owns it. The constants are the common ones: k1 = 1.5 and b = 0.75. Inverse document frequency is log(1 + (N − df + 0.5) / (df + 0.5)), where N is the number of skills and df is how many of them contain the term.</w:t>
+        <w:t xml:space="preserve">If the best match is still weak, the router returns an empty list. A question about dinner does not get an Apex skill. That cutoff is a number in the code, currently recorded in eval/results.json. You only change it by rerunning the eval after the catalog grows. You do not need the math to write a skill. You need a description that uses the words a person would actually type.</w:t>
       </w:r>
     </w:p>
     <w:p>
@@ -3395,25 +3303,7 @@
           <w:sz w:val="22"/>
           <w:szCs w:val="22"/>
         </w:rPr>
-        <w:t xml:space="preserve">There is a floor. If the top score is below it, find_skill returns an empty list. Common words such as “the” and “for” are stripped before scoring, so they cannot decide a match. The floor checked into this repo is 1.5, which is the value in eval/results.json. A larger catalog changes the scores. Sweep the floor against your gold set when you add skills. Do not copy a floor from a different catalog.</w:t>
-      </w:r>
-    </w:p>
-    <w:p>
-      <w:pPr>
-        <w:spacing w:after="160" w:before="0" w:line="288"/>
-      </w:pPr>
-      <w:r>
-        <w:rPr>
-          <w:rFonts w:ascii="Calibri" w:cs="Calibri" w:eastAsia="Calibri" w:hAnsi="Calibri"/>
-          <w:b w:val="false"/>
-          <w:bCs w:val="false"/>
-          <w:i w:val="false"/>
-          <w:iCs w:val="false"/>
-          <w:color w:val="243038"/>
-          <w:sz w:val="22"/>
-          <w:szCs w:val="22"/>
-        </w:rPr>
-        <w:t xml:space="preserve">A second threshold, set at 70 percent of the floor, lets a close runner-up through so you can still measure Recall@3. Anything under that line is dropped.</w:t>
+        <w:t xml:space="preserve">The method has a name, BM25. It is the same idea a library catalog uses: a rare word is a better clue than a common one. The formula is in lib/score.mjs for anyone who wants it. The rest of this post does not depend on it.</w:t>
       </w:r>
     </w:p>
     <w:p>
@@ -3453,7 +3343,7 @@
           <w:sz w:val="22"/>
           <w:szCs w:val="22"/>
         </w:rPr>
-        <w:t xml:space="preserve">A hand-written intent list is still in the repo, in router/intents.json. If the prompt contains one of its phrases, that rule names a skill. The first matching phrase wins. The production router does not use those phrases to rank. eval/compare.mjs scores them so the list can be compared with BM25 on the same prompts.</w:t>
+        <w:t xml:space="preserve">A hand-written phrase list is still in the repo, in router/intents.json. If the prompt contains one of those phrases, the list names a skill. The first matching phrase wins. The router that actually ships does not use that list to pick the winner. We still score the list, on the same prompts, so we can see what we would lose by going back to it.</w:t>
       </w:r>
     </w:p>
     <w:p>
@@ -3471,7 +3361,7 @@
           <w:sz w:val="22"/>
           <w:szCs w:val="22"/>
         </w:rPr>
-        <w:t xml:space="preserve">On this gold set the intent list reaches 78.6% Recall@1 (55/70) and 0/10 false fires. It is silent on prompts that do not contain its phrase, which is why every paraphrase misses. It also misses a direct prompt that describes the job without using the exact words in the rule.</w:t>
+        <w:t xml:space="preserve">On this set the phrase list puts the right skill first 78.6% of the time (55 of 70) and does not answer any of the 10 unrelated prompts. It misses whenever the person does not use the exact phrase. That includes every paraphrase.</w:t>
       </w:r>
     </w:p>
     <w:p>
@@ -3489,7 +3379,7 @@
           <w:sz w:val="22"/>
           <w:szCs w:val="22"/>
         </w:rPr>
-        <w:t xml:space="preserve">The list kept one job. After BM25 picks a winner, a companion map can say: when the release skill wins, also load the docs skill. Those names come back as load-with. They do not change who won. If you do not need companions, leave the map empty. An earlier mistake was letting the same list both rank and annotate. Ranking is BM25. Annotation happens after.</w:t>
+        <w:t xml:space="preserve">The list kept one job. After the router picks a winner, a companion map can say: when the release skill wins, also load the docs skill. Those names come back as “load with.” They do not change who won. If you do not need companions, leave the map empty. Letting the same list both pick the winner and name companions was the earlier mistake.</w:t>
       </w:r>
     </w:p>
     <w:p>
@@ -3511,7 +3401,7 @@
           <w:sz w:val="32"/>
           <w:szCs w:val="32"/>
         </w:rPr>
-        <w:t xml:space="preserve">The bake-off</w:t>
+        <w:t xml:space="preserve">What we measured</w:t>
       </w:r>
     </w:p>
     <w:p>
@@ -3529,7 +3419,7 @@
           <w:sz w:val="22"/>
           <w:szCs w:val="22"/>
         </w:rPr>
-        <w:t xml:space="preserve">The gold set is eval/prompts.jsonl in this repo: 70 prompts that name a skill, plus 10 prompts that should abstain. 12 of the in-scope prompts are paraphrases. They describe the job without the skill’s vocabulary. node eval/compare.mjs scores every row on those same lines and writes eval/results.json. The table below is that file. Recall@1 means the right skill is first. Recall@3 means it is in the top three. False fires are out-of-scope prompts that still returned a skill.</w:t>
+        <w:t xml:space="preserve">The test set is eval/prompts.jsonl in this repo: 70 prompts that should land on a skill, plus 10 prompts that should get no skill at all. 12 of the real prompts say the job in different words than the skill description. node eval/compare.mjs runs every approach on those same lines and writes eval/results.json. The table below is that file, in plain terms. “Right skill first” means the skill we expected was the top result. “Unrelated prompts answered” means a dinner plan or a flight search still got a Salesforce skill. The full grid, including second and third place, stays in eval/results.md.</w:t>
       </w:r>
     </w:p>
     <w:p>
@@ -3550,11 +3440,9 @@
         </w:tblBorders>
       </w:tblPr>
       <w:tblGrid>
-        <w:gridCol w:w="4680"/>
-        <w:gridCol w:w="1300"/>
-        <w:gridCol w:w="1400"/>
-        <w:gridCol w:w="1100"/>
-        <w:gridCol w:w="1600"/>
+        <w:gridCol w:w="5200"/>
+        <w:gridCol w:w="2680"/>
+        <w:gridCol w:w="2200"/>
       </w:tblGrid>
       <w:tr>
         <w:trPr>
@@ -3563,7 +3451,7 @@
         </w:trPr>
         <w:tc>
           <w:tcPr>
-            <w:tcW w:type="dxa" w:w="4680"/>
+            <w:tcW w:type="dxa" w:w="5200"/>
             <w:tcBorders>
               <w:top w:val="single" w:color="D5DDE2" w:sz="4"/>
               <w:left w:val="single" w:color="D5DDE2" w:sz="4"/>
@@ -3594,13 +3482,13 @@
                 <w:sz w:val="18"/>
                 <w:szCs w:val="18"/>
               </w:rPr>
-              <w:t xml:space="preserve">Scorer</w:t>
-            </w:r>
-          </w:p>
-        </w:tc>
-        <w:tc>
-          <w:tcPr>
-            <w:tcW w:type="dxa" w:w="1300"/>
+              <w:t xml:space="preserve">How we picked</w:t>
+            </w:r>
+          </w:p>
+        </w:tc>
+        <w:tc>
+          <w:tcPr>
+            <w:tcW w:type="dxa" w:w="2680"/>
             <w:tcBorders>
               <w:top w:val="single" w:color="D5DDE2" w:sz="4"/>
               <w:left w:val="single" w:color="D5DDE2" w:sz="4"/>
@@ -3631,13 +3519,13 @@
                 <w:sz w:val="18"/>
                 <w:szCs w:val="18"/>
               </w:rPr>
-              <w:t xml:space="preserve">Recall@1</w:t>
-            </w:r>
-          </w:p>
-        </w:tc>
-        <w:tc>
-          <w:tcPr>
-            <w:tcW w:type="dxa" w:w="1400"/>
+              <w:t xml:space="preserve">Right skill first</w:t>
+            </w:r>
+          </w:p>
+        </w:tc>
+        <w:tc>
+          <w:tcPr>
+            <w:tcW w:type="dxa" w:w="2200"/>
             <w:tcBorders>
               <w:top w:val="single" w:color="D5DDE2" w:sz="4"/>
               <w:left w:val="single" w:color="D5DDE2" w:sz="4"/>
@@ -3668,81 +3556,7 @@
                 <w:sz w:val="18"/>
                 <w:szCs w:val="18"/>
               </w:rPr>
-              <w:t xml:space="preserve">Recall@3</w:t>
-            </w:r>
-          </w:p>
-        </w:tc>
-        <w:tc>
-          <w:tcPr>
-            <w:tcW w:type="dxa" w:w="1100"/>
-            <w:tcBorders>
-              <w:top w:val="single" w:color="D5DDE2" w:sz="4"/>
-              <w:left w:val="single" w:color="D5DDE2" w:sz="4"/>
-              <w:bottom w:val="single" w:color="D5DDE2" w:sz="4"/>
-              <w:right w:val="single" w:color="D5DDE2" w:sz="4"/>
-            </w:tcBorders>
-            <w:shd w:fill="1B3A4B" w:val="clear"/>
-            <w:tcMar>
-              <w:top w:type="dxa" w:w="60"/>
-              <w:left w:type="dxa" w:w="80"/>
-              <w:bottom w:type="dxa" w:w="60"/>
-              <w:right w:type="dxa" w:w="80"/>
-            </w:tcMar>
-            <w:vAlign w:val="center"/>
-          </w:tcPr>
-          <w:p>
-            <w:pPr>
-              <w:spacing w:after="0" w:before="0"/>
-            </w:pPr>
-            <w:r>
-              <w:rPr>
-                <w:rFonts w:ascii="Calibri" w:cs="Calibri" w:eastAsia="Calibri" w:hAnsi="Calibri"/>
-                <w:b/>
-                <w:bCs/>
-                <w:i w:val="false"/>
-                <w:iCs w:val="false"/>
-                <w:color w:val="FFFFFF"/>
-                <w:sz w:val="18"/>
-                <w:szCs w:val="18"/>
-              </w:rPr>
-              <w:t xml:space="preserve">MRR</w:t>
-            </w:r>
-          </w:p>
-        </w:tc>
-        <w:tc>
-          <w:tcPr>
-            <w:tcW w:type="dxa" w:w="1600"/>
-            <w:tcBorders>
-              <w:top w:val="single" w:color="D5DDE2" w:sz="4"/>
-              <w:left w:val="single" w:color="D5DDE2" w:sz="4"/>
-              <w:bottom w:val="single" w:color="D5DDE2" w:sz="4"/>
-              <w:right w:val="single" w:color="D5DDE2" w:sz="4"/>
-            </w:tcBorders>
-            <w:shd w:fill="1B3A4B" w:val="clear"/>
-            <w:tcMar>
-              <w:top w:type="dxa" w:w="60"/>
-              <w:left w:type="dxa" w:w="80"/>
-              <w:bottom w:type="dxa" w:w="60"/>
-              <w:right w:type="dxa" w:w="80"/>
-            </w:tcMar>
-            <w:vAlign w:val="center"/>
-          </w:tcPr>
-          <w:p>
-            <w:pPr>
-              <w:spacing w:after="0" w:before="0"/>
-            </w:pPr>
-            <w:r>
-              <w:rPr>
-                <w:rFonts w:ascii="Calibri" w:cs="Calibri" w:eastAsia="Calibri" w:hAnsi="Calibri"/>
-                <w:b/>
-                <w:bCs/>
-                <w:i w:val="false"/>
-                <w:iCs w:val="false"/>
-                <w:color w:val="FFFFFF"/>
-                <w:sz w:val="18"/>
-                <w:szCs w:val="18"/>
-              </w:rPr>
-              <w:t xml:space="preserve">False fires</w:t>
+              <w:t xml:space="preserve">Unrelated prompts answered</w:t>
             </w:r>
           </w:p>
         </w:tc>
@@ -3753,7 +3567,7 @@
         </w:trPr>
         <w:tc>
           <w:tcPr>
-            <w:tcW w:type="dxa" w:w="4680"/>
+            <w:tcW w:type="dxa" w:w="5200"/>
             <w:tcBorders>
               <w:top w:val="single" w:color="D5DDE2" w:sz="4"/>
               <w:left w:val="single" w:color="D5DDE2" w:sz="4"/>
@@ -3784,13 +3598,13 @@
                 <w:sz w:val="18"/>
                 <w:szCs w:val="18"/>
               </w:rPr>
-              <w:t xml:space="preserve">Intent list (first matching phrase)</w:t>
-            </w:r>
-          </w:p>
-        </w:tc>
-        <w:tc>
-          <w:tcPr>
-            <w:tcW w:type="dxa" w:w="1300"/>
+              <w:t xml:space="preserve">Phrase list. First match wins.</w:t>
+            </w:r>
+          </w:p>
+        </w:tc>
+        <w:tc>
+          <w:tcPr>
+            <w:tcW w:type="dxa" w:w="2680"/>
             <w:tcBorders>
               <w:top w:val="single" w:color="D5DDE2" w:sz="4"/>
               <w:left w:val="single" w:color="D5DDE2" w:sz="4"/>
@@ -3821,87 +3635,13 @@
                 <w:sz w:val="18"/>
                 <w:szCs w:val="18"/>
               </w:rPr>
-              <w:t xml:space="preserve">78.6%</w:t>
-            </w:r>
-          </w:p>
-        </w:tc>
-        <w:tc>
-          <w:tcPr>
-            <w:tcW w:type="dxa" w:w="1400"/>
-            <w:tcBorders>
-              <w:top w:val="single" w:color="D5DDE2" w:sz="4"/>
-              <w:left w:val="single" w:color="D5DDE2" w:sz="4"/>
-              <w:bottom w:val="single" w:color="D5DDE2" w:sz="4"/>
-              <w:right w:val="single" w:color="D5DDE2" w:sz="4"/>
-            </w:tcBorders>
-            <w:shd w:fill="FFFFFF" w:val="clear"/>
-            <w:tcMar>
-              <w:top w:type="dxa" w:w="60"/>
-              <w:left w:type="dxa" w:w="80"/>
-              <w:bottom w:type="dxa" w:w="60"/>
-              <w:right w:type="dxa" w:w="80"/>
-            </w:tcMar>
-            <w:vAlign w:val="center"/>
-          </w:tcPr>
-          <w:p>
-            <w:pPr>
-              <w:spacing w:after="0" w:before="0"/>
-            </w:pPr>
-            <w:r>
-              <w:rPr>
-                <w:rFonts w:ascii="Calibri" w:cs="Calibri" w:eastAsia="Calibri" w:hAnsi="Calibri"/>
-                <w:b w:val="false"/>
-                <w:bCs w:val="false"/>
-                <w:i w:val="false"/>
-                <w:iCs w:val="false"/>
-                <w:color w:val="243038"/>
-                <w:sz w:val="18"/>
-                <w:szCs w:val="18"/>
-              </w:rPr>
-              <w:t xml:space="preserve">78.6%</w:t>
-            </w:r>
-          </w:p>
-        </w:tc>
-        <w:tc>
-          <w:tcPr>
-            <w:tcW w:type="dxa" w:w="1100"/>
-            <w:tcBorders>
-              <w:top w:val="single" w:color="D5DDE2" w:sz="4"/>
-              <w:left w:val="single" w:color="D5DDE2" w:sz="4"/>
-              <w:bottom w:val="single" w:color="D5DDE2" w:sz="4"/>
-              <w:right w:val="single" w:color="D5DDE2" w:sz="4"/>
-            </w:tcBorders>
-            <w:shd w:fill="FFFFFF" w:val="clear"/>
-            <w:tcMar>
-              <w:top w:type="dxa" w:w="60"/>
-              <w:left w:type="dxa" w:w="80"/>
-              <w:bottom w:type="dxa" w:w="60"/>
-              <w:right w:type="dxa" w:w="80"/>
-            </w:tcMar>
-            <w:vAlign w:val="center"/>
-          </w:tcPr>
-          <w:p>
-            <w:pPr>
-              <w:spacing w:after="0" w:before="0"/>
-            </w:pPr>
-            <w:r>
-              <w:rPr>
-                <w:rFonts w:ascii="Calibri" w:cs="Calibri" w:eastAsia="Calibri" w:hAnsi="Calibri"/>
-                <w:b w:val="false"/>
-                <w:bCs w:val="false"/>
-                <w:i w:val="false"/>
-                <w:iCs w:val="false"/>
-                <w:color w:val="243038"/>
-                <w:sz w:val="18"/>
-                <w:szCs w:val="18"/>
-              </w:rPr>
-              <w:t xml:space="preserve">0.786</w:t>
-            </w:r>
-          </w:p>
-        </w:tc>
-        <w:tc>
-          <w:tcPr>
-            <w:tcW w:type="dxa" w:w="1600"/>
+              <w:t xml:space="preserve">78.6% (55 of 70)</w:t>
+            </w:r>
+          </w:p>
+        </w:tc>
+        <w:tc>
+          <w:tcPr>
+            <w:tcW w:type="dxa" w:w="2200"/>
             <w:tcBorders>
               <w:top w:val="single" w:color="D5DDE2" w:sz="4"/>
               <w:left w:val="single" w:color="D5DDE2" w:sz="4"/>
@@ -3943,7 +3683,7 @@
         </w:trPr>
         <w:tc>
           <w:tcPr>
-            <w:tcW w:type="dxa" w:w="4680"/>
+            <w:tcW w:type="dxa" w:w="5200"/>
             <w:tcBorders>
               <w:top w:val="single" w:color="D5DDE2" w:sz="4"/>
               <w:left w:val="single" w:color="D5DDE2" w:sz="4"/>
@@ -3974,13 +3714,13 @@
                 <w:sz w:val="18"/>
                 <w:szCs w:val="18"/>
               </w:rPr>
-              <w:t xml:space="preserve">Token overlap, no IDF</w:t>
-            </w:r>
-          </w:p>
-        </w:tc>
-        <w:tc>
-          <w:tcPr>
-            <w:tcW w:type="dxa" w:w="1300"/>
+              <w:t xml:space="preserve">Count the words in common.</w:t>
+            </w:r>
+          </w:p>
+        </w:tc>
+        <w:tc>
+          <w:tcPr>
+            <w:tcW w:type="dxa" w:w="2680"/>
             <w:tcBorders>
               <w:top w:val="single" w:color="D5DDE2" w:sz="4"/>
               <w:left w:val="single" w:color="D5DDE2" w:sz="4"/>
@@ -4011,87 +3751,13 @@
                 <w:sz w:val="18"/>
                 <w:szCs w:val="18"/>
               </w:rPr>
-              <w:t xml:space="preserve">82.9%</w:t>
-            </w:r>
-          </w:p>
-        </w:tc>
-        <w:tc>
-          <w:tcPr>
-            <w:tcW w:type="dxa" w:w="1400"/>
-            <w:tcBorders>
-              <w:top w:val="single" w:color="D5DDE2" w:sz="4"/>
-              <w:left w:val="single" w:color="D5DDE2" w:sz="4"/>
-              <w:bottom w:val="single" w:color="D5DDE2" w:sz="4"/>
-              <w:right w:val="single" w:color="D5DDE2" w:sz="4"/>
-            </w:tcBorders>
-            <w:shd w:fill="F4F7F8" w:val="clear"/>
-            <w:tcMar>
-              <w:top w:type="dxa" w:w="60"/>
-              <w:left w:type="dxa" w:w="80"/>
-              <w:bottom w:type="dxa" w:w="60"/>
-              <w:right w:type="dxa" w:w="80"/>
-            </w:tcMar>
-            <w:vAlign w:val="center"/>
-          </w:tcPr>
-          <w:p>
-            <w:pPr>
-              <w:spacing w:after="0" w:before="0"/>
-            </w:pPr>
-            <w:r>
-              <w:rPr>
-                <w:rFonts w:ascii="Calibri" w:cs="Calibri" w:eastAsia="Calibri" w:hAnsi="Calibri"/>
-                <w:b w:val="false"/>
-                <w:bCs w:val="false"/>
-                <w:i w:val="false"/>
-                <w:iCs w:val="false"/>
-                <w:color w:val="243038"/>
-                <w:sz w:val="18"/>
-                <w:szCs w:val="18"/>
-              </w:rPr>
-              <w:t xml:space="preserve">85.7%</w:t>
-            </w:r>
-          </w:p>
-        </w:tc>
-        <w:tc>
-          <w:tcPr>
-            <w:tcW w:type="dxa" w:w="1100"/>
-            <w:tcBorders>
-              <w:top w:val="single" w:color="D5DDE2" w:sz="4"/>
-              <w:left w:val="single" w:color="D5DDE2" w:sz="4"/>
-              <w:bottom w:val="single" w:color="D5DDE2" w:sz="4"/>
-              <w:right w:val="single" w:color="D5DDE2" w:sz="4"/>
-            </w:tcBorders>
-            <w:shd w:fill="F4F7F8" w:val="clear"/>
-            <w:tcMar>
-              <w:top w:type="dxa" w:w="60"/>
-              <w:left w:type="dxa" w:w="80"/>
-              <w:bottom w:type="dxa" w:w="60"/>
-              <w:right w:type="dxa" w:w="80"/>
-            </w:tcMar>
-            <w:vAlign w:val="center"/>
-          </w:tcPr>
-          <w:p>
-            <w:pPr>
-              <w:spacing w:after="0" w:before="0"/>
-            </w:pPr>
-            <w:r>
-              <w:rPr>
-                <w:rFonts w:ascii="Calibri" w:cs="Calibri" w:eastAsia="Calibri" w:hAnsi="Calibri"/>
-                <w:b w:val="false"/>
-                <w:bCs w:val="false"/>
-                <w:i w:val="false"/>
-                <w:iCs w:val="false"/>
-                <w:color w:val="243038"/>
-                <w:sz w:val="18"/>
-                <w:szCs w:val="18"/>
-              </w:rPr>
-              <w:t xml:space="preserve">0.843</w:t>
-            </w:r>
-          </w:p>
-        </w:tc>
-        <w:tc>
-          <w:tcPr>
-            <w:tcW w:type="dxa" w:w="1600"/>
+              <w:t xml:space="preserve">82.9% (58 of 70)</w:t>
+            </w:r>
+          </w:p>
+        </w:tc>
+        <w:tc>
+          <w:tcPr>
+            <w:tcW w:type="dxa" w:w="2200"/>
             <w:tcBorders>
               <w:top w:val="single" w:color="D5DDE2" w:sz="4"/>
               <w:left w:val="single" w:color="D5DDE2" w:sz="4"/>
@@ -4133,7 +3799,7 @@
         </w:trPr>
         <w:tc>
           <w:tcPr>
-            <w:tcW w:type="dxa" w:w="4680"/>
+            <w:tcW w:type="dxa" w:w="5200"/>
             <w:tcBorders>
               <w:top w:val="single" w:color="D5DDE2" w:sz="4"/>
               <w:left w:val="single" w:color="D5DDE2" w:sz="4"/>
@@ -4164,13 +3830,13 @@
                 <w:sz w:val="18"/>
                 <w:szCs w:val="18"/>
               </w:rPr>
-              <w:t xml:space="preserve">BM25 on name, description, keywords</w:t>
-            </w:r>
-          </w:p>
-        </w:tc>
-        <w:tc>
-          <w:tcPr>
-            <w:tcW w:type="dxa" w:w="1300"/>
+              <w:t xml:space="preserve">Name and one-line description. This is what ships.</w:t>
+            </w:r>
+          </w:p>
+        </w:tc>
+        <w:tc>
+          <w:tcPr>
+            <w:tcW w:type="dxa" w:w="2680"/>
             <w:tcBorders>
               <w:top w:val="single" w:color="D5DDE2" w:sz="4"/>
               <w:left w:val="single" w:color="D5DDE2" w:sz="4"/>
@@ -4201,87 +3867,13 @@
                 <w:sz w:val="18"/>
                 <w:szCs w:val="18"/>
               </w:rPr>
-              <w:t xml:space="preserve">82.9%</w:t>
-            </w:r>
-          </w:p>
-        </w:tc>
-        <w:tc>
-          <w:tcPr>
-            <w:tcW w:type="dxa" w:w="1400"/>
-            <w:tcBorders>
-              <w:top w:val="single" w:color="D5DDE2" w:sz="4"/>
-              <w:left w:val="single" w:color="D5DDE2" w:sz="4"/>
-              <w:bottom w:val="single" w:color="D5DDE2" w:sz="4"/>
-              <w:right w:val="single" w:color="D5DDE2" w:sz="4"/>
-            </w:tcBorders>
-            <w:shd w:fill="FFFFFF" w:val="clear"/>
-            <w:tcMar>
-              <w:top w:type="dxa" w:w="60"/>
-              <w:left w:type="dxa" w:w="80"/>
-              <w:bottom w:type="dxa" w:w="60"/>
-              <w:right w:type="dxa" w:w="80"/>
-            </w:tcMar>
-            <w:vAlign w:val="center"/>
-          </w:tcPr>
-          <w:p>
-            <w:pPr>
-              <w:spacing w:after="0" w:before="0"/>
-            </w:pPr>
-            <w:r>
-              <w:rPr>
-                <w:rFonts w:ascii="Calibri" w:cs="Calibri" w:eastAsia="Calibri" w:hAnsi="Calibri"/>
-                <w:b w:val="false"/>
-                <w:bCs w:val="false"/>
-                <w:i w:val="false"/>
-                <w:iCs w:val="false"/>
-                <w:color w:val="243038"/>
-                <w:sz w:val="18"/>
-                <w:szCs w:val="18"/>
-              </w:rPr>
-              <w:t xml:space="preserve">84.3%</w:t>
-            </w:r>
-          </w:p>
-        </w:tc>
-        <w:tc>
-          <w:tcPr>
-            <w:tcW w:type="dxa" w:w="1100"/>
-            <w:tcBorders>
-              <w:top w:val="single" w:color="D5DDE2" w:sz="4"/>
-              <w:left w:val="single" w:color="D5DDE2" w:sz="4"/>
-              <w:bottom w:val="single" w:color="D5DDE2" w:sz="4"/>
-              <w:right w:val="single" w:color="D5DDE2" w:sz="4"/>
-            </w:tcBorders>
-            <w:shd w:fill="FFFFFF" w:val="clear"/>
-            <w:tcMar>
-              <w:top w:type="dxa" w:w="60"/>
-              <w:left w:type="dxa" w:w="80"/>
-              <w:bottom w:type="dxa" w:w="60"/>
-              <w:right w:type="dxa" w:w="80"/>
-            </w:tcMar>
-            <w:vAlign w:val="center"/>
-          </w:tcPr>
-          <w:p>
-            <w:pPr>
-              <w:spacing w:after="0" w:before="0"/>
-            </w:pPr>
-            <w:r>
-              <w:rPr>
-                <w:rFonts w:ascii="Calibri" w:cs="Calibri" w:eastAsia="Calibri" w:hAnsi="Calibri"/>
-                <w:b w:val="false"/>
-                <w:bCs w:val="false"/>
-                <w:i w:val="false"/>
-                <w:iCs w:val="false"/>
-                <w:color w:val="243038"/>
-                <w:sz w:val="18"/>
-                <w:szCs w:val="18"/>
-              </w:rPr>
-              <w:t xml:space="preserve">0.833</w:t>
-            </w:r>
-          </w:p>
-        </w:tc>
-        <w:tc>
-          <w:tcPr>
-            <w:tcW w:type="dxa" w:w="1600"/>
+              <w:t xml:space="preserve">82.9% (58 of 70)</w:t>
+            </w:r>
+          </w:p>
+        </w:tc>
+        <w:tc>
+          <w:tcPr>
+            <w:tcW w:type="dxa" w:w="2200"/>
             <w:tcBorders>
               <w:top w:val="single" w:color="D5DDE2" w:sz="4"/>
               <w:left w:val="single" w:color="D5DDE2" w:sz="4"/>
@@ -4323,7 +3915,7 @@
         </w:trPr>
         <w:tc>
           <w:tcPr>
-            <w:tcW w:type="dxa" w:w="4680"/>
+            <w:tcW w:type="dxa" w:w="5200"/>
             <w:tcBorders>
               <w:top w:val="single" w:color="D5DDE2" w:sz="4"/>
               <w:left w:val="single" w:color="D5DDE2" w:sz="4"/>
@@ -4354,13 +3946,13 @@
                 <w:sz w:val="18"/>
                 <w:szCs w:val="18"/>
               </w:rPr>
-              <w:t xml:space="preserve">BM25 plus the full skill body</w:t>
-            </w:r>
-          </w:p>
-        </w:tc>
-        <w:tc>
-          <w:tcPr>
-            <w:tcW w:type="dxa" w:w="1300"/>
+              <w:t xml:space="preserve">Name, description, and the whole skill file.</w:t>
+            </w:r>
+          </w:p>
+        </w:tc>
+        <w:tc>
+          <w:tcPr>
+            <w:tcW w:type="dxa" w:w="2680"/>
             <w:tcBorders>
               <w:top w:val="single" w:color="D5DDE2" w:sz="4"/>
               <w:left w:val="single" w:color="D5DDE2" w:sz="4"/>
@@ -4391,13 +3983,13 @@
                 <w:sz w:val="18"/>
                 <w:szCs w:val="18"/>
               </w:rPr>
-              <w:t xml:space="preserve">80.0%</w:t>
-            </w:r>
-          </w:p>
-        </w:tc>
-        <w:tc>
-          <w:tcPr>
-            <w:tcW w:type="dxa" w:w="1400"/>
+              <w:t xml:space="preserve">80.0% (56 of 70)</w:t>
+            </w:r>
+          </w:p>
+        </w:tc>
+        <w:tc>
+          <w:tcPr>
+            <w:tcW w:type="dxa" w:w="2200"/>
             <w:tcBorders>
               <w:top w:val="single" w:color="D5DDE2" w:sz="4"/>
               <w:left w:val="single" w:color="D5DDE2" w:sz="4"/>
@@ -4428,80 +4020,6 @@
                 <w:sz w:val="18"/>
                 <w:szCs w:val="18"/>
               </w:rPr>
-              <w:t xml:space="preserve">84.3%</w:t>
-            </w:r>
-          </w:p>
-        </w:tc>
-        <w:tc>
-          <w:tcPr>
-            <w:tcW w:type="dxa" w:w="1100"/>
-            <w:tcBorders>
-              <w:top w:val="single" w:color="D5DDE2" w:sz="4"/>
-              <w:left w:val="single" w:color="D5DDE2" w:sz="4"/>
-              <w:bottom w:val="single" w:color="D5DDE2" w:sz="4"/>
-              <w:right w:val="single" w:color="D5DDE2" w:sz="4"/>
-            </w:tcBorders>
-            <w:shd w:fill="F4F7F8" w:val="clear"/>
-            <w:tcMar>
-              <w:top w:type="dxa" w:w="60"/>
-              <w:left w:type="dxa" w:w="80"/>
-              <w:bottom w:type="dxa" w:w="60"/>
-              <w:right w:type="dxa" w:w="80"/>
-            </w:tcMar>
-            <w:vAlign w:val="center"/>
-          </w:tcPr>
-          <w:p>
-            <w:pPr>
-              <w:spacing w:after="0" w:before="0"/>
-            </w:pPr>
-            <w:r>
-              <w:rPr>
-                <w:rFonts w:ascii="Calibri" w:cs="Calibri" w:eastAsia="Calibri" w:hAnsi="Calibri"/>
-                <w:b w:val="false"/>
-                <w:bCs w:val="false"/>
-                <w:i w:val="false"/>
-                <w:iCs w:val="false"/>
-                <w:color w:val="243038"/>
-                <w:sz w:val="18"/>
-                <w:szCs w:val="18"/>
-              </w:rPr>
-              <w:t xml:space="preserve">0.817</w:t>
-            </w:r>
-          </w:p>
-        </w:tc>
-        <w:tc>
-          <w:tcPr>
-            <w:tcW w:type="dxa" w:w="1600"/>
-            <w:tcBorders>
-              <w:top w:val="single" w:color="D5DDE2" w:sz="4"/>
-              <w:left w:val="single" w:color="D5DDE2" w:sz="4"/>
-              <w:bottom w:val="single" w:color="D5DDE2" w:sz="4"/>
-              <w:right w:val="single" w:color="D5DDE2" w:sz="4"/>
-            </w:tcBorders>
-            <w:shd w:fill="F4F7F8" w:val="clear"/>
-            <w:tcMar>
-              <w:top w:type="dxa" w:w="60"/>
-              <w:left w:type="dxa" w:w="80"/>
-              <w:bottom w:type="dxa" w:w="60"/>
-              <w:right w:type="dxa" w:w="80"/>
-            </w:tcMar>
-            <w:vAlign w:val="center"/>
-          </w:tcPr>
-          <w:p>
-            <w:pPr>
-              <w:spacing w:after="0" w:before="0"/>
-            </w:pPr>
-            <w:r>
-              <w:rPr>
-                <w:rFonts w:ascii="Calibri" w:cs="Calibri" w:eastAsia="Calibri" w:hAnsi="Calibri"/>
-                <w:b w:val="false"/>
-                <w:bCs w:val="false"/>
-                <w:i w:val="false"/>
-                <w:iCs w:val="false"/>
-                <w:color w:val="243038"/>
-                <w:sz w:val="18"/>
-                <w:szCs w:val="18"/>
-              </w:rPr>
               <w:t xml:space="preserve">3/10</w:t>
             </w:r>
           </w:p>
@@ -4528,7 +4046,7 @@
           <w:sz w:val="22"/>
           <w:szCs w:val="22"/>
         </w:rPr>
-        <w:t xml:space="preserve">Frontmatter BM25 is the scorer the server ships. On this run it is 82.9% Recall@1 (58/70), MRR 0.833, and 0/10 false fires. Token overlap, which counts shared words and ignores how rare they are, ties that Recall@1 on this catalog. The two separate once the skill body is included.</w:t>
+        <w:t xml:space="preserve">The shipped approach, matching the name and the one-line description, puts the right skill first 82.9% of the time (58 of 70) and answers 0/10 unrelated prompts. Simply counting words in common ties that on this small catalog. The two split when we also search the body of the skill file.</w:t>
       </w:r>
     </w:p>
     <w:p>
@@ -4546,7 +4064,7 @@
           <w:sz w:val="22"/>
           <w:szCs w:val="22"/>
         </w:rPr>
-        <w:t xml:space="preserve">BM25 plus the full SKILL.md body falls to 80.0% Recall@1 and fires on 3/10 out-of-scope prompts. Skill bodies share ordinary instructional prose. That prose is enough to pull the wrong skill up and to answer a prompt that should have been refused. The description already holds the distinctive words. The body belongs in read_skill, which runs after the route.</w:t>
+        <w:t xml:space="preserve">Searching the whole SKILL.md drops the right-skill rate to 80.0% and answers 3/10 unrelated prompts. Skill files share a lot of ordinary teaching language: “use this skill when the user…” That shared language is enough to pick the wrong skill, and enough to answer a prompt that should have been left alone. The one-line description already has the words that matter. The rest of the file is for after the choice.</w:t>
       </w:r>
     </w:p>
     <w:p>
@@ -4564,7 +4082,7 @@
           <w:sz w:val="22"/>
           <w:szCs w:val="22"/>
         </w:rPr>
-        <w:t xml:space="preserve">This repo does not ship an embedding model, so this post does not quote an embedding score. The four rows above are the comparison eval/compare.mjs can rerun from the files in the repo.</w:t>
+        <w:t xml:space="preserve">This repo does not include a search that treats two differently worded sentences as the same idea, so this post does not quote one. The four rows above are the comparison you can rerun from the files in the repo.</w:t>
       </w:r>
     </w:p>
     <w:tbl>
@@ -4648,7 +4166,7 @@
           <w:sz w:val="32"/>
           <w:szCs w:val="32"/>
         </w:rPr>
-        <w:t xml:space="preserve">What the 82.9% hides</w:t>
+        <w:t xml:space="preserve">The percentage is not the whole story</w:t>
       </w:r>
     </w:p>
     <w:p>
@@ -4666,7 +4184,7 @@
           <w:sz w:val="22"/>
           <w:szCs w:val="22"/>
         </w:rPr>
-        <w:t xml:space="preserve">The 82.9% is not “the router understands the work.” All 58 direct prompts hit. All 12 paraphrases miss, so paraphrase Recall@1 is 0.0%. Those misses are listed in eval/results.md. “Show me customers we added in the last seven days” does not say SOQL, so platform-soql-query does not win.</w:t>
+        <w:t xml:space="preserve">That 82.9% does not mean the router understands the work. All 58 prompts that used the skill’s own words were routed correctly. All 12 prompts that said the same job in different words were missed. Those misses are listed in eval/results.md. “Show me customers we added in the last seven days” never says SOQL, so the SOQL skill does not win.</w:t>
       </w:r>
     </w:p>
     <w:p>
@@ -4702,7 +4220,7 @@
           <w:sz w:val="22"/>
           <w:szCs w:val="22"/>
         </w:rPr>
-        <w:t xml:space="preserve">That is why the eval is in the repo. Every skill you add comes with at least one prompt that must hit and, if the new vocabulary is broad, one prompt that must abstain. node eval/run-eval.mjs drives the MCP server against the same prompts. The gate in this repo is 80 percent Recall@1 and zero false fires. The last run is 82.9% and 0/10. If you change a description, rerun compare.mjs and rebuild this post from eval/results.json. The file wins if the two disagree.</w:t>
+        <w:t xml:space="preserve">That is why the test prompts are in the repo. Every skill you add comes with at least one prompt that must hit and, if the new words are broad, one prompt that must come back empty. node eval/run-eval.mjs asks the running server the same questions. The bar in this repo is: the right skill comes first at least 80 percent of the time, and none of the unrelated prompts get a skill. The last run clears that bar. If you change a description, rerun the comparison and rebuild this post from eval/results.json. If the post and the file disagree, the file wins.</w:t>
       </w:r>
     </w:p>
     <w:p>
@@ -4742,7 +4260,7 @@
           <w:sz w:val="22"/>
           <w:szCs w:val="22"/>
         </w:rPr>
-        <w:t xml:space="preserve">An MCP tool is called on purpose. A hook is not. It sees every prompt, including dinner plans and laptop shopping, and it has to stay quiet on those. The hook uses the same scorer as the server, then adds one extra gate: at least one matched token has to be distinctive, meaning its inverse document frequency clears a second threshold. A prompt that only shares ordinary words with the catalog produces no output.</w:t>
+        <w:t xml:space="preserve">Calling a tool is a choice. A hook is not. The hook sees every prompt, including dinner plans and laptop shopping, and it has to stay quiet on those. It uses the same match as the server, and it only speaks when one of the matched words is distinctive. A prompt that only shares ordinary words produces no hint.</w:t>
       </w:r>
     </w:p>
     <w:p>
@@ -4800,7 +4318,7 @@
           <w:sz w:val="22"/>
           <w:szCs w:val="22"/>
         </w:rPr>
-        <w:t xml:space="preserve">Some skills are not procedures. They are a folder of curated notes: a status-code table, a pagination note, an idempotency note. Routing picks the skill. search_topics then read_topic picks the note. I did not put BM25 on that second hop. A single skill’s topic list is small, the filenames are already good queries, and a second ranking function would be a second floor to tune. The sample repo includes one such skill, a short HTTP API guide, so the shape is visible without anyone’s internal notes attached.</w:t>
+        <w:t xml:space="preserve">Some skills are not procedures. They are a folder of short notes: a status-code table, a pagination note, an idempotency note. The router picks the skill. A simpler keyword search then picks the note. The sample repo includes one such skill, a short HTTP API guide, so you can see the shape without anyone’s internal notes attached.</w:t>
       </w:r>
     </w:p>
     <w:p>
@@ -4842,7 +4360,7 @@
         </w:rPr>
         <w:t xml:space="preserve">The reference implementation is </w:t>
       </w:r>
-      <w:hyperlink w:history="1" r:id="rId2jikxmvmfijlk3k0q9-xp">
+      <w:hyperlink w:history="1" r:id="rIdr7t5jgzh528pad6qugyae">
         <w:r>
           <w:rPr>
             <w:rStyle w:val="Hyperlink"/>
@@ -5159,7 +4677,7 @@
           <w:sz w:val="22"/>
           <w:szCs w:val="22"/>
         </w:rPr>
-        <w:t xml:space="preserve">I would leave an embedding model out until it is a scorer in eval/compare.mjs and beats the BM25 row on this gold set, including the false fires. This repo does not have that row.</w:t>
+        <w:t xml:space="preserve">I would leave a vector search out until it is one of the rows in the comparison and it beats the shipped matcher on this same prompt file, including the unrelated prompts. This repo does not have that row.</w:t>
       </w:r>
     </w:p>
     <w:p>
@@ -5177,7 +4695,7 @@
           <w:sz w:val="22"/>
           <w:szCs w:val="22"/>
         </w:rPr>
-        <w:t xml:space="preserve">I would leave the intent list out of the vote. On the same prompts it scores 78.6%, below frontmatter BM25, because a prompt that skips the phrase never matches. It stays as the companion map.</w:t>
+        <w:t xml:space="preserve">I would leave the phrase list out of the choice. On the same prompts it is right 78.6% of the time, behind the shipped matcher, because a prompt that skips the phrase never matches. The list stays as the companion map.</w:t>
       </w:r>
     </w:p>
     <w:p>
@@ -5195,7 +4713,7 @@
           <w:sz w:val="22"/>
           <w:szCs w:val="22"/>
         </w:rPr>
-        <w:t xml:space="preserve">I would leave the skill body out of the index. More text at route time felt like more context. It was more ways to tie.</w:t>
+        <w:t xml:space="preserve">I would leave the body of the skill out of the match. Searching the whole file felt like giving the router more context. On this prompt set it created more ties and more answers to prompts that were not ours.</w:t>
       </w:r>
     </w:p>
     <w:p>
@@ -5235,7 +4753,7 @@
           <w:sz w:val="22"/>
           <w:szCs w:val="22"/>
         </w:rPr>
-        <w:t xml:space="preserve">Skill libraries are everywhere now. The useful next step is small. A generated index. A ranker that sends the prompt to one skill. A floor you retune when the catalog changes. A gold set, checked in, that fails the build when a new skill steals a neighbor. The agent loads that skill and does the task it describes. The rest of the library stays on disk. When the prompt is not one of yours, the router gets out of the way.</w:t>
+        <w:t xml:space="preserve">Skill libraries are everywhere now. The useful next step is small. An index you can regenerate. A match that sends the prompt to one skill. A test file, checked in, that fails when a new skill steals a neighbor. The agent loads that skill and does the task it describes. The rest of the library stays on disk. When the prompt is not one of yours, the router gets out of the way.</w:t>
       </w:r>
     </w:p>
     <w:p>
@@ -5278,7 +4796,7 @@
         </w:rPr>
         <w:t xml:space="preserve">Reference code: </w:t>
       </w:r>
-      <w:hyperlink w:history="1" r:id="rIdmonlbrmvkqijishldupvq">
+      <w:hyperlink w:history="1" r:id="rId_j3ixsx64prmvek1wax3l">
         <w:r>
           <w:rPr>
             <w:rStyle w:val="Hyperlink"/>

</xml_diff>

<commit_message>
Load every skill a prompt asks for, one or more.
A single winner dropped the second job. The router now returns each skill whose job the prompt names, and the gold set and blog match that.
</commit_message>
<xml_diff>
--- a/docs/Load-the-Right-Skill-First.docx
+++ b/docs/Load-the-Right-Skill-First.docx
@@ -538,7 +538,7 @@
           <w:sz w:val="22"/>
           <w:szCs w:val="22"/>
         </w:rPr>
-        <w:t xml:space="preserve">The miss is not the missing skill. The miss is the prompt. A person types “add a formula field and make sure the existing permission set can see it,” and the agent either loads nothing and improvises, or loads the nearest skill and follows the wrong procedure. Ninety good playbooks in a folder do not help if the turn loads zero of them, or loads the one that creates a new permission set when the task was to edit the set you already have.</w:t>
+        <w:t xml:space="preserve">The miss is not the missing skill. The miss is the prompt. A person types “add a formula field and make sure the existing permission set can see it,” and the agent either loads nothing and improvises, or loads one nearby skill and follows only half the job. Ninety good playbooks in a folder do not help if the turn loads zero of them, or loads the field skill and never the permission-set skill the prompt also asked for.</w:t>
       </w:r>
     </w:p>
     <w:tbl>
@@ -618,7 +618,7 @@
           <w:sz w:val="22"/>
           <w:szCs w:val="22"/>
         </w:rPr>
-        <w:t xml:space="preserve">That second question is the whole product. The catalog measured in this repo is 19 skills. The router reads the prompt, compares it with skill names and descriptions, and returns the one skill to load. If the match is weak, it returns an empty list. Empty is a successful answer. A router that always picks something will eventually follow the wrong playbook with complete confidence.</w:t>
+        <w:t xml:space="preserve">That second question is the whole product. The catalog measured in this repo is 19 skills. The router reads the prompt, compares it with skill names and descriptions, and returns the skills to load. A prompt about one job returns one skill. A prompt that asks for two jobs returns both. If the match is weak, it returns an empty list. Empty is a successful answer. A router that always picks something will eventually follow the wrong playbook with complete confidence.</w:t>
       </w:r>
     </w:p>
     <w:p>
@@ -757,7 +757,7 @@
                 <w:sz w:val="18"/>
                 <w:szCs w:val="18"/>
               </w:rPr>
-              <w:t xml:space="preserve">The prompt it should win</w:t>
+              <w:t xml:space="preserve">The job it owns</w:t>
             </w:r>
           </w:p>
         </w:tc>
@@ -1749,7 +1749,7 @@
           <w:sz w:val="22"/>
           <w:szCs w:val="22"/>
         </w:rPr>
-        <w:t xml:space="preserve">Watch one prompt move through the router.</w:t>
+        <w:t xml:space="preserve">Watch a few prompts move through the router. These lines are in eval/prompts.jsonl.</w:t>
       </w:r>
     </w:p>
     <w:p>
@@ -1772,7 +1772,7 @@
           <w:sz w:val="22"/>
           <w:szCs w:val="22"/>
         </w:rPr>
-        <w:t xml:space="preserve">“Write a SOQL query for accounts created this week.” SOQL is the query skill’s word. The deploy skill and the Apex skill stay unloaded. Winner: platform-soql-query.</w:t>
+        <w:t xml:space="preserve">“Write a SOQL query for accounts created this week.” That is one job. The query skill loads. The deploy skill and the Apex skill stay on disk.</w:t>
       </w:r>
     </w:p>
     <w:p>
@@ -1795,7 +1795,7 @@
           <w:sz w:val="22"/>
           <w:szCs w:val="22"/>
         </w:rPr>
-        <w:t xml:space="preserve">“Run the failing test class and tell me the coverage.” Coverage belongs to the skill that runs tests, not the one that writes a new test. Winner: platform-apex-test-run.</w:t>
+        <w:t xml:space="preserve">“Run the failing test class and tell me the coverage.” Coverage belongs to the skill that runs tests, not the one that writes a new test. One skill loads: platform-apex-test-run.</w:t>
       </w:r>
     </w:p>
     <w:p>
@@ -1818,7 +1818,7 @@
           <w:sz w:val="22"/>
           <w:szCs w:val="22"/>
         </w:rPr>
-        <w:t xml:space="preserve">“Add a formula field for renewal date.” Winner: platform-custom-field-generate. If the same turn also says “grant access on the existing permission set,” the router can name platform-permission-set-generate as a companion. The companion is loaded with the winner. It does not steal the win.</w:t>
+        <w:t xml:space="preserve">“Add a formula field for renewal date and grant field-level security on the sales permission set.” That is two jobs. The field skill and the permission-set skill both load. A prompt that only asks for the formula field loads only the field skill. The permission-set skill does not come along unless the prompt asked for access.</w:t>
       </w:r>
     </w:p>
     <w:p>
@@ -1859,7 +1859,7 @@
           <w:sz w:val="22"/>
           <w:szCs w:val="22"/>
         </w:rPr>
-        <w:t xml:space="preserve">That is the help. The library can hold dozens or hundreds of skills. The prompt pays for one of them. Context stays small, the guardrails in that skill actually run, and a prompt that is not yours does not get a random playbook stapled to it.</w:t>
+        <w:t xml:space="preserve">That is the help. The library can hold dozens or hundreds of skills. The prompt pays for the skills it asked for, and no others. Context stays small, the guardrails in those skills actually run, and a prompt that is not yours does not get a random playbook stapled to it.</w:t>
       </w:r>
     </w:p>
     <w:p>
@@ -1870,9 +1870,9 @@
       <w:r>
         <w:drawing>
           <wp:inline distT="0" distB="0" distL="0" distR="0">
-            <wp:extent cx="5905500" cy="2876550"/>
+            <wp:extent cx="5905500" cy="3171825"/>
             <wp:effectExtent t="0" r="0" b="0" l="0"/>
-            <wp:docPr id="1" name="01-route" descr="A prompt goes to the skill router, which either loads one skill or abstains." title="A prompt goes to the skill router, which either loads one skill or abstains."/>
+            <wp:docPr id="1" name="01-route" descr="A prompt that names two jobs loads both skills. A weak match loads nothing." title="A prompt that names two jobs loads both skills. A weak match loads nothing."/>
             <wp:cNvGraphicFramePr>
               <a:graphicFrameLocks xmlns:a="http://schemas.openxmlformats.org/drawingml/2006/main" noChangeAspect="1"/>
             </wp:cNvGraphicFramePr>
@@ -1895,7 +1895,7 @@
                   <pic:spPr bwMode="auto">
                     <a:xfrm>
                       <a:off x="0" y="0"/>
-                      <a:ext cx="5905500" cy="2876550"/>
+                      <a:ext cx="5905500" cy="3171825"/>
                     </a:xfrm>
                     <a:prstGeom prst="rect">
                       <a:avLst/>
@@ -1924,7 +1924,7 @@
           <w:sz w:val="18"/>
           <w:szCs w:val="18"/>
         </w:rPr>
-        <w:t xml:space="preserve">Figure 1. A strong match loads one skill. A weak match loads nothing.</w:t>
+        <w:t xml:space="preserve">Figure 1. A prompt that names two jobs loads both skills. A weak match loads nothing.</w:t>
       </w:r>
     </w:p>
     <w:p>
@@ -1995,7 +1995,7 @@
           <wp:inline distT="0" distB="0" distL="0" distR="0">
             <wp:extent cx="5905500" cy="3171825"/>
             <wp:effectExtent t="0" r="0" b="0" l="0"/>
-            <wp:docPr id="2" name="02-library" descr="Eight skills stay on disk. One skill is loaded into the turn." title="Eight skills stay on disk. One skill is loaded into the turn."/>
+            <wp:docPr id="2" name="02-library" descr="Most skills stay on disk. The turn loads the skills the prompt asked for." title="Most skills stay on disk. The turn loads the skills the prompt asked for."/>
             <wp:cNvGraphicFramePr>
               <a:graphicFrameLocks xmlns:a="http://schemas.openxmlformats.org/drawingml/2006/main" noChangeAspect="1"/>
             </wp:cNvGraphicFramePr>
@@ -2047,7 +2047,7 @@
           <w:sz w:val="18"/>
           <w:szCs w:val="18"/>
         </w:rPr>
-        <w:t xml:space="preserve">Figure 2. The catalog can be large. The turn receives the winner only.</w:t>
+        <w:t xml:space="preserve">Figure 2. The catalog can be large. The turn receives only the skills this prompt needs.</w:t>
       </w:r>
     </w:p>
     <w:p>
@@ -2070,7 +2070,7 @@
           <w:sz w:val="22"/>
           <w:szCs w:val="22"/>
         </w:rPr>
-        <w:t xml:space="preserve">It names the owning skill before any code, metadata, or query is written. The agent then reads that SKILL.md and follows it.</w:t>
+        <w:t xml:space="preserve">It names the skills to load before any code, metadata, or query is written. The agent reads each of those SKILL.md files and follows them.</w:t>
       </w:r>
     </w:p>
     <w:p>
@@ -2093,7 +2093,7 @@
           <w:sz w:val="22"/>
           <w:szCs w:val="22"/>
         </w:rPr>
-        <w:t xml:space="preserve">It keeps the rest of the library on disk. find_skill returns a ranked hit, not the catalog. list_skills and read_skill exist so the agent can open exactly what was named.</w:t>
+        <w:t xml:space="preserve">It keeps the rest of the library on disk. find_skill returns the skills for this prompt, not the catalog. list_skills and read_skill exist so the agent can open exactly what was named.</w:t>
       </w:r>
     </w:p>
     <w:p>
@@ -2162,7 +2162,7 @@
           <w:sz w:val="22"/>
           <w:szCs w:val="22"/>
         </w:rPr>
-        <w:t xml:space="preserve">It names companions after the winner is chosen. A field change that also needs access can load the permission-set skill in the same turn. The companion list never reorders the ranking.</w:t>
+        <w:t xml:space="preserve">It returns one skill or several, depending on the prompt. A field change that also asks for access loads both skills. A field change that does not mention access loads only the field skill.</w:t>
       </w:r>
     </w:p>
     <w:p>
@@ -2185,7 +2185,7 @@
           <w:sz w:val="22"/>
           <w:szCs w:val="22"/>
         </w:rPr>
-        <w:t xml:space="preserve">The same index is available three ways, because hosts differ. ROUTER.md is the human table. An MCP server exposes find_skill, list_skills, read_skill, search_topics, and read_topic over stdin, with no packages to install. An optional hook prints “load this skill first” only when it is sure, and prints nothing otherwise.</w:t>
+        <w:t xml:space="preserve">The same index is available three ways, because hosts differ. ROUTER.md is the human table. An MCP server exposes find_skill, list_skills, read_skill, search_topics, and read_topic over stdin, with no packages to install. An optional hook prints the skills to load only when it is sure, and prints nothing otherwise.</w:t>
       </w:r>
     </w:p>
     <w:p>
@@ -2313,7 +2313,7 @@
           <w:sz w:val="22"/>
           <w:szCs w:val="22"/>
         </w:rPr>
-        <w:t xml:space="preserve">Create skills/&lt;name&gt;/SKILL.md. Put the words a person would actually type into the description. That sentence is the routing signal. The body is the procedure, and it is loaded only after the skill wins.</w:t>
+        <w:t xml:space="preserve">Create skills/&lt;name&gt;/SKILL.md. Put the words a person would actually type into the description, including the short phrase that names the job. That phrase is how a prompt claims this skill. The body is the procedure, and it is loaded only after the skill is chosen.</w:t>
       </w:r>
     </w:p>
     <w:p>
@@ -2336,7 +2336,7 @@
           <w:sz w:val="22"/>
           <w:szCs w:val="22"/>
         </w:rPr>
-        <w:t xml:space="preserve">If another skill should come along for the ride, add one line to the companion map. That line is attached after a winner is chosen. It does not vote.</w:t>
+        <w:t xml:space="preserve">If a real prompt needs two skills, do not hard-wire them together. Write the prompt so it uses both job phrases, and add that prompt to the gold set. The router loads both because the prompt asked for both.</w:t>
       </w:r>
     </w:p>
     <w:p>
@@ -2359,7 +2359,7 @@
           <w:sz w:val="22"/>
           <w:szCs w:val="22"/>
         </w:rPr>
-        <w:t xml:space="preserve">Add a gold prompt that must hit this skill, and a negative if the new words could false-fire on an unrelated prompt.</w:t>
+        <w:t xml:space="preserve">Add a gold prompt that must return this skill, and a negative if the new words could fire on an unrelated prompt. If the skill is often used beside another, add one prompt that must return both, and one prompt that must return only this skill.</w:t>
       </w:r>
     </w:p>
     <w:p>
@@ -2382,7 +2382,7 @@
           <w:sz w:val="22"/>
           <w:szCs w:val="22"/>
         </w:rPr>
-        <w:t xml:space="preserve">Regenerate the index and run the eval. If the right skill stops coming first, or an unrelated prompt starts getting a skill, the new description is overlapping a neighbor. Fix that before the next skill.</w:t>
+        <w:t xml:space="preserve">Regenerate the index and run the eval. If the right skills stop coming back, or an unrelated prompt starts getting a skill, the new description is overlapping a neighbor. Fix that before the next skill.</w:t>
       </w:r>
     </w:p>
     <w:p>
@@ -2545,7 +2545,7 @@
           <w:sz w:val="22"/>
           <w:szCs w:val="22"/>
         </w:rPr>
-        <w:t xml:space="preserve">Putting every skill into the prompt does not fix this. The descriptions crowd each other, and the bodies blow the context window before the agent has done any work. What you want is a cheap step in front: return the one skill to load, or return nothing.</w:t>
+        <w:t xml:space="preserve">Putting every skill into the prompt does not fix this. The descriptions crowd each other, and the bodies blow the context window before the agent has done any work. What you want is a cheap step in front: return the skills this prompt needs, or return nothing.</w:t>
       </w:r>
     </w:p>
     <w:p>
@@ -2631,7 +2631,7 @@
           <w:sz w:val="22"/>
           <w:szCs w:val="22"/>
         </w:rPr>
-        <w:t xml:space="preserve">ROUTER.md is the same catalog for a person, plus a companion table.</w:t>
+        <w:t xml:space="preserve">ROUTER.md is the same catalog for a person.</w:t>
       </w:r>
     </w:p>
     <w:p>
@@ -2707,7 +2707,7 @@
           <w:sz w:val="22"/>
           <w:szCs w:val="22"/>
         </w:rPr>
-        <w:t xml:space="preserve">find_skill is the call that matters. The other four exist so the agent can open exactly the skill or note that won, instead of guessing a path.</w:t>
+        <w:t xml:space="preserve">find_skill is the call that matters. The list it returns is the set to load. Read every skill in it. The other four tools exist so the agent can open those files, instead of guessing a path.</w:t>
       </w:r>
     </w:p>
     <w:p>
@@ -2885,7 +2885,7 @@
                 <w:sz w:val="18"/>
                 <w:szCs w:val="18"/>
               </w:rPr>
-              <w:t xml:space="preserve">The skill to load, the words that matched, a one-line why, and any companion skills. An empty list when nothing fits.</w:t>
+              <w:t xml:space="preserve">Every skill this prompt needs. One skill, or several. An empty list when nothing fits. Read all of them.</w:t>
             </w:r>
           </w:p>
         </w:tc>
@@ -3249,7 +3249,7 @@
           <w:sz w:val="22"/>
           <w:szCs w:val="22"/>
         </w:rPr>
-        <w:t xml:space="preserve">The router does not read every skill from top to bottom before it chooses. It reads two things: the skill’s name, and the one-line description at the top of SKILL.md. That sentence is the routing signal. The rest of the file is the procedure, and it is loaded only after a skill has already won.</w:t>
+        <w:t xml:space="preserve">The router does not read every skill from top to bottom before it chooses. It reads two things: the skill’s name, and the one-line description at the top of SKILL.md. That sentence is the routing signal. The rest of the file is the procedure, and it is loaded only after the skill has been chosen.</w:t>
       </w:r>
     </w:p>
     <w:p>
@@ -3285,7 +3285,7 @@
           <w:sz w:val="22"/>
           <w:szCs w:val="22"/>
         </w:rPr>
-        <w:t xml:space="preserve">If the best match is still weak, the router returns an empty list. A question about dinner does not get an Apex skill. That cutoff is a number in the code, currently recorded in eval/results.json. You only change it by rerunning the eval after the catalog grows. You do not need the math to write a skill. You need a description that uses the words a person would actually type.</w:t>
+        <w:t xml:space="preserve">A skill joins the set when the prompt uses that skill’s own job phrase, the short words in its description such as “formula field” or “field-level security.” One phrase, one skill. Two phrases from two skills, both skills. If the prompt does not use any of those phrases but one skill is still clearly the best match, that one skill loads. If the best match is weak, the router returns an empty list. A question about dinner does not get an Apex skill. That cutoff is a number in the code, currently recorded in eval/results.json. You only change it by rerunning the eval after the catalog grows. You do not need the math to write a skill. You need a description that uses the words a person would actually type.</w:t>
       </w:r>
     </w:p>
     <w:p>
@@ -3325,7 +3325,7 @@
           <w:sz w:val="32"/>
           <w:szCs w:val="32"/>
         </w:rPr>
-        <w:t xml:space="preserve">Companions do not vote</w:t>
+        <w:t xml:space="preserve">One prompt can need more than one skill</w:t>
       </w:r>
     </w:p>
     <w:p>
@@ -3343,7 +3343,7 @@
           <w:sz w:val="22"/>
           <w:szCs w:val="22"/>
         </w:rPr>
-        <w:t xml:space="preserve">A hand-written phrase list is still in the repo, in router/intents.json. If the prompt contains one of those phrases, the list names a skill. The first matching phrase wins. The router that actually ships does not use that list to pick the winner. We still score the list, on the same prompts, so we can see what we would lose by going back to it.</w:t>
+        <w:t xml:space="preserve">A router that always returns one skill is the wrong shape. Create a field, and the permission-set skill should not come along unless the person asked for access. The prompt decides the set.</w:t>
       </w:r>
     </w:p>
     <w:p>
@@ -3361,7 +3361,7 @@
           <w:sz w:val="22"/>
           <w:szCs w:val="22"/>
         </w:rPr>
-        <w:t xml:space="preserve">On this set the phrase list puts the right skill first 78.6% of the time (55 of 70) and does not answer any of the 10 unrelated prompts. It misses whenever the person does not use the exact phrase. That includes every paraphrase.</w:t>
+        <w:t xml:space="preserve">A hand-written phrase list is still in the repo, in router/intents.json, so we can measure the older idea. The first matching phrase wins, and the second job is dropped. On this set that list puts a right skill first 80.0% of the time (60 of 75) and does not answer any of the 10 unrelated prompts. It misses whenever the person does not use the exact phrase. It also misses the second skill on every prompt that needs two. The router that ships does not use that list.</w:t>
       </w:r>
     </w:p>
     <w:p>
@@ -3379,7 +3379,7 @@
           <w:sz w:val="22"/>
           <w:szCs w:val="22"/>
         </w:rPr>
-        <w:t xml:space="preserve">The list kept one job. After the router picks a winner, a companion map can say: when the release skill wins, also load the docs skill. Those names come back as “load with.” They do not change who won. If you do not need companions, leave the map empty. Letting the same list both pick the winner and name companions was the earlier mistake.</w:t>
+        <w:t xml:space="preserve">5 prompts in the gold set ask for two skills: a formula field plus field access, an Apex class plus its test class, a retrieve plus a deploy, a review plus a unit test, and a release checklist plus docs. The shipped router returned both skills, and no extra skill, on 5 of those 5. A prompt that names only one of those jobs returns only that skill.</w:t>
       </w:r>
     </w:p>
     <w:p>
@@ -3419,7 +3419,7 @@
           <w:sz w:val="22"/>
           <w:szCs w:val="22"/>
         </w:rPr>
-        <w:t xml:space="preserve">The test set is eval/prompts.jsonl in this repo: 70 prompts that should land on a skill, plus 10 prompts that should get no skill at all. 12 of the real prompts say the job in different words than the skill description. node eval/compare.mjs runs every approach on those same lines and writes eval/results.json. The table below is that file, in plain terms. “Right skill first” means the skill we expected was the top result. “Unrelated prompts answered” means a dinner plan or a flight search still got a Salesforce skill. The full grid, including second and third place, stays in eval/results.md.</w:t>
+        <w:t xml:space="preserve">The test set is eval/prompts.jsonl in this repo: 75 prompts that should load one or more skills, plus 10 prompts that should get no skill at all. 12 of the real prompts say the job in different words than the skill description. 5 prompts ask for two skills. node eval/compare.mjs runs every approach on those same lines and writes eval/results.json. The table below is that file, in plain terms. “Right skill first” means the strongest skill returned was one the prompt needed. “Unrelated prompts answered” means a dinner plan or a flight search still got a Salesforce skill. The full grid stays in eval/results.md.</w:t>
       </w:r>
     </w:p>
     <w:p>
@@ -3635,7 +3635,7 @@
                 <w:sz w:val="18"/>
                 <w:szCs w:val="18"/>
               </w:rPr>
-              <w:t xml:space="preserve">78.6% (55 of 70)</w:t>
+              <w:t xml:space="preserve">80.0% (60 of 75)</w:t>
             </w:r>
           </w:p>
         </w:tc>
@@ -3751,7 +3751,7 @@
                 <w:sz w:val="18"/>
                 <w:szCs w:val="18"/>
               </w:rPr>
-              <w:t xml:space="preserve">82.9% (58 of 70)</w:t>
+              <w:t xml:space="preserve">84.0% (63 of 75)</w:t>
             </w:r>
           </w:p>
         </w:tc>
@@ -3867,7 +3867,7 @@
                 <w:sz w:val="18"/>
                 <w:szCs w:val="18"/>
               </w:rPr>
-              <w:t xml:space="preserve">82.9% (58 of 70)</w:t>
+              <w:t xml:space="preserve">84.0% (63 of 75)</w:t>
             </w:r>
           </w:p>
         </w:tc>
@@ -3983,7 +3983,7 @@
                 <w:sz w:val="18"/>
                 <w:szCs w:val="18"/>
               </w:rPr>
-              <w:t xml:space="preserve">80.0% (56 of 70)</w:t>
+              <w:t xml:space="preserve">84.0% (63 of 75)</w:t>
             </w:r>
           </w:p>
         </w:tc>
@@ -4046,7 +4046,7 @@
           <w:sz w:val="22"/>
           <w:szCs w:val="22"/>
         </w:rPr>
-        <w:t xml:space="preserve">The shipped approach, matching the name and the one-line description, puts the right skill first 82.9% of the time (58 of 70) and answers 0/10 unrelated prompts. Simply counting words in common ties that on this small catalog. The two split when we also search the body of the skill file.</w:t>
+        <w:t xml:space="preserve">The shipped approach, matching the name and the one-line description, puts a needed skill first 84.0% of the time (63 of 75) and answers 0/10 unrelated prompts. On those same 75 prompts, the skills it returned were exactly the skills the prompt needed 84.0% of the time (63 of 75). Simply counting words in common ties the first-skill number on this small catalog, and then keeps returning neighboring skills the prompt did not ask for. The two also split when we search the body of the skill file.</w:t>
       </w:r>
     </w:p>
     <w:p>
@@ -4064,7 +4064,7 @@
           <w:sz w:val="22"/>
           <w:szCs w:val="22"/>
         </w:rPr>
-        <w:t xml:space="preserve">Searching the whole SKILL.md drops the right-skill rate to 80.0% and answers 3/10 unrelated prompts. Skill files share a lot of ordinary teaching language: “use this skill when the user…” That shared language is enough to pick the wrong skill, and enough to answer a prompt that should have been left alone. The one-line description already has the words that matter. The rest of the file is for after the choice.</w:t>
+        <w:t xml:space="preserve">Searching the whole SKILL.md answers 3/10 unrelated prompts. Skill files share a lot of ordinary teaching language: “use this skill when the user…” That shared language is enough to answer a prompt that should have been left alone. The one-line description already has the words that matter. The rest of the file is for after the choice.</w:t>
       </w:r>
     </w:p>
     <w:p>
@@ -4136,7 +4136,7 @@
                 <w:sz w:val="22"/>
                 <w:szCs w:val="22"/>
               </w:rPr>
-              <w:t xml:space="preserve">The body of a skill is context for doing the task. It is noise for choosing the task. Index the description. Load the body only after the skill has won.</w:t>
+              <w:t xml:space="preserve">The body of a skill is context for doing the task. It is noise for choosing the task. Index the description. Load the body only after the skill has been chosen.</w:t>
             </w:r>
           </w:p>
         </w:tc>
@@ -4184,7 +4184,7 @@
           <w:sz w:val="22"/>
           <w:szCs w:val="22"/>
         </w:rPr>
-        <w:t xml:space="preserve">That 82.9% does not mean the router understands the work. All 58 prompts that used the skill’s own words were routed correctly. All 12 prompts that said the same job in different words were missed. Those misses are listed in eval/results.md. “Show me customers we added in the last seven days” never says SOQL, so the SOQL skill does not win.</w:t>
+        <w:t xml:space="preserve">That 84.0% does not mean the router understands the work. All 63 prompts that used the skills’ own words loaded exactly the skills they asked for, including the prompts that asked for two. All 12 prompts that said the same job in different words were missed. Those misses are listed in eval/results.md. “Show me customers we added in the last seven days” never says SOQL, so the SOQL skill does not load.</w:t>
       </w:r>
     </w:p>
     <w:p>
@@ -4220,7 +4220,7 @@
           <w:sz w:val="22"/>
           <w:szCs w:val="22"/>
         </w:rPr>
-        <w:t xml:space="preserve">That is why the test prompts are in the repo. Every skill you add comes with at least one prompt that must hit and, if the new words are broad, one prompt that must come back empty. node eval/run-eval.mjs asks the running server the same questions. The bar in this repo is: the right skill comes first at least 80 percent of the time, and none of the unrelated prompts get a skill. The last run clears that bar. If you change a description, rerun the comparison and rebuild this post from eval/results.json. If the post and the file disagree, the file wins.</w:t>
+        <w:t xml:space="preserve">That is why the test prompts are in the repo. Every skill you add comes with at least one prompt that must return it and, if the new words are broad, one prompt that must come back empty. When two skills belong in the same turn, the gold set has a prompt that must return both. node eval/run-eval.mjs asks the running server the same questions. The bar in this repo is: the skills returned are exactly the skills the prompt needed at least 80 percent of the time, and none of the unrelated prompts get a skill. The last run clears that bar. If you change a description, rerun the comparison and rebuild this post from eval/results.json. If the post and the file disagree, the file wins.</w:t>
       </w:r>
     </w:p>
     <w:p>
@@ -4318,7 +4318,7 @@
           <w:sz w:val="22"/>
           <w:szCs w:val="22"/>
         </w:rPr>
-        <w:t xml:space="preserve">Some skills are not procedures. They are a folder of short notes: a status-code table, a pagination note, an idempotency note. The router picks the skill. A simpler keyword search then picks the note. The sample repo includes one such skill, a short HTTP API guide, so you can see the shape without anyone’s internal notes attached.</w:t>
+        <w:t xml:space="preserve">Some skills are not procedures. They are a folder of short notes: a status-code table, a pagination note, an idempotency note. The router picks that skill the same way it picks any other skill in the set. A simpler keyword search then picks the note. The sample repo includes one such skill, a short HTTP API guide, so you can see the shape without anyone’s internal notes attached.</w:t>
       </w:r>
     </w:p>
     <w:p>
@@ -4360,7 +4360,7 @@
         </w:rPr>
         <w:t xml:space="preserve">The reference implementation is </w:t>
       </w:r>
-      <w:hyperlink w:history="1" r:id="rIdr7t5jgzh528pad6qugyae">
+      <w:hyperlink w:history="1" r:id="rIdbvtxfgmxj8juhoomkz3pu">
         <w:r>
           <w:rPr>
             <w:rStyle w:val="Hyperlink"/>
@@ -4382,7 +4382,7 @@
           <w:sz w:val="22"/>
           <w:szCs w:val="22"/>
         </w:rPr>
-        <w:t xml:space="preserve">. 19 skills, a companion map, the MCP server, the hook, and the eval in eval/prompts.jsonl. Wire the server into any MCP client:</w:t>
+        <w:t xml:space="preserve">. 19 skills, the MCP server, the hook, and the eval in eval/prompts.jsonl. Wire the server into any MCP client:</w:t>
       </w:r>
     </w:p>
     <w:p>
@@ -4695,7 +4695,7 @@
           <w:sz w:val="22"/>
           <w:szCs w:val="22"/>
         </w:rPr>
-        <w:t xml:space="preserve">I would leave the phrase list out of the choice. On the same prompts it is right 78.6% of the time, behind the shipped matcher, because a prompt that skips the phrase never matches. The list stays as the companion map.</w:t>
+        <w:t xml:space="preserve">I would leave the first-match phrase list out of the choice. On the same prompts it is right 80.0% of the time, and it can return only one skill, so a prompt that asks for two jobs loses the second.</w:t>
       </w:r>
     </w:p>
     <w:p>
@@ -4753,7 +4753,7 @@
           <w:sz w:val="22"/>
           <w:szCs w:val="22"/>
         </w:rPr>
-        <w:t xml:space="preserve">Skill libraries are everywhere now. The useful next step is small. An index you can regenerate. A match that sends the prompt to one skill. A test file, checked in, that fails when a new skill steals a neighbor. The agent loads that skill and does the task it describes. The rest of the library stays on disk. When the prompt is not one of yours, the router gets out of the way.</w:t>
+        <w:t xml:space="preserve">Skill libraries are everywhere now. The useful next step is small. An index you can regenerate. A match that sends the prompt to the skills it needs, one or more. A test file, checked in, that fails when a new skill steals a neighbor or when a two-job prompt comes back with only one. The agent loads those skills and does the work they describe. The rest of the library stays on disk. When the prompt is not one of yours, the router gets out of the way.</w:t>
       </w:r>
     </w:p>
     <w:p>
@@ -4796,7 +4796,7 @@
         </w:rPr>
         <w:t xml:space="preserve">Reference code: </w:t>
       </w:r>
-      <w:hyperlink w:history="1" r:id="rId_j3ixsx64prmvek1wax3l">
+      <w:hyperlink w:history="1" r:id="rIdq0epd51bktsy4uiloh87m">
         <w:r>
           <w:rPr>
             <w:rStyle w:val="Hyperlink"/>

</xml_diff>

<commit_message>
Make the post match what a reader can check in the repo.
Quoted prompts, the keywords line, and the comparison table now say the same thing as the gold set and the results file.
</commit_message>
<xml_diff>
--- a/docs/Load-the-Right-Skill-First.docx
+++ b/docs/Load-the-Right-Skill-First.docx
@@ -658,7 +658,7 @@
           <w:sz w:val="22"/>
           <w:szCs w:val="22"/>
         </w:rPr>
-        <w:t xml:space="preserve">Here is a small cut of the kind of library people are already installing. These are ordinary Salesforce platform skills. Each one owns a narrow job. The descriptions are the routing signal: the words a person actually types.</w:t>
+        <w:t xml:space="preserve">Here are 12 of the 19 skills in the measurement. They are short samples of those jobs, written for this repo, not the full playbooks a team would install. The other seven are general skills in the same run: unit tests, a pull-request review, an explanation, docs, a SQL query, a release, and an HTTP note. Each sample owns a narrow job. The description, and the keywords line under it, are the routing signal.</w:t>
       </w:r>
     </w:p>
     <w:p>
@@ -1795,7 +1795,7 @@
           <w:sz w:val="22"/>
           <w:szCs w:val="22"/>
         </w:rPr>
-        <w:t xml:space="preserve">“Run the failing test class and tell me the coverage.” Coverage belongs to the skill that runs tests, not the one that writes a new test. One skill loads: platform-apex-test-run.</w:t>
+        <w:t xml:space="preserve">“Run the Apex tests and tell me the code coverage.” Coverage belongs to the skill that runs tests, not the one that writes a new test. One skill loads: platform-apex-test-run.</w:t>
       </w:r>
     </w:p>
     <w:p>
@@ -2313,7 +2313,7 @@
           <w:sz w:val="22"/>
           <w:szCs w:val="22"/>
         </w:rPr>
-        <w:t xml:space="preserve">Create skills/&lt;name&gt;/SKILL.md. Put the words a person would actually type into the description, including the short phrase that names the job. That phrase is how a prompt claims this skill. The body is the procedure, and it is loaded only after the skill is chosen.</w:t>
+        <w:t xml:space="preserve">Create skills/&lt;name&gt;/SKILL.md. The description is what the score reads. The keywords line holds the job phrases, separated by commas, in the words a person would type: formula field, field-level security. A prompt that contains one of those phrases loads this skill. The body is the procedure, and it is loaded only after the skill is chosen.</w:t>
       </w:r>
     </w:p>
     <w:p>
@@ -2585,7 +2585,7 @@
           <w:sz w:val="22"/>
           <w:szCs w:val="22"/>
         </w:rPr>
-        <w:t xml:space="preserve">A generator walks skills/ and reads each SKILL.md. It keeps the routing signal and throws away the procedure: directory name, frontmatter name, description, and a short keyword list taken from that description. It writes two artifacts from the same pass.</w:t>
+        <w:t xml:space="preserve">A generator walks skills/ and reads each SKILL.md. It keeps the routing signal and throws away the procedure: directory name, frontmatter name, description, and the keywords line. Multi-word job phrases come from that keywords line. Single words are also taken from the description, and they affect the score only. It writes two artifacts from the same pass.</w:t>
       </w:r>
     </w:p>
     <w:p>
@@ -3285,7 +3285,7 @@
           <w:sz w:val="22"/>
           <w:szCs w:val="22"/>
         </w:rPr>
-        <w:t xml:space="preserve">A skill joins the set when the prompt uses that skill’s own job phrase, the short words in its description such as “formula field” or “field-level security.” One phrase, one skill. Two phrases from two skills, both skills. If the prompt does not use any of those phrases but one skill is still clearly the best match, that one skill loads. If the best match is weak, the router returns an empty list. A question about dinner does not get an Apex skill. That cutoff is a number in the code, currently recorded in eval/results.json. You only change it by rerunning the eval after the catalog grows. You do not need the math to write a skill. You need a description that uses the words a person would actually type.</w:t>
+        <w:t xml:space="preserve">A skill joins the set when the prompt contains that skill’s job phrase. The job phrase is a multi-word entry on the keywords line, such as “formula field” or “field-level security.” One phrase, one skill. Two phrases from two skills, both skills. Words that appear only in the description do not add a second skill. If the prompt uses none of the phrases, but one skill is still clearly the best match, that one skill loads. If the best match is weak, the router returns an empty list. A question about dinner does not get an Apex skill. That cutoff is a number in the code, currently recorded in eval/results.json. You only change it by rerunning the eval after the catalog grows. You do not need the math to write a skill. You need a keywords line that uses the words a person would actually type.</w:t>
       </w:r>
     </w:p>
     <w:p>
@@ -3419,7 +3419,7 @@
           <w:sz w:val="22"/>
           <w:szCs w:val="22"/>
         </w:rPr>
-        <w:t xml:space="preserve">The test set is eval/prompts.jsonl in this repo: 75 prompts that should load one or more skills, plus 10 prompts that should get no skill at all. 12 of the real prompts say the job in different words than the skill description. 5 prompts ask for two skills. node eval/compare.mjs runs every approach on those same lines and writes eval/results.json. The table below is that file, in plain terms. “Right skill first” means the strongest skill returned was one the prompt needed. “Unrelated prompts answered” means a dinner plan or a flight search still got a Salesforce skill. The full grid stays in eval/results.md.</w:t>
+        <w:t xml:space="preserve">The test set is eval/prompts.jsonl in this repo: 75 prompts that should load one or more skills, plus 10 prompts that should get no skill at all. 12 of the real prompts say the job in different words than the skill description. 5 prompts ask for two skills. node eval/compare.mjs runs every approach on those same lines and writes eval/results.json. The table below is that file, in plain terms. “Right skill first” means the strongest skill returned was one the prompt needed. “Only the skills asked for” means the list was exactly that set, with nothing extra and nothing missing. “Unrelated prompts answered” means a dinner plan or a flight search still got a Salesforce skill. The same table is in eval/results.md.</w:t>
       </w:r>
     </w:p>
     <w:p>
@@ -3440,9 +3440,10 @@
         </w:tblBorders>
       </w:tblPr>
       <w:tblGrid>
-        <w:gridCol w:w="5200"/>
-        <w:gridCol w:w="2680"/>
-        <w:gridCol w:w="2200"/>
+        <w:gridCol w:w="3600"/>
+        <w:gridCol w:w="2000"/>
+        <w:gridCol w:w="2480"/>
+        <w:gridCol w:w="2000"/>
       </w:tblGrid>
       <w:tr>
         <w:trPr>
@@ -3451,7 +3452,7 @@
         </w:trPr>
         <w:tc>
           <w:tcPr>
-            <w:tcW w:type="dxa" w:w="5200"/>
+            <w:tcW w:type="dxa" w:w="3600"/>
             <w:tcBorders>
               <w:top w:val="single" w:color="D5DDE2" w:sz="4"/>
               <w:left w:val="single" w:color="D5DDE2" w:sz="4"/>
@@ -3488,7 +3489,7 @@
         </w:tc>
         <w:tc>
           <w:tcPr>
-            <w:tcW w:type="dxa" w:w="2680"/>
+            <w:tcW w:type="dxa" w:w="2000"/>
             <w:tcBorders>
               <w:top w:val="single" w:color="D5DDE2" w:sz="4"/>
               <w:left w:val="single" w:color="D5DDE2" w:sz="4"/>
@@ -3525,7 +3526,44 @@
         </w:tc>
         <w:tc>
           <w:tcPr>
-            <w:tcW w:type="dxa" w:w="2200"/>
+            <w:tcW w:type="dxa" w:w="2480"/>
+            <w:tcBorders>
+              <w:top w:val="single" w:color="D5DDE2" w:sz="4"/>
+              <w:left w:val="single" w:color="D5DDE2" w:sz="4"/>
+              <w:bottom w:val="single" w:color="D5DDE2" w:sz="4"/>
+              <w:right w:val="single" w:color="D5DDE2" w:sz="4"/>
+            </w:tcBorders>
+            <w:shd w:fill="1B3A4B" w:val="clear"/>
+            <w:tcMar>
+              <w:top w:type="dxa" w:w="60"/>
+              <w:left w:type="dxa" w:w="80"/>
+              <w:bottom w:type="dxa" w:w="60"/>
+              <w:right w:type="dxa" w:w="80"/>
+            </w:tcMar>
+            <w:vAlign w:val="center"/>
+          </w:tcPr>
+          <w:p>
+            <w:pPr>
+              <w:spacing w:after="0" w:before="0"/>
+            </w:pPr>
+            <w:r>
+              <w:rPr>
+                <w:rFonts w:ascii="Calibri" w:cs="Calibri" w:eastAsia="Calibri" w:hAnsi="Calibri"/>
+                <w:b/>
+                <w:bCs/>
+                <w:i w:val="false"/>
+                <w:iCs w:val="false"/>
+                <w:color w:val="FFFFFF"/>
+                <w:sz w:val="18"/>
+                <w:szCs w:val="18"/>
+              </w:rPr>
+              <w:t xml:space="preserve">Only the skills asked for</w:t>
+            </w:r>
+          </w:p>
+        </w:tc>
+        <w:tc>
+          <w:tcPr>
+            <w:tcW w:type="dxa" w:w="2000"/>
             <w:tcBorders>
               <w:top w:val="single" w:color="D5DDE2" w:sz="4"/>
               <w:left w:val="single" w:color="D5DDE2" w:sz="4"/>
@@ -3567,7 +3605,7 @@
         </w:trPr>
         <w:tc>
           <w:tcPr>
-            <w:tcW w:type="dxa" w:w="5200"/>
+            <w:tcW w:type="dxa" w:w="3600"/>
             <w:tcBorders>
               <w:top w:val="single" w:color="D5DDE2" w:sz="4"/>
               <w:left w:val="single" w:color="D5DDE2" w:sz="4"/>
@@ -3604,7 +3642,7 @@
         </w:tc>
         <w:tc>
           <w:tcPr>
-            <w:tcW w:type="dxa" w:w="2680"/>
+            <w:tcW w:type="dxa" w:w="2000"/>
             <w:tcBorders>
               <w:top w:val="single" w:color="D5DDE2" w:sz="4"/>
               <w:left w:val="single" w:color="D5DDE2" w:sz="4"/>
@@ -3641,7 +3679,44 @@
         </w:tc>
         <w:tc>
           <w:tcPr>
-            <w:tcW w:type="dxa" w:w="2200"/>
+            <w:tcW w:type="dxa" w:w="2480"/>
+            <w:tcBorders>
+              <w:top w:val="single" w:color="D5DDE2" w:sz="4"/>
+              <w:left w:val="single" w:color="D5DDE2" w:sz="4"/>
+              <w:bottom w:val="single" w:color="D5DDE2" w:sz="4"/>
+              <w:right w:val="single" w:color="D5DDE2" w:sz="4"/>
+            </w:tcBorders>
+            <w:shd w:fill="FFFFFF" w:val="clear"/>
+            <w:tcMar>
+              <w:top w:type="dxa" w:w="60"/>
+              <w:left w:type="dxa" w:w="80"/>
+              <w:bottom w:type="dxa" w:w="60"/>
+              <w:right w:type="dxa" w:w="80"/>
+            </w:tcMar>
+            <w:vAlign w:val="center"/>
+          </w:tcPr>
+          <w:p>
+            <w:pPr>
+              <w:spacing w:after="0" w:before="0"/>
+            </w:pPr>
+            <w:r>
+              <w:rPr>
+                <w:rFonts w:ascii="Calibri" w:cs="Calibri" w:eastAsia="Calibri" w:hAnsi="Calibri"/>
+                <w:b w:val="false"/>
+                <w:bCs w:val="false"/>
+                <w:i w:val="false"/>
+                <w:iCs w:val="false"/>
+                <w:color w:val="243038"/>
+                <w:sz w:val="18"/>
+                <w:szCs w:val="18"/>
+              </w:rPr>
+              <w:t xml:space="preserve">73.3% (55 of 75)</w:t>
+            </w:r>
+          </w:p>
+        </w:tc>
+        <w:tc>
+          <w:tcPr>
+            <w:tcW w:type="dxa" w:w="2000"/>
             <w:tcBorders>
               <w:top w:val="single" w:color="D5DDE2" w:sz="4"/>
               <w:left w:val="single" w:color="D5DDE2" w:sz="4"/>
@@ -3683,7 +3758,7 @@
         </w:trPr>
         <w:tc>
           <w:tcPr>
-            <w:tcW w:type="dxa" w:w="5200"/>
+            <w:tcW w:type="dxa" w:w="3600"/>
             <w:tcBorders>
               <w:top w:val="single" w:color="D5DDE2" w:sz="4"/>
               <w:left w:val="single" w:color="D5DDE2" w:sz="4"/>
@@ -3720,7 +3795,7 @@
         </w:tc>
         <w:tc>
           <w:tcPr>
-            <w:tcW w:type="dxa" w:w="2680"/>
+            <w:tcW w:type="dxa" w:w="2000"/>
             <w:tcBorders>
               <w:top w:val="single" w:color="D5DDE2" w:sz="4"/>
               <w:left w:val="single" w:color="D5DDE2" w:sz="4"/>
@@ -3757,7 +3832,44 @@
         </w:tc>
         <w:tc>
           <w:tcPr>
-            <w:tcW w:type="dxa" w:w="2200"/>
+            <w:tcW w:type="dxa" w:w="2480"/>
+            <w:tcBorders>
+              <w:top w:val="single" w:color="D5DDE2" w:sz="4"/>
+              <w:left w:val="single" w:color="D5DDE2" w:sz="4"/>
+              <w:bottom w:val="single" w:color="D5DDE2" w:sz="4"/>
+              <w:right w:val="single" w:color="D5DDE2" w:sz="4"/>
+            </w:tcBorders>
+            <w:shd w:fill="F4F7F8" w:val="clear"/>
+            <w:tcMar>
+              <w:top w:type="dxa" w:w="60"/>
+              <w:left w:type="dxa" w:w="80"/>
+              <w:bottom w:type="dxa" w:w="60"/>
+              <w:right w:type="dxa" w:w="80"/>
+            </w:tcMar>
+            <w:vAlign w:val="center"/>
+          </w:tcPr>
+          <w:p>
+            <w:pPr>
+              <w:spacing w:after="0" w:before="0"/>
+            </w:pPr>
+            <w:r>
+              <w:rPr>
+                <w:rFonts w:ascii="Calibri" w:cs="Calibri" w:eastAsia="Calibri" w:hAnsi="Calibri"/>
+                <w:b w:val="false"/>
+                <w:bCs w:val="false"/>
+                <w:i w:val="false"/>
+                <w:iCs w:val="false"/>
+                <w:color w:val="243038"/>
+                <w:sz w:val="18"/>
+                <w:szCs w:val="18"/>
+              </w:rPr>
+              <w:t xml:space="preserve">9.3% (7 of 75)</w:t>
+            </w:r>
+          </w:p>
+        </w:tc>
+        <w:tc>
+          <w:tcPr>
+            <w:tcW w:type="dxa" w:w="2000"/>
             <w:tcBorders>
               <w:top w:val="single" w:color="D5DDE2" w:sz="4"/>
               <w:left w:val="single" w:color="D5DDE2" w:sz="4"/>
@@ -3799,7 +3911,7 @@
         </w:trPr>
         <w:tc>
           <w:tcPr>
-            <w:tcW w:type="dxa" w:w="5200"/>
+            <w:tcW w:type="dxa" w:w="3600"/>
             <w:tcBorders>
               <w:top w:val="single" w:color="D5DDE2" w:sz="4"/>
               <w:left w:val="single" w:color="D5DDE2" w:sz="4"/>
@@ -3836,7 +3948,7 @@
         </w:tc>
         <w:tc>
           <w:tcPr>
-            <w:tcW w:type="dxa" w:w="2680"/>
+            <w:tcW w:type="dxa" w:w="2000"/>
             <w:tcBorders>
               <w:top w:val="single" w:color="D5DDE2" w:sz="4"/>
               <w:left w:val="single" w:color="D5DDE2" w:sz="4"/>
@@ -3873,7 +3985,44 @@
         </w:tc>
         <w:tc>
           <w:tcPr>
-            <w:tcW w:type="dxa" w:w="2200"/>
+            <w:tcW w:type="dxa" w:w="2480"/>
+            <w:tcBorders>
+              <w:top w:val="single" w:color="D5DDE2" w:sz="4"/>
+              <w:left w:val="single" w:color="D5DDE2" w:sz="4"/>
+              <w:bottom w:val="single" w:color="D5DDE2" w:sz="4"/>
+              <w:right w:val="single" w:color="D5DDE2" w:sz="4"/>
+            </w:tcBorders>
+            <w:shd w:fill="FFFFFF" w:val="clear"/>
+            <w:tcMar>
+              <w:top w:type="dxa" w:w="60"/>
+              <w:left w:type="dxa" w:w="80"/>
+              <w:bottom w:type="dxa" w:w="60"/>
+              <w:right w:type="dxa" w:w="80"/>
+            </w:tcMar>
+            <w:vAlign w:val="center"/>
+          </w:tcPr>
+          <w:p>
+            <w:pPr>
+              <w:spacing w:after="0" w:before="0"/>
+            </w:pPr>
+            <w:r>
+              <w:rPr>
+                <w:rFonts w:ascii="Calibri" w:cs="Calibri" w:eastAsia="Calibri" w:hAnsi="Calibri"/>
+                <w:b w:val="false"/>
+                <w:bCs w:val="false"/>
+                <w:i w:val="false"/>
+                <w:iCs w:val="false"/>
+                <w:color w:val="243038"/>
+                <w:sz w:val="18"/>
+                <w:szCs w:val="18"/>
+              </w:rPr>
+              <w:t xml:space="preserve">84.0% (63 of 75)</w:t>
+            </w:r>
+          </w:p>
+        </w:tc>
+        <w:tc>
+          <w:tcPr>
+            <w:tcW w:type="dxa" w:w="2000"/>
             <w:tcBorders>
               <w:top w:val="single" w:color="D5DDE2" w:sz="4"/>
               <w:left w:val="single" w:color="D5DDE2" w:sz="4"/>
@@ -3915,7 +4064,7 @@
         </w:trPr>
         <w:tc>
           <w:tcPr>
-            <w:tcW w:type="dxa" w:w="5200"/>
+            <w:tcW w:type="dxa" w:w="3600"/>
             <w:tcBorders>
               <w:top w:val="single" w:color="D5DDE2" w:sz="4"/>
               <w:left w:val="single" w:color="D5DDE2" w:sz="4"/>
@@ -3952,7 +4101,7 @@
         </w:tc>
         <w:tc>
           <w:tcPr>
-            <w:tcW w:type="dxa" w:w="2680"/>
+            <w:tcW w:type="dxa" w:w="2000"/>
             <w:tcBorders>
               <w:top w:val="single" w:color="D5DDE2" w:sz="4"/>
               <w:left w:val="single" w:color="D5DDE2" w:sz="4"/>
@@ -3989,7 +4138,44 @@
         </w:tc>
         <w:tc>
           <w:tcPr>
-            <w:tcW w:type="dxa" w:w="2200"/>
+            <w:tcW w:type="dxa" w:w="2480"/>
+            <w:tcBorders>
+              <w:top w:val="single" w:color="D5DDE2" w:sz="4"/>
+              <w:left w:val="single" w:color="D5DDE2" w:sz="4"/>
+              <w:bottom w:val="single" w:color="D5DDE2" w:sz="4"/>
+              <w:right w:val="single" w:color="D5DDE2" w:sz="4"/>
+            </w:tcBorders>
+            <w:shd w:fill="F4F7F8" w:val="clear"/>
+            <w:tcMar>
+              <w:top w:type="dxa" w:w="60"/>
+              <w:left w:type="dxa" w:w="80"/>
+              <w:bottom w:type="dxa" w:w="60"/>
+              <w:right w:type="dxa" w:w="80"/>
+            </w:tcMar>
+            <w:vAlign w:val="center"/>
+          </w:tcPr>
+          <w:p>
+            <w:pPr>
+              <w:spacing w:after="0" w:before="0"/>
+            </w:pPr>
+            <w:r>
+              <w:rPr>
+                <w:rFonts w:ascii="Calibri" w:cs="Calibri" w:eastAsia="Calibri" w:hAnsi="Calibri"/>
+                <w:b w:val="false"/>
+                <w:bCs w:val="false"/>
+                <w:i w:val="false"/>
+                <w:iCs w:val="false"/>
+                <w:color w:val="243038"/>
+                <w:sz w:val="18"/>
+                <w:szCs w:val="18"/>
+              </w:rPr>
+              <w:t xml:space="preserve">84.0% (63 of 75)</w:t>
+            </w:r>
+          </w:p>
+        </w:tc>
+        <w:tc>
+          <w:tcPr>
+            <w:tcW w:type="dxa" w:w="2000"/>
             <w:tcBorders>
               <w:top w:val="single" w:color="D5DDE2" w:sz="4"/>
               <w:left w:val="single" w:color="D5DDE2" w:sz="4"/>
@@ -4184,7 +4370,7 @@
           <w:sz w:val="22"/>
           <w:szCs w:val="22"/>
         </w:rPr>
-        <w:t xml:space="preserve">That 84.0% does not mean the router understands the work. All 63 prompts that used the skills’ own words loaded exactly the skills they asked for, including the prompts that asked for two. All 12 prompts that said the same job in different words were missed. Those misses are listed in eval/results.md. “Show me customers we added in the last seven days” never says SOQL, so the SOQL skill does not load.</w:t>
+        <w:t xml:space="preserve">That 84.0% does not mean the router understands the work. All 63 prompts that used the skills’ own words loaded exactly the skills they asked for, including the prompts that asked for two. Of the 12 prompts that said the same job in different words, 4 returned nothing and 8 returned a different skill. “The suite is red in the org. What failed?” loaded the deploy skill. The list is in eval/results.md. “Show me customers we added in the last seven days” never says SOQL, so the SOQL skill does not load.</w:t>
       </w:r>
     </w:p>
     <w:p>
@@ -4360,7 +4546,7 @@
         </w:rPr>
         <w:t xml:space="preserve">The reference implementation is </w:t>
       </w:r>
-      <w:hyperlink w:history="1" r:id="rIdbvtxfgmxj8juhoomkz3pu">
+      <w:hyperlink w:history="1" r:id="rIdqdj1idsf27jsxc0awcrke">
         <w:r>
           <w:rPr>
             <w:rStyle w:val="Hyperlink"/>
@@ -4387,6 +4573,24 @@
     </w:p>
     <w:p>
       <w:pPr>
+        <w:spacing w:after="160" w:before="0" w:line="288"/>
+      </w:pPr>
+      <w:r>
+        <w:rPr>
+          <w:rFonts w:ascii="Calibri" w:cs="Calibri" w:eastAsia="Calibri" w:hAnsi="Calibri"/>
+          <w:b w:val="false"/>
+          <w:bCs w:val="false"/>
+          <w:i w:val="false"/>
+          <w:iCs w:val="false"/>
+          <w:color w:val="243038"/>
+          <w:sz w:val="22"/>
+          <w:szCs w:val="22"/>
+        </w:rPr>
+        <w:t xml:space="preserve">Replace the path with the real checkout. A relative path works only when the client starts in that directory.</w:t>
+      </w:r>
+    </w:p>
+    <w:p>
+      <w:pPr>
         <w:shd w:fill="F3F1EC" w:val="clear"/>
         <w:spacing w:after="0" w:before="80" w:line="240"/>
       </w:pPr>
@@ -4477,7 +4681,7 @@
           <w:sz w:val="18"/>
           <w:szCs w:val="18"/>
         </w:rPr>
-        <w:t xml:space="preserve">      "args": ["mcp/server.mjs"]</w:t>
+        <w:t xml:space="preserve">      "args": ["/absolute/path/to/skill-router/mcp/server.mjs"],</w:t>
       </w:r>
     </w:p>
     <w:p>
@@ -4496,7 +4700,7 @@
           <w:sz w:val="18"/>
           <w:szCs w:val="18"/>
         </w:rPr>
-        <w:t xml:space="preserve">    }</w:t>
+        <w:t xml:space="preserve">      "env": {</w:t>
       </w:r>
     </w:p>
     <w:p>
@@ -4515,13 +4719,13 @@
           <w:sz w:val="18"/>
           <w:szCs w:val="18"/>
         </w:rPr>
-        <w:t xml:space="preserve">  }</w:t>
+        <w:t xml:space="preserve">        "SKILL_ROUTER_ROOT": "/absolute/path/to/skill-router"</w:t>
       </w:r>
     </w:p>
     <w:p>
       <w:pPr>
         <w:shd w:fill="F3F1EC" w:val="clear"/>
-        <w:spacing w:after="80" w:before="0" w:line="240"/>
+        <w:spacing w:after="0" w:before="0" w:line="240"/>
       </w:pPr>
       <w:r>
         <w:rPr>
@@ -4534,36 +4738,13 @@
           <w:sz w:val="18"/>
           <w:szCs w:val="18"/>
         </w:rPr>
-        <w:t xml:space="preserve">}</w:t>
-      </w:r>
-    </w:p>
-    <w:p>
-      <w:pPr>
-        <w:spacing w:after="120" w:before="0"/>
-      </w:pPr>
-    </w:p>
-    <w:p>
-      <w:pPr>
-        <w:spacing w:after="160" w:before="0" w:line="288"/>
-      </w:pPr>
-      <w:r>
-        <w:rPr>
-          <w:rFonts w:ascii="Calibri" w:cs="Calibri" w:eastAsia="Calibri" w:hAnsi="Calibri"/>
-          <w:b w:val="false"/>
-          <w:bCs w:val="false"/>
-          <w:i w:val="false"/>
-          <w:iCs w:val="false"/>
-          <w:color w:val="243038"/>
-          <w:sz w:val="22"/>
-          <w:szCs w:val="22"/>
-        </w:rPr>
-        <w:t xml:space="preserve">Rebuild the index after you add or edit a skill, then run the gate:</w:t>
+        <w:t xml:space="preserve">      }</w:t>
       </w:r>
     </w:p>
     <w:p>
       <w:pPr>
         <w:shd w:fill="F3F1EC" w:val="clear"/>
-        <w:spacing w:after="0" w:before="80" w:line="240"/>
+        <w:spacing w:after="0" w:before="0" w:line="240"/>
       </w:pPr>
       <w:r>
         <w:rPr>
@@ -4576,7 +4757,7 @@
           <w:sz w:val="18"/>
           <w:szCs w:val="18"/>
         </w:rPr>
-        <w:t xml:space="preserve">node scripts/generate-index.mjs</w:t>
+        <w:t xml:space="preserve">    }</w:t>
       </w:r>
     </w:p>
     <w:p>
@@ -4595,7 +4776,7 @@
           <w:sz w:val="18"/>
           <w:szCs w:val="18"/>
         </w:rPr>
-        <w:t xml:space="preserve">node eval/compare.mjs</w:t>
+        <w:t xml:space="preserve">  }</w:t>
       </w:r>
     </w:p>
     <w:p>
@@ -4614,6 +4795,86 @@
           <w:sz w:val="18"/>
           <w:szCs w:val="18"/>
         </w:rPr>
+        <w:t xml:space="preserve">}</w:t>
+      </w:r>
+    </w:p>
+    <w:p>
+      <w:pPr>
+        <w:spacing w:after="120" w:before="0"/>
+      </w:pPr>
+    </w:p>
+    <w:p>
+      <w:pPr>
+        <w:spacing w:after="160" w:before="0" w:line="288"/>
+      </w:pPr>
+      <w:r>
+        <w:rPr>
+          <w:rFonts w:ascii="Calibri" w:cs="Calibri" w:eastAsia="Calibri" w:hAnsi="Calibri"/>
+          <w:b w:val="false"/>
+          <w:bCs w:val="false"/>
+          <w:i w:val="false"/>
+          <w:iCs w:val="false"/>
+          <w:color w:val="243038"/>
+          <w:sz w:val="22"/>
+          <w:szCs w:val="22"/>
+        </w:rPr>
+        <w:t xml:space="preserve">Rebuild the index after you add or edit a skill, then run the gate:</w:t>
+      </w:r>
+    </w:p>
+    <w:p>
+      <w:pPr>
+        <w:shd w:fill="F3F1EC" w:val="clear"/>
+        <w:spacing w:after="0" w:before="80" w:line="240"/>
+      </w:pPr>
+      <w:r>
+        <w:rPr>
+          <w:rFonts w:ascii="Consolas" w:cs="Consolas" w:eastAsia="Consolas" w:hAnsi="Consolas"/>
+          <w:b w:val="false"/>
+          <w:bCs w:val="false"/>
+          <w:i w:val="false"/>
+          <w:iCs w:val="false"/>
+          <w:color w:val="1A2830"/>
+          <w:sz w:val="18"/>
+          <w:szCs w:val="18"/>
+        </w:rPr>
+        <w:t xml:space="preserve">node scripts/generate-index.mjs</w:t>
+      </w:r>
+    </w:p>
+    <w:p>
+      <w:pPr>
+        <w:shd w:fill="F3F1EC" w:val="clear"/>
+        <w:spacing w:after="0" w:before="0" w:line="240"/>
+      </w:pPr>
+      <w:r>
+        <w:rPr>
+          <w:rFonts w:ascii="Consolas" w:cs="Consolas" w:eastAsia="Consolas" w:hAnsi="Consolas"/>
+          <w:b w:val="false"/>
+          <w:bCs w:val="false"/>
+          <w:i w:val="false"/>
+          <w:iCs w:val="false"/>
+          <w:color w:val="1A2830"/>
+          <w:sz w:val="18"/>
+          <w:szCs w:val="18"/>
+        </w:rPr>
+        <w:t xml:space="preserve">node eval/compare.mjs</w:t>
+      </w:r>
+    </w:p>
+    <w:p>
+      <w:pPr>
+        <w:shd w:fill="F3F1EC" w:val="clear"/>
+        <w:spacing w:after="80" w:before="0" w:line="240"/>
+      </w:pPr>
+      <w:r>
+        <w:rPr>
+          <w:rFonts w:ascii="Consolas" w:cs="Consolas" w:eastAsia="Consolas" w:hAnsi="Consolas"/>
+          <w:b w:val="false"/>
+          <w:bCs w:val="false"/>
+          <w:i w:val="false"/>
+          <w:iCs w:val="false"/>
+          <w:color w:val="1A2830"/>
+          <w:sz w:val="18"/>
+          <w:szCs w:val="18"/>
+        </w:rPr>
         <w:t xml:space="preserve">node eval/run-eval.mjs --gate 80</w:t>
       </w:r>
     </w:p>
@@ -4637,7 +4898,7 @@
           <w:sz w:val="22"/>
           <w:szCs w:val="22"/>
         </w:rPr>
-        <w:t xml:space="preserve">Those two commands are the entire extension loop: regenerate the index, then prove the new skill did not steal a neighbor. Set SKILL_ROUTER_ROOT if the checkout is not the working directory, and SKILL_ROUTER_SKILLS_DIR if the skills live somewhere else, such as a user-level skills folder. Set SKILL_ROUTER_FLOOR when you retune.</w:t>
+        <w:t xml:space="preserve">Those three commands are the entire extension loop: regenerate the index, write the results, then prove the new skill did not steal a neighbor. Set SKILL_ROUTER_ROOT if the checkout is not the working directory, and SKILL_ROUTER_SKILLS_DIR if the skills live somewhere else, such as a user-level skills folder. Set SKILL_ROUTER_FLOOR when you retune.</w:t>
       </w:r>
     </w:p>
     <w:p>
@@ -4796,7 +5057,7 @@
         </w:rPr>
         <w:t xml:space="preserve">Reference code: </w:t>
       </w:r>
-      <w:hyperlink w:history="1" r:id="rIdq0epd51bktsy4uiloh87m">
+      <w:hyperlink w:history="1" r:id="rId6l5r0xdl-e3y9ion5n2wh">
         <w:r>
           <w:rPr>
             <w:rStyle w:val="Hyperlink"/>

</xml_diff>

<commit_message>
Use Arial and Menlo so Pages opens the post without a font prompt.
Calibri and Consolas are Microsoft fonts, and Pages asks to replace them on a Mac that does not have Office.
</commit_message>
<xml_diff>
--- a/docs/Load-the-Right-Skill-First.docx
+++ b/docs/Load-the-Right-Skill-First.docx
@@ -8,7 +8,7 @@
       </w:pPr>
       <w:r>
         <w:rPr>
-          <w:rFonts w:ascii="Calibri" w:cs="Calibri" w:eastAsia="Calibri" w:hAnsi="Calibri"/>
+          <w:rFonts w:ascii="Arial" w:cs="Arial" w:eastAsia="Arial" w:hAnsi="Arial"/>
           <w:b/>
           <w:bCs/>
           <w:i w:val="false"/>
@@ -26,7 +26,7 @@
       </w:pPr>
       <w:r>
         <w:rPr>
-          <w:rFonts w:ascii="Calibri" w:cs="Calibri" w:eastAsia="Calibri" w:hAnsi="Calibri"/>
+          <w:rFonts w:ascii="Arial" w:cs="Arial" w:eastAsia="Arial" w:hAnsi="Arial"/>
           <w:b/>
           <w:bCs/>
           <w:i w:val="false"/>
@@ -44,7 +44,7 @@
       </w:pPr>
       <w:r>
         <w:rPr>
-          <w:rFonts w:ascii="Calibri" w:cs="Calibri" w:eastAsia="Calibri" w:hAnsi="Calibri"/>
+          <w:rFonts w:ascii="Arial" w:cs="Arial" w:eastAsia="Arial" w:hAnsi="Arial"/>
           <w:b w:val="false"/>
           <w:bCs w:val="false"/>
           <w:i/>
@@ -62,7 +62,7 @@
       </w:pPr>
       <w:r>
         <w:rPr>
-          <w:rFonts w:ascii="Calibri" w:cs="Calibri" w:eastAsia="Calibri" w:hAnsi="Calibri"/>
+          <w:rFonts w:ascii="Arial" w:cs="Arial" w:eastAsia="Arial" w:hAnsi="Arial"/>
           <w:b/>
           <w:bCs/>
           <w:i w:val="false"/>
@@ -75,7 +75,7 @@
       </w:r>
       <w:r>
         <w:rPr>
-          <w:rFonts w:ascii="Calibri" w:cs="Calibri" w:eastAsia="Calibri" w:hAnsi="Calibri"/>
+          <w:rFonts w:ascii="Arial" w:cs="Arial" w:eastAsia="Arial" w:hAnsi="Arial"/>
           <w:b w:val="false"/>
           <w:bCs w:val="false"/>
           <w:i w:val="false"/>
@@ -132,7 +132,7 @@
             </w:pPr>
             <w:r>
               <w:rPr>
-                <w:rFonts w:ascii="Calibri" w:cs="Calibri" w:eastAsia="Calibri" w:hAnsi="Calibri"/>
+                <w:rFonts w:ascii="Arial" w:cs="Arial" w:eastAsia="Arial" w:hAnsi="Arial"/>
                 <w:b/>
                 <w:bCs/>
                 <w:i w:val="false"/>
@@ -169,7 +169,7 @@
             </w:pPr>
             <w:r>
               <w:rPr>
-                <w:rFonts w:ascii="Calibri" w:cs="Calibri" w:eastAsia="Calibri" w:hAnsi="Calibri"/>
+                <w:rFonts w:ascii="Arial" w:cs="Arial" w:eastAsia="Arial" w:hAnsi="Arial"/>
                 <w:b/>
                 <w:bCs/>
                 <w:i w:val="false"/>
@@ -211,7 +211,7 @@
             </w:pPr>
             <w:r>
               <w:rPr>
-                <w:rFonts w:ascii="Calibri" w:cs="Calibri" w:eastAsia="Calibri" w:hAnsi="Calibri"/>
+                <w:rFonts w:ascii="Arial" w:cs="Arial" w:eastAsia="Arial" w:hAnsi="Arial"/>
                 <w:b/>
                 <w:bCs/>
                 <w:i w:val="false"/>
@@ -248,7 +248,7 @@
             </w:pPr>
             <w:r>
               <w:rPr>
-                <w:rFonts w:ascii="Calibri" w:cs="Calibri" w:eastAsia="Calibri" w:hAnsi="Calibri"/>
+                <w:rFonts w:ascii="Arial" w:cs="Arial" w:eastAsia="Arial" w:hAnsi="Arial"/>
                 <w:b w:val="false"/>
                 <w:bCs w:val="false"/>
                 <w:i w:val="false"/>
@@ -290,7 +290,7 @@
             </w:pPr>
             <w:r>
               <w:rPr>
-                <w:rFonts w:ascii="Calibri" w:cs="Calibri" w:eastAsia="Calibri" w:hAnsi="Calibri"/>
+                <w:rFonts w:ascii="Arial" w:cs="Arial" w:eastAsia="Arial" w:hAnsi="Arial"/>
                 <w:b/>
                 <w:bCs/>
                 <w:i w:val="false"/>
@@ -327,7 +327,7 @@
             </w:pPr>
             <w:r>
               <w:rPr>
-                <w:rFonts w:ascii="Calibri" w:cs="Calibri" w:eastAsia="Calibri" w:hAnsi="Calibri"/>
+                <w:rFonts w:ascii="Arial" w:cs="Arial" w:eastAsia="Arial" w:hAnsi="Arial"/>
                 <w:b w:val="false"/>
                 <w:bCs w:val="false"/>
                 <w:i w:val="false"/>
@@ -369,7 +369,7 @@
             </w:pPr>
             <w:r>
               <w:rPr>
-                <w:rFonts w:ascii="Calibri" w:cs="Calibri" w:eastAsia="Calibri" w:hAnsi="Calibri"/>
+                <w:rFonts w:ascii="Arial" w:cs="Arial" w:eastAsia="Arial" w:hAnsi="Arial"/>
                 <w:b/>
                 <w:bCs/>
                 <w:i w:val="false"/>
@@ -406,7 +406,7 @@
             </w:pPr>
             <w:r>
               <w:rPr>
-                <w:rFonts w:ascii="Calibri" w:cs="Calibri" w:eastAsia="Calibri" w:hAnsi="Calibri"/>
+                <w:rFonts w:ascii="Arial" w:cs="Arial" w:eastAsia="Arial" w:hAnsi="Arial"/>
                 <w:b w:val="false"/>
                 <w:bCs w:val="false"/>
                 <w:i w:val="false"/>
@@ -448,7 +448,7 @@
             </w:pPr>
             <w:r>
               <w:rPr>
-                <w:rFonts w:ascii="Calibri" w:cs="Calibri" w:eastAsia="Calibri" w:hAnsi="Calibri"/>
+                <w:rFonts w:ascii="Arial" w:cs="Arial" w:eastAsia="Arial" w:hAnsi="Arial"/>
                 <w:b/>
                 <w:bCs/>
                 <w:i w:val="false"/>
@@ -485,7 +485,7 @@
             </w:pPr>
             <w:r>
               <w:rPr>
-                <w:rFonts w:ascii="Calibri" w:cs="Calibri" w:eastAsia="Calibri" w:hAnsi="Calibri"/>
+                <w:rFonts w:ascii="Arial" w:cs="Arial" w:eastAsia="Arial" w:hAnsi="Arial"/>
                 <w:b w:val="false"/>
                 <w:bCs w:val="false"/>
                 <w:i w:val="false"/>
@@ -511,7 +511,7 @@
       </w:pPr>
       <w:r>
         <w:rPr>
-          <w:rFonts w:ascii="Calibri" w:cs="Calibri" w:eastAsia="Calibri" w:hAnsi="Calibri"/>
+          <w:rFonts w:ascii="Arial" w:cs="Arial" w:eastAsia="Arial" w:hAnsi="Arial"/>
           <w:b w:val="false"/>
           <w:bCs w:val="false"/>
           <w:i w:val="false"/>
@@ -529,7 +529,7 @@
       </w:pPr>
       <w:r>
         <w:rPr>
-          <w:rFonts w:ascii="Calibri" w:cs="Calibri" w:eastAsia="Calibri" w:hAnsi="Calibri"/>
+          <w:rFonts w:ascii="Arial" w:cs="Arial" w:eastAsia="Arial" w:hAnsi="Arial"/>
           <w:b w:val="false"/>
           <w:bCs w:val="false"/>
           <w:i w:val="false"/>
@@ -583,7 +583,7 @@
             </w:pPr>
             <w:r>
               <w:rPr>
-                <w:rFonts w:ascii="Calibri" w:cs="Calibri" w:eastAsia="Calibri" w:hAnsi="Calibri"/>
+                <w:rFonts w:ascii="Arial" w:cs="Arial" w:eastAsia="Arial" w:hAnsi="Arial"/>
                 <w:b w:val="false"/>
                 <w:bCs w:val="false"/>
                 <w:i/>
@@ -609,7 +609,7 @@
       </w:pPr>
       <w:r>
         <w:rPr>
-          <w:rFonts w:ascii="Calibri" w:cs="Calibri" w:eastAsia="Calibri" w:hAnsi="Calibri"/>
+          <w:rFonts w:ascii="Arial" w:cs="Arial" w:eastAsia="Arial" w:hAnsi="Arial"/>
           <w:b w:val="false"/>
           <w:bCs w:val="false"/>
           <w:i w:val="false"/>
@@ -631,7 +631,7 @@
       </w:pPr>
       <w:r>
         <w:rPr>
-          <w:rFonts w:ascii="Calibri" w:cs="Calibri" w:eastAsia="Calibri" w:hAnsi="Calibri"/>
+          <w:rFonts w:ascii="Arial" w:cs="Arial" w:eastAsia="Arial" w:hAnsi="Arial"/>
           <w:b/>
           <w:bCs/>
           <w:i w:val="false"/>
@@ -649,7 +649,7 @@
       </w:pPr>
       <w:r>
         <w:rPr>
-          <w:rFonts w:ascii="Calibri" w:cs="Calibri" w:eastAsia="Calibri" w:hAnsi="Calibri"/>
+          <w:rFonts w:ascii="Arial" w:cs="Arial" w:eastAsia="Arial" w:hAnsi="Arial"/>
           <w:b w:val="false"/>
           <w:bCs w:val="false"/>
           <w:i w:val="false"/>
@@ -711,7 +711,7 @@
             </w:pPr>
             <w:r>
               <w:rPr>
-                <w:rFonts w:ascii="Calibri" w:cs="Calibri" w:eastAsia="Calibri" w:hAnsi="Calibri"/>
+                <w:rFonts w:ascii="Arial" w:cs="Arial" w:eastAsia="Arial" w:hAnsi="Arial"/>
                 <w:b/>
                 <w:bCs/>
                 <w:i w:val="false"/>
@@ -748,7 +748,7 @@
             </w:pPr>
             <w:r>
               <w:rPr>
-                <w:rFonts w:ascii="Calibri" w:cs="Calibri" w:eastAsia="Calibri" w:hAnsi="Calibri"/>
+                <w:rFonts w:ascii="Arial" w:cs="Arial" w:eastAsia="Arial" w:hAnsi="Arial"/>
                 <w:b/>
                 <w:bCs/>
                 <w:i w:val="false"/>
@@ -790,7 +790,7 @@
             </w:pPr>
             <w:r>
               <w:rPr>
-                <w:rFonts w:ascii="Calibri" w:cs="Calibri" w:eastAsia="Calibri" w:hAnsi="Calibri"/>
+                <w:rFonts w:ascii="Arial" w:cs="Arial" w:eastAsia="Arial" w:hAnsi="Arial"/>
                 <w:b/>
                 <w:bCs/>
                 <w:i w:val="false"/>
@@ -827,7 +827,7 @@
             </w:pPr>
             <w:r>
               <w:rPr>
-                <w:rFonts w:ascii="Calibri" w:cs="Calibri" w:eastAsia="Calibri" w:hAnsi="Calibri"/>
+                <w:rFonts w:ascii="Arial" w:cs="Arial" w:eastAsia="Arial" w:hAnsi="Arial"/>
                 <w:b w:val="false"/>
                 <w:bCs w:val="false"/>
                 <w:i w:val="false"/>
@@ -869,7 +869,7 @@
             </w:pPr>
             <w:r>
               <w:rPr>
-                <w:rFonts w:ascii="Calibri" w:cs="Calibri" w:eastAsia="Calibri" w:hAnsi="Calibri"/>
+                <w:rFonts w:ascii="Arial" w:cs="Arial" w:eastAsia="Arial" w:hAnsi="Arial"/>
                 <w:b/>
                 <w:bCs/>
                 <w:i w:val="false"/>
@@ -906,7 +906,7 @@
             </w:pPr>
             <w:r>
               <w:rPr>
-                <w:rFonts w:ascii="Calibri" w:cs="Calibri" w:eastAsia="Calibri" w:hAnsi="Calibri"/>
+                <w:rFonts w:ascii="Arial" w:cs="Arial" w:eastAsia="Arial" w:hAnsi="Arial"/>
                 <w:b w:val="false"/>
                 <w:bCs w:val="false"/>
                 <w:i w:val="false"/>
@@ -948,7 +948,7 @@
             </w:pPr>
             <w:r>
               <w:rPr>
-                <w:rFonts w:ascii="Calibri" w:cs="Calibri" w:eastAsia="Calibri" w:hAnsi="Calibri"/>
+                <w:rFonts w:ascii="Arial" w:cs="Arial" w:eastAsia="Arial" w:hAnsi="Arial"/>
                 <w:b/>
                 <w:bCs/>
                 <w:i w:val="false"/>
@@ -985,7 +985,7 @@
             </w:pPr>
             <w:r>
               <w:rPr>
-                <w:rFonts w:ascii="Calibri" w:cs="Calibri" w:eastAsia="Calibri" w:hAnsi="Calibri"/>
+                <w:rFonts w:ascii="Arial" w:cs="Arial" w:eastAsia="Arial" w:hAnsi="Arial"/>
                 <w:b w:val="false"/>
                 <w:bCs w:val="false"/>
                 <w:i w:val="false"/>
@@ -1027,7 +1027,7 @@
             </w:pPr>
             <w:r>
               <w:rPr>
-                <w:rFonts w:ascii="Calibri" w:cs="Calibri" w:eastAsia="Calibri" w:hAnsi="Calibri"/>
+                <w:rFonts w:ascii="Arial" w:cs="Arial" w:eastAsia="Arial" w:hAnsi="Arial"/>
                 <w:b/>
                 <w:bCs/>
                 <w:i w:val="false"/>
@@ -1064,7 +1064,7 @@
             </w:pPr>
             <w:r>
               <w:rPr>
-                <w:rFonts w:ascii="Calibri" w:cs="Calibri" w:eastAsia="Calibri" w:hAnsi="Calibri"/>
+                <w:rFonts w:ascii="Arial" w:cs="Arial" w:eastAsia="Arial" w:hAnsi="Arial"/>
                 <w:b w:val="false"/>
                 <w:bCs w:val="false"/>
                 <w:i w:val="false"/>
@@ -1106,7 +1106,7 @@
             </w:pPr>
             <w:r>
               <w:rPr>
-                <w:rFonts w:ascii="Calibri" w:cs="Calibri" w:eastAsia="Calibri" w:hAnsi="Calibri"/>
+                <w:rFonts w:ascii="Arial" w:cs="Arial" w:eastAsia="Arial" w:hAnsi="Arial"/>
                 <w:b/>
                 <w:bCs/>
                 <w:i w:val="false"/>
@@ -1143,7 +1143,7 @@
             </w:pPr>
             <w:r>
               <w:rPr>
-                <w:rFonts w:ascii="Calibri" w:cs="Calibri" w:eastAsia="Calibri" w:hAnsi="Calibri"/>
+                <w:rFonts w:ascii="Arial" w:cs="Arial" w:eastAsia="Arial" w:hAnsi="Arial"/>
                 <w:b w:val="false"/>
                 <w:bCs w:val="false"/>
                 <w:i w:val="false"/>
@@ -1185,7 +1185,7 @@
             </w:pPr>
             <w:r>
               <w:rPr>
-                <w:rFonts w:ascii="Calibri" w:cs="Calibri" w:eastAsia="Calibri" w:hAnsi="Calibri"/>
+                <w:rFonts w:ascii="Arial" w:cs="Arial" w:eastAsia="Arial" w:hAnsi="Arial"/>
                 <w:b/>
                 <w:bCs/>
                 <w:i w:val="false"/>
@@ -1222,7 +1222,7 @@
             </w:pPr>
             <w:r>
               <w:rPr>
-                <w:rFonts w:ascii="Calibri" w:cs="Calibri" w:eastAsia="Calibri" w:hAnsi="Calibri"/>
+                <w:rFonts w:ascii="Arial" w:cs="Arial" w:eastAsia="Arial" w:hAnsi="Arial"/>
                 <w:b w:val="false"/>
                 <w:bCs w:val="false"/>
                 <w:i w:val="false"/>
@@ -1264,7 +1264,7 @@
             </w:pPr>
             <w:r>
               <w:rPr>
-                <w:rFonts w:ascii="Calibri" w:cs="Calibri" w:eastAsia="Calibri" w:hAnsi="Calibri"/>
+                <w:rFonts w:ascii="Arial" w:cs="Arial" w:eastAsia="Arial" w:hAnsi="Arial"/>
                 <w:b/>
                 <w:bCs/>
                 <w:i w:val="false"/>
@@ -1301,7 +1301,7 @@
             </w:pPr>
             <w:r>
               <w:rPr>
-                <w:rFonts w:ascii="Calibri" w:cs="Calibri" w:eastAsia="Calibri" w:hAnsi="Calibri"/>
+                <w:rFonts w:ascii="Arial" w:cs="Arial" w:eastAsia="Arial" w:hAnsi="Arial"/>
                 <w:b w:val="false"/>
                 <w:bCs w:val="false"/>
                 <w:i w:val="false"/>
@@ -1343,7 +1343,7 @@
             </w:pPr>
             <w:r>
               <w:rPr>
-                <w:rFonts w:ascii="Calibri" w:cs="Calibri" w:eastAsia="Calibri" w:hAnsi="Calibri"/>
+                <w:rFonts w:ascii="Arial" w:cs="Arial" w:eastAsia="Arial" w:hAnsi="Arial"/>
                 <w:b/>
                 <w:bCs/>
                 <w:i w:val="false"/>
@@ -1380,7 +1380,7 @@
             </w:pPr>
             <w:r>
               <w:rPr>
-                <w:rFonts w:ascii="Calibri" w:cs="Calibri" w:eastAsia="Calibri" w:hAnsi="Calibri"/>
+                <w:rFonts w:ascii="Arial" w:cs="Arial" w:eastAsia="Arial" w:hAnsi="Arial"/>
                 <w:b w:val="false"/>
                 <w:bCs w:val="false"/>
                 <w:i w:val="false"/>
@@ -1422,7 +1422,7 @@
             </w:pPr>
             <w:r>
               <w:rPr>
-                <w:rFonts w:ascii="Calibri" w:cs="Calibri" w:eastAsia="Calibri" w:hAnsi="Calibri"/>
+                <w:rFonts w:ascii="Arial" w:cs="Arial" w:eastAsia="Arial" w:hAnsi="Arial"/>
                 <w:b/>
                 <w:bCs/>
                 <w:i w:val="false"/>
@@ -1459,7 +1459,7 @@
             </w:pPr>
             <w:r>
               <w:rPr>
-                <w:rFonts w:ascii="Calibri" w:cs="Calibri" w:eastAsia="Calibri" w:hAnsi="Calibri"/>
+                <w:rFonts w:ascii="Arial" w:cs="Arial" w:eastAsia="Arial" w:hAnsi="Arial"/>
                 <w:b w:val="false"/>
                 <w:bCs w:val="false"/>
                 <w:i w:val="false"/>
@@ -1501,7 +1501,7 @@
             </w:pPr>
             <w:r>
               <w:rPr>
-                <w:rFonts w:ascii="Calibri" w:cs="Calibri" w:eastAsia="Calibri" w:hAnsi="Calibri"/>
+                <w:rFonts w:ascii="Arial" w:cs="Arial" w:eastAsia="Arial" w:hAnsi="Arial"/>
                 <w:b/>
                 <w:bCs/>
                 <w:i w:val="false"/>
@@ -1538,7 +1538,7 @@
             </w:pPr>
             <w:r>
               <w:rPr>
-                <w:rFonts w:ascii="Calibri" w:cs="Calibri" w:eastAsia="Calibri" w:hAnsi="Calibri"/>
+                <w:rFonts w:ascii="Arial" w:cs="Arial" w:eastAsia="Arial" w:hAnsi="Arial"/>
                 <w:b w:val="false"/>
                 <w:bCs w:val="false"/>
                 <w:i w:val="false"/>
@@ -1580,7 +1580,7 @@
             </w:pPr>
             <w:r>
               <w:rPr>
-                <w:rFonts w:ascii="Calibri" w:cs="Calibri" w:eastAsia="Calibri" w:hAnsi="Calibri"/>
+                <w:rFonts w:ascii="Arial" w:cs="Arial" w:eastAsia="Arial" w:hAnsi="Arial"/>
                 <w:b/>
                 <w:bCs/>
                 <w:i w:val="false"/>
@@ -1617,7 +1617,7 @@
             </w:pPr>
             <w:r>
               <w:rPr>
-                <w:rFonts w:ascii="Calibri" w:cs="Calibri" w:eastAsia="Calibri" w:hAnsi="Calibri"/>
+                <w:rFonts w:ascii="Arial" w:cs="Arial" w:eastAsia="Arial" w:hAnsi="Arial"/>
                 <w:b w:val="false"/>
                 <w:bCs w:val="false"/>
                 <w:i w:val="false"/>
@@ -1659,7 +1659,7 @@
             </w:pPr>
             <w:r>
               <w:rPr>
-                <w:rFonts w:ascii="Calibri" w:cs="Calibri" w:eastAsia="Calibri" w:hAnsi="Calibri"/>
+                <w:rFonts w:ascii="Arial" w:cs="Arial" w:eastAsia="Arial" w:hAnsi="Arial"/>
                 <w:b/>
                 <w:bCs/>
                 <w:i w:val="false"/>
@@ -1696,7 +1696,7 @@
             </w:pPr>
             <w:r>
               <w:rPr>
-                <w:rFonts w:ascii="Calibri" w:cs="Calibri" w:eastAsia="Calibri" w:hAnsi="Calibri"/>
+                <w:rFonts w:ascii="Arial" w:cs="Arial" w:eastAsia="Arial" w:hAnsi="Arial"/>
                 <w:b w:val="false"/>
                 <w:bCs w:val="false"/>
                 <w:i w:val="false"/>
@@ -1722,7 +1722,7 @@
       </w:pPr>
       <w:r>
         <w:rPr>
-          <w:rFonts w:ascii="Calibri" w:cs="Calibri" w:eastAsia="Calibri" w:hAnsi="Calibri"/>
+          <w:rFonts w:ascii="Arial" w:cs="Arial" w:eastAsia="Arial" w:hAnsi="Arial"/>
           <w:b w:val="false"/>
           <w:bCs w:val="false"/>
           <w:i w:val="false"/>
@@ -1740,7 +1740,7 @@
       </w:pPr>
       <w:r>
         <w:rPr>
-          <w:rFonts w:ascii="Calibri" w:cs="Calibri" w:eastAsia="Calibri" w:hAnsi="Calibri"/>
+          <w:rFonts w:ascii="Arial" w:cs="Arial" w:eastAsia="Arial" w:hAnsi="Arial"/>
           <w:b w:val="false"/>
           <w:bCs w:val="false"/>
           <w:i w:val="false"/>
@@ -1763,7 +1763,7 @@
       </w:pPr>
       <w:r>
         <w:rPr>
-          <w:rFonts w:ascii="Calibri" w:cs="Calibri" w:eastAsia="Calibri" w:hAnsi="Calibri"/>
+          <w:rFonts w:ascii="Arial" w:cs="Arial" w:eastAsia="Arial" w:hAnsi="Arial"/>
           <w:b w:val="false"/>
           <w:bCs w:val="false"/>
           <w:i w:val="false"/>
@@ -1786,7 +1786,7 @@
       </w:pPr>
       <w:r>
         <w:rPr>
-          <w:rFonts w:ascii="Calibri" w:cs="Calibri" w:eastAsia="Calibri" w:hAnsi="Calibri"/>
+          <w:rFonts w:ascii="Arial" w:cs="Arial" w:eastAsia="Arial" w:hAnsi="Arial"/>
           <w:b w:val="false"/>
           <w:bCs w:val="false"/>
           <w:i w:val="false"/>
@@ -1809,7 +1809,7 @@
       </w:pPr>
       <w:r>
         <w:rPr>
-          <w:rFonts w:ascii="Calibri" w:cs="Calibri" w:eastAsia="Calibri" w:hAnsi="Calibri"/>
+          <w:rFonts w:ascii="Arial" w:cs="Arial" w:eastAsia="Arial" w:hAnsi="Arial"/>
           <w:b w:val="false"/>
           <w:bCs w:val="false"/>
           <w:i w:val="false"/>
@@ -1832,7 +1832,7 @@
       </w:pPr>
       <w:r>
         <w:rPr>
-          <w:rFonts w:ascii="Calibri" w:cs="Calibri" w:eastAsia="Calibri" w:hAnsi="Calibri"/>
+          <w:rFonts w:ascii="Arial" w:cs="Arial" w:eastAsia="Arial" w:hAnsi="Arial"/>
           <w:b w:val="false"/>
           <w:bCs w:val="false"/>
           <w:i w:val="false"/>
@@ -1850,7 +1850,7 @@
       </w:pPr>
       <w:r>
         <w:rPr>
-          <w:rFonts w:ascii="Calibri" w:cs="Calibri" w:eastAsia="Calibri" w:hAnsi="Calibri"/>
+          <w:rFonts w:ascii="Arial" w:cs="Arial" w:eastAsia="Arial" w:hAnsi="Arial"/>
           <w:b w:val="false"/>
           <w:bCs w:val="false"/>
           <w:i w:val="false"/>
@@ -1915,7 +1915,7 @@
       </w:pPr>
       <w:r>
         <w:rPr>
-          <w:rFonts w:ascii="Calibri" w:cs="Calibri" w:eastAsia="Calibri" w:hAnsi="Calibri"/>
+          <w:rFonts w:ascii="Arial" w:cs="Arial" w:eastAsia="Arial" w:hAnsi="Arial"/>
           <w:b w:val="false"/>
           <w:bCs w:val="false"/>
           <w:i/>
@@ -1937,7 +1937,7 @@
       </w:pPr>
       <w:r>
         <w:rPr>
-          <w:rFonts w:ascii="Calibri" w:cs="Calibri" w:eastAsia="Calibri" w:hAnsi="Calibri"/>
+          <w:rFonts w:ascii="Arial" w:cs="Arial" w:eastAsia="Arial" w:hAnsi="Arial"/>
           <w:b/>
           <w:bCs/>
           <w:i w:val="false"/>
@@ -1955,7 +1955,7 @@
       </w:pPr>
       <w:r>
         <w:rPr>
-          <w:rFonts w:ascii="Calibri" w:cs="Calibri" w:eastAsia="Calibri" w:hAnsi="Calibri"/>
+          <w:rFonts w:ascii="Arial" w:cs="Arial" w:eastAsia="Arial" w:hAnsi="Arial"/>
           <w:b w:val="false"/>
           <w:bCs w:val="false"/>
           <w:i w:val="false"/>
@@ -1973,7 +1973,7 @@
       </w:pPr>
       <w:r>
         <w:rPr>
-          <w:rFonts w:ascii="Calibri" w:cs="Calibri" w:eastAsia="Calibri" w:hAnsi="Calibri"/>
+          <w:rFonts w:ascii="Arial" w:cs="Arial" w:eastAsia="Arial" w:hAnsi="Arial"/>
           <w:b w:val="false"/>
           <w:bCs w:val="false"/>
           <w:i w:val="false"/>
@@ -2038,7 +2038,7 @@
       </w:pPr>
       <w:r>
         <w:rPr>
-          <w:rFonts w:ascii="Calibri" w:cs="Calibri" w:eastAsia="Calibri" w:hAnsi="Calibri"/>
+          <w:rFonts w:ascii="Arial" w:cs="Arial" w:eastAsia="Arial" w:hAnsi="Arial"/>
           <w:b w:val="false"/>
           <w:bCs w:val="false"/>
           <w:i/>
@@ -2061,7 +2061,7 @@
       </w:pPr>
       <w:r>
         <w:rPr>
-          <w:rFonts w:ascii="Calibri" w:cs="Calibri" w:eastAsia="Calibri" w:hAnsi="Calibri"/>
+          <w:rFonts w:ascii="Arial" w:cs="Arial" w:eastAsia="Arial" w:hAnsi="Arial"/>
           <w:b w:val="false"/>
           <w:bCs w:val="false"/>
           <w:i w:val="false"/>
@@ -2084,7 +2084,7 @@
       </w:pPr>
       <w:r>
         <w:rPr>
-          <w:rFonts w:ascii="Calibri" w:cs="Calibri" w:eastAsia="Calibri" w:hAnsi="Calibri"/>
+          <w:rFonts w:ascii="Arial" w:cs="Arial" w:eastAsia="Arial" w:hAnsi="Arial"/>
           <w:b w:val="false"/>
           <w:bCs w:val="false"/>
           <w:i w:val="false"/>
@@ -2107,7 +2107,7 @@
       </w:pPr>
       <w:r>
         <w:rPr>
-          <w:rFonts w:ascii="Calibri" w:cs="Calibri" w:eastAsia="Calibri" w:hAnsi="Calibri"/>
+          <w:rFonts w:ascii="Arial" w:cs="Arial" w:eastAsia="Arial" w:hAnsi="Arial"/>
           <w:b w:val="false"/>
           <w:bCs w:val="false"/>
           <w:i w:val="false"/>
@@ -2130,7 +2130,7 @@
       </w:pPr>
       <w:r>
         <w:rPr>
-          <w:rFonts w:ascii="Calibri" w:cs="Calibri" w:eastAsia="Calibri" w:hAnsi="Calibri"/>
+          <w:rFonts w:ascii="Arial" w:cs="Arial" w:eastAsia="Arial" w:hAnsi="Arial"/>
           <w:b w:val="false"/>
           <w:bCs w:val="false"/>
           <w:i w:val="false"/>
@@ -2153,7 +2153,7 @@
       </w:pPr>
       <w:r>
         <w:rPr>
-          <w:rFonts w:ascii="Calibri" w:cs="Calibri" w:eastAsia="Calibri" w:hAnsi="Calibri"/>
+          <w:rFonts w:ascii="Arial" w:cs="Arial" w:eastAsia="Arial" w:hAnsi="Arial"/>
           <w:b w:val="false"/>
           <w:bCs w:val="false"/>
           <w:i w:val="false"/>
@@ -2176,7 +2176,7 @@
       </w:pPr>
       <w:r>
         <w:rPr>
-          <w:rFonts w:ascii="Calibri" w:cs="Calibri" w:eastAsia="Calibri" w:hAnsi="Calibri"/>
+          <w:rFonts w:ascii="Arial" w:cs="Arial" w:eastAsia="Arial" w:hAnsi="Arial"/>
           <w:b w:val="false"/>
           <w:bCs w:val="false"/>
           <w:i w:val="false"/>
@@ -2198,7 +2198,7 @@
       </w:pPr>
       <w:r>
         <w:rPr>
-          <w:rFonts w:ascii="Calibri" w:cs="Calibri" w:eastAsia="Calibri" w:hAnsi="Calibri"/>
+          <w:rFonts w:ascii="Arial" w:cs="Arial" w:eastAsia="Arial" w:hAnsi="Arial"/>
           <w:b/>
           <w:bCs/>
           <w:i w:val="false"/>
@@ -2216,7 +2216,7 @@
       </w:pPr>
       <w:r>
         <w:rPr>
-          <w:rFonts w:ascii="Calibri" w:cs="Calibri" w:eastAsia="Calibri" w:hAnsi="Calibri"/>
+          <w:rFonts w:ascii="Arial" w:cs="Arial" w:eastAsia="Arial" w:hAnsi="Arial"/>
           <w:b w:val="false"/>
           <w:bCs w:val="false"/>
           <w:i w:val="false"/>
@@ -2281,7 +2281,7 @@
       </w:pPr>
       <w:r>
         <w:rPr>
-          <w:rFonts w:ascii="Calibri" w:cs="Calibri" w:eastAsia="Calibri" w:hAnsi="Calibri"/>
+          <w:rFonts w:ascii="Arial" w:cs="Arial" w:eastAsia="Arial" w:hAnsi="Arial"/>
           <w:b w:val="false"/>
           <w:bCs w:val="false"/>
           <w:i/>
@@ -2304,7 +2304,7 @@
       </w:pPr>
       <w:r>
         <w:rPr>
-          <w:rFonts w:ascii="Calibri" w:cs="Calibri" w:eastAsia="Calibri" w:hAnsi="Calibri"/>
+          <w:rFonts w:ascii="Arial" w:cs="Arial" w:eastAsia="Arial" w:hAnsi="Arial"/>
           <w:b w:val="false"/>
           <w:bCs w:val="false"/>
           <w:i w:val="false"/>
@@ -2327,7 +2327,7 @@
       </w:pPr>
       <w:r>
         <w:rPr>
-          <w:rFonts w:ascii="Calibri" w:cs="Calibri" w:eastAsia="Calibri" w:hAnsi="Calibri"/>
+          <w:rFonts w:ascii="Arial" w:cs="Arial" w:eastAsia="Arial" w:hAnsi="Arial"/>
           <w:b w:val="false"/>
           <w:bCs w:val="false"/>
           <w:i w:val="false"/>
@@ -2350,7 +2350,7 @@
       </w:pPr>
       <w:r>
         <w:rPr>
-          <w:rFonts w:ascii="Calibri" w:cs="Calibri" w:eastAsia="Calibri" w:hAnsi="Calibri"/>
+          <w:rFonts w:ascii="Arial" w:cs="Arial" w:eastAsia="Arial" w:hAnsi="Arial"/>
           <w:b w:val="false"/>
           <w:bCs w:val="false"/>
           <w:i w:val="false"/>
@@ -2373,7 +2373,7 @@
       </w:pPr>
       <w:r>
         <w:rPr>
-          <w:rFonts w:ascii="Calibri" w:cs="Calibri" w:eastAsia="Calibri" w:hAnsi="Calibri"/>
+          <w:rFonts w:ascii="Arial" w:cs="Arial" w:eastAsia="Arial" w:hAnsi="Arial"/>
           <w:b w:val="false"/>
           <w:bCs w:val="false"/>
           <w:i w:val="false"/>
@@ -2396,7 +2396,7 @@
       </w:pPr>
       <w:r>
         <w:rPr>
-          <w:rFonts w:ascii="Calibri" w:cs="Calibri" w:eastAsia="Calibri" w:hAnsi="Calibri"/>
+          <w:rFonts w:ascii="Arial" w:cs="Arial" w:eastAsia="Arial" w:hAnsi="Arial"/>
           <w:b w:val="false"/>
           <w:bCs w:val="false"/>
           <w:i w:val="false"/>
@@ -2414,7 +2414,7 @@
       </w:pPr>
       <w:r>
         <w:rPr>
-          <w:rFonts w:ascii="Calibri" w:cs="Calibri" w:eastAsia="Calibri" w:hAnsi="Calibri"/>
+          <w:rFonts w:ascii="Arial" w:cs="Arial" w:eastAsia="Arial" w:hAnsi="Arial"/>
           <w:b w:val="false"/>
           <w:bCs w:val="false"/>
           <w:i w:val="false"/>
@@ -2436,7 +2436,7 @@
       </w:pPr>
       <w:r>
         <w:rPr>
-          <w:rFonts w:ascii="Calibri" w:cs="Calibri" w:eastAsia="Calibri" w:hAnsi="Calibri"/>
+          <w:rFonts w:ascii="Arial" w:cs="Arial" w:eastAsia="Arial" w:hAnsi="Arial"/>
           <w:b/>
           <w:bCs/>
           <w:i w:val="false"/>
@@ -2454,7 +2454,7 @@
       </w:pPr>
       <w:r>
         <w:rPr>
-          <w:rFonts w:ascii="Calibri" w:cs="Calibri" w:eastAsia="Calibri" w:hAnsi="Calibri"/>
+          <w:rFonts w:ascii="Arial" w:cs="Arial" w:eastAsia="Arial" w:hAnsi="Arial"/>
           <w:b w:val="false"/>
           <w:bCs w:val="false"/>
           <w:i w:val="false"/>
@@ -2472,7 +2472,7 @@
       </w:pPr>
       <w:r>
         <w:rPr>
-          <w:rFonts w:ascii="Calibri" w:cs="Calibri" w:eastAsia="Calibri" w:hAnsi="Calibri"/>
+          <w:rFonts w:ascii="Arial" w:cs="Arial" w:eastAsia="Arial" w:hAnsi="Arial"/>
           <w:b w:val="false"/>
           <w:bCs w:val="false"/>
           <w:i w:val="false"/>
@@ -2495,7 +2495,7 @@
       </w:pPr>
       <w:r>
         <w:rPr>
-          <w:rFonts w:ascii="Calibri" w:cs="Calibri" w:eastAsia="Calibri" w:hAnsi="Calibri"/>
+          <w:rFonts w:ascii="Arial" w:cs="Arial" w:eastAsia="Arial" w:hAnsi="Arial"/>
           <w:b w:val="false"/>
           <w:bCs w:val="false"/>
           <w:i w:val="false"/>
@@ -2518,7 +2518,7 @@
       </w:pPr>
       <w:r>
         <w:rPr>
-          <w:rFonts w:ascii="Calibri" w:cs="Calibri" w:eastAsia="Calibri" w:hAnsi="Calibri"/>
+          <w:rFonts w:ascii="Arial" w:cs="Arial" w:eastAsia="Arial" w:hAnsi="Arial"/>
           <w:b w:val="false"/>
           <w:bCs w:val="false"/>
           <w:i w:val="false"/>
@@ -2536,7 +2536,7 @@
       </w:pPr>
       <w:r>
         <w:rPr>
-          <w:rFonts w:ascii="Calibri" w:cs="Calibri" w:eastAsia="Calibri" w:hAnsi="Calibri"/>
+          <w:rFonts w:ascii="Arial" w:cs="Arial" w:eastAsia="Arial" w:hAnsi="Arial"/>
           <w:b w:val="false"/>
           <w:bCs w:val="false"/>
           <w:i w:val="false"/>
@@ -2558,7 +2558,7 @@
       </w:pPr>
       <w:r>
         <w:rPr>
-          <w:rFonts w:ascii="Calibri" w:cs="Calibri" w:eastAsia="Calibri" w:hAnsi="Calibri"/>
+          <w:rFonts w:ascii="Arial" w:cs="Arial" w:eastAsia="Arial" w:hAnsi="Arial"/>
           <w:b/>
           <w:bCs/>
           <w:i w:val="false"/>
@@ -2576,7 +2576,7 @@
       </w:pPr>
       <w:r>
         <w:rPr>
-          <w:rFonts w:ascii="Calibri" w:cs="Calibri" w:eastAsia="Calibri" w:hAnsi="Calibri"/>
+          <w:rFonts w:ascii="Arial" w:cs="Arial" w:eastAsia="Arial" w:hAnsi="Arial"/>
           <w:b w:val="false"/>
           <w:bCs w:val="false"/>
           <w:i w:val="false"/>
@@ -2599,7 +2599,7 @@
       </w:pPr>
       <w:r>
         <w:rPr>
-          <w:rFonts w:ascii="Calibri" w:cs="Calibri" w:eastAsia="Calibri" w:hAnsi="Calibri"/>
+          <w:rFonts w:ascii="Arial" w:cs="Arial" w:eastAsia="Arial" w:hAnsi="Arial"/>
           <w:b w:val="false"/>
           <w:bCs w:val="false"/>
           <w:i w:val="false"/>
@@ -2622,7 +2622,7 @@
       </w:pPr>
       <w:r>
         <w:rPr>
-          <w:rFonts w:ascii="Calibri" w:cs="Calibri" w:eastAsia="Calibri" w:hAnsi="Calibri"/>
+          <w:rFonts w:ascii="Arial" w:cs="Arial" w:eastAsia="Arial" w:hAnsi="Arial"/>
           <w:b w:val="false"/>
           <w:bCs w:val="false"/>
           <w:i w:val="false"/>
@@ -2640,7 +2640,7 @@
       </w:pPr>
       <w:r>
         <w:rPr>
-          <w:rFonts w:ascii="Calibri" w:cs="Calibri" w:eastAsia="Calibri" w:hAnsi="Calibri"/>
+          <w:rFonts w:ascii="Arial" w:cs="Arial" w:eastAsia="Arial" w:hAnsi="Arial"/>
           <w:b w:val="false"/>
           <w:bCs w:val="false"/>
           <w:i w:val="false"/>
@@ -2658,7 +2658,7 @@
       </w:pPr>
       <w:r>
         <w:rPr>
-          <w:rFonts w:ascii="Calibri" w:cs="Calibri" w:eastAsia="Calibri" w:hAnsi="Calibri"/>
+          <w:rFonts w:ascii="Arial" w:cs="Arial" w:eastAsia="Arial" w:hAnsi="Arial"/>
           <w:b w:val="false"/>
           <w:bCs w:val="false"/>
           <w:i w:val="false"/>
@@ -2680,7 +2680,7 @@
       </w:pPr>
       <w:r>
         <w:rPr>
-          <w:rFonts w:ascii="Calibri" w:cs="Calibri" w:eastAsia="Calibri" w:hAnsi="Calibri"/>
+          <w:rFonts w:ascii="Arial" w:cs="Arial" w:eastAsia="Arial" w:hAnsi="Arial"/>
           <w:b/>
           <w:bCs/>
           <w:i w:val="false"/>
@@ -2698,7 +2698,7 @@
       </w:pPr>
       <w:r>
         <w:rPr>
-          <w:rFonts w:ascii="Calibri" w:cs="Calibri" w:eastAsia="Calibri" w:hAnsi="Calibri"/>
+          <w:rFonts w:ascii="Arial" w:cs="Arial" w:eastAsia="Arial" w:hAnsi="Arial"/>
           <w:b w:val="false"/>
           <w:bCs w:val="false"/>
           <w:i w:val="false"/>
@@ -2760,7 +2760,7 @@
             </w:pPr>
             <w:r>
               <w:rPr>
-                <w:rFonts w:ascii="Calibri" w:cs="Calibri" w:eastAsia="Calibri" w:hAnsi="Calibri"/>
+                <w:rFonts w:ascii="Arial" w:cs="Arial" w:eastAsia="Arial" w:hAnsi="Arial"/>
                 <w:b/>
                 <w:bCs/>
                 <w:i w:val="false"/>
@@ -2797,7 +2797,7 @@
             </w:pPr>
             <w:r>
               <w:rPr>
-                <w:rFonts w:ascii="Calibri" w:cs="Calibri" w:eastAsia="Calibri" w:hAnsi="Calibri"/>
+                <w:rFonts w:ascii="Arial" w:cs="Arial" w:eastAsia="Arial" w:hAnsi="Arial"/>
                 <w:b/>
                 <w:bCs/>
                 <w:i w:val="false"/>
@@ -2839,7 +2839,7 @@
             </w:pPr>
             <w:r>
               <w:rPr>
-                <w:rFonts w:ascii="Calibri" w:cs="Calibri" w:eastAsia="Calibri" w:hAnsi="Calibri"/>
+                <w:rFonts w:ascii="Arial" w:cs="Arial" w:eastAsia="Arial" w:hAnsi="Arial"/>
                 <w:b/>
                 <w:bCs/>
                 <w:i w:val="false"/>
@@ -2876,7 +2876,7 @@
             </w:pPr>
             <w:r>
               <w:rPr>
-                <w:rFonts w:ascii="Calibri" w:cs="Calibri" w:eastAsia="Calibri" w:hAnsi="Calibri"/>
+                <w:rFonts w:ascii="Arial" w:cs="Arial" w:eastAsia="Arial" w:hAnsi="Arial"/>
                 <w:b w:val="false"/>
                 <w:bCs w:val="false"/>
                 <w:i w:val="false"/>
@@ -2918,7 +2918,7 @@
             </w:pPr>
             <w:r>
               <w:rPr>
-                <w:rFonts w:ascii="Calibri" w:cs="Calibri" w:eastAsia="Calibri" w:hAnsi="Calibri"/>
+                <w:rFonts w:ascii="Arial" w:cs="Arial" w:eastAsia="Arial" w:hAnsi="Arial"/>
                 <w:b/>
                 <w:bCs/>
                 <w:i w:val="false"/>
@@ -2955,7 +2955,7 @@
             </w:pPr>
             <w:r>
               <w:rPr>
-                <w:rFonts w:ascii="Calibri" w:cs="Calibri" w:eastAsia="Calibri" w:hAnsi="Calibri"/>
+                <w:rFonts w:ascii="Arial" w:cs="Arial" w:eastAsia="Arial" w:hAnsi="Arial"/>
                 <w:b w:val="false"/>
                 <w:bCs w:val="false"/>
                 <w:i w:val="false"/>
@@ -2997,7 +2997,7 @@
             </w:pPr>
             <w:r>
               <w:rPr>
-                <w:rFonts w:ascii="Calibri" w:cs="Calibri" w:eastAsia="Calibri" w:hAnsi="Calibri"/>
+                <w:rFonts w:ascii="Arial" w:cs="Arial" w:eastAsia="Arial" w:hAnsi="Arial"/>
                 <w:b/>
                 <w:bCs/>
                 <w:i w:val="false"/>
@@ -3034,7 +3034,7 @@
             </w:pPr>
             <w:r>
               <w:rPr>
-                <w:rFonts w:ascii="Calibri" w:cs="Calibri" w:eastAsia="Calibri" w:hAnsi="Calibri"/>
+                <w:rFonts w:ascii="Arial" w:cs="Arial" w:eastAsia="Arial" w:hAnsi="Arial"/>
                 <w:b w:val="false"/>
                 <w:bCs w:val="false"/>
                 <w:i w:val="false"/>
@@ -3076,7 +3076,7 @@
             </w:pPr>
             <w:r>
               <w:rPr>
-                <w:rFonts w:ascii="Calibri" w:cs="Calibri" w:eastAsia="Calibri" w:hAnsi="Calibri"/>
+                <w:rFonts w:ascii="Arial" w:cs="Arial" w:eastAsia="Arial" w:hAnsi="Arial"/>
                 <w:b/>
                 <w:bCs/>
                 <w:i w:val="false"/>
@@ -3113,7 +3113,7 @@
             </w:pPr>
             <w:r>
               <w:rPr>
-                <w:rFonts w:ascii="Calibri" w:cs="Calibri" w:eastAsia="Calibri" w:hAnsi="Calibri"/>
+                <w:rFonts w:ascii="Arial" w:cs="Arial" w:eastAsia="Arial" w:hAnsi="Arial"/>
                 <w:b w:val="false"/>
                 <w:bCs w:val="false"/>
                 <w:i w:val="false"/>
@@ -3155,7 +3155,7 @@
             </w:pPr>
             <w:r>
               <w:rPr>
-                <w:rFonts w:ascii="Calibri" w:cs="Calibri" w:eastAsia="Calibri" w:hAnsi="Calibri"/>
+                <w:rFonts w:ascii="Arial" w:cs="Arial" w:eastAsia="Arial" w:hAnsi="Arial"/>
                 <w:b/>
                 <w:bCs/>
                 <w:i w:val="false"/>
@@ -3192,7 +3192,7 @@
             </w:pPr>
             <w:r>
               <w:rPr>
-                <w:rFonts w:ascii="Calibri" w:cs="Calibri" w:eastAsia="Calibri" w:hAnsi="Calibri"/>
+                <w:rFonts w:ascii="Arial" w:cs="Arial" w:eastAsia="Arial" w:hAnsi="Arial"/>
                 <w:b w:val="false"/>
                 <w:bCs w:val="false"/>
                 <w:i w:val="false"/>
@@ -3222,7 +3222,7 @@
       </w:pPr>
       <w:r>
         <w:rPr>
-          <w:rFonts w:ascii="Calibri" w:cs="Calibri" w:eastAsia="Calibri" w:hAnsi="Calibri"/>
+          <w:rFonts w:ascii="Arial" w:cs="Arial" w:eastAsia="Arial" w:hAnsi="Arial"/>
           <w:b/>
           <w:bCs/>
           <w:i w:val="false"/>
@@ -3240,7 +3240,7 @@
       </w:pPr>
       <w:r>
         <w:rPr>
-          <w:rFonts w:ascii="Calibri" w:cs="Calibri" w:eastAsia="Calibri" w:hAnsi="Calibri"/>
+          <w:rFonts w:ascii="Arial" w:cs="Arial" w:eastAsia="Arial" w:hAnsi="Arial"/>
           <w:b w:val="false"/>
           <w:bCs w:val="false"/>
           <w:i w:val="false"/>
@@ -3258,7 +3258,7 @@
       </w:pPr>
       <w:r>
         <w:rPr>
-          <w:rFonts w:ascii="Calibri" w:cs="Calibri" w:eastAsia="Calibri" w:hAnsi="Calibri"/>
+          <w:rFonts w:ascii="Arial" w:cs="Arial" w:eastAsia="Arial" w:hAnsi="Arial"/>
           <w:b w:val="false"/>
           <w:bCs w:val="false"/>
           <w:i w:val="false"/>
@@ -3276,7 +3276,7 @@
       </w:pPr>
       <w:r>
         <w:rPr>
-          <w:rFonts w:ascii="Calibri" w:cs="Calibri" w:eastAsia="Calibri" w:hAnsi="Calibri"/>
+          <w:rFonts w:ascii="Arial" w:cs="Arial" w:eastAsia="Arial" w:hAnsi="Arial"/>
           <w:b w:val="false"/>
           <w:bCs w:val="false"/>
           <w:i w:val="false"/>
@@ -3294,7 +3294,7 @@
       </w:pPr>
       <w:r>
         <w:rPr>
-          <w:rFonts w:ascii="Calibri" w:cs="Calibri" w:eastAsia="Calibri" w:hAnsi="Calibri"/>
+          <w:rFonts w:ascii="Arial" w:cs="Arial" w:eastAsia="Arial" w:hAnsi="Arial"/>
           <w:b w:val="false"/>
           <w:bCs w:val="false"/>
           <w:i w:val="false"/>
@@ -3316,7 +3316,7 @@
       </w:pPr>
       <w:r>
         <w:rPr>
-          <w:rFonts w:ascii="Calibri" w:cs="Calibri" w:eastAsia="Calibri" w:hAnsi="Calibri"/>
+          <w:rFonts w:ascii="Arial" w:cs="Arial" w:eastAsia="Arial" w:hAnsi="Arial"/>
           <w:b/>
           <w:bCs/>
           <w:i w:val="false"/>
@@ -3334,7 +3334,7 @@
       </w:pPr>
       <w:r>
         <w:rPr>
-          <w:rFonts w:ascii="Calibri" w:cs="Calibri" w:eastAsia="Calibri" w:hAnsi="Calibri"/>
+          <w:rFonts w:ascii="Arial" w:cs="Arial" w:eastAsia="Arial" w:hAnsi="Arial"/>
           <w:b w:val="false"/>
           <w:bCs w:val="false"/>
           <w:i w:val="false"/>
@@ -3352,7 +3352,7 @@
       </w:pPr>
       <w:r>
         <w:rPr>
-          <w:rFonts w:ascii="Calibri" w:cs="Calibri" w:eastAsia="Calibri" w:hAnsi="Calibri"/>
+          <w:rFonts w:ascii="Arial" w:cs="Arial" w:eastAsia="Arial" w:hAnsi="Arial"/>
           <w:b w:val="false"/>
           <w:bCs w:val="false"/>
           <w:i w:val="false"/>
@@ -3370,7 +3370,7 @@
       </w:pPr>
       <w:r>
         <w:rPr>
-          <w:rFonts w:ascii="Calibri" w:cs="Calibri" w:eastAsia="Calibri" w:hAnsi="Calibri"/>
+          <w:rFonts w:ascii="Arial" w:cs="Arial" w:eastAsia="Arial" w:hAnsi="Arial"/>
           <w:b w:val="false"/>
           <w:bCs w:val="false"/>
           <w:i w:val="false"/>
@@ -3392,7 +3392,7 @@
       </w:pPr>
       <w:r>
         <w:rPr>
-          <w:rFonts w:ascii="Calibri" w:cs="Calibri" w:eastAsia="Calibri" w:hAnsi="Calibri"/>
+          <w:rFonts w:ascii="Arial" w:cs="Arial" w:eastAsia="Arial" w:hAnsi="Arial"/>
           <w:b/>
           <w:bCs/>
           <w:i w:val="false"/>
@@ -3410,7 +3410,7 @@
       </w:pPr>
       <w:r>
         <w:rPr>
-          <w:rFonts w:ascii="Calibri" w:cs="Calibri" w:eastAsia="Calibri" w:hAnsi="Calibri"/>
+          <w:rFonts w:ascii="Arial" w:cs="Arial" w:eastAsia="Arial" w:hAnsi="Arial"/>
           <w:b w:val="false"/>
           <w:bCs w:val="false"/>
           <w:i w:val="false"/>
@@ -3474,7 +3474,7 @@
             </w:pPr>
             <w:r>
               <w:rPr>
-                <w:rFonts w:ascii="Calibri" w:cs="Calibri" w:eastAsia="Calibri" w:hAnsi="Calibri"/>
+                <w:rFonts w:ascii="Arial" w:cs="Arial" w:eastAsia="Arial" w:hAnsi="Arial"/>
                 <w:b/>
                 <w:bCs/>
                 <w:i w:val="false"/>
@@ -3511,7 +3511,7 @@
             </w:pPr>
             <w:r>
               <w:rPr>
-                <w:rFonts w:ascii="Calibri" w:cs="Calibri" w:eastAsia="Calibri" w:hAnsi="Calibri"/>
+                <w:rFonts w:ascii="Arial" w:cs="Arial" w:eastAsia="Arial" w:hAnsi="Arial"/>
                 <w:b/>
                 <w:bCs/>
                 <w:i w:val="false"/>
@@ -3548,7 +3548,7 @@
             </w:pPr>
             <w:r>
               <w:rPr>
-                <w:rFonts w:ascii="Calibri" w:cs="Calibri" w:eastAsia="Calibri" w:hAnsi="Calibri"/>
+                <w:rFonts w:ascii="Arial" w:cs="Arial" w:eastAsia="Arial" w:hAnsi="Arial"/>
                 <w:b/>
                 <w:bCs/>
                 <w:i w:val="false"/>
@@ -3585,7 +3585,7 @@
             </w:pPr>
             <w:r>
               <w:rPr>
-                <w:rFonts w:ascii="Calibri" w:cs="Calibri" w:eastAsia="Calibri" w:hAnsi="Calibri"/>
+                <w:rFonts w:ascii="Arial" w:cs="Arial" w:eastAsia="Arial" w:hAnsi="Arial"/>
                 <w:b/>
                 <w:bCs/>
                 <w:i w:val="false"/>
@@ -3627,7 +3627,7 @@
             </w:pPr>
             <w:r>
               <w:rPr>
-                <w:rFonts w:ascii="Calibri" w:cs="Calibri" w:eastAsia="Calibri" w:hAnsi="Calibri"/>
+                <w:rFonts w:ascii="Arial" w:cs="Arial" w:eastAsia="Arial" w:hAnsi="Arial"/>
                 <w:b/>
                 <w:bCs/>
                 <w:i w:val="false"/>
@@ -3664,7 +3664,7 @@
             </w:pPr>
             <w:r>
               <w:rPr>
-                <w:rFonts w:ascii="Calibri" w:cs="Calibri" w:eastAsia="Calibri" w:hAnsi="Calibri"/>
+                <w:rFonts w:ascii="Arial" w:cs="Arial" w:eastAsia="Arial" w:hAnsi="Arial"/>
                 <w:b w:val="false"/>
                 <w:bCs w:val="false"/>
                 <w:i w:val="false"/>
@@ -3701,7 +3701,7 @@
             </w:pPr>
             <w:r>
               <w:rPr>
-                <w:rFonts w:ascii="Calibri" w:cs="Calibri" w:eastAsia="Calibri" w:hAnsi="Calibri"/>
+                <w:rFonts w:ascii="Arial" w:cs="Arial" w:eastAsia="Arial" w:hAnsi="Arial"/>
                 <w:b w:val="false"/>
                 <w:bCs w:val="false"/>
                 <w:i w:val="false"/>
@@ -3738,7 +3738,7 @@
             </w:pPr>
             <w:r>
               <w:rPr>
-                <w:rFonts w:ascii="Calibri" w:cs="Calibri" w:eastAsia="Calibri" w:hAnsi="Calibri"/>
+                <w:rFonts w:ascii="Arial" w:cs="Arial" w:eastAsia="Arial" w:hAnsi="Arial"/>
                 <w:b w:val="false"/>
                 <w:bCs w:val="false"/>
                 <w:i w:val="false"/>
@@ -3780,7 +3780,7 @@
             </w:pPr>
             <w:r>
               <w:rPr>
-                <w:rFonts w:ascii="Calibri" w:cs="Calibri" w:eastAsia="Calibri" w:hAnsi="Calibri"/>
+                <w:rFonts w:ascii="Arial" w:cs="Arial" w:eastAsia="Arial" w:hAnsi="Arial"/>
                 <w:b/>
                 <w:bCs/>
                 <w:i w:val="false"/>
@@ -3817,7 +3817,7 @@
             </w:pPr>
             <w:r>
               <w:rPr>
-                <w:rFonts w:ascii="Calibri" w:cs="Calibri" w:eastAsia="Calibri" w:hAnsi="Calibri"/>
+                <w:rFonts w:ascii="Arial" w:cs="Arial" w:eastAsia="Arial" w:hAnsi="Arial"/>
                 <w:b w:val="false"/>
                 <w:bCs w:val="false"/>
                 <w:i w:val="false"/>
@@ -3854,7 +3854,7 @@
             </w:pPr>
             <w:r>
               <w:rPr>
-                <w:rFonts w:ascii="Calibri" w:cs="Calibri" w:eastAsia="Calibri" w:hAnsi="Calibri"/>
+                <w:rFonts w:ascii="Arial" w:cs="Arial" w:eastAsia="Arial" w:hAnsi="Arial"/>
                 <w:b w:val="false"/>
                 <w:bCs w:val="false"/>
                 <w:i w:val="false"/>
@@ -3891,7 +3891,7 @@
             </w:pPr>
             <w:r>
               <w:rPr>
-                <w:rFonts w:ascii="Calibri" w:cs="Calibri" w:eastAsia="Calibri" w:hAnsi="Calibri"/>
+                <w:rFonts w:ascii="Arial" w:cs="Arial" w:eastAsia="Arial" w:hAnsi="Arial"/>
                 <w:b w:val="false"/>
                 <w:bCs w:val="false"/>
                 <w:i w:val="false"/>
@@ -3933,7 +3933,7 @@
             </w:pPr>
             <w:r>
               <w:rPr>
-                <w:rFonts w:ascii="Calibri" w:cs="Calibri" w:eastAsia="Calibri" w:hAnsi="Calibri"/>
+                <w:rFonts w:ascii="Arial" w:cs="Arial" w:eastAsia="Arial" w:hAnsi="Arial"/>
                 <w:b/>
                 <w:bCs/>
                 <w:i w:val="false"/>
@@ -3970,7 +3970,7 @@
             </w:pPr>
             <w:r>
               <w:rPr>
-                <w:rFonts w:ascii="Calibri" w:cs="Calibri" w:eastAsia="Calibri" w:hAnsi="Calibri"/>
+                <w:rFonts w:ascii="Arial" w:cs="Arial" w:eastAsia="Arial" w:hAnsi="Arial"/>
                 <w:b w:val="false"/>
                 <w:bCs w:val="false"/>
                 <w:i w:val="false"/>
@@ -4007,7 +4007,7 @@
             </w:pPr>
             <w:r>
               <w:rPr>
-                <w:rFonts w:ascii="Calibri" w:cs="Calibri" w:eastAsia="Calibri" w:hAnsi="Calibri"/>
+                <w:rFonts w:ascii="Arial" w:cs="Arial" w:eastAsia="Arial" w:hAnsi="Arial"/>
                 <w:b w:val="false"/>
                 <w:bCs w:val="false"/>
                 <w:i w:val="false"/>
@@ -4044,7 +4044,7 @@
             </w:pPr>
             <w:r>
               <w:rPr>
-                <w:rFonts w:ascii="Calibri" w:cs="Calibri" w:eastAsia="Calibri" w:hAnsi="Calibri"/>
+                <w:rFonts w:ascii="Arial" w:cs="Arial" w:eastAsia="Arial" w:hAnsi="Arial"/>
                 <w:b w:val="false"/>
                 <w:bCs w:val="false"/>
                 <w:i w:val="false"/>
@@ -4086,7 +4086,7 @@
             </w:pPr>
             <w:r>
               <w:rPr>
-                <w:rFonts w:ascii="Calibri" w:cs="Calibri" w:eastAsia="Calibri" w:hAnsi="Calibri"/>
+                <w:rFonts w:ascii="Arial" w:cs="Arial" w:eastAsia="Arial" w:hAnsi="Arial"/>
                 <w:b/>
                 <w:bCs/>
                 <w:i w:val="false"/>
@@ -4123,7 +4123,7 @@
             </w:pPr>
             <w:r>
               <w:rPr>
-                <w:rFonts w:ascii="Calibri" w:cs="Calibri" w:eastAsia="Calibri" w:hAnsi="Calibri"/>
+                <w:rFonts w:ascii="Arial" w:cs="Arial" w:eastAsia="Arial" w:hAnsi="Arial"/>
                 <w:b w:val="false"/>
                 <w:bCs w:val="false"/>
                 <w:i w:val="false"/>
@@ -4160,7 +4160,7 @@
             </w:pPr>
             <w:r>
               <w:rPr>
-                <w:rFonts w:ascii="Calibri" w:cs="Calibri" w:eastAsia="Calibri" w:hAnsi="Calibri"/>
+                <w:rFonts w:ascii="Arial" w:cs="Arial" w:eastAsia="Arial" w:hAnsi="Arial"/>
                 <w:b w:val="false"/>
                 <w:bCs w:val="false"/>
                 <w:i w:val="false"/>
@@ -4197,7 +4197,7 @@
             </w:pPr>
             <w:r>
               <w:rPr>
-                <w:rFonts w:ascii="Calibri" w:cs="Calibri" w:eastAsia="Calibri" w:hAnsi="Calibri"/>
+                <w:rFonts w:ascii="Arial" w:cs="Arial" w:eastAsia="Arial" w:hAnsi="Arial"/>
                 <w:b w:val="false"/>
                 <w:bCs w:val="false"/>
                 <w:i w:val="false"/>
@@ -4223,7 +4223,7 @@
       </w:pPr>
       <w:r>
         <w:rPr>
-          <w:rFonts w:ascii="Calibri" w:cs="Calibri" w:eastAsia="Calibri" w:hAnsi="Calibri"/>
+          <w:rFonts w:ascii="Arial" w:cs="Arial" w:eastAsia="Arial" w:hAnsi="Arial"/>
           <w:b w:val="false"/>
           <w:bCs w:val="false"/>
           <w:i w:val="false"/>
@@ -4241,7 +4241,7 @@
       </w:pPr>
       <w:r>
         <w:rPr>
-          <w:rFonts w:ascii="Calibri" w:cs="Calibri" w:eastAsia="Calibri" w:hAnsi="Calibri"/>
+          <w:rFonts w:ascii="Arial" w:cs="Arial" w:eastAsia="Arial" w:hAnsi="Arial"/>
           <w:b w:val="false"/>
           <w:bCs w:val="false"/>
           <w:i w:val="false"/>
@@ -4259,7 +4259,7 @@
       </w:pPr>
       <w:r>
         <w:rPr>
-          <w:rFonts w:ascii="Calibri" w:cs="Calibri" w:eastAsia="Calibri" w:hAnsi="Calibri"/>
+          <w:rFonts w:ascii="Arial" w:cs="Arial" w:eastAsia="Arial" w:hAnsi="Arial"/>
           <w:b w:val="false"/>
           <w:bCs w:val="false"/>
           <w:i w:val="false"/>
@@ -4313,7 +4313,7 @@
             </w:pPr>
             <w:r>
               <w:rPr>
-                <w:rFonts w:ascii="Calibri" w:cs="Calibri" w:eastAsia="Calibri" w:hAnsi="Calibri"/>
+                <w:rFonts w:ascii="Arial" w:cs="Arial" w:eastAsia="Arial" w:hAnsi="Arial"/>
                 <w:b w:val="false"/>
                 <w:bCs w:val="false"/>
                 <w:i/>
@@ -4343,7 +4343,7 @@
       </w:pPr>
       <w:r>
         <w:rPr>
-          <w:rFonts w:ascii="Calibri" w:cs="Calibri" w:eastAsia="Calibri" w:hAnsi="Calibri"/>
+          <w:rFonts w:ascii="Arial" w:cs="Arial" w:eastAsia="Arial" w:hAnsi="Arial"/>
           <w:b/>
           <w:bCs/>
           <w:i w:val="false"/>
@@ -4361,7 +4361,7 @@
       </w:pPr>
       <w:r>
         <w:rPr>
-          <w:rFonts w:ascii="Calibri" w:cs="Calibri" w:eastAsia="Calibri" w:hAnsi="Calibri"/>
+          <w:rFonts w:ascii="Arial" w:cs="Arial" w:eastAsia="Arial" w:hAnsi="Arial"/>
           <w:b w:val="false"/>
           <w:bCs w:val="false"/>
           <w:i w:val="false"/>
@@ -4379,7 +4379,7 @@
       </w:pPr>
       <w:r>
         <w:rPr>
-          <w:rFonts w:ascii="Calibri" w:cs="Calibri" w:eastAsia="Calibri" w:hAnsi="Calibri"/>
+          <w:rFonts w:ascii="Arial" w:cs="Arial" w:eastAsia="Arial" w:hAnsi="Arial"/>
           <w:b w:val="false"/>
           <w:bCs w:val="false"/>
           <w:i w:val="false"/>
@@ -4397,7 +4397,7 @@
       </w:pPr>
       <w:r>
         <w:rPr>
-          <w:rFonts w:ascii="Calibri" w:cs="Calibri" w:eastAsia="Calibri" w:hAnsi="Calibri"/>
+          <w:rFonts w:ascii="Arial" w:cs="Arial" w:eastAsia="Arial" w:hAnsi="Arial"/>
           <w:b w:val="false"/>
           <w:bCs w:val="false"/>
           <w:i w:val="false"/>
@@ -4419,7 +4419,7 @@
       </w:pPr>
       <w:r>
         <w:rPr>
-          <w:rFonts w:ascii="Calibri" w:cs="Calibri" w:eastAsia="Calibri" w:hAnsi="Calibri"/>
+          <w:rFonts w:ascii="Arial" w:cs="Arial" w:eastAsia="Arial" w:hAnsi="Arial"/>
           <w:b/>
           <w:bCs/>
           <w:i w:val="false"/>
@@ -4437,7 +4437,7 @@
       </w:pPr>
       <w:r>
         <w:rPr>
-          <w:rFonts w:ascii="Calibri" w:cs="Calibri" w:eastAsia="Calibri" w:hAnsi="Calibri"/>
+          <w:rFonts w:ascii="Arial" w:cs="Arial" w:eastAsia="Arial" w:hAnsi="Arial"/>
           <w:b w:val="false"/>
           <w:bCs w:val="false"/>
           <w:i w:val="false"/>
@@ -4455,7 +4455,7 @@
       </w:pPr>
       <w:r>
         <w:rPr>
-          <w:rFonts w:ascii="Calibri" w:cs="Calibri" w:eastAsia="Calibri" w:hAnsi="Calibri"/>
+          <w:rFonts w:ascii="Arial" w:cs="Arial" w:eastAsia="Arial" w:hAnsi="Arial"/>
           <w:b w:val="false"/>
           <w:bCs w:val="false"/>
           <w:i w:val="false"/>
@@ -4477,7 +4477,7 @@
       </w:pPr>
       <w:r>
         <w:rPr>
-          <w:rFonts w:ascii="Calibri" w:cs="Calibri" w:eastAsia="Calibri" w:hAnsi="Calibri"/>
+          <w:rFonts w:ascii="Arial" w:cs="Arial" w:eastAsia="Arial" w:hAnsi="Arial"/>
           <w:b/>
           <w:bCs/>
           <w:i w:val="false"/>
@@ -4495,7 +4495,7 @@
       </w:pPr>
       <w:r>
         <w:rPr>
-          <w:rFonts w:ascii="Calibri" w:cs="Calibri" w:eastAsia="Calibri" w:hAnsi="Calibri"/>
+          <w:rFonts w:ascii="Arial" w:cs="Arial" w:eastAsia="Arial" w:hAnsi="Arial"/>
           <w:b w:val="false"/>
           <w:bCs w:val="false"/>
           <w:i w:val="false"/>
@@ -4517,7 +4517,7 @@
       </w:pPr>
       <w:r>
         <w:rPr>
-          <w:rFonts w:ascii="Calibri" w:cs="Calibri" w:eastAsia="Calibri" w:hAnsi="Calibri"/>
+          <w:rFonts w:ascii="Arial" w:cs="Arial" w:eastAsia="Arial" w:hAnsi="Arial"/>
           <w:b/>
           <w:bCs/>
           <w:i w:val="false"/>
@@ -4535,7 +4535,7 @@
       </w:pPr>
       <w:r>
         <w:rPr>
-          <w:rFonts w:ascii="Calibri" w:cs="Calibri" w:eastAsia="Calibri" w:hAnsi="Calibri"/>
+          <w:rFonts w:ascii="Arial" w:cs="Arial" w:eastAsia="Arial" w:hAnsi="Arial"/>
           <w:b w:val="false"/>
           <w:bCs w:val="false"/>
           <w:i w:val="false"/>
@@ -4546,11 +4546,11 @@
         </w:rPr>
         <w:t xml:space="preserve">The reference implementation is </w:t>
       </w:r>
-      <w:hyperlink w:history="1" r:id="rIdqdj1idsf27jsxc0awcrke">
+      <w:hyperlink w:history="1" r:id="rIdl9d89mmgcbttwxz3jhol0">
         <w:r>
           <w:rPr>
             <w:rStyle w:val="Hyperlink"/>
-            <w:rFonts w:ascii="Calibri" w:cs="Calibri" w:eastAsia="Calibri" w:hAnsi="Calibri"/>
+            <w:rFonts w:ascii="Arial" w:cs="Arial" w:eastAsia="Arial" w:hAnsi="Arial"/>
             <w:sz w:val="22"/>
             <w:szCs w:val="22"/>
           </w:rPr>
@@ -4559,7 +4559,7 @@
       </w:hyperlink>
       <w:r>
         <w:rPr>
-          <w:rFonts w:ascii="Calibri" w:cs="Calibri" w:eastAsia="Calibri" w:hAnsi="Calibri"/>
+          <w:rFonts w:ascii="Arial" w:cs="Arial" w:eastAsia="Arial" w:hAnsi="Arial"/>
           <w:b w:val="false"/>
           <w:bCs w:val="false"/>
           <w:i w:val="false"/>
@@ -4577,7 +4577,7 @@
       </w:pPr>
       <w:r>
         <w:rPr>
-          <w:rFonts w:ascii="Calibri" w:cs="Calibri" w:eastAsia="Calibri" w:hAnsi="Calibri"/>
+          <w:rFonts w:ascii="Arial" w:cs="Arial" w:eastAsia="Arial" w:hAnsi="Arial"/>
           <w:b w:val="false"/>
           <w:bCs w:val="false"/>
           <w:i w:val="false"/>
@@ -4596,7 +4596,7 @@
       </w:pPr>
       <w:r>
         <w:rPr>
-          <w:rFonts w:ascii="Consolas" w:cs="Consolas" w:eastAsia="Consolas" w:hAnsi="Consolas"/>
+          <w:rFonts w:ascii="Menlo" w:cs="Menlo" w:eastAsia="Menlo" w:hAnsi="Menlo"/>
           <w:b w:val="false"/>
           <w:bCs w:val="false"/>
           <w:i w:val="false"/>
@@ -4615,7 +4615,7 @@
       </w:pPr>
       <w:r>
         <w:rPr>
-          <w:rFonts w:ascii="Consolas" w:cs="Consolas" w:eastAsia="Consolas" w:hAnsi="Consolas"/>
+          <w:rFonts w:ascii="Menlo" w:cs="Menlo" w:eastAsia="Menlo" w:hAnsi="Menlo"/>
           <w:b w:val="false"/>
           <w:bCs w:val="false"/>
           <w:i w:val="false"/>
@@ -4634,7 +4634,7 @@
       </w:pPr>
       <w:r>
         <w:rPr>
-          <w:rFonts w:ascii="Consolas" w:cs="Consolas" w:eastAsia="Consolas" w:hAnsi="Consolas"/>
+          <w:rFonts w:ascii="Menlo" w:cs="Menlo" w:eastAsia="Menlo" w:hAnsi="Menlo"/>
           <w:b w:val="false"/>
           <w:bCs w:val="false"/>
           <w:i w:val="false"/>
@@ -4653,7 +4653,7 @@
       </w:pPr>
       <w:r>
         <w:rPr>
-          <w:rFonts w:ascii="Consolas" w:cs="Consolas" w:eastAsia="Consolas" w:hAnsi="Consolas"/>
+          <w:rFonts w:ascii="Menlo" w:cs="Menlo" w:eastAsia="Menlo" w:hAnsi="Menlo"/>
           <w:b w:val="false"/>
           <w:bCs w:val="false"/>
           <w:i w:val="false"/>
@@ -4672,7 +4672,7 @@
       </w:pPr>
       <w:r>
         <w:rPr>
-          <w:rFonts w:ascii="Consolas" w:cs="Consolas" w:eastAsia="Consolas" w:hAnsi="Consolas"/>
+          <w:rFonts w:ascii="Menlo" w:cs="Menlo" w:eastAsia="Menlo" w:hAnsi="Menlo"/>
           <w:b w:val="false"/>
           <w:bCs w:val="false"/>
           <w:i w:val="false"/>
@@ -4691,7 +4691,7 @@
       </w:pPr>
       <w:r>
         <w:rPr>
-          <w:rFonts w:ascii="Consolas" w:cs="Consolas" w:eastAsia="Consolas" w:hAnsi="Consolas"/>
+          <w:rFonts w:ascii="Menlo" w:cs="Menlo" w:eastAsia="Menlo" w:hAnsi="Menlo"/>
           <w:b w:val="false"/>
           <w:bCs w:val="false"/>
           <w:i w:val="false"/>
@@ -4710,7 +4710,7 @@
       </w:pPr>
       <w:r>
         <w:rPr>
-          <w:rFonts w:ascii="Consolas" w:cs="Consolas" w:eastAsia="Consolas" w:hAnsi="Consolas"/>
+          <w:rFonts w:ascii="Menlo" w:cs="Menlo" w:eastAsia="Menlo" w:hAnsi="Menlo"/>
           <w:b w:val="false"/>
           <w:bCs w:val="false"/>
           <w:i w:val="false"/>
@@ -4729,7 +4729,7 @@
       </w:pPr>
       <w:r>
         <w:rPr>
-          <w:rFonts w:ascii="Consolas" w:cs="Consolas" w:eastAsia="Consolas" w:hAnsi="Consolas"/>
+          <w:rFonts w:ascii="Menlo" w:cs="Menlo" w:eastAsia="Menlo" w:hAnsi="Menlo"/>
           <w:b w:val="false"/>
           <w:bCs w:val="false"/>
           <w:i w:val="false"/>
@@ -4748,7 +4748,7 @@
       </w:pPr>
       <w:r>
         <w:rPr>
-          <w:rFonts w:ascii="Consolas" w:cs="Consolas" w:eastAsia="Consolas" w:hAnsi="Consolas"/>
+          <w:rFonts w:ascii="Menlo" w:cs="Menlo" w:eastAsia="Menlo" w:hAnsi="Menlo"/>
           <w:b w:val="false"/>
           <w:bCs w:val="false"/>
           <w:i w:val="false"/>
@@ -4767,7 +4767,7 @@
       </w:pPr>
       <w:r>
         <w:rPr>
-          <w:rFonts w:ascii="Consolas" w:cs="Consolas" w:eastAsia="Consolas" w:hAnsi="Consolas"/>
+          <w:rFonts w:ascii="Menlo" w:cs="Menlo" w:eastAsia="Menlo" w:hAnsi="Menlo"/>
           <w:b w:val="false"/>
           <w:bCs w:val="false"/>
           <w:i w:val="false"/>
@@ -4786,7 +4786,7 @@
       </w:pPr>
       <w:r>
         <w:rPr>
-          <w:rFonts w:ascii="Consolas" w:cs="Consolas" w:eastAsia="Consolas" w:hAnsi="Consolas"/>
+          <w:rFonts w:ascii="Menlo" w:cs="Menlo" w:eastAsia="Menlo" w:hAnsi="Menlo"/>
           <w:b w:val="false"/>
           <w:bCs w:val="false"/>
           <w:i w:val="false"/>
@@ -4809,7 +4809,7 @@
       </w:pPr>
       <w:r>
         <w:rPr>
-          <w:rFonts w:ascii="Calibri" w:cs="Calibri" w:eastAsia="Calibri" w:hAnsi="Calibri"/>
+          <w:rFonts w:ascii="Arial" w:cs="Arial" w:eastAsia="Arial" w:hAnsi="Arial"/>
           <w:b w:val="false"/>
           <w:bCs w:val="false"/>
           <w:i w:val="false"/>
@@ -4828,7 +4828,7 @@
       </w:pPr>
       <w:r>
         <w:rPr>
-          <w:rFonts w:ascii="Consolas" w:cs="Consolas" w:eastAsia="Consolas" w:hAnsi="Consolas"/>
+          <w:rFonts w:ascii="Menlo" w:cs="Menlo" w:eastAsia="Menlo" w:hAnsi="Menlo"/>
           <w:b w:val="false"/>
           <w:bCs w:val="false"/>
           <w:i w:val="false"/>
@@ -4847,7 +4847,7 @@
       </w:pPr>
       <w:r>
         <w:rPr>
-          <w:rFonts w:ascii="Consolas" w:cs="Consolas" w:eastAsia="Consolas" w:hAnsi="Consolas"/>
+          <w:rFonts w:ascii="Menlo" w:cs="Menlo" w:eastAsia="Menlo" w:hAnsi="Menlo"/>
           <w:b w:val="false"/>
           <w:bCs w:val="false"/>
           <w:i w:val="false"/>
@@ -4866,7 +4866,7 @@
       </w:pPr>
       <w:r>
         <w:rPr>
-          <w:rFonts w:ascii="Consolas" w:cs="Consolas" w:eastAsia="Consolas" w:hAnsi="Consolas"/>
+          <w:rFonts w:ascii="Menlo" w:cs="Menlo" w:eastAsia="Menlo" w:hAnsi="Menlo"/>
           <w:b w:val="false"/>
           <w:bCs w:val="false"/>
           <w:i w:val="false"/>
@@ -4889,7 +4889,7 @@
       </w:pPr>
       <w:r>
         <w:rPr>
-          <w:rFonts w:ascii="Calibri" w:cs="Calibri" w:eastAsia="Calibri" w:hAnsi="Calibri"/>
+          <w:rFonts w:ascii="Arial" w:cs="Arial" w:eastAsia="Arial" w:hAnsi="Arial"/>
           <w:b w:val="false"/>
           <w:bCs w:val="false"/>
           <w:i w:val="false"/>
@@ -4911,7 +4911,7 @@
       </w:pPr>
       <w:r>
         <w:rPr>
-          <w:rFonts w:ascii="Calibri" w:cs="Calibri" w:eastAsia="Calibri" w:hAnsi="Calibri"/>
+          <w:rFonts w:ascii="Arial" w:cs="Arial" w:eastAsia="Arial" w:hAnsi="Arial"/>
           <w:b/>
           <w:bCs/>
           <w:i w:val="false"/>
@@ -4929,7 +4929,7 @@
       </w:pPr>
       <w:r>
         <w:rPr>
-          <w:rFonts w:ascii="Calibri" w:cs="Calibri" w:eastAsia="Calibri" w:hAnsi="Calibri"/>
+          <w:rFonts w:ascii="Arial" w:cs="Arial" w:eastAsia="Arial" w:hAnsi="Arial"/>
           <w:b w:val="false"/>
           <w:bCs w:val="false"/>
           <w:i w:val="false"/>
@@ -4947,7 +4947,7 @@
       </w:pPr>
       <w:r>
         <w:rPr>
-          <w:rFonts w:ascii="Calibri" w:cs="Calibri" w:eastAsia="Calibri" w:hAnsi="Calibri"/>
+          <w:rFonts w:ascii="Arial" w:cs="Arial" w:eastAsia="Arial" w:hAnsi="Arial"/>
           <w:b w:val="false"/>
           <w:bCs w:val="false"/>
           <w:i w:val="false"/>
@@ -4965,7 +4965,7 @@
       </w:pPr>
       <w:r>
         <w:rPr>
-          <w:rFonts w:ascii="Calibri" w:cs="Calibri" w:eastAsia="Calibri" w:hAnsi="Calibri"/>
+          <w:rFonts w:ascii="Arial" w:cs="Arial" w:eastAsia="Arial" w:hAnsi="Arial"/>
           <w:b w:val="false"/>
           <w:bCs w:val="false"/>
           <w:i w:val="false"/>
@@ -4987,7 +4987,7 @@
       </w:pPr>
       <w:r>
         <w:rPr>
-          <w:rFonts w:ascii="Calibri" w:cs="Calibri" w:eastAsia="Calibri" w:hAnsi="Calibri"/>
+          <w:rFonts w:ascii="Arial" w:cs="Arial" w:eastAsia="Arial" w:hAnsi="Arial"/>
           <w:b/>
           <w:bCs/>
           <w:i w:val="false"/>
@@ -5005,7 +5005,7 @@
       </w:pPr>
       <w:r>
         <w:rPr>
-          <w:rFonts w:ascii="Calibri" w:cs="Calibri" w:eastAsia="Calibri" w:hAnsi="Calibri"/>
+          <w:rFonts w:ascii="Arial" w:cs="Arial" w:eastAsia="Arial" w:hAnsi="Arial"/>
           <w:b w:val="false"/>
           <w:bCs w:val="false"/>
           <w:i w:val="false"/>
@@ -5028,7 +5028,7 @@
       </w:pPr>
       <w:r>
         <w:rPr>
-          <w:rFonts w:ascii="Calibri" w:cs="Calibri" w:eastAsia="Calibri" w:hAnsi="Calibri"/>
+          <w:rFonts w:ascii="Arial" w:cs="Arial" w:eastAsia="Arial" w:hAnsi="Arial"/>
           <w:b/>
           <w:bCs/>
           <w:i w:val="false"/>
@@ -5046,7 +5046,7 @@
       </w:pPr>
       <w:r>
         <w:rPr>
-          <w:rFonts w:ascii="Calibri" w:cs="Calibri" w:eastAsia="Calibri" w:hAnsi="Calibri"/>
+          <w:rFonts w:ascii="Arial" w:cs="Arial" w:eastAsia="Arial" w:hAnsi="Arial"/>
           <w:b w:val="false"/>
           <w:bCs w:val="false"/>
           <w:i w:val="false"/>
@@ -5057,11 +5057,11 @@
         </w:rPr>
         <w:t xml:space="preserve">Reference code: </w:t>
       </w:r>
-      <w:hyperlink w:history="1" r:id="rId6l5r0xdl-e3y9ion5n2wh">
+      <w:hyperlink w:history="1" r:id="rIduzr0l3bvucjhpbohrmxop">
         <w:r>
           <w:rPr>
             <w:rStyle w:val="Hyperlink"/>
-            <w:rFonts w:ascii="Calibri" w:cs="Calibri" w:eastAsia="Calibri" w:hAnsi="Calibri"/>
+            <w:rFonts w:ascii="Arial" w:cs="Arial" w:eastAsia="Arial" w:hAnsi="Arial"/>
             <w:sz w:val="22"/>
             <w:szCs w:val="22"/>
           </w:rPr>
@@ -5075,7 +5075,7 @@
       </w:pPr>
       <w:r>
         <w:rPr>
-          <w:rFonts w:ascii="Calibri" w:cs="Calibri" w:eastAsia="Calibri" w:hAnsi="Calibri"/>
+          <w:rFonts w:ascii="Arial" w:cs="Arial" w:eastAsia="Arial" w:hAnsi="Arial"/>
           <w:b w:val="false"/>
           <w:bCs w:val="false"/>
           <w:i/>
@@ -5148,7 +5148,7 @@
     </w:pPr>
     <w:r>
       <w:rPr>
-        <w:rFonts w:ascii="Calibri" w:cs="Calibri" w:eastAsia="Calibri" w:hAnsi="Calibri"/>
+        <w:rFonts w:ascii="Arial" w:cs="Arial" w:eastAsia="Arial" w:hAnsi="Arial"/>
         <w:b w:val="false"/>
         <w:bCs w:val="false"/>
         <w:i/>
@@ -5161,7 +5161,7 @@
     </w:r>
     <w:r>
       <w:rPr>
-        <w:rFonts w:ascii="Calibri" w:cs="Calibri" w:eastAsia="Calibri" w:hAnsi="Calibri"/>
+        <w:rFonts w:ascii="Arial" w:cs="Arial" w:eastAsia="Arial" w:hAnsi="Arial"/>
         <w:b w:val="false"/>
         <w:bCs w:val="false"/>
         <w:i w:val="false"/>
@@ -5174,7 +5174,7 @@
     </w:r>
     <w:r>
       <w:rPr>
-        <w:rFonts w:ascii="Calibri" w:cs="Calibri" w:eastAsia="Calibri" w:hAnsi="Calibri"/>
+        <w:rFonts w:ascii="Arial" w:cs="Arial" w:eastAsia="Arial" w:hAnsi="Arial"/>
         <w:color w:val="5E6A71"/>
         <w:sz w:val="16"/>
         <w:szCs w:val="16"/>
@@ -5186,7 +5186,7 @@
     </w:r>
     <w:r>
       <w:rPr>
-        <w:rFonts w:ascii="Calibri" w:cs="Calibri" w:eastAsia="Calibri" w:hAnsi="Calibri"/>
+        <w:rFonts w:ascii="Arial" w:cs="Arial" w:eastAsia="Arial" w:hAnsi="Arial"/>
         <w:b w:val="false"/>
         <w:bCs w:val="false"/>
         <w:i w:val="false"/>
@@ -5199,7 +5199,7 @@
     </w:r>
     <w:r>
       <w:rPr>
-        <w:rFonts w:ascii="Calibri" w:cs="Calibri" w:eastAsia="Calibri" w:hAnsi="Calibri"/>
+        <w:rFonts w:ascii="Arial" w:cs="Arial" w:eastAsia="Arial" w:hAnsi="Arial"/>
         <w:color w:val="5E6A71"/>
         <w:sz w:val="16"/>
         <w:szCs w:val="16"/>
@@ -5261,7 +5261,7 @@
     </w:pPr>
     <w:r>
       <w:rPr>
-        <w:rFonts w:ascii="Calibri" w:cs="Calibri" w:eastAsia="Calibri" w:hAnsi="Calibri"/>
+        <w:rFonts w:ascii="Arial" w:cs="Arial" w:eastAsia="Arial" w:hAnsi="Arial"/>
         <w:b w:val="false"/>
         <w:bCs w:val="false"/>
         <w:i w:val="false"/>
@@ -5274,7 +5274,7 @@
     </w:r>
     <w:r>
       <w:rPr>
-        <w:rFonts w:ascii="Calibri" w:cs="Calibri" w:eastAsia="Calibri" w:hAnsi="Calibri"/>
+        <w:rFonts w:ascii="Arial" w:cs="Arial" w:eastAsia="Arial" w:hAnsi="Arial"/>
         <w:b w:val="false"/>
         <w:bCs w:val="false"/>
         <w:i w:val="false"/>
@@ -5287,7 +5287,7 @@
     </w:r>
     <w:r>
       <w:rPr>
-        <w:rFonts w:ascii="Calibri" w:cs="Calibri" w:eastAsia="Calibri" w:hAnsi="Calibri"/>
+        <w:rFonts w:ascii="Arial" w:cs="Arial" w:eastAsia="Arial" w:hAnsi="Arial"/>
         <w:b w:val="false"/>
         <w:bCs w:val="false"/>
         <w:i/>
@@ -5444,7 +5444,7 @@
   <w:docDefaults>
     <w:rPrDefault>
       <w:rPr>
-        <w:rFonts w:ascii="Calibri" w:cs="Calibri" w:eastAsia="Calibri" w:hAnsi="Calibri"/>
+        <w:rFonts w:ascii="Arial" w:cs="Arial" w:eastAsia="Arial" w:hAnsi="Arial"/>
         <w:color w:val="243038"/>
         <w:sz w:val="22"/>
         <w:szCs w:val="22"/>
@@ -5615,7 +5615,7 @@
       <w:outlineLvl w:val="0"/>
     </w:pPr>
     <w:rPr>
-      <w:rFonts w:ascii="Calibri" w:cs="Calibri" w:eastAsia="Calibri" w:hAnsi="Calibri"/>
+      <w:rFonts w:ascii="Arial" w:cs="Arial" w:eastAsia="Arial" w:hAnsi="Arial"/>
       <w:b/>
       <w:bCs/>
       <w:color w:val="1B3A4B"/>
@@ -5633,7 +5633,7 @@
       <w:outlineLvl w:val="1"/>
     </w:pPr>
     <w:rPr>
-      <w:rFonts w:ascii="Calibri" w:cs="Calibri" w:eastAsia="Calibri" w:hAnsi="Calibri"/>
+      <w:rFonts w:ascii="Arial" w:cs="Arial" w:eastAsia="Arial" w:hAnsi="Arial"/>
       <w:b/>
       <w:bCs/>
       <w:color w:val="1B3A4B"/>
@@ -5685,9 +5685,9 @@
         <a:srgbClr val="954F72"/>
       </a:folHlink>
     </a:clrScheme>
-    <a:fontScheme name="Office">
+    <a:fontScheme name="Office Theme">
       <a:majorFont>
-        <a:latin typeface="Calibri Light" panose="020F0302020204030204"/>
+        <a:latin typeface="Arial"/>
         <a:ea typeface=""/>
         <a:cs typeface=""/>
         <a:font script="Jpan" typeface="游ゴシック Light"/>
@@ -5739,7 +5739,7 @@
         <a:font script="Tfng" typeface="Ebrima"/>
       </a:majorFont>
       <a:minorFont>
-        <a:latin typeface="Calibri" panose="020F0502020204030204"/>
+        <a:latin typeface="Arial"/>
         <a:ea typeface=""/>
         <a:cs typeface=""/>
         <a:font script="Jpan" typeface="游明朝"/>

</xml_diff>

<commit_message>
Treat the checked-in skills as samples, not the library.
Point the router at skills you wrote or at forcedotcom/sf-skills. The sample count is only the set the post measured.
</commit_message>
<xml_diff>
--- a/docs/Load-the-Right-Skill-First.docx
+++ b/docs/Load-the-Right-Skill-First.docx
@@ -53,7 +53,7 @@
           <w:sz w:val="24"/>
           <w:szCs w:val="24"/>
         </w:rPr>
-        <w:t xml:space="preserve">Everyone has a skill library now. The part that matters is which skill a prompt actually loads.</w:t>
+        <w:t xml:space="preserve">Everyone has a skill library now. The part that matters is which skills a prompt actually loads.</w:t>
       </w:r>
     </w:p>
     <w:p>
@@ -618,7 +618,43 @@
           <w:sz w:val="22"/>
           <w:szCs w:val="22"/>
         </w:rPr>
-        <w:t xml:space="preserve">That second question is the whole product. The catalog measured in this repo is 19 skills. The router reads the prompt, compares it with skill names and descriptions, and returns the skills to load. A prompt about one job returns one skill. A prompt that asks for two jobs returns both. If the match is weak, it returns an empty list. Empty is a successful answer. A router that always picks something will eventually follow the wrong playbook with complete confidence.</w:t>
+        <w:t xml:space="preserve">That second question is the whole product. The router reads the prompt, compares it with skill names and descriptions, and returns the skills to load. A prompt about one job returns one skill. A prompt that asks for two jobs returns both. If the match is weak, it returns an empty list. Empty is a successful answer. A router that always picks something will eventually follow the wrong playbook with complete confidence.</w:t>
+      </w:r>
+    </w:p>
+    <w:p>
+      <w:pPr>
+        <w:spacing w:after="160" w:before="0" w:line="288"/>
+      </w:pPr>
+      <w:r>
+        <w:rPr>
+          <w:rFonts w:ascii="Arial" w:cs="Arial" w:eastAsia="Arial" w:hAnsi="Arial"/>
+          <w:b w:val="false"/>
+          <w:bCs w:val="false"/>
+          <w:i w:val="false"/>
+          <w:iCs w:val="false"/>
+          <w:color w:val="243038"/>
+          <w:sz w:val="22"/>
+          <w:szCs w:val="22"/>
+        </w:rPr>
+        <w:t xml:space="preserve">The skills checked into this repo are samples. They are here so the route can be shown and the numbers can be checked. They are not a library to adopt. Point the router at skills you have already written. Or point it at the skills folder in github.com/forcedotcom/sf-skills, the Salesforce skills library, which already has SKILL.md files for Apex, Flow, fields, permission sets, and the jobs around them. The router does not care who wrote the file. It loads the skills the prompt asked for, and it leaves the rest on disk.</w:t>
+      </w:r>
+    </w:p>
+    <w:p>
+      <w:pPr>
+        <w:spacing w:after="160" w:before="0" w:line="288"/>
+      </w:pPr>
+      <w:r>
+        <w:rPr>
+          <w:rFonts w:ascii="Arial" w:cs="Arial" w:eastAsia="Arial" w:hAnsi="Arial"/>
+          <w:b w:val="false"/>
+          <w:bCs w:val="false"/>
+          <w:i w:val="false"/>
+          <w:iCs w:val="false"/>
+          <w:color w:val="243038"/>
+          <w:sz w:val="22"/>
+          <w:szCs w:val="22"/>
+        </w:rPr>
+        <w:t xml:space="preserve">The measurement later in this post uses those samples, 19 short files, because that is the folder in the repo. Swap the folder and the same router runs on yours.</w:t>
       </w:r>
     </w:p>
     <w:p>
@@ -640,7 +676,7 @@
           <w:sz w:val="32"/>
           <w:szCs w:val="32"/>
         </w:rPr>
-        <w:t xml:space="preserve">A slice of a Salesforce skill library</w:t>
+        <w:t xml:space="preserve">Samples, so the route is visible</w:t>
       </w:r>
     </w:p>
     <w:p>
@@ -658,7 +694,7 @@
           <w:sz w:val="22"/>
           <w:szCs w:val="22"/>
         </w:rPr>
-        <w:t xml:space="preserve">Here are 12 of the 19 skills in the measurement. They are short samples of those jobs, written for this repo, not the full playbooks a team would install. The other seven are general skills in the same run: unit tests, a pull-request review, an explanation, docs, a SQL query, a release, and an HTTP note. Each sample owns a narrow job. The description, and the keywords line under it, are the routing signal.</w:t>
+        <w:t xml:space="preserve">The names below are the kind of Salesforce jobs a prompt has to tell apart. The files in this repo are short stand-ins, a few lines each, so this post can show the route without pasting a real playbook. The other samples in the measurement are general: unit tests, a pull-request review, an explanation, docs, a SQL query, a release, and an HTTP note. Use forcedotcom/sf-skills when you want the real versions of jobs like these, and leave these samples behind. Each sample still has the routing signal: a description, and a keywords line.</w:t>
       </w:r>
     </w:p>
     <w:p>
@@ -2225,7 +2261,25 @@
           <w:sz w:val="22"/>
           <w:szCs w:val="22"/>
         </w:rPr>
-        <w:t xml:space="preserve">This is the part teams underestimate. Adding the next skill should be a file, not a project. The ranker does not get a new branch. You do not retrain a model. You do not edit a priority list of phrases and hope you inserted the rule in the right place.</w:t>
+        <w:t xml:space="preserve">This is the part teams underestimate. Adding the next skill should be a file, not a project. The ranker does not get a new branch. You do not retrain a model. You do not edit a priority list of phrases and hope you inserted the rule in the right place. The samples stay in the repo for the eval. Your catalog is a different folder.</w:t>
+      </w:r>
+    </w:p>
+    <w:p>
+      <w:pPr>
+        <w:spacing w:after="160" w:before="0" w:line="288"/>
+      </w:pPr>
+      <w:r>
+        <w:rPr>
+          <w:rFonts w:ascii="Arial" w:cs="Arial" w:eastAsia="Arial" w:hAnsi="Arial"/>
+          <w:b w:val="false"/>
+          <w:bCs w:val="false"/>
+          <w:i w:val="false"/>
+          <w:iCs w:val="false"/>
+          <w:color w:val="243038"/>
+          <w:sz w:val="22"/>
+          <w:szCs w:val="22"/>
+        </w:rPr>
+        <w:t xml:space="preserve">Two ways to fill that folder. Write your own SKILL.md files. Or clone the Salesforce skills library and point the router at its skills directory. Those files already have a name and a description, which is what the score reads. They do not use the keywords line this router uses when one prompt should load two skills. Add that line on the skills you want loaded together. Without it, a prompt still loads the single best match.</w:t>
       </w:r>
     </w:p>
     <w:p>
@@ -2405,6 +2459,90 @@
           <w:sz w:val="22"/>
           <w:szCs w:val="22"/>
         </w:rPr>
+        <w:t xml:space="preserve">To use the Salesforce skills library instead of the samples:</w:t>
+      </w:r>
+    </w:p>
+    <w:p>
+      <w:pPr>
+        <w:shd w:fill="F3F1EC" w:val="clear"/>
+        <w:spacing w:after="0" w:before="80" w:line="240"/>
+      </w:pPr>
+      <w:r>
+        <w:rPr>
+          <w:rFonts w:ascii="Menlo" w:cs="Menlo" w:eastAsia="Menlo" w:hAnsi="Menlo"/>
+          <w:b w:val="false"/>
+          <w:bCs w:val="false"/>
+          <w:i w:val="false"/>
+          <w:iCs w:val="false"/>
+          <w:color w:val="1A2830"/>
+          <w:sz w:val="18"/>
+          <w:szCs w:val="18"/>
+        </w:rPr>
+        <w:t xml:space="preserve">git clone https://github.com/forcedotcom/sf-skills.git</w:t>
+      </w:r>
+    </w:p>
+    <w:p>
+      <w:pPr>
+        <w:shd w:fill="F3F1EC" w:val="clear"/>
+        <w:spacing w:after="80" w:before="0" w:line="240"/>
+      </w:pPr>
+      <w:r>
+        <w:rPr>
+          <w:rFonts w:ascii="Menlo" w:cs="Menlo" w:eastAsia="Menlo" w:hAnsi="Menlo"/>
+          <w:b w:val="false"/>
+          <w:bCs w:val="false"/>
+          <w:i w:val="false"/>
+          <w:iCs w:val="false"/>
+          <w:color w:val="1A2830"/>
+          <w:sz w:val="18"/>
+          <w:szCs w:val="18"/>
+        </w:rPr>
+        <w:t xml:space="preserve">node scripts/generate-index.mjs --skills-dir /path/to/sf-skills/skills --out-dir .</w:t>
+      </w:r>
+    </w:p>
+    <w:p>
+      <w:pPr>
+        <w:spacing w:after="120" w:before="0"/>
+      </w:pPr>
+    </w:p>
+    <w:p>
+      <w:pPr>
+        <w:spacing w:after="160" w:before="0" w:line="288"/>
+      </w:pPr>
+      <w:r>
+        <w:rPr>
+          <w:rFonts w:ascii="Arial" w:cs="Arial" w:eastAsia="Arial" w:hAnsi="Arial"/>
+          <w:b w:val="false"/>
+          <w:bCs w:val="false"/>
+          <w:i w:val="false"/>
+          <w:iCs w:val="false"/>
+          <w:color w:val="243038"/>
+          <w:sz w:val="22"/>
+          <w:szCs w:val="22"/>
+        </w:rPr>
+        <w:t xml:space="preserve">Set SKILL_ROUTER_SKILLS_DIR to that same skills folder when you start the server. Nothing from that repo is copied into this one. A folder of skills you wrote is the same command, with your path.</w:t>
+      </w:r>
+    </w:p>
+    <w:p>
+      <w:pPr>
+        <w:spacing w:after="120" w:before="0"/>
+      </w:pPr>
+    </w:p>
+    <w:p>
+      <w:pPr>
+        <w:spacing w:after="160" w:before="0" w:line="288"/>
+      </w:pPr>
+      <w:r>
+        <w:rPr>
+          <w:rFonts w:ascii="Arial" w:cs="Arial" w:eastAsia="Arial" w:hAnsi="Arial"/>
+          <w:b w:val="false"/>
+          <w:bCs w:val="false"/>
+          <w:i w:val="false"/>
+          <w:iCs w:val="false"/>
+          <w:color w:val="243038"/>
+          <w:sz w:val="22"/>
+          <w:szCs w:val="22"/>
+        </w:rPr>
         <w:t xml:space="preserve">The router code stays put. The index is generated. A new Salesforce skill — a naming-convention check, a permission-set diff, a flow-fault reviewer — shows up in find_skill on the next prompt, because its description is now in the catalog. Removing a skill is the same operation in reverse: delete the folder, regenerate, confirm the gold prompts that used to hit it now abstain or land on the replacement.</w:t>
       </w:r>
     </w:p>
@@ -4546,7 +4684,7 @@
         </w:rPr>
         <w:t xml:space="preserve">The reference implementation is </w:t>
       </w:r>
-      <w:hyperlink w:history="1" r:id="rIdl9d89mmgcbttwxz3jhol0">
+      <w:hyperlink w:history="1" r:id="rIde_libozhpbardo_febslt">
         <w:r>
           <w:rPr>
             <w:rStyle w:val="Hyperlink"/>
@@ -4568,7 +4706,7 @@
           <w:sz w:val="22"/>
           <w:szCs w:val="22"/>
         </w:rPr>
-        <w:t xml:space="preserve">. 19 skills, the MCP server, the hook, and the eval in eval/prompts.jsonl. Wire the server into any MCP client:</w:t>
+        <w:t xml:space="preserve">. It ships sample skills so the eval can be rerun, plus the MCP server, the hook, and eval/prompts.jsonl. Point SKILL_ROUTER_SKILLS_DIR at your own skills, or at skills/ from forcedotcom/sf-skills, and the same server loads those instead. Wire it into any MCP client:</w:t>
       </w:r>
     </w:p>
     <w:p>
@@ -5057,7 +5195,7 @@
         </w:rPr>
         <w:t xml:space="preserve">Reference code: </w:t>
       </w:r>
-      <w:hyperlink w:history="1" r:id="rIduzr0l3bvucjhpbohrmxop">
+      <w:hyperlink w:history="1" r:id="rIduxmg-sc-hle_egektnkhu">
         <w:r>
           <w:rPr>
             <w:rStyle w:val="Hyperlink"/>

</xml_diff>

<commit_message>
Make the README and diagrams safe to follow on a first read.
</commit_message>
<xml_diff>
--- a/docs/Load-the-Right-Skill-First.docx
+++ b/docs/Load-the-Right-Skill-First.docx
@@ -2459,7 +2459,7 @@
           <w:sz w:val="22"/>
           <w:szCs w:val="22"/>
         </w:rPr>
-        <w:t xml:space="preserve">To use the Salesforce skills library instead of the samples:</w:t>
+        <w:t xml:space="preserve">To use the Salesforce skills library instead of the samples, run this from the skill-router folder. The clone lands next to the router, and the second command rewrites the local index. The sample files stay in skills/.</w:t>
       </w:r>
     </w:p>
     <w:p>
@@ -2497,7 +2497,7 @@
           <w:sz w:val="18"/>
           <w:szCs w:val="18"/>
         </w:rPr>
-        <w:t xml:space="preserve">node scripts/generate-index.mjs --skills-dir /path/to/sf-skills/skills --out-dir .</w:t>
+        <w:t xml:space="preserve">node scripts/generate-index.mjs --skills-dir sf-skills/skills --out-dir .</w:t>
       </w:r>
     </w:p>
     <w:p>
@@ -2520,7 +2520,7 @@
           <w:sz w:val="22"/>
           <w:szCs w:val="22"/>
         </w:rPr>
-        <w:t xml:space="preserve">Set SKILL_ROUTER_SKILLS_DIR to that same skills folder when you start the server. Nothing from that repo is copied into this one. A folder of skills you wrote is the same command, with your path.</w:t>
+        <w:t xml:space="preserve">Set SKILL_ROUTER_SKILLS_DIR to sf-skills/skills when you start the server. If you cloned it somewhere else, pass that path in both places. Nothing from that repo is copied into this one. A folder of skills you wrote is the same command, with your path.</w:t>
       </w:r>
     </w:p>
     <w:p>
@@ -4684,7 +4684,7 @@
         </w:rPr>
         <w:t xml:space="preserve">The reference implementation is </w:t>
       </w:r>
-      <w:hyperlink w:history="1" r:id="rIde_libozhpbardo_febslt">
+      <w:hyperlink w:history="1" r:id="rIdcfsf5s8zamkaup-jslor_">
         <w:r>
           <w:rPr>
             <w:rStyle w:val="Hyperlink"/>
@@ -5195,7 +5195,7 @@
         </w:rPr>
         <w:t xml:space="preserve">Reference code: </w:t>
       </w:r>
-      <w:hyperlink w:history="1" r:id="rIduxmg-sc-hle_egektnkhu">
+      <w:hyperlink w:history="1" r:id="rIdfvdk-nmx3348dfcrgc748">
         <w:r>
           <w:rPr>
             <w:rStyle w:val="Hyperlink"/>

</xml_diff>

<commit_message>
Point the public links at the personal GitHub account.
</commit_message>
<xml_diff>
--- a/docs/Load-the-Right-Skill-First.docx
+++ b/docs/Load-the-Right-Skill-First.docx
@@ -415,7 +415,7 @@
                 <w:sz w:val="18"/>
                 <w:szCs w:val="18"/>
               </w:rPr>
-              <w:t xml:space="preserve">github.com/lparuchuru-titan/skill-router</w:t>
+              <w:t xml:space="preserve">github.com/Lakshmikanth-Paruchuru/skill-router</w:t>
             </w:r>
           </w:p>
         </w:tc>
@@ -4684,7 +4684,7 @@
         </w:rPr>
         <w:t xml:space="preserve">The reference implementation is </w:t>
       </w:r>
-      <w:hyperlink w:history="1" r:id="rIdcfsf5s8zamkaup-jslor_">
+      <w:hyperlink w:history="1" r:id="rIdth45ibdwltrghzhxkzec4">
         <w:r>
           <w:rPr>
             <w:rStyle w:val="Hyperlink"/>
@@ -4692,7 +4692,7 @@
             <w:sz w:val="22"/>
             <w:szCs w:val="22"/>
           </w:rPr>
-          <w:t xml:space="preserve">github.com/lparuchuru-titan/skill-router</w:t>
+          <w:t xml:space="preserve">github.com/Lakshmikanth-Paruchuru/skill-router</w:t>
         </w:r>
       </w:hyperlink>
       <w:r>
@@ -5195,7 +5195,7 @@
         </w:rPr>
         <w:t xml:space="preserve">Reference code: </w:t>
       </w:r>
-      <w:hyperlink w:history="1" r:id="rIdfvdk-nmx3348dfcrgc748">
+      <w:hyperlink w:history="1" r:id="rIdsc_9f0ftfs1nrefab6syf">
         <w:r>
           <w:rPr>
             <w:rStyle w:val="Hyperlink"/>
@@ -5203,7 +5203,7 @@
             <w:sz w:val="22"/>
             <w:szCs w:val="22"/>
           </w:rPr>
-          <w:t xml:space="preserve">github.com/lparuchuru-titan/skill-router</w:t>
+          <w:t xml:space="preserve">github.com/Lakshmikanth-Paruchuru/skill-router</w:t>
         </w:r>
       </w:hyperlink>
     </w:p>

</xml_diff>

<commit_message>
Set file names and code in the blog in bold Menlo.
</commit_message>
<xml_diff>
--- a/docs/Load-the-Right-Skill-First.docx
+++ b/docs/Load-the-Right-Skill-First.docx
@@ -406,12 +406,12 @@
             </w:pPr>
             <w:r>
               <w:rPr>
-                <w:rFonts w:ascii="Arial" w:cs="Arial" w:eastAsia="Arial" w:hAnsi="Arial"/>
-                <w:b w:val="false"/>
-                <w:bCs w:val="false"/>
+                <w:rFonts w:ascii="Menlo" w:cs="Menlo" w:eastAsia="Menlo" w:hAnsi="Menlo"/>
+                <w:b/>
+                <w:bCs/>
                 <w:i w:val="false"/>
                 <w:iCs w:val="false"/>
-                <w:color w:val="243038"/>
+                <w:color w:val="1B3A4B"/>
                 <w:sz w:val="18"/>
                 <w:szCs w:val="18"/>
               </w:rPr>
@@ -520,7 +520,33 @@
           <w:sz w:val="22"/>
           <w:szCs w:val="22"/>
         </w:rPr>
-        <w:t xml:space="preserve">A year ago, a skill library was a novelty. Now it is the default. Teams publish folders of SKILL.md files for Claude, Cursor, and every other coding agent that will read them. Salesforce teams have been early and loud about it: one skill to write Apex, another to run tests, another to deploy, another to grant field access, another to scan the diff. The library grows every week. The agent does not get better at the same rate.</w:t>
+        <w:t xml:space="preserve">A year ago, a skill library was a novelty. Now it is the default. Teams publish folders of </w:t>
+      </w:r>
+      <w:r>
+        <w:rPr>
+          <w:rFonts w:ascii="Menlo" w:cs="Menlo" w:eastAsia="Menlo" w:hAnsi="Menlo"/>
+          <w:b/>
+          <w:bCs/>
+          <w:i w:val="false"/>
+          <w:iCs w:val="false"/>
+          <w:color w:val="1B3A4B"/>
+          <w:sz w:val="22"/>
+          <w:szCs w:val="22"/>
+        </w:rPr>
+        <w:t xml:space="preserve">SKILL.md</w:t>
+      </w:r>
+      <w:r>
+        <w:rPr>
+          <w:rFonts w:ascii="Arial" w:cs="Arial" w:eastAsia="Arial" w:hAnsi="Arial"/>
+          <w:b w:val="false"/>
+          <w:bCs w:val="false"/>
+          <w:i w:val="false"/>
+          <w:iCs w:val="false"/>
+          <w:color w:val="243038"/>
+          <w:sz w:val="22"/>
+          <w:szCs w:val="22"/>
+        </w:rPr>
+        <w:t xml:space="preserve"> files for Claude, Cursor, and every other coding agent that will read them. Salesforce teams have been early and loud about it: one skill to write Apex, another to run tests, another to deploy, another to grant field access, another to scan the diff. The library grows every week. The agent does not get better at the same rate.</w:t>
       </w:r>
     </w:p>
     <w:p>
@@ -636,7 +662,59 @@
           <w:sz w:val="22"/>
           <w:szCs w:val="22"/>
         </w:rPr>
-        <w:t xml:space="preserve">The skills checked into this repo are samples. They are here so the route can be shown and the numbers can be checked. They are not a library to adopt. Point the router at skills you have already written. Or point it at the skills folder in github.com/forcedotcom/sf-skills, the Salesforce skills library, which already has SKILL.md files for Apex, Flow, fields, permission sets, and the jobs around them. The router does not care who wrote the file. It loads the skills the prompt asked for, and it leaves the rest on disk.</w:t>
+        <w:t xml:space="preserve">The skills checked into this repo are samples. They are here so the route can be shown and the numbers can be checked. They are not a library to adopt. Point the router at skills you have already written. Or point it at the skills folder in </w:t>
+      </w:r>
+      <w:r>
+        <w:rPr>
+          <w:rFonts w:ascii="Menlo" w:cs="Menlo" w:eastAsia="Menlo" w:hAnsi="Menlo"/>
+          <w:b/>
+          <w:bCs/>
+          <w:i w:val="false"/>
+          <w:iCs w:val="false"/>
+          <w:color w:val="1B3A4B"/>
+          <w:sz w:val="22"/>
+          <w:szCs w:val="22"/>
+        </w:rPr>
+        <w:t xml:space="preserve">github.com/forcedotcom/sf-skills</w:t>
+      </w:r>
+      <w:r>
+        <w:rPr>
+          <w:rFonts w:ascii="Arial" w:cs="Arial" w:eastAsia="Arial" w:hAnsi="Arial"/>
+          <w:b w:val="false"/>
+          <w:bCs w:val="false"/>
+          <w:i w:val="false"/>
+          <w:iCs w:val="false"/>
+          <w:color w:val="243038"/>
+          <w:sz w:val="22"/>
+          <w:szCs w:val="22"/>
+        </w:rPr>
+        <w:t xml:space="preserve">, the Salesforce skills library, which already has </w:t>
+      </w:r>
+      <w:r>
+        <w:rPr>
+          <w:rFonts w:ascii="Menlo" w:cs="Menlo" w:eastAsia="Menlo" w:hAnsi="Menlo"/>
+          <w:b/>
+          <w:bCs/>
+          <w:i w:val="false"/>
+          <w:iCs w:val="false"/>
+          <w:color w:val="1B3A4B"/>
+          <w:sz w:val="22"/>
+          <w:szCs w:val="22"/>
+        </w:rPr>
+        <w:t xml:space="preserve">SKILL.md</w:t>
+      </w:r>
+      <w:r>
+        <w:rPr>
+          <w:rFonts w:ascii="Arial" w:cs="Arial" w:eastAsia="Arial" w:hAnsi="Arial"/>
+          <w:b w:val="false"/>
+          <w:bCs w:val="false"/>
+          <w:i w:val="false"/>
+          <w:iCs w:val="false"/>
+          <w:color w:val="243038"/>
+          <w:sz w:val="22"/>
+          <w:szCs w:val="22"/>
+        </w:rPr>
+        <w:t xml:space="preserve"> files for Apex, Flow, fields, permission sets, and the jobs around them. The router does not care who wrote the file. It loads the skills the prompt asked for, and it leaves the rest on disk.</w:t>
       </w:r>
     </w:p>
     <w:p>
@@ -694,7 +772,33 @@
           <w:sz w:val="22"/>
           <w:szCs w:val="22"/>
         </w:rPr>
-        <w:t xml:space="preserve">The names below are the kind of Salesforce jobs a prompt has to tell apart. The files in this repo are short stand-ins, a few lines each, so this post can show the route without pasting a real playbook. The other samples in the measurement are general: unit tests, a pull-request review, an explanation, docs, a SQL query, a release, and an HTTP note. Use forcedotcom/sf-skills when you want the real versions of jobs like these, and leave these samples behind. Each sample still has the routing signal: a description, and a keywords line.</w:t>
+        <w:t xml:space="preserve">The names below are the kind of Salesforce jobs a prompt has to tell apart. The files in this repo are short stand-ins, a few lines each, so this post can show the route without pasting a real playbook. The other samples in the measurement are general: unit tests, a pull-request review, an explanation, docs, a SQL query, a release, and an HTTP note. Use </w:t>
+      </w:r>
+      <w:r>
+        <w:rPr>
+          <w:rFonts w:ascii="Menlo" w:cs="Menlo" w:eastAsia="Menlo" w:hAnsi="Menlo"/>
+          <w:b/>
+          <w:bCs/>
+          <w:i w:val="false"/>
+          <w:iCs w:val="false"/>
+          <w:color w:val="1B3A4B"/>
+          <w:sz w:val="22"/>
+          <w:szCs w:val="22"/>
+        </w:rPr>
+        <w:t xml:space="preserve">forcedotcom/sf-skills</w:t>
+      </w:r>
+      <w:r>
+        <w:rPr>
+          <w:rFonts w:ascii="Arial" w:cs="Arial" w:eastAsia="Arial" w:hAnsi="Arial"/>
+          <w:b w:val="false"/>
+          <w:bCs w:val="false"/>
+          <w:i w:val="false"/>
+          <w:iCs w:val="false"/>
+          <w:color w:val="243038"/>
+          <w:sz w:val="22"/>
+          <w:szCs w:val="22"/>
+        </w:rPr>
+        <w:t xml:space="preserve"> when you want the real versions of jobs like these, and leave these samples behind. Each sample still has the routing signal: a description, and a keywords line.</w:t>
       </w:r>
     </w:p>
     <w:p>
@@ -826,12 +930,12 @@
             </w:pPr>
             <w:r>
               <w:rPr>
-                <w:rFonts w:ascii="Arial" w:cs="Arial" w:eastAsia="Arial" w:hAnsi="Arial"/>
+                <w:rFonts w:ascii="Menlo" w:cs="Menlo" w:eastAsia="Menlo" w:hAnsi="Menlo"/>
                 <w:b/>
                 <w:bCs/>
                 <w:i w:val="false"/>
                 <w:iCs w:val="false"/>
-                <w:color w:val="243038"/>
+                <w:color w:val="1B3A4B"/>
                 <w:sz w:val="18"/>
                 <w:szCs w:val="18"/>
               </w:rPr>
@@ -905,12 +1009,12 @@
             </w:pPr>
             <w:r>
               <w:rPr>
-                <w:rFonts w:ascii="Arial" w:cs="Arial" w:eastAsia="Arial" w:hAnsi="Arial"/>
+                <w:rFonts w:ascii="Menlo" w:cs="Menlo" w:eastAsia="Menlo" w:hAnsi="Menlo"/>
                 <w:b/>
                 <w:bCs/>
                 <w:i w:val="false"/>
                 <w:iCs w:val="false"/>
-                <w:color w:val="243038"/>
+                <w:color w:val="1B3A4B"/>
                 <w:sz w:val="18"/>
                 <w:szCs w:val="18"/>
               </w:rPr>
@@ -984,12 +1088,12 @@
             </w:pPr>
             <w:r>
               <w:rPr>
-                <w:rFonts w:ascii="Arial" w:cs="Arial" w:eastAsia="Arial" w:hAnsi="Arial"/>
+                <w:rFonts w:ascii="Menlo" w:cs="Menlo" w:eastAsia="Menlo" w:hAnsi="Menlo"/>
                 <w:b/>
                 <w:bCs/>
                 <w:i w:val="false"/>
                 <w:iCs w:val="false"/>
-                <w:color w:val="243038"/>
+                <w:color w:val="1B3A4B"/>
                 <w:sz w:val="18"/>
                 <w:szCs w:val="18"/>
               </w:rPr>
@@ -1063,12 +1167,12 @@
             </w:pPr>
             <w:r>
               <w:rPr>
-                <w:rFonts w:ascii="Arial" w:cs="Arial" w:eastAsia="Arial" w:hAnsi="Arial"/>
+                <w:rFonts w:ascii="Menlo" w:cs="Menlo" w:eastAsia="Menlo" w:hAnsi="Menlo"/>
                 <w:b/>
                 <w:bCs/>
                 <w:i w:val="false"/>
                 <w:iCs w:val="false"/>
-                <w:color w:val="243038"/>
+                <w:color w:val="1B3A4B"/>
                 <w:sz w:val="18"/>
                 <w:szCs w:val="18"/>
               </w:rPr>
@@ -1142,12 +1246,12 @@
             </w:pPr>
             <w:r>
               <w:rPr>
-                <w:rFonts w:ascii="Arial" w:cs="Arial" w:eastAsia="Arial" w:hAnsi="Arial"/>
+                <w:rFonts w:ascii="Menlo" w:cs="Menlo" w:eastAsia="Menlo" w:hAnsi="Menlo"/>
                 <w:b/>
                 <w:bCs/>
                 <w:i w:val="false"/>
                 <w:iCs w:val="false"/>
-                <w:color w:val="243038"/>
+                <w:color w:val="1B3A4B"/>
                 <w:sz w:val="18"/>
                 <w:szCs w:val="18"/>
               </w:rPr>
@@ -1221,12 +1325,12 @@
             </w:pPr>
             <w:r>
               <w:rPr>
-                <w:rFonts w:ascii="Arial" w:cs="Arial" w:eastAsia="Arial" w:hAnsi="Arial"/>
+                <w:rFonts w:ascii="Menlo" w:cs="Menlo" w:eastAsia="Menlo" w:hAnsi="Menlo"/>
                 <w:b/>
                 <w:bCs/>
                 <w:i w:val="false"/>
                 <w:iCs w:val="false"/>
-                <w:color w:val="243038"/>
+                <w:color w:val="1B3A4B"/>
                 <w:sz w:val="18"/>
                 <w:szCs w:val="18"/>
               </w:rPr>
@@ -1300,12 +1404,12 @@
             </w:pPr>
             <w:r>
               <w:rPr>
-                <w:rFonts w:ascii="Arial" w:cs="Arial" w:eastAsia="Arial" w:hAnsi="Arial"/>
+                <w:rFonts w:ascii="Menlo" w:cs="Menlo" w:eastAsia="Menlo" w:hAnsi="Menlo"/>
                 <w:b/>
                 <w:bCs/>
                 <w:i w:val="false"/>
                 <w:iCs w:val="false"/>
-                <w:color w:val="243038"/>
+                <w:color w:val="1B3A4B"/>
                 <w:sz w:val="18"/>
                 <w:szCs w:val="18"/>
               </w:rPr>
@@ -1379,12 +1483,12 @@
             </w:pPr>
             <w:r>
               <w:rPr>
-                <w:rFonts w:ascii="Arial" w:cs="Arial" w:eastAsia="Arial" w:hAnsi="Arial"/>
+                <w:rFonts w:ascii="Menlo" w:cs="Menlo" w:eastAsia="Menlo" w:hAnsi="Menlo"/>
                 <w:b/>
                 <w:bCs/>
                 <w:i w:val="false"/>
                 <w:iCs w:val="false"/>
-                <w:color w:val="243038"/>
+                <w:color w:val="1B3A4B"/>
                 <w:sz w:val="18"/>
                 <w:szCs w:val="18"/>
               </w:rPr>
@@ -1458,12 +1562,12 @@
             </w:pPr>
             <w:r>
               <w:rPr>
-                <w:rFonts w:ascii="Arial" w:cs="Arial" w:eastAsia="Arial" w:hAnsi="Arial"/>
+                <w:rFonts w:ascii="Menlo" w:cs="Menlo" w:eastAsia="Menlo" w:hAnsi="Menlo"/>
                 <w:b/>
                 <w:bCs/>
                 <w:i w:val="false"/>
                 <w:iCs w:val="false"/>
-                <w:color w:val="243038"/>
+                <w:color w:val="1B3A4B"/>
                 <w:sz w:val="18"/>
                 <w:szCs w:val="18"/>
               </w:rPr>
@@ -1537,12 +1641,12 @@
             </w:pPr>
             <w:r>
               <w:rPr>
-                <w:rFonts w:ascii="Arial" w:cs="Arial" w:eastAsia="Arial" w:hAnsi="Arial"/>
+                <w:rFonts w:ascii="Menlo" w:cs="Menlo" w:eastAsia="Menlo" w:hAnsi="Menlo"/>
                 <w:b/>
                 <w:bCs/>
                 <w:i w:val="false"/>
                 <w:iCs w:val="false"/>
-                <w:color w:val="243038"/>
+                <w:color w:val="1B3A4B"/>
                 <w:sz w:val="18"/>
                 <w:szCs w:val="18"/>
               </w:rPr>
@@ -1616,12 +1720,12 @@
             </w:pPr>
             <w:r>
               <w:rPr>
-                <w:rFonts w:ascii="Arial" w:cs="Arial" w:eastAsia="Arial" w:hAnsi="Arial"/>
+                <w:rFonts w:ascii="Menlo" w:cs="Menlo" w:eastAsia="Menlo" w:hAnsi="Menlo"/>
                 <w:b/>
                 <w:bCs/>
                 <w:i w:val="false"/>
                 <w:iCs w:val="false"/>
-                <w:color w:val="243038"/>
+                <w:color w:val="1B3A4B"/>
                 <w:sz w:val="18"/>
                 <w:szCs w:val="18"/>
               </w:rPr>
@@ -1695,12 +1799,12 @@
             </w:pPr>
             <w:r>
               <w:rPr>
-                <w:rFonts w:ascii="Arial" w:cs="Arial" w:eastAsia="Arial" w:hAnsi="Arial"/>
+                <w:rFonts w:ascii="Menlo" w:cs="Menlo" w:eastAsia="Menlo" w:hAnsi="Menlo"/>
                 <w:b/>
                 <w:bCs/>
                 <w:i w:val="false"/>
                 <w:iCs w:val="false"/>
-                <w:color w:val="243038"/>
+                <w:color w:val="1B3A4B"/>
                 <w:sz w:val="18"/>
                 <w:szCs w:val="18"/>
               </w:rPr>
@@ -1785,7 +1889,20 @@
           <w:sz w:val="22"/>
           <w:szCs w:val="22"/>
         </w:rPr>
-        <w:t xml:space="preserve">Watch a few prompts move through the router. These lines are in eval/prompts.jsonl.</w:t>
+        <w:t xml:space="preserve">Watch a few prompts move through the router. These lines are in </w:t>
+      </w:r>
+      <w:r>
+        <w:rPr>
+          <w:rFonts w:ascii="Menlo" w:cs="Menlo" w:eastAsia="Menlo" w:hAnsi="Menlo"/>
+          <w:b/>
+          <w:bCs/>
+          <w:i w:val="false"/>
+          <w:iCs w:val="false"/>
+          <w:color w:val="1B3A4B"/>
+          <w:sz w:val="22"/>
+          <w:szCs w:val="22"/>
+        </w:rPr>
+        <w:t xml:space="preserve">eval/prompts.jsonl.</w:t>
       </w:r>
     </w:p>
     <w:p>
@@ -1831,7 +1948,33 @@
           <w:sz w:val="22"/>
           <w:szCs w:val="22"/>
         </w:rPr>
-        <w:t xml:space="preserve">“Run the Apex tests and tell me the code coverage.” Coverage belongs to the skill that runs tests, not the one that writes a new test. One skill loads: platform-apex-test-run.</w:t>
+        <w:t xml:space="preserve">“Run the Apex tests and tell me the code coverage.” Coverage belongs to the skill that runs tests, not the one that writes a new test. One skill loads: </w:t>
+      </w:r>
+      <w:r>
+        <w:rPr>
+          <w:rFonts w:ascii="Menlo" w:cs="Menlo" w:eastAsia="Menlo" w:hAnsi="Menlo"/>
+          <w:b/>
+          <w:bCs/>
+          <w:i w:val="false"/>
+          <w:iCs w:val="false"/>
+          <w:color w:val="1B3A4B"/>
+          <w:sz w:val="22"/>
+          <w:szCs w:val="22"/>
+        </w:rPr>
+        <w:t xml:space="preserve">platform-apex-test-run</w:t>
+      </w:r>
+      <w:r>
+        <w:rPr>
+          <w:rFonts w:ascii="Arial" w:cs="Arial" w:eastAsia="Arial" w:hAnsi="Arial"/>
+          <w:b w:val="false"/>
+          <w:bCs w:val="false"/>
+          <w:i w:val="false"/>
+          <w:iCs w:val="false"/>
+          <w:color w:val="243038"/>
+          <w:sz w:val="22"/>
+          <w:szCs w:val="22"/>
+        </w:rPr>
+        <w:t xml:space="preserve">.</w:t>
       </w:r>
     </w:p>
     <w:p>
@@ -2106,7 +2249,33 @@
           <w:sz w:val="22"/>
           <w:szCs w:val="22"/>
         </w:rPr>
-        <w:t xml:space="preserve">It names the skills to load before any code, metadata, or query is written. The agent reads each of those SKILL.md files and follows them.</w:t>
+        <w:t xml:space="preserve">It names the skills to load before any code, metadata, or query is written. The agent reads each of those </w:t>
+      </w:r>
+      <w:r>
+        <w:rPr>
+          <w:rFonts w:ascii="Menlo" w:cs="Menlo" w:eastAsia="Menlo" w:hAnsi="Menlo"/>
+          <w:b/>
+          <w:bCs/>
+          <w:i w:val="false"/>
+          <w:iCs w:val="false"/>
+          <w:color w:val="1B3A4B"/>
+          <w:sz w:val="22"/>
+          <w:szCs w:val="22"/>
+        </w:rPr>
+        <w:t xml:space="preserve">SKILL.md</w:t>
+      </w:r>
+      <w:r>
+        <w:rPr>
+          <w:rFonts w:ascii="Arial" w:cs="Arial" w:eastAsia="Arial" w:hAnsi="Arial"/>
+          <w:b w:val="false"/>
+          <w:bCs w:val="false"/>
+          <w:i w:val="false"/>
+          <w:iCs w:val="false"/>
+          <w:color w:val="243038"/>
+          <w:sz w:val="22"/>
+          <w:szCs w:val="22"/>
+        </w:rPr>
+        <w:t xml:space="preserve"> files and follows them.</w:t>
       </w:r>
     </w:p>
     <w:p>
@@ -2129,7 +2298,85 @@
           <w:sz w:val="22"/>
           <w:szCs w:val="22"/>
         </w:rPr>
-        <w:t xml:space="preserve">It keeps the rest of the library on disk. find_skill returns the skills for this prompt, not the catalog. list_skills and read_skill exist so the agent can open exactly what was named.</w:t>
+        <w:t xml:space="preserve">It keeps the rest of the library on disk. </w:t>
+      </w:r>
+      <w:r>
+        <w:rPr>
+          <w:rFonts w:ascii="Menlo" w:cs="Menlo" w:eastAsia="Menlo" w:hAnsi="Menlo"/>
+          <w:b/>
+          <w:bCs/>
+          <w:i w:val="false"/>
+          <w:iCs w:val="false"/>
+          <w:color w:val="1B3A4B"/>
+          <w:sz w:val="22"/>
+          <w:szCs w:val="22"/>
+        </w:rPr>
+        <w:t xml:space="preserve">find_skill</w:t>
+      </w:r>
+      <w:r>
+        <w:rPr>
+          <w:rFonts w:ascii="Arial" w:cs="Arial" w:eastAsia="Arial" w:hAnsi="Arial"/>
+          <w:b w:val="false"/>
+          <w:bCs w:val="false"/>
+          <w:i w:val="false"/>
+          <w:iCs w:val="false"/>
+          <w:color w:val="243038"/>
+          <w:sz w:val="22"/>
+          <w:szCs w:val="22"/>
+        </w:rPr>
+        <w:t xml:space="preserve"> returns the skills for this prompt, not the catalog. </w:t>
+      </w:r>
+      <w:r>
+        <w:rPr>
+          <w:rFonts w:ascii="Menlo" w:cs="Menlo" w:eastAsia="Menlo" w:hAnsi="Menlo"/>
+          <w:b/>
+          <w:bCs/>
+          <w:i w:val="false"/>
+          <w:iCs w:val="false"/>
+          <w:color w:val="1B3A4B"/>
+          <w:sz w:val="22"/>
+          <w:szCs w:val="22"/>
+        </w:rPr>
+        <w:t xml:space="preserve">list_skills</w:t>
+      </w:r>
+      <w:r>
+        <w:rPr>
+          <w:rFonts w:ascii="Arial" w:cs="Arial" w:eastAsia="Arial" w:hAnsi="Arial"/>
+          <w:b w:val="false"/>
+          <w:bCs w:val="false"/>
+          <w:i w:val="false"/>
+          <w:iCs w:val="false"/>
+          <w:color w:val="243038"/>
+          <w:sz w:val="22"/>
+          <w:szCs w:val="22"/>
+        </w:rPr>
+        <w:t xml:space="preserve"> and </w:t>
+      </w:r>
+      <w:r>
+        <w:rPr>
+          <w:rFonts w:ascii="Menlo" w:cs="Menlo" w:eastAsia="Menlo" w:hAnsi="Menlo"/>
+          <w:b/>
+          <w:bCs/>
+          <w:i w:val="false"/>
+          <w:iCs w:val="false"/>
+          <w:color w:val="1B3A4B"/>
+          <w:sz w:val="22"/>
+          <w:szCs w:val="22"/>
+        </w:rPr>
+        <w:t xml:space="preserve">read_skill</w:t>
+      </w:r>
+      <w:r>
+        <w:rPr>
+          <w:rFonts w:ascii="Arial" w:cs="Arial" w:eastAsia="Arial" w:hAnsi="Arial"/>
+          <w:b w:val="false"/>
+          <w:bCs w:val="false"/>
+          <w:i w:val="false"/>
+          <w:iCs w:val="false"/>
+          <w:color w:val="243038"/>
+          <w:sz w:val="22"/>
+          <w:szCs w:val="22"/>
+        </w:rPr>
+        <w:t xml:space="preserve"> exist so the agent can open exactly what was named.</w:t>
       </w:r>
     </w:p>
     <w:p>
@@ -2221,7 +2468,163 @@
           <w:sz w:val="22"/>
           <w:szCs w:val="22"/>
         </w:rPr>
-        <w:t xml:space="preserve">The same index is available three ways, because hosts differ. ROUTER.md is the human table. An MCP server exposes find_skill, list_skills, read_skill, search_topics, and read_topic over stdin, with no packages to install. An optional hook prints the skills to load only when it is sure, and prints nothing otherwise.</w:t>
+        <w:t xml:space="preserve">The same index is available three ways, because hosts differ. </w:t>
+      </w:r>
+      <w:r>
+        <w:rPr>
+          <w:rFonts w:ascii="Menlo" w:cs="Menlo" w:eastAsia="Menlo" w:hAnsi="Menlo"/>
+          <w:b/>
+          <w:bCs/>
+          <w:i w:val="false"/>
+          <w:iCs w:val="false"/>
+          <w:color w:val="1B3A4B"/>
+          <w:sz w:val="22"/>
+          <w:szCs w:val="22"/>
+        </w:rPr>
+        <w:t xml:space="preserve">ROUTER.md</w:t>
+      </w:r>
+      <w:r>
+        <w:rPr>
+          <w:rFonts w:ascii="Arial" w:cs="Arial" w:eastAsia="Arial" w:hAnsi="Arial"/>
+          <w:b w:val="false"/>
+          <w:bCs w:val="false"/>
+          <w:i w:val="false"/>
+          <w:iCs w:val="false"/>
+          <w:color w:val="243038"/>
+          <w:sz w:val="22"/>
+          <w:szCs w:val="22"/>
+        </w:rPr>
+        <w:t xml:space="preserve"> is the human table. An MCP server exposes </w:t>
+      </w:r>
+      <w:r>
+        <w:rPr>
+          <w:rFonts w:ascii="Menlo" w:cs="Menlo" w:eastAsia="Menlo" w:hAnsi="Menlo"/>
+          <w:b/>
+          <w:bCs/>
+          <w:i w:val="false"/>
+          <w:iCs w:val="false"/>
+          <w:color w:val="1B3A4B"/>
+          <w:sz w:val="22"/>
+          <w:szCs w:val="22"/>
+        </w:rPr>
+        <w:t xml:space="preserve">find_skill</w:t>
+      </w:r>
+      <w:r>
+        <w:rPr>
+          <w:rFonts w:ascii="Arial" w:cs="Arial" w:eastAsia="Arial" w:hAnsi="Arial"/>
+          <w:b w:val="false"/>
+          <w:bCs w:val="false"/>
+          <w:i w:val="false"/>
+          <w:iCs w:val="false"/>
+          <w:color w:val="243038"/>
+          <w:sz w:val="22"/>
+          <w:szCs w:val="22"/>
+        </w:rPr>
+        <w:t xml:space="preserve">, </w:t>
+      </w:r>
+      <w:r>
+        <w:rPr>
+          <w:rFonts w:ascii="Menlo" w:cs="Menlo" w:eastAsia="Menlo" w:hAnsi="Menlo"/>
+          <w:b/>
+          <w:bCs/>
+          <w:i w:val="false"/>
+          <w:iCs w:val="false"/>
+          <w:color w:val="1B3A4B"/>
+          <w:sz w:val="22"/>
+          <w:szCs w:val="22"/>
+        </w:rPr>
+        <w:t xml:space="preserve">list_skills</w:t>
+      </w:r>
+      <w:r>
+        <w:rPr>
+          <w:rFonts w:ascii="Arial" w:cs="Arial" w:eastAsia="Arial" w:hAnsi="Arial"/>
+          <w:b w:val="false"/>
+          <w:bCs w:val="false"/>
+          <w:i w:val="false"/>
+          <w:iCs w:val="false"/>
+          <w:color w:val="243038"/>
+          <w:sz w:val="22"/>
+          <w:szCs w:val="22"/>
+        </w:rPr>
+        <w:t xml:space="preserve">, </w:t>
+      </w:r>
+      <w:r>
+        <w:rPr>
+          <w:rFonts w:ascii="Menlo" w:cs="Menlo" w:eastAsia="Menlo" w:hAnsi="Menlo"/>
+          <w:b/>
+          <w:bCs/>
+          <w:i w:val="false"/>
+          <w:iCs w:val="false"/>
+          <w:color w:val="1B3A4B"/>
+          <w:sz w:val="22"/>
+          <w:szCs w:val="22"/>
+        </w:rPr>
+        <w:t xml:space="preserve">read_skill</w:t>
+      </w:r>
+      <w:r>
+        <w:rPr>
+          <w:rFonts w:ascii="Arial" w:cs="Arial" w:eastAsia="Arial" w:hAnsi="Arial"/>
+          <w:b w:val="false"/>
+          <w:bCs w:val="false"/>
+          <w:i w:val="false"/>
+          <w:iCs w:val="false"/>
+          <w:color w:val="243038"/>
+          <w:sz w:val="22"/>
+          <w:szCs w:val="22"/>
+        </w:rPr>
+        <w:t xml:space="preserve">, </w:t>
+      </w:r>
+      <w:r>
+        <w:rPr>
+          <w:rFonts w:ascii="Menlo" w:cs="Menlo" w:eastAsia="Menlo" w:hAnsi="Menlo"/>
+          <w:b/>
+          <w:bCs/>
+          <w:i w:val="false"/>
+          <w:iCs w:val="false"/>
+          <w:color w:val="1B3A4B"/>
+          <w:sz w:val="22"/>
+          <w:szCs w:val="22"/>
+        </w:rPr>
+        <w:t xml:space="preserve">search_topics</w:t>
+      </w:r>
+      <w:r>
+        <w:rPr>
+          <w:rFonts w:ascii="Arial" w:cs="Arial" w:eastAsia="Arial" w:hAnsi="Arial"/>
+          <w:b w:val="false"/>
+          <w:bCs w:val="false"/>
+          <w:i w:val="false"/>
+          <w:iCs w:val="false"/>
+          <w:color w:val="243038"/>
+          <w:sz w:val="22"/>
+          <w:szCs w:val="22"/>
+        </w:rPr>
+        <w:t xml:space="preserve">, and </w:t>
+      </w:r>
+      <w:r>
+        <w:rPr>
+          <w:rFonts w:ascii="Menlo" w:cs="Menlo" w:eastAsia="Menlo" w:hAnsi="Menlo"/>
+          <w:b/>
+          <w:bCs/>
+          <w:i w:val="false"/>
+          <w:iCs w:val="false"/>
+          <w:color w:val="1B3A4B"/>
+          <w:sz w:val="22"/>
+          <w:szCs w:val="22"/>
+        </w:rPr>
+        <w:t xml:space="preserve">read_topic</w:t>
+      </w:r>
+      <w:r>
+        <w:rPr>
+          <w:rFonts w:ascii="Arial" w:cs="Arial" w:eastAsia="Arial" w:hAnsi="Arial"/>
+          <w:b w:val="false"/>
+          <w:bCs w:val="false"/>
+          <w:i w:val="false"/>
+          <w:iCs w:val="false"/>
+          <w:color w:val="243038"/>
+          <w:sz w:val="22"/>
+          <w:szCs w:val="22"/>
+        </w:rPr>
+        <w:t xml:space="preserve"> over stdin, with no packages to install. An optional hook prints the skills to load only when it is sure, and prints nothing otherwise.</w:t>
       </w:r>
     </w:p>
     <w:p>
@@ -2279,7 +2682,33 @@
           <w:sz w:val="22"/>
           <w:szCs w:val="22"/>
         </w:rPr>
-        <w:t xml:space="preserve">Two ways to fill that folder. Write your own SKILL.md files. Or clone the Salesforce skills library and point the router at its skills directory. Those files already have a name and a description, which is what the score reads. They do not use the keywords line this router uses when one prompt should load two skills. Add that line on the skills you want loaded together. Without it, a prompt still loads the single best match.</w:t>
+        <w:t xml:space="preserve">Two ways to fill that folder. Write your own </w:t>
+      </w:r>
+      <w:r>
+        <w:rPr>
+          <w:rFonts w:ascii="Menlo" w:cs="Menlo" w:eastAsia="Menlo" w:hAnsi="Menlo"/>
+          <w:b/>
+          <w:bCs/>
+          <w:i w:val="false"/>
+          <w:iCs w:val="false"/>
+          <w:color w:val="1B3A4B"/>
+          <w:sz w:val="22"/>
+          <w:szCs w:val="22"/>
+        </w:rPr>
+        <w:t xml:space="preserve">SKILL.md</w:t>
+      </w:r>
+      <w:r>
+        <w:rPr>
+          <w:rFonts w:ascii="Arial" w:cs="Arial" w:eastAsia="Arial" w:hAnsi="Arial"/>
+          <w:b w:val="false"/>
+          <w:bCs w:val="false"/>
+          <w:i w:val="false"/>
+          <w:iCs w:val="false"/>
+          <w:color w:val="243038"/>
+          <w:sz w:val="22"/>
+          <w:szCs w:val="22"/>
+        </w:rPr>
+        <w:t xml:space="preserve"> files. Or clone the Salesforce skills library and point the router at its skills directory. Those files already have a name and a description, which is what the score reads. They do not use the keywords line this router uses when one prompt should load two skills. Add that line on the skills you want loaded together. Without it, a prompt still loads the single best match.</w:t>
       </w:r>
     </w:p>
     <w:p>
@@ -2367,7 +2796,33 @@
           <w:sz w:val="22"/>
           <w:szCs w:val="22"/>
         </w:rPr>
-        <w:t xml:space="preserve">Create skills/&lt;name&gt;/SKILL.md. The description is what the score reads. The keywords line holds the job phrases, separated by commas, in the words a person would type: formula field, field-level security. A prompt that contains one of those phrases loads this skill. The body is the procedure, and it is loaded only after the skill is chosen.</w:t>
+        <w:t xml:space="preserve">Create </w:t>
+      </w:r>
+      <w:r>
+        <w:rPr>
+          <w:rFonts w:ascii="Menlo" w:cs="Menlo" w:eastAsia="Menlo" w:hAnsi="Menlo"/>
+          <w:b/>
+          <w:bCs/>
+          <w:i w:val="false"/>
+          <w:iCs w:val="false"/>
+          <w:color w:val="1B3A4B"/>
+          <w:sz w:val="22"/>
+          <w:szCs w:val="22"/>
+        </w:rPr>
+        <w:t xml:space="preserve">skills/&lt;name&gt;/SKILL.md.</w:t>
+      </w:r>
+      <w:r>
+        <w:rPr>
+          <w:rFonts w:ascii="Arial" w:cs="Arial" w:eastAsia="Arial" w:hAnsi="Arial"/>
+          <w:b w:val="false"/>
+          <w:bCs w:val="false"/>
+          <w:i w:val="false"/>
+          <w:iCs w:val="false"/>
+          <w:color w:val="243038"/>
+          <w:sz w:val="22"/>
+          <w:szCs w:val="22"/>
+        </w:rPr>
+        <w:t xml:space="preserve"> The description is what the score reads. The keywords line holds the job phrases, separated by commas, in the words a person would type: formula field, field-level security. A prompt that contains one of those phrases loads this skill. The body is the procedure, and it is loaded only after the skill is chosen.</w:t>
       </w:r>
     </w:p>
     <w:p>
@@ -2459,7 +2914,20 @@
           <w:sz w:val="22"/>
           <w:szCs w:val="22"/>
         </w:rPr>
-        <w:t xml:space="preserve">To use the Salesforce skills library instead of the samples, run this from the skill-router folder. The clone lands next to the router, and the second command rewrites the local index. The sample files stay in skills/.</w:t>
+        <w:t xml:space="preserve">To use the Salesforce skills library instead of the samples, run this from the skill-router folder. The clone lands next to the router, and the second command rewrites the local index. The sample files stay in </w:t>
+      </w:r>
+      <w:r>
+        <w:rPr>
+          <w:rFonts w:ascii="Menlo" w:cs="Menlo" w:eastAsia="Menlo" w:hAnsi="Menlo"/>
+          <w:b/>
+          <w:bCs/>
+          <w:i w:val="false"/>
+          <w:iCs w:val="false"/>
+          <w:color w:val="1B3A4B"/>
+          <w:sz w:val="22"/>
+          <w:szCs w:val="22"/>
+        </w:rPr>
+        <w:t xml:space="preserve">skills/.</w:t>
       </w:r>
     </w:p>
     <w:p>
@@ -2470,13 +2938,13 @@
       <w:r>
         <w:rPr>
           <w:rFonts w:ascii="Menlo" w:cs="Menlo" w:eastAsia="Menlo" w:hAnsi="Menlo"/>
-          <w:b w:val="false"/>
-          <w:bCs w:val="false"/>
-          <w:i w:val="false"/>
-          <w:iCs w:val="false"/>
-          <w:color w:val="1A2830"/>
-          <w:sz w:val="18"/>
-          <w:szCs w:val="18"/>
+          <w:b/>
+          <w:bCs/>
+          <w:i w:val="false"/>
+          <w:iCs w:val="false"/>
+          <w:color w:val="1B3A4B"/>
+          <w:sz w:val="20"/>
+          <w:szCs w:val="20"/>
         </w:rPr>
         <w:t xml:space="preserve">git clone https://github.com/forcedotcom/sf-skills.git</w:t>
       </w:r>
@@ -2489,13 +2957,13 @@
       <w:r>
         <w:rPr>
           <w:rFonts w:ascii="Menlo" w:cs="Menlo" w:eastAsia="Menlo" w:hAnsi="Menlo"/>
-          <w:b w:val="false"/>
-          <w:bCs w:val="false"/>
-          <w:i w:val="false"/>
-          <w:iCs w:val="false"/>
-          <w:color w:val="1A2830"/>
-          <w:sz w:val="18"/>
-          <w:szCs w:val="18"/>
+          <w:b/>
+          <w:bCs/>
+          <w:i w:val="false"/>
+          <w:iCs w:val="false"/>
+          <w:color w:val="1B3A4B"/>
+          <w:sz w:val="20"/>
+          <w:szCs w:val="20"/>
         </w:rPr>
         <w:t xml:space="preserve">node scripts/generate-index.mjs --skills-dir sf-skills/skills --out-dir .</w:t>
       </w:r>
@@ -2520,7 +2988,59 @@
           <w:sz w:val="22"/>
           <w:szCs w:val="22"/>
         </w:rPr>
-        <w:t xml:space="preserve">Set SKILL_ROUTER_SKILLS_DIR to sf-skills/skills when you start the server. If you cloned it somewhere else, pass that path in both places. Nothing from that repo is copied into this one. A folder of skills you wrote is the same command, with your path.</w:t>
+        <w:t xml:space="preserve">Set </w:t>
+      </w:r>
+      <w:r>
+        <w:rPr>
+          <w:rFonts w:ascii="Menlo" w:cs="Menlo" w:eastAsia="Menlo" w:hAnsi="Menlo"/>
+          <w:b/>
+          <w:bCs/>
+          <w:i w:val="false"/>
+          <w:iCs w:val="false"/>
+          <w:color w:val="1B3A4B"/>
+          <w:sz w:val="22"/>
+          <w:szCs w:val="22"/>
+        </w:rPr>
+        <w:t xml:space="preserve">SKILL_ROUTER_SKILLS_DIR</w:t>
+      </w:r>
+      <w:r>
+        <w:rPr>
+          <w:rFonts w:ascii="Arial" w:cs="Arial" w:eastAsia="Arial" w:hAnsi="Arial"/>
+          <w:b w:val="false"/>
+          <w:bCs w:val="false"/>
+          <w:i w:val="false"/>
+          <w:iCs w:val="false"/>
+          <w:color w:val="243038"/>
+          <w:sz w:val="22"/>
+          <w:szCs w:val="22"/>
+        </w:rPr>
+        <w:t xml:space="preserve"> to </w:t>
+      </w:r>
+      <w:r>
+        <w:rPr>
+          <w:rFonts w:ascii="Menlo" w:cs="Menlo" w:eastAsia="Menlo" w:hAnsi="Menlo"/>
+          <w:b/>
+          <w:bCs/>
+          <w:i w:val="false"/>
+          <w:iCs w:val="false"/>
+          <w:color w:val="1B3A4B"/>
+          <w:sz w:val="22"/>
+          <w:szCs w:val="22"/>
+        </w:rPr>
+        <w:t xml:space="preserve">sf-skills/skills</w:t>
+      </w:r>
+      <w:r>
+        <w:rPr>
+          <w:rFonts w:ascii="Arial" w:cs="Arial" w:eastAsia="Arial" w:hAnsi="Arial"/>
+          <w:b w:val="false"/>
+          <w:bCs w:val="false"/>
+          <w:i w:val="false"/>
+          <w:iCs w:val="false"/>
+          <w:color w:val="243038"/>
+          <w:sz w:val="22"/>
+          <w:szCs w:val="22"/>
+        </w:rPr>
+        <w:t xml:space="preserve"> when you start the server. If you cloned it somewhere else, pass that path in both places. Nothing from that repo is copied into this one. A folder of skills you wrote is the same command, with your path.</w:t>
       </w:r>
     </w:p>
     <w:p>
@@ -2543,7 +3063,33 @@
           <w:sz w:val="22"/>
           <w:szCs w:val="22"/>
         </w:rPr>
-        <w:t xml:space="preserve">The router code stays put. The index is generated. A new Salesforce skill — a naming-convention check, a permission-set diff, a flow-fault reviewer — shows up in find_skill on the next prompt, because its description is now in the catalog. Removing a skill is the same operation in reverse: delete the folder, regenerate, confirm the gold prompts that used to hit it now abstain or land on the replacement.</w:t>
+        <w:t xml:space="preserve">The router code stays put. The index is generated. A new Salesforce skill — a naming-convention check, a permission-set diff, a flow-fault reviewer — shows up in </w:t>
+      </w:r>
+      <w:r>
+        <w:rPr>
+          <w:rFonts w:ascii="Menlo" w:cs="Menlo" w:eastAsia="Menlo" w:hAnsi="Menlo"/>
+          <w:b/>
+          <w:bCs/>
+          <w:i w:val="false"/>
+          <w:iCs w:val="false"/>
+          <w:color w:val="1B3A4B"/>
+          <w:sz w:val="22"/>
+          <w:szCs w:val="22"/>
+        </w:rPr>
+        <w:t xml:space="preserve">find_skill</w:t>
+      </w:r>
+      <w:r>
+        <w:rPr>
+          <w:rFonts w:ascii="Arial" w:cs="Arial" w:eastAsia="Arial" w:hAnsi="Arial"/>
+          <w:b w:val="false"/>
+          <w:bCs w:val="false"/>
+          <w:i w:val="false"/>
+          <w:iCs w:val="false"/>
+          <w:color w:val="243038"/>
+          <w:sz w:val="22"/>
+          <w:szCs w:val="22"/>
+        </w:rPr>
+        <w:t xml:space="preserve"> on the next prompt, because its description is now in the catalog. Removing a skill is the same operation in reverse: delete the folder, regenerate, confirm the gold prompts that used to hit it now abstain or land on the replacement.</w:t>
       </w:r>
     </w:p>
     <w:p>
@@ -2723,7 +3269,59 @@
           <w:sz w:val="22"/>
           <w:szCs w:val="22"/>
         </w:rPr>
-        <w:t xml:space="preserve">A generator walks skills/ and reads each SKILL.md. It keeps the routing signal and throws away the procedure: directory name, frontmatter name, description, and the keywords line. Multi-word job phrases come from that keywords line. Single words are also taken from the description, and they affect the score only. It writes two artifacts from the same pass.</w:t>
+        <w:t xml:space="preserve">A generator walks </w:t>
+      </w:r>
+      <w:r>
+        <w:rPr>
+          <w:rFonts w:ascii="Menlo" w:cs="Menlo" w:eastAsia="Menlo" w:hAnsi="Menlo"/>
+          <w:b/>
+          <w:bCs/>
+          <w:i w:val="false"/>
+          <w:iCs w:val="false"/>
+          <w:color w:val="1B3A4B"/>
+          <w:sz w:val="22"/>
+          <w:szCs w:val="22"/>
+        </w:rPr>
+        <w:t xml:space="preserve">skills/</w:t>
+      </w:r>
+      <w:r>
+        <w:rPr>
+          <w:rFonts w:ascii="Arial" w:cs="Arial" w:eastAsia="Arial" w:hAnsi="Arial"/>
+          <w:b w:val="false"/>
+          <w:bCs w:val="false"/>
+          <w:i w:val="false"/>
+          <w:iCs w:val="false"/>
+          <w:color w:val="243038"/>
+          <w:sz w:val="22"/>
+          <w:szCs w:val="22"/>
+        </w:rPr>
+        <w:t xml:space="preserve"> and reads each </w:t>
+      </w:r>
+      <w:r>
+        <w:rPr>
+          <w:rFonts w:ascii="Menlo" w:cs="Menlo" w:eastAsia="Menlo" w:hAnsi="Menlo"/>
+          <w:b/>
+          <w:bCs/>
+          <w:i w:val="false"/>
+          <w:iCs w:val="false"/>
+          <w:color w:val="1B3A4B"/>
+          <w:sz w:val="22"/>
+          <w:szCs w:val="22"/>
+        </w:rPr>
+        <w:t xml:space="preserve">SKILL.md</w:t>
+      </w:r>
+      <w:r>
+        <w:rPr>
+          <w:rFonts w:ascii="Arial" w:cs="Arial" w:eastAsia="Arial" w:hAnsi="Arial"/>
+          <w:b w:val="false"/>
+          <w:bCs w:val="false"/>
+          <w:i w:val="false"/>
+          <w:iCs w:val="false"/>
+          <w:color w:val="243038"/>
+          <w:sz w:val="22"/>
+          <w:szCs w:val="22"/>
+        </w:rPr>
+        <w:t xml:space="preserve">. It keeps the routing signal and throws away the procedure: directory name, frontmatter name, description, and the keywords line. Multi-word job phrases come from that keywords line. Single words are also taken from the description, and they affect the score only. It writes two artifacts from the same pass.</w:t>
       </w:r>
     </w:p>
     <w:p>
@@ -2737,16 +3335,29 @@
       </w:pPr>
       <w:r>
         <w:rPr>
-          <w:rFonts w:ascii="Arial" w:cs="Arial" w:eastAsia="Arial" w:hAnsi="Arial"/>
-          <w:b w:val="false"/>
-          <w:bCs w:val="false"/>
-          <w:i w:val="false"/>
-          <w:iCs w:val="false"/>
-          <w:color w:val="243038"/>
-          <w:sz w:val="22"/>
-          <w:szCs w:val="22"/>
-        </w:rPr>
-        <w:t xml:space="preserve">router/skills-index.json is the catalog the server scores against.</w:t>
+          <w:rFonts w:ascii="Menlo" w:cs="Menlo" w:eastAsia="Menlo" w:hAnsi="Menlo"/>
+          <w:b/>
+          <w:bCs/>
+          <w:i w:val="false"/>
+          <w:iCs w:val="false"/>
+          <w:color w:val="1B3A4B"/>
+          <w:sz w:val="22"/>
+          <w:szCs w:val="22"/>
+        </w:rPr>
+        <w:t xml:space="preserve">router/skills-index.json</w:t>
+      </w:r>
+      <w:r>
+        <w:rPr>
+          <w:rFonts w:ascii="Arial" w:cs="Arial" w:eastAsia="Arial" w:hAnsi="Arial"/>
+          <w:b w:val="false"/>
+          <w:bCs w:val="false"/>
+          <w:i w:val="false"/>
+          <w:iCs w:val="false"/>
+          <w:color w:val="243038"/>
+          <w:sz w:val="22"/>
+          <w:szCs w:val="22"/>
+        </w:rPr>
+        <w:t xml:space="preserve"> is the catalog the server scores against.</w:t>
       </w:r>
     </w:p>
     <w:p>
@@ -2760,16 +3371,29 @@
       </w:pPr>
       <w:r>
         <w:rPr>
-          <w:rFonts w:ascii="Arial" w:cs="Arial" w:eastAsia="Arial" w:hAnsi="Arial"/>
-          <w:b w:val="false"/>
-          <w:bCs w:val="false"/>
-          <w:i w:val="false"/>
-          <w:iCs w:val="false"/>
-          <w:color w:val="243038"/>
-          <w:sz w:val="22"/>
-          <w:szCs w:val="22"/>
-        </w:rPr>
-        <w:t xml:space="preserve">ROUTER.md is the same catalog for a person.</w:t>
+          <w:rFonts w:ascii="Menlo" w:cs="Menlo" w:eastAsia="Menlo" w:hAnsi="Menlo"/>
+          <w:b/>
+          <w:bCs/>
+          <w:i w:val="false"/>
+          <w:iCs w:val="false"/>
+          <w:color w:val="1B3A4B"/>
+          <w:sz w:val="22"/>
+          <w:szCs w:val="22"/>
+        </w:rPr>
+        <w:t xml:space="preserve">ROUTER.md</w:t>
+      </w:r>
+      <w:r>
+        <w:rPr>
+          <w:rFonts w:ascii="Arial" w:cs="Arial" w:eastAsia="Arial" w:hAnsi="Arial"/>
+          <w:b w:val="false"/>
+          <w:bCs w:val="false"/>
+          <w:i w:val="false"/>
+          <w:iCs w:val="false"/>
+          <w:color w:val="243038"/>
+          <w:sz w:val="22"/>
+          <w:szCs w:val="22"/>
+        </w:rPr>
+        <w:t xml:space="preserve"> is the same catalog for a person.</w:t>
       </w:r>
     </w:p>
     <w:p>
@@ -2836,16 +3460,29 @@
       </w:pPr>
       <w:r>
         <w:rPr>
-          <w:rFonts w:ascii="Arial" w:cs="Arial" w:eastAsia="Arial" w:hAnsi="Arial"/>
-          <w:b w:val="false"/>
-          <w:bCs w:val="false"/>
-          <w:i w:val="false"/>
-          <w:iCs w:val="false"/>
-          <w:color w:val="243038"/>
-          <w:sz w:val="22"/>
-          <w:szCs w:val="22"/>
-        </w:rPr>
-        <w:t xml:space="preserve">find_skill is the call that matters. The list it returns is the set to load. Read every skill in it. The other four tools exist so the agent can open those files, instead of guessing a path.</w:t>
+          <w:rFonts w:ascii="Menlo" w:cs="Menlo" w:eastAsia="Menlo" w:hAnsi="Menlo"/>
+          <w:b/>
+          <w:bCs/>
+          <w:i w:val="false"/>
+          <w:iCs w:val="false"/>
+          <w:color w:val="1B3A4B"/>
+          <w:sz w:val="22"/>
+          <w:szCs w:val="22"/>
+        </w:rPr>
+        <w:t xml:space="preserve">find_skill</w:t>
+      </w:r>
+      <w:r>
+        <w:rPr>
+          <w:rFonts w:ascii="Arial" w:cs="Arial" w:eastAsia="Arial" w:hAnsi="Arial"/>
+          <w:b w:val="false"/>
+          <w:bCs w:val="false"/>
+          <w:i w:val="false"/>
+          <w:iCs w:val="false"/>
+          <w:color w:val="243038"/>
+          <w:sz w:val="22"/>
+          <w:szCs w:val="22"/>
+        </w:rPr>
+        <w:t xml:space="preserve"> is the call that matters. The list it returns is the set to load. Read every skill in it. The other four tools exist so the agent can open those files, instead of guessing a path.</w:t>
       </w:r>
     </w:p>
     <w:p>
@@ -2977,12 +3614,12 @@
             </w:pPr>
             <w:r>
               <w:rPr>
-                <w:rFonts w:ascii="Arial" w:cs="Arial" w:eastAsia="Arial" w:hAnsi="Arial"/>
+                <w:rFonts w:ascii="Menlo" w:cs="Menlo" w:eastAsia="Menlo" w:hAnsi="Menlo"/>
                 <w:b/>
                 <w:bCs/>
                 <w:i w:val="false"/>
                 <w:iCs w:val="false"/>
-                <w:color w:val="243038"/>
+                <w:color w:val="1B3A4B"/>
                 <w:sz w:val="18"/>
                 <w:szCs w:val="18"/>
               </w:rPr>
@@ -3056,12 +3693,12 @@
             </w:pPr>
             <w:r>
               <w:rPr>
-                <w:rFonts w:ascii="Arial" w:cs="Arial" w:eastAsia="Arial" w:hAnsi="Arial"/>
+                <w:rFonts w:ascii="Menlo" w:cs="Menlo" w:eastAsia="Menlo" w:hAnsi="Menlo"/>
                 <w:b/>
                 <w:bCs/>
                 <w:i w:val="false"/>
                 <w:iCs w:val="false"/>
-                <w:color w:val="243038"/>
+                <w:color w:val="1B3A4B"/>
                 <w:sz w:val="18"/>
                 <w:szCs w:val="18"/>
               </w:rPr>
@@ -3135,12 +3772,12 @@
             </w:pPr>
             <w:r>
               <w:rPr>
-                <w:rFonts w:ascii="Arial" w:cs="Arial" w:eastAsia="Arial" w:hAnsi="Arial"/>
+                <w:rFonts w:ascii="Menlo" w:cs="Menlo" w:eastAsia="Menlo" w:hAnsi="Menlo"/>
                 <w:b/>
                 <w:bCs/>
                 <w:i w:val="false"/>
                 <w:iCs w:val="false"/>
-                <w:color w:val="243038"/>
+                <w:color w:val="1B3A4B"/>
                 <w:sz w:val="18"/>
                 <w:szCs w:val="18"/>
               </w:rPr>
@@ -3181,7 +3818,33 @@
                 <w:sz w:val="18"/>
                 <w:szCs w:val="18"/>
               </w:rPr>
-              <w:t xml:space="preserve">The full SKILL.md, so the agent follows the procedure after the route.</w:t>
+              <w:t xml:space="preserve">The full </w:t>
+            </w:r>
+            <w:r>
+              <w:rPr>
+                <w:rFonts w:ascii="Menlo" w:cs="Menlo" w:eastAsia="Menlo" w:hAnsi="Menlo"/>
+                <w:b/>
+                <w:bCs/>
+                <w:i w:val="false"/>
+                <w:iCs w:val="false"/>
+                <w:color w:val="1B3A4B"/>
+                <w:sz w:val="18"/>
+                <w:szCs w:val="18"/>
+              </w:rPr>
+              <w:t xml:space="preserve">SKILL.md</w:t>
+            </w:r>
+            <w:r>
+              <w:rPr>
+                <w:rFonts w:ascii="Arial" w:cs="Arial" w:eastAsia="Arial" w:hAnsi="Arial"/>
+                <w:b w:val="false"/>
+                <w:bCs w:val="false"/>
+                <w:i w:val="false"/>
+                <w:iCs w:val="false"/>
+                <w:color w:val="243038"/>
+                <w:sz w:val="18"/>
+                <w:szCs w:val="18"/>
+              </w:rPr>
+              <w:t xml:space="preserve">, so the agent follows the procedure after the route.</w:t>
             </w:r>
           </w:p>
         </w:tc>
@@ -3214,12 +3877,12 @@
             </w:pPr>
             <w:r>
               <w:rPr>
-                <w:rFonts w:ascii="Arial" w:cs="Arial" w:eastAsia="Arial" w:hAnsi="Arial"/>
+                <w:rFonts w:ascii="Menlo" w:cs="Menlo" w:eastAsia="Menlo" w:hAnsi="Menlo"/>
                 <w:b/>
                 <w:bCs/>
                 <w:i w:val="false"/>
                 <w:iCs w:val="false"/>
-                <w:color w:val="243038"/>
+                <w:color w:val="1B3A4B"/>
                 <w:sz w:val="18"/>
                 <w:szCs w:val="18"/>
               </w:rPr>
@@ -3293,12 +3956,12 @@
             </w:pPr>
             <w:r>
               <w:rPr>
-                <w:rFonts w:ascii="Arial" w:cs="Arial" w:eastAsia="Arial" w:hAnsi="Arial"/>
+                <w:rFonts w:ascii="Menlo" w:cs="Menlo" w:eastAsia="Menlo" w:hAnsi="Menlo"/>
                 <w:b/>
                 <w:bCs/>
                 <w:i w:val="false"/>
                 <w:iCs w:val="false"/>
-                <w:color w:val="243038"/>
+                <w:color w:val="1B3A4B"/>
                 <w:sz w:val="18"/>
                 <w:szCs w:val="18"/>
               </w:rPr>
@@ -3387,7 +4050,33 @@
           <w:sz w:val="22"/>
           <w:szCs w:val="22"/>
         </w:rPr>
-        <w:t xml:space="preserve">The router does not read every skill from top to bottom before it chooses. It reads two things: the skill’s name, and the one-line description at the top of SKILL.md. That sentence is the routing signal. The rest of the file is the procedure, and it is loaded only after the skill has been chosen.</w:t>
+        <w:t xml:space="preserve">The router does not read every skill from top to bottom before it chooses. It reads two things: the skill’s name, and the one-line description at the top of </w:t>
+      </w:r>
+      <w:r>
+        <w:rPr>
+          <w:rFonts w:ascii="Menlo" w:cs="Menlo" w:eastAsia="Menlo" w:hAnsi="Menlo"/>
+          <w:b/>
+          <w:bCs/>
+          <w:i w:val="false"/>
+          <w:iCs w:val="false"/>
+          <w:color w:val="1B3A4B"/>
+          <w:sz w:val="22"/>
+          <w:szCs w:val="22"/>
+        </w:rPr>
+        <w:t xml:space="preserve">SKILL.md</w:t>
+      </w:r>
+      <w:r>
+        <w:rPr>
+          <w:rFonts w:ascii="Arial" w:cs="Arial" w:eastAsia="Arial" w:hAnsi="Arial"/>
+          <w:b w:val="false"/>
+          <w:bCs w:val="false"/>
+          <w:i w:val="false"/>
+          <w:iCs w:val="false"/>
+          <w:color w:val="243038"/>
+          <w:sz w:val="22"/>
+          <w:szCs w:val="22"/>
+        </w:rPr>
+        <w:t xml:space="preserve">. That sentence is the routing signal. The rest of the file is the procedure, and it is loaded only after the skill has been chosen.</w:t>
       </w:r>
     </w:p>
     <w:p>
@@ -3423,7 +4112,33 @@
           <w:sz w:val="22"/>
           <w:szCs w:val="22"/>
         </w:rPr>
-        <w:t xml:space="preserve">A skill joins the set when the prompt contains that skill’s job phrase. The job phrase is a multi-word entry on the keywords line, such as “formula field” or “field-level security.” One phrase, one skill. Two phrases from two skills, both skills. Words that appear only in the description do not add a second skill. If the prompt uses none of the phrases, but one skill is still clearly the best match, that one skill loads. If the best match is weak, the router returns an empty list. A question about dinner does not get an Apex skill. That cutoff is a number in the code, currently recorded in eval/results.json. You only change it by rerunning the eval after the catalog grows. You do not need the math to write a skill. You need a keywords line that uses the words a person would actually type.</w:t>
+        <w:t xml:space="preserve">A skill joins the set when the prompt contains that skill’s job phrase. The job phrase is a multi-word entry on the keywords line, such as “formula field” or “field-level security.” One phrase, one skill. Two phrases from two skills, both skills. Words that appear only in the description do not add a second skill. If the prompt uses none of the phrases, but one skill is still clearly the best match, that one skill loads. If the best match is weak, the router returns an empty list. A question about dinner does not get an Apex skill. That cutoff is a number in the code, currently recorded in </w:t>
+      </w:r>
+      <w:r>
+        <w:rPr>
+          <w:rFonts w:ascii="Menlo" w:cs="Menlo" w:eastAsia="Menlo" w:hAnsi="Menlo"/>
+          <w:b/>
+          <w:bCs/>
+          <w:i w:val="false"/>
+          <w:iCs w:val="false"/>
+          <w:color w:val="1B3A4B"/>
+          <w:sz w:val="22"/>
+          <w:szCs w:val="22"/>
+        </w:rPr>
+        <w:t xml:space="preserve">eval/results.json.</w:t>
+      </w:r>
+      <w:r>
+        <w:rPr>
+          <w:rFonts w:ascii="Arial" w:cs="Arial" w:eastAsia="Arial" w:hAnsi="Arial"/>
+          <w:b w:val="false"/>
+          <w:bCs w:val="false"/>
+          <w:i w:val="false"/>
+          <w:iCs w:val="false"/>
+          <w:color w:val="243038"/>
+          <w:sz w:val="22"/>
+          <w:szCs w:val="22"/>
+        </w:rPr>
+        <w:t xml:space="preserve"> You only change it by rerunning the eval after the catalog grows. You do not need the math to write a skill. You need a keywords line that uses the words a person would actually type.</w:t>
       </w:r>
     </w:p>
     <w:p>
@@ -3441,7 +4156,33 @@
           <w:sz w:val="22"/>
           <w:szCs w:val="22"/>
         </w:rPr>
-        <w:t xml:space="preserve">The method has a name, BM25. It is the same idea a library catalog uses: a rare word is a better clue than a common one. The formula is in lib/score.mjs for anyone who wants it. The rest of this post does not depend on it.</w:t>
+        <w:t xml:space="preserve">The method has a name, BM25. It is the same idea a library catalog uses: a rare word is a better clue than a common one. The formula is in </w:t>
+      </w:r>
+      <w:r>
+        <w:rPr>
+          <w:rFonts w:ascii="Menlo" w:cs="Menlo" w:eastAsia="Menlo" w:hAnsi="Menlo"/>
+          <w:b/>
+          <w:bCs/>
+          <w:i w:val="false"/>
+          <w:iCs w:val="false"/>
+          <w:color w:val="1B3A4B"/>
+          <w:sz w:val="22"/>
+          <w:szCs w:val="22"/>
+        </w:rPr>
+        <w:t xml:space="preserve">lib/score.mjs</w:t>
+      </w:r>
+      <w:r>
+        <w:rPr>
+          <w:rFonts w:ascii="Arial" w:cs="Arial" w:eastAsia="Arial" w:hAnsi="Arial"/>
+          <w:b w:val="false"/>
+          <w:bCs w:val="false"/>
+          <w:i w:val="false"/>
+          <w:iCs w:val="false"/>
+          <w:color w:val="243038"/>
+          <w:sz w:val="22"/>
+          <w:szCs w:val="22"/>
+        </w:rPr>
+        <w:t xml:space="preserve"> for anyone who wants it. The rest of this post does not depend on it.</w:t>
       </w:r>
     </w:p>
     <w:p>
@@ -3499,7 +4240,33 @@
           <w:sz w:val="22"/>
           <w:szCs w:val="22"/>
         </w:rPr>
-        <w:t xml:space="preserve">A hand-written phrase list is still in the repo, in router/intents.json, so we can measure the older idea. The first matching phrase wins, and the second job is dropped. On this set that list puts a right skill first 80.0% of the time (60 of 75) and does not answer any of the 10 unrelated prompts. It misses whenever the person does not use the exact phrase. It also misses the second skill on every prompt that needs two. The router that ships does not use that list.</w:t>
+        <w:t xml:space="preserve">A hand-written phrase list is still in the repo, in </w:t>
+      </w:r>
+      <w:r>
+        <w:rPr>
+          <w:rFonts w:ascii="Menlo" w:cs="Menlo" w:eastAsia="Menlo" w:hAnsi="Menlo"/>
+          <w:b/>
+          <w:bCs/>
+          <w:i w:val="false"/>
+          <w:iCs w:val="false"/>
+          <w:color w:val="1B3A4B"/>
+          <w:sz w:val="22"/>
+          <w:szCs w:val="22"/>
+        </w:rPr>
+        <w:t xml:space="preserve">router/intents.json</w:t>
+      </w:r>
+      <w:r>
+        <w:rPr>
+          <w:rFonts w:ascii="Arial" w:cs="Arial" w:eastAsia="Arial" w:hAnsi="Arial"/>
+          <w:b w:val="false"/>
+          <w:bCs w:val="false"/>
+          <w:i w:val="false"/>
+          <w:iCs w:val="false"/>
+          <w:color w:val="243038"/>
+          <w:sz w:val="22"/>
+          <w:szCs w:val="22"/>
+        </w:rPr>
+        <w:t xml:space="preserve">, so we can measure the older idea. The first matching phrase wins, and the second job is dropped. On this set that list puts a right skill first 80.0% of the time (60 of 75) and does not answer any of the 10 unrelated prompts. It misses whenever the person does not use the exact phrase. It also misses the second skill on every prompt that needs two. The router that ships does not use that list.</w:t>
       </w:r>
     </w:p>
     <w:p>
@@ -3557,7 +4324,98 @@
           <w:sz w:val="22"/>
           <w:szCs w:val="22"/>
         </w:rPr>
-        <w:t xml:space="preserve">The test set is eval/prompts.jsonl in this repo: 75 prompts that should load one or more skills, plus 10 prompts that should get no skill at all. 12 of the real prompts say the job in different words than the skill description. 5 prompts ask for two skills. node eval/compare.mjs runs every approach on those same lines and writes eval/results.json. The table below is that file, in plain terms. “Right skill first” means the strongest skill returned was one the prompt needed. “Only the skills asked for” means the list was exactly that set, with nothing extra and nothing missing. “Unrelated prompts answered” means a dinner plan or a flight search still got a Salesforce skill. The same table is in eval/results.md.</w:t>
+        <w:t xml:space="preserve">The test set is </w:t>
+      </w:r>
+      <w:r>
+        <w:rPr>
+          <w:rFonts w:ascii="Menlo" w:cs="Menlo" w:eastAsia="Menlo" w:hAnsi="Menlo"/>
+          <w:b/>
+          <w:bCs/>
+          <w:i w:val="false"/>
+          <w:iCs w:val="false"/>
+          <w:color w:val="1B3A4B"/>
+          <w:sz w:val="22"/>
+          <w:szCs w:val="22"/>
+        </w:rPr>
+        <w:t xml:space="preserve">eval/prompts.jsonl</w:t>
+      </w:r>
+      <w:r>
+        <w:rPr>
+          <w:rFonts w:ascii="Arial" w:cs="Arial" w:eastAsia="Arial" w:hAnsi="Arial"/>
+          <w:b w:val="false"/>
+          <w:bCs w:val="false"/>
+          <w:i w:val="false"/>
+          <w:iCs w:val="false"/>
+          <w:color w:val="243038"/>
+          <w:sz w:val="22"/>
+          <w:szCs w:val="22"/>
+        </w:rPr>
+        <w:t xml:space="preserve"> in this repo: 75 prompts that should load one or more skills, plus 10 prompts that should get no skill at all. 12 of the real prompts say the job in different words than the skill description. 5 prompts ask for two skills. node </w:t>
+      </w:r>
+      <w:r>
+        <w:rPr>
+          <w:rFonts w:ascii="Menlo" w:cs="Menlo" w:eastAsia="Menlo" w:hAnsi="Menlo"/>
+          <w:b/>
+          <w:bCs/>
+          <w:i w:val="false"/>
+          <w:iCs w:val="false"/>
+          <w:color w:val="1B3A4B"/>
+          <w:sz w:val="22"/>
+          <w:szCs w:val="22"/>
+        </w:rPr>
+        <w:t xml:space="preserve">eval/compare.mjs</w:t>
+      </w:r>
+      <w:r>
+        <w:rPr>
+          <w:rFonts w:ascii="Arial" w:cs="Arial" w:eastAsia="Arial" w:hAnsi="Arial"/>
+          <w:b w:val="false"/>
+          <w:bCs w:val="false"/>
+          <w:i w:val="false"/>
+          <w:iCs w:val="false"/>
+          <w:color w:val="243038"/>
+          <w:sz w:val="22"/>
+          <w:szCs w:val="22"/>
+        </w:rPr>
+        <w:t xml:space="preserve"> runs every approach on those same lines and writes </w:t>
+      </w:r>
+      <w:r>
+        <w:rPr>
+          <w:rFonts w:ascii="Menlo" w:cs="Menlo" w:eastAsia="Menlo" w:hAnsi="Menlo"/>
+          <w:b/>
+          <w:bCs/>
+          <w:i w:val="false"/>
+          <w:iCs w:val="false"/>
+          <w:color w:val="1B3A4B"/>
+          <w:sz w:val="22"/>
+          <w:szCs w:val="22"/>
+        </w:rPr>
+        <w:t xml:space="preserve">eval/results.json.</w:t>
+      </w:r>
+      <w:r>
+        <w:rPr>
+          <w:rFonts w:ascii="Arial" w:cs="Arial" w:eastAsia="Arial" w:hAnsi="Arial"/>
+          <w:b w:val="false"/>
+          <w:bCs w:val="false"/>
+          <w:i w:val="false"/>
+          <w:iCs w:val="false"/>
+          <w:color w:val="243038"/>
+          <w:sz w:val="22"/>
+          <w:szCs w:val="22"/>
+        </w:rPr>
+        <w:t xml:space="preserve"> The table below is that file, in plain terms. “Right skill first” means the strongest skill returned was one the prompt needed. “Only the skills asked for” means the list was exactly that set, with nothing extra and nothing missing. “Unrelated prompts answered” means a dinner plan or a flight search still got a Salesforce skill. The same table is in </w:t>
+      </w:r>
+      <w:r>
+        <w:rPr>
+          <w:rFonts w:ascii="Menlo" w:cs="Menlo" w:eastAsia="Menlo" w:hAnsi="Menlo"/>
+          <w:b/>
+          <w:bCs/>
+          <w:i w:val="false"/>
+          <w:iCs w:val="false"/>
+          <w:color w:val="1B3A4B"/>
+          <w:sz w:val="22"/>
+          <w:szCs w:val="22"/>
+        </w:rPr>
+        <w:t xml:space="preserve">eval/results.md.</w:t>
       </w:r>
     </w:p>
     <w:p>
@@ -3876,12 +4734,12 @@
             </w:pPr>
             <w:r>
               <w:rPr>
-                <w:rFonts w:ascii="Arial" w:cs="Arial" w:eastAsia="Arial" w:hAnsi="Arial"/>
-                <w:b w:val="false"/>
-                <w:bCs w:val="false"/>
+                <w:rFonts w:ascii="Menlo" w:cs="Menlo" w:eastAsia="Menlo" w:hAnsi="Menlo"/>
+                <w:b/>
+                <w:bCs/>
                 <w:i w:val="false"/>
                 <w:iCs w:val="false"/>
-                <w:color w:val="243038"/>
+                <w:color w:val="1B3A4B"/>
                 <w:sz w:val="18"/>
                 <w:szCs w:val="18"/>
               </w:rPr>
@@ -4029,12 +4887,12 @@
             </w:pPr>
             <w:r>
               <w:rPr>
-                <w:rFonts w:ascii="Arial" w:cs="Arial" w:eastAsia="Arial" w:hAnsi="Arial"/>
-                <w:b w:val="false"/>
-                <w:bCs w:val="false"/>
+                <w:rFonts w:ascii="Menlo" w:cs="Menlo" w:eastAsia="Menlo" w:hAnsi="Menlo"/>
+                <w:b/>
+                <w:bCs/>
                 <w:i w:val="false"/>
                 <w:iCs w:val="false"/>
-                <w:color w:val="243038"/>
+                <w:color w:val="1B3A4B"/>
                 <w:sz w:val="18"/>
                 <w:szCs w:val="18"/>
               </w:rPr>
@@ -4182,12 +5040,12 @@
             </w:pPr>
             <w:r>
               <w:rPr>
-                <w:rFonts w:ascii="Arial" w:cs="Arial" w:eastAsia="Arial" w:hAnsi="Arial"/>
-                <w:b w:val="false"/>
-                <w:bCs w:val="false"/>
+                <w:rFonts w:ascii="Menlo" w:cs="Menlo" w:eastAsia="Menlo" w:hAnsi="Menlo"/>
+                <w:b/>
+                <w:bCs/>
                 <w:i w:val="false"/>
                 <w:iCs w:val="false"/>
-                <w:color w:val="243038"/>
+                <w:color w:val="1B3A4B"/>
                 <w:sz w:val="18"/>
                 <w:szCs w:val="18"/>
               </w:rPr>
@@ -4335,12 +5193,12 @@
             </w:pPr>
             <w:r>
               <w:rPr>
-                <w:rFonts w:ascii="Arial" w:cs="Arial" w:eastAsia="Arial" w:hAnsi="Arial"/>
-                <w:b w:val="false"/>
-                <w:bCs w:val="false"/>
+                <w:rFonts w:ascii="Menlo" w:cs="Menlo" w:eastAsia="Menlo" w:hAnsi="Menlo"/>
+                <w:b/>
+                <w:bCs/>
                 <w:i w:val="false"/>
                 <w:iCs w:val="false"/>
-                <w:color w:val="243038"/>
+                <w:color w:val="1B3A4B"/>
                 <w:sz w:val="18"/>
                 <w:szCs w:val="18"/>
               </w:rPr>
@@ -4370,7 +5228,33 @@
           <w:sz w:val="22"/>
           <w:szCs w:val="22"/>
         </w:rPr>
-        <w:t xml:space="preserve">The shipped approach, matching the name and the one-line description, puts a needed skill first 84.0% of the time (63 of 75) and answers 0/10 unrelated prompts. On those same 75 prompts, the skills it returned were exactly the skills the prompt needed 84.0% of the time (63 of 75). Simply counting words in common ties the first-skill number on this small catalog, and then keeps returning neighboring skills the prompt did not ask for. The two also split when we search the body of the skill file.</w:t>
+        <w:t xml:space="preserve">The shipped approach, matching the name and the one-line description, puts a needed skill first 84.0% of the time (63 of 75) and answers </w:t>
+      </w:r>
+      <w:r>
+        <w:rPr>
+          <w:rFonts w:ascii="Menlo" w:cs="Menlo" w:eastAsia="Menlo" w:hAnsi="Menlo"/>
+          <w:b/>
+          <w:bCs/>
+          <w:i w:val="false"/>
+          <w:iCs w:val="false"/>
+          <w:color w:val="1B3A4B"/>
+          <w:sz w:val="22"/>
+          <w:szCs w:val="22"/>
+        </w:rPr>
+        <w:t xml:space="preserve">0/10</w:t>
+      </w:r>
+      <w:r>
+        <w:rPr>
+          <w:rFonts w:ascii="Arial" w:cs="Arial" w:eastAsia="Arial" w:hAnsi="Arial"/>
+          <w:b w:val="false"/>
+          <w:bCs w:val="false"/>
+          <w:i w:val="false"/>
+          <w:iCs w:val="false"/>
+          <w:color w:val="243038"/>
+          <w:sz w:val="22"/>
+          <w:szCs w:val="22"/>
+        </w:rPr>
+        <w:t xml:space="preserve"> unrelated prompts. On those same 75 prompts, the skills it returned were exactly the skills the prompt needed 84.0% of the time (63 of 75). Simply counting words in common ties the first-skill number on this small catalog, and then keeps returning neighboring skills the prompt did not ask for. The two also split when we search the body of the skill file.</w:t>
       </w:r>
     </w:p>
     <w:p>
@@ -4388,7 +5272,59 @@
           <w:sz w:val="22"/>
           <w:szCs w:val="22"/>
         </w:rPr>
-        <w:t xml:space="preserve">Searching the whole SKILL.md answers 3/10 unrelated prompts. Skill files share a lot of ordinary teaching language: “use this skill when the user…” That shared language is enough to answer a prompt that should have been left alone. The one-line description already has the words that matter. The rest of the file is for after the choice.</w:t>
+        <w:t xml:space="preserve">Searching the whole </w:t>
+      </w:r>
+      <w:r>
+        <w:rPr>
+          <w:rFonts w:ascii="Menlo" w:cs="Menlo" w:eastAsia="Menlo" w:hAnsi="Menlo"/>
+          <w:b/>
+          <w:bCs/>
+          <w:i w:val="false"/>
+          <w:iCs w:val="false"/>
+          <w:color w:val="1B3A4B"/>
+          <w:sz w:val="22"/>
+          <w:szCs w:val="22"/>
+        </w:rPr>
+        <w:t xml:space="preserve">SKILL.md</w:t>
+      </w:r>
+      <w:r>
+        <w:rPr>
+          <w:rFonts w:ascii="Arial" w:cs="Arial" w:eastAsia="Arial" w:hAnsi="Arial"/>
+          <w:b w:val="false"/>
+          <w:bCs w:val="false"/>
+          <w:i w:val="false"/>
+          <w:iCs w:val="false"/>
+          <w:color w:val="243038"/>
+          <w:sz w:val="22"/>
+          <w:szCs w:val="22"/>
+        </w:rPr>
+        <w:t xml:space="preserve"> answers </w:t>
+      </w:r>
+      <w:r>
+        <w:rPr>
+          <w:rFonts w:ascii="Menlo" w:cs="Menlo" w:eastAsia="Menlo" w:hAnsi="Menlo"/>
+          <w:b/>
+          <w:bCs/>
+          <w:i w:val="false"/>
+          <w:iCs w:val="false"/>
+          <w:color w:val="1B3A4B"/>
+          <w:sz w:val="22"/>
+          <w:szCs w:val="22"/>
+        </w:rPr>
+        <w:t xml:space="preserve">3/10</w:t>
+      </w:r>
+      <w:r>
+        <w:rPr>
+          <w:rFonts w:ascii="Arial" w:cs="Arial" w:eastAsia="Arial" w:hAnsi="Arial"/>
+          <w:b w:val="false"/>
+          <w:bCs w:val="false"/>
+          <w:i w:val="false"/>
+          <w:iCs w:val="false"/>
+          <w:color w:val="243038"/>
+          <w:sz w:val="22"/>
+          <w:szCs w:val="22"/>
+        </w:rPr>
+        <w:t xml:space="preserve"> unrelated prompts. Skill files share a lot of ordinary teaching language: “use this skill when the user…” That shared language is enough to answer a prompt that should have been left alone. The one-line description already has the words that matter. The rest of the file is for after the choice.</w:t>
       </w:r>
     </w:p>
     <w:p>
@@ -4508,7 +5444,33 @@
           <w:sz w:val="22"/>
           <w:szCs w:val="22"/>
         </w:rPr>
-        <w:t xml:space="preserve">That 84.0% does not mean the router understands the work. All 63 prompts that used the skills’ own words loaded exactly the skills they asked for, including the prompts that asked for two. Of the 12 prompts that said the same job in different words, 4 returned nothing and 8 returned a different skill. “The suite is red in the org. What failed?” loaded the deploy skill. The list is in eval/results.md. “Show me customers we added in the last seven days” never says SOQL, so the SOQL skill does not load.</w:t>
+        <w:t xml:space="preserve">That 84.0% does not mean the router understands the work. All 63 prompts that used the skills’ own words loaded exactly the skills they asked for, including the prompts that asked for two. Of the 12 prompts that said the same job in different words, 4 returned nothing and 8 returned a different skill. “The suite is red in the org. What failed?” loaded the deploy skill. The list is in </w:t>
+      </w:r>
+      <w:r>
+        <w:rPr>
+          <w:rFonts w:ascii="Menlo" w:cs="Menlo" w:eastAsia="Menlo" w:hAnsi="Menlo"/>
+          <w:b/>
+          <w:bCs/>
+          <w:i w:val="false"/>
+          <w:iCs w:val="false"/>
+          <w:color w:val="1B3A4B"/>
+          <w:sz w:val="22"/>
+          <w:szCs w:val="22"/>
+        </w:rPr>
+        <w:t xml:space="preserve">eval/results.md.</w:t>
+      </w:r>
+      <w:r>
+        <w:rPr>
+          <w:rFonts w:ascii="Arial" w:cs="Arial" w:eastAsia="Arial" w:hAnsi="Arial"/>
+          <w:b w:val="false"/>
+          <w:bCs w:val="false"/>
+          <w:i w:val="false"/>
+          <w:iCs w:val="false"/>
+          <w:color w:val="243038"/>
+          <w:sz w:val="22"/>
+          <w:szCs w:val="22"/>
+        </w:rPr>
+        <w:t xml:space="preserve"> “Show me customers we added in the last seven days” never says SOQL, so the SOQL skill does not load.</w:t>
       </w:r>
     </w:p>
     <w:p>
@@ -4544,7 +5506,59 @@
           <w:sz w:val="22"/>
           <w:szCs w:val="22"/>
         </w:rPr>
-        <w:t xml:space="preserve">That is why the test prompts are in the repo. Every skill you add comes with at least one prompt that must return it and, if the new words are broad, one prompt that must come back empty. When two skills belong in the same turn, the gold set has a prompt that must return both. node eval/run-eval.mjs asks the running server the same questions. The bar in this repo is: the skills returned are exactly the skills the prompt needed at least 80 percent of the time, and none of the unrelated prompts get a skill. The last run clears that bar. If you change a description, rerun the comparison and rebuild this post from eval/results.json. If the post and the file disagree, the file wins.</w:t>
+        <w:t xml:space="preserve">That is why the test prompts are in the repo. Every skill you add comes with at least one prompt that must return it and, if the new words are broad, one prompt that must come back empty. When two skills belong in the same turn, the gold set has a prompt that must return both. node </w:t>
+      </w:r>
+      <w:r>
+        <w:rPr>
+          <w:rFonts w:ascii="Menlo" w:cs="Menlo" w:eastAsia="Menlo" w:hAnsi="Menlo"/>
+          <w:b/>
+          <w:bCs/>
+          <w:i w:val="false"/>
+          <w:iCs w:val="false"/>
+          <w:color w:val="1B3A4B"/>
+          <w:sz w:val="22"/>
+          <w:szCs w:val="22"/>
+        </w:rPr>
+        <w:t xml:space="preserve">eval/run-eval.mjs</w:t>
+      </w:r>
+      <w:r>
+        <w:rPr>
+          <w:rFonts w:ascii="Arial" w:cs="Arial" w:eastAsia="Arial" w:hAnsi="Arial"/>
+          <w:b w:val="false"/>
+          <w:bCs w:val="false"/>
+          <w:i w:val="false"/>
+          <w:iCs w:val="false"/>
+          <w:color w:val="243038"/>
+          <w:sz w:val="22"/>
+          <w:szCs w:val="22"/>
+        </w:rPr>
+        <w:t xml:space="preserve"> asks the running server the same questions. The bar in this repo is: the skills returned are exactly the skills the prompt needed at least 80 percent of the time, and none of the unrelated prompts get a skill. The last run clears that bar. If you change a description, rerun the comparison and rebuild this post from </w:t>
+      </w:r>
+      <w:r>
+        <w:rPr>
+          <w:rFonts w:ascii="Menlo" w:cs="Menlo" w:eastAsia="Menlo" w:hAnsi="Menlo"/>
+          <w:b/>
+          <w:bCs/>
+          <w:i w:val="false"/>
+          <w:iCs w:val="false"/>
+          <w:color w:val="1B3A4B"/>
+          <w:sz w:val="22"/>
+          <w:szCs w:val="22"/>
+        </w:rPr>
+        <w:t xml:space="preserve">eval/results.json.</w:t>
+      </w:r>
+      <w:r>
+        <w:rPr>
+          <w:rFonts w:ascii="Arial" w:cs="Arial" w:eastAsia="Arial" w:hAnsi="Arial"/>
+          <w:b w:val="false"/>
+          <w:bCs w:val="false"/>
+          <w:i w:val="false"/>
+          <w:iCs w:val="false"/>
+          <w:color w:val="243038"/>
+          <w:sz w:val="22"/>
+          <w:szCs w:val="22"/>
+        </w:rPr>
+        <w:t xml:space="preserve"> If the post and the file disagree, the file wins.</w:t>
       </w:r>
     </w:p>
     <w:p>
@@ -4684,13 +5698,15 @@
         </w:rPr>
         <w:t xml:space="preserve">The reference implementation is </w:t>
       </w:r>
-      <w:hyperlink w:history="1" r:id="rIdth45ibdwltrghzhxkzec4">
+      <w:hyperlink w:history="1" r:id="rIdusojhhappmr5xf2_0myr9">
         <w:r>
           <w:rPr>
             <w:rStyle w:val="Hyperlink"/>
-            <w:rFonts w:ascii="Arial" w:cs="Arial" w:eastAsia="Arial" w:hAnsi="Arial"/>
-            <w:sz w:val="22"/>
-            <w:szCs w:val="22"/>
+            <w:rFonts w:ascii="Menlo" w:cs="Menlo" w:eastAsia="Menlo" w:hAnsi="Menlo"/>
+            <w:b/>
+            <w:bCs/>
+            <w:sz w:val="20"/>
+            <w:szCs w:val="20"/>
           </w:rPr>
           <w:t xml:space="preserve">github.com/Lakshmikanth-Paruchuru/skill-router</w:t>
         </w:r>
@@ -4706,7 +5722,111 @@
           <w:sz w:val="22"/>
           <w:szCs w:val="22"/>
         </w:rPr>
-        <w:t xml:space="preserve">. It ships sample skills so the eval can be rerun, plus the MCP server, the hook, and eval/prompts.jsonl. Point SKILL_ROUTER_SKILLS_DIR at your own skills, or at skills/ from forcedotcom/sf-skills, and the same server loads those instead. Wire it into any MCP client:</w:t>
+        <w:t xml:space="preserve">. It ships sample skills so the eval can be rerun, plus the MCP server, the hook, and </w:t>
+      </w:r>
+      <w:r>
+        <w:rPr>
+          <w:rFonts w:ascii="Menlo" w:cs="Menlo" w:eastAsia="Menlo" w:hAnsi="Menlo"/>
+          <w:b/>
+          <w:bCs/>
+          <w:i w:val="false"/>
+          <w:iCs w:val="false"/>
+          <w:color w:val="1B3A4B"/>
+          <w:sz w:val="22"/>
+          <w:szCs w:val="22"/>
+        </w:rPr>
+        <w:t xml:space="preserve">eval/prompts.jsonl.</w:t>
+      </w:r>
+      <w:r>
+        <w:rPr>
+          <w:rFonts w:ascii="Arial" w:cs="Arial" w:eastAsia="Arial" w:hAnsi="Arial"/>
+          <w:b w:val="false"/>
+          <w:bCs w:val="false"/>
+          <w:i w:val="false"/>
+          <w:iCs w:val="false"/>
+          <w:color w:val="243038"/>
+          <w:sz w:val="22"/>
+          <w:szCs w:val="22"/>
+        </w:rPr>
+        <w:t xml:space="preserve"> Point </w:t>
+      </w:r>
+      <w:r>
+        <w:rPr>
+          <w:rFonts w:ascii="Menlo" w:cs="Menlo" w:eastAsia="Menlo" w:hAnsi="Menlo"/>
+          <w:b/>
+          <w:bCs/>
+          <w:i w:val="false"/>
+          <w:iCs w:val="false"/>
+          <w:color w:val="1B3A4B"/>
+          <w:sz w:val="22"/>
+          <w:szCs w:val="22"/>
+        </w:rPr>
+        <w:t xml:space="preserve">SKILL_ROUTER_SKILLS_DIR</w:t>
+      </w:r>
+      <w:r>
+        <w:rPr>
+          <w:rFonts w:ascii="Arial" w:cs="Arial" w:eastAsia="Arial" w:hAnsi="Arial"/>
+          <w:b w:val="false"/>
+          <w:bCs w:val="false"/>
+          <w:i w:val="false"/>
+          <w:iCs w:val="false"/>
+          <w:color w:val="243038"/>
+          <w:sz w:val="22"/>
+          <w:szCs w:val="22"/>
+        </w:rPr>
+        <w:t xml:space="preserve"> at your own skills, or at </w:t>
+      </w:r>
+      <w:r>
+        <w:rPr>
+          <w:rFonts w:ascii="Menlo" w:cs="Menlo" w:eastAsia="Menlo" w:hAnsi="Menlo"/>
+          <w:b/>
+          <w:bCs/>
+          <w:i w:val="false"/>
+          <w:iCs w:val="false"/>
+          <w:color w:val="1B3A4B"/>
+          <w:sz w:val="22"/>
+          <w:szCs w:val="22"/>
+        </w:rPr>
+        <w:t xml:space="preserve">skills/</w:t>
+      </w:r>
+      <w:r>
+        <w:rPr>
+          <w:rFonts w:ascii="Arial" w:cs="Arial" w:eastAsia="Arial" w:hAnsi="Arial"/>
+          <w:b w:val="false"/>
+          <w:bCs w:val="false"/>
+          <w:i w:val="false"/>
+          <w:iCs w:val="false"/>
+          <w:color w:val="243038"/>
+          <w:sz w:val="22"/>
+          <w:szCs w:val="22"/>
+        </w:rPr>
+        <w:t xml:space="preserve"> from </w:t>
+      </w:r>
+      <w:r>
+        <w:rPr>
+          <w:rFonts w:ascii="Menlo" w:cs="Menlo" w:eastAsia="Menlo" w:hAnsi="Menlo"/>
+          <w:b/>
+          <w:bCs/>
+          <w:i w:val="false"/>
+          <w:iCs w:val="false"/>
+          <w:color w:val="1B3A4B"/>
+          <w:sz w:val="22"/>
+          <w:szCs w:val="22"/>
+        </w:rPr>
+        <w:t xml:space="preserve">forcedotcom/sf-skills</w:t>
+      </w:r>
+      <w:r>
+        <w:rPr>
+          <w:rFonts w:ascii="Arial" w:cs="Arial" w:eastAsia="Arial" w:hAnsi="Arial"/>
+          <w:b w:val="false"/>
+          <w:bCs w:val="false"/>
+          <w:i w:val="false"/>
+          <w:iCs w:val="false"/>
+          <w:color w:val="243038"/>
+          <w:sz w:val="22"/>
+          <w:szCs w:val="22"/>
+        </w:rPr>
+        <w:t xml:space="preserve">, and the same server loads those instead. Wire it into any MCP client:</w:t>
       </w:r>
     </w:p>
     <w:p>
@@ -4735,13 +5855,13 @@
       <w:r>
         <w:rPr>
           <w:rFonts w:ascii="Menlo" w:cs="Menlo" w:eastAsia="Menlo" w:hAnsi="Menlo"/>
-          <w:b w:val="false"/>
-          <w:bCs w:val="false"/>
-          <w:i w:val="false"/>
-          <w:iCs w:val="false"/>
-          <w:color w:val="1A2830"/>
-          <w:sz w:val="18"/>
-          <w:szCs w:val="18"/>
+          <w:b/>
+          <w:bCs/>
+          <w:i w:val="false"/>
+          <w:iCs w:val="false"/>
+          <w:color w:val="1B3A4B"/>
+          <w:sz w:val="20"/>
+          <w:szCs w:val="20"/>
         </w:rPr>
         <w:t xml:space="preserve">{</w:t>
       </w:r>
@@ -4754,13 +5874,13 @@
       <w:r>
         <w:rPr>
           <w:rFonts w:ascii="Menlo" w:cs="Menlo" w:eastAsia="Menlo" w:hAnsi="Menlo"/>
-          <w:b w:val="false"/>
-          <w:bCs w:val="false"/>
-          <w:i w:val="false"/>
-          <w:iCs w:val="false"/>
-          <w:color w:val="1A2830"/>
-          <w:sz w:val="18"/>
-          <w:szCs w:val="18"/>
+          <w:b/>
+          <w:bCs/>
+          <w:i w:val="false"/>
+          <w:iCs w:val="false"/>
+          <w:color w:val="1B3A4B"/>
+          <w:sz w:val="20"/>
+          <w:szCs w:val="20"/>
         </w:rPr>
         <w:t xml:space="preserve">  "mcpServers": {</w:t>
       </w:r>
@@ -4773,13 +5893,13 @@
       <w:r>
         <w:rPr>
           <w:rFonts w:ascii="Menlo" w:cs="Menlo" w:eastAsia="Menlo" w:hAnsi="Menlo"/>
-          <w:b w:val="false"/>
-          <w:bCs w:val="false"/>
-          <w:i w:val="false"/>
-          <w:iCs w:val="false"/>
-          <w:color w:val="1A2830"/>
-          <w:sz w:val="18"/>
-          <w:szCs w:val="18"/>
+          <w:b/>
+          <w:bCs/>
+          <w:i w:val="false"/>
+          <w:iCs w:val="false"/>
+          <w:color w:val="1B3A4B"/>
+          <w:sz w:val="20"/>
+          <w:szCs w:val="20"/>
         </w:rPr>
         <w:t xml:space="preserve">    "skill-router": {</w:t>
       </w:r>
@@ -4792,13 +5912,13 @@
       <w:r>
         <w:rPr>
           <w:rFonts w:ascii="Menlo" w:cs="Menlo" w:eastAsia="Menlo" w:hAnsi="Menlo"/>
-          <w:b w:val="false"/>
-          <w:bCs w:val="false"/>
-          <w:i w:val="false"/>
-          <w:iCs w:val="false"/>
-          <w:color w:val="1A2830"/>
-          <w:sz w:val="18"/>
-          <w:szCs w:val="18"/>
+          <w:b/>
+          <w:bCs/>
+          <w:i w:val="false"/>
+          <w:iCs w:val="false"/>
+          <w:color w:val="1B3A4B"/>
+          <w:sz w:val="20"/>
+          <w:szCs w:val="20"/>
         </w:rPr>
         <w:t xml:space="preserve">      "command": "node",</w:t>
       </w:r>
@@ -4811,13 +5931,13 @@
       <w:r>
         <w:rPr>
           <w:rFonts w:ascii="Menlo" w:cs="Menlo" w:eastAsia="Menlo" w:hAnsi="Menlo"/>
-          <w:b w:val="false"/>
-          <w:bCs w:val="false"/>
-          <w:i w:val="false"/>
-          <w:iCs w:val="false"/>
-          <w:color w:val="1A2830"/>
-          <w:sz w:val="18"/>
-          <w:szCs w:val="18"/>
+          <w:b/>
+          <w:bCs/>
+          <w:i w:val="false"/>
+          <w:iCs w:val="false"/>
+          <w:color w:val="1B3A4B"/>
+          <w:sz w:val="20"/>
+          <w:szCs w:val="20"/>
         </w:rPr>
         <w:t xml:space="preserve">      "args": ["/absolute/path/to/skill-router/mcp/server.mjs"],</w:t>
       </w:r>
@@ -4830,13 +5950,13 @@
       <w:r>
         <w:rPr>
           <w:rFonts w:ascii="Menlo" w:cs="Menlo" w:eastAsia="Menlo" w:hAnsi="Menlo"/>
-          <w:b w:val="false"/>
-          <w:bCs w:val="false"/>
-          <w:i w:val="false"/>
-          <w:iCs w:val="false"/>
-          <w:color w:val="1A2830"/>
-          <w:sz w:val="18"/>
-          <w:szCs w:val="18"/>
+          <w:b/>
+          <w:bCs/>
+          <w:i w:val="false"/>
+          <w:iCs w:val="false"/>
+          <w:color w:val="1B3A4B"/>
+          <w:sz w:val="20"/>
+          <w:szCs w:val="20"/>
         </w:rPr>
         <w:t xml:space="preserve">      "env": {</w:t>
       </w:r>
@@ -4849,13 +5969,13 @@
       <w:r>
         <w:rPr>
           <w:rFonts w:ascii="Menlo" w:cs="Menlo" w:eastAsia="Menlo" w:hAnsi="Menlo"/>
-          <w:b w:val="false"/>
-          <w:bCs w:val="false"/>
-          <w:i w:val="false"/>
-          <w:iCs w:val="false"/>
-          <w:color w:val="1A2830"/>
-          <w:sz w:val="18"/>
-          <w:szCs w:val="18"/>
+          <w:b/>
+          <w:bCs/>
+          <w:i w:val="false"/>
+          <w:iCs w:val="false"/>
+          <w:color w:val="1B3A4B"/>
+          <w:sz w:val="20"/>
+          <w:szCs w:val="20"/>
         </w:rPr>
         <w:t xml:space="preserve">        "SKILL_ROUTER_ROOT": "/absolute/path/to/skill-router"</w:t>
       </w:r>
@@ -4868,13 +5988,13 @@
       <w:r>
         <w:rPr>
           <w:rFonts w:ascii="Menlo" w:cs="Menlo" w:eastAsia="Menlo" w:hAnsi="Menlo"/>
-          <w:b w:val="false"/>
-          <w:bCs w:val="false"/>
-          <w:i w:val="false"/>
-          <w:iCs w:val="false"/>
-          <w:color w:val="1A2830"/>
-          <w:sz w:val="18"/>
-          <w:szCs w:val="18"/>
+          <w:b/>
+          <w:bCs/>
+          <w:i w:val="false"/>
+          <w:iCs w:val="false"/>
+          <w:color w:val="1B3A4B"/>
+          <w:sz w:val="20"/>
+          <w:szCs w:val="20"/>
         </w:rPr>
         <w:t xml:space="preserve">      }</w:t>
       </w:r>
@@ -4887,13 +6007,13 @@
       <w:r>
         <w:rPr>
           <w:rFonts w:ascii="Menlo" w:cs="Menlo" w:eastAsia="Menlo" w:hAnsi="Menlo"/>
-          <w:b w:val="false"/>
-          <w:bCs w:val="false"/>
-          <w:i w:val="false"/>
-          <w:iCs w:val="false"/>
-          <w:color w:val="1A2830"/>
-          <w:sz w:val="18"/>
-          <w:szCs w:val="18"/>
+          <w:b/>
+          <w:bCs/>
+          <w:i w:val="false"/>
+          <w:iCs w:val="false"/>
+          <w:color w:val="1B3A4B"/>
+          <w:sz w:val="20"/>
+          <w:szCs w:val="20"/>
         </w:rPr>
         <w:t xml:space="preserve">    }</w:t>
       </w:r>
@@ -4906,13 +6026,13 @@
       <w:r>
         <w:rPr>
           <w:rFonts w:ascii="Menlo" w:cs="Menlo" w:eastAsia="Menlo" w:hAnsi="Menlo"/>
-          <w:b w:val="false"/>
-          <w:bCs w:val="false"/>
-          <w:i w:val="false"/>
-          <w:iCs w:val="false"/>
-          <w:color w:val="1A2830"/>
-          <w:sz w:val="18"/>
-          <w:szCs w:val="18"/>
+          <w:b/>
+          <w:bCs/>
+          <w:i w:val="false"/>
+          <w:iCs w:val="false"/>
+          <w:color w:val="1B3A4B"/>
+          <w:sz w:val="20"/>
+          <w:szCs w:val="20"/>
         </w:rPr>
         <w:t xml:space="preserve">  }</w:t>
       </w:r>
@@ -4925,13 +6045,13 @@
       <w:r>
         <w:rPr>
           <w:rFonts w:ascii="Menlo" w:cs="Menlo" w:eastAsia="Menlo" w:hAnsi="Menlo"/>
-          <w:b w:val="false"/>
-          <w:bCs w:val="false"/>
-          <w:i w:val="false"/>
-          <w:iCs w:val="false"/>
-          <w:color w:val="1A2830"/>
-          <w:sz w:val="18"/>
-          <w:szCs w:val="18"/>
+          <w:b/>
+          <w:bCs/>
+          <w:i w:val="false"/>
+          <w:iCs w:val="false"/>
+          <w:color w:val="1B3A4B"/>
+          <w:sz w:val="20"/>
+          <w:szCs w:val="20"/>
         </w:rPr>
         <w:t xml:space="preserve">}</w:t>
       </w:r>
@@ -4967,13 +6087,13 @@
       <w:r>
         <w:rPr>
           <w:rFonts w:ascii="Menlo" w:cs="Menlo" w:eastAsia="Menlo" w:hAnsi="Menlo"/>
-          <w:b w:val="false"/>
-          <w:bCs w:val="false"/>
-          <w:i w:val="false"/>
-          <w:iCs w:val="false"/>
-          <w:color w:val="1A2830"/>
-          <w:sz w:val="18"/>
-          <w:szCs w:val="18"/>
+          <w:b/>
+          <w:bCs/>
+          <w:i w:val="false"/>
+          <w:iCs w:val="false"/>
+          <w:color w:val="1B3A4B"/>
+          <w:sz w:val="20"/>
+          <w:szCs w:val="20"/>
         </w:rPr>
         <w:t xml:space="preserve">node scripts/generate-index.mjs</w:t>
       </w:r>
@@ -4986,13 +6106,13 @@
       <w:r>
         <w:rPr>
           <w:rFonts w:ascii="Menlo" w:cs="Menlo" w:eastAsia="Menlo" w:hAnsi="Menlo"/>
-          <w:b w:val="false"/>
-          <w:bCs w:val="false"/>
-          <w:i w:val="false"/>
-          <w:iCs w:val="false"/>
-          <w:color w:val="1A2830"/>
-          <w:sz w:val="18"/>
-          <w:szCs w:val="18"/>
+          <w:b/>
+          <w:bCs/>
+          <w:i w:val="false"/>
+          <w:iCs w:val="false"/>
+          <w:color w:val="1B3A4B"/>
+          <w:sz w:val="20"/>
+          <w:szCs w:val="20"/>
         </w:rPr>
         <w:t xml:space="preserve">node eval/compare.mjs</w:t>
       </w:r>
@@ -5005,13 +6125,13 @@
       <w:r>
         <w:rPr>
           <w:rFonts w:ascii="Menlo" w:cs="Menlo" w:eastAsia="Menlo" w:hAnsi="Menlo"/>
-          <w:b w:val="false"/>
-          <w:bCs w:val="false"/>
-          <w:i w:val="false"/>
-          <w:iCs w:val="false"/>
-          <w:color w:val="1A2830"/>
-          <w:sz w:val="18"/>
-          <w:szCs w:val="18"/>
+          <w:b/>
+          <w:bCs/>
+          <w:i w:val="false"/>
+          <w:iCs w:val="false"/>
+          <w:color w:val="1B3A4B"/>
+          <w:sz w:val="20"/>
+          <w:szCs w:val="20"/>
         </w:rPr>
         <w:t xml:space="preserve">node eval/run-eval.mjs --gate 80</w:t>
       </w:r>
@@ -5036,7 +6156,85 @@
           <w:sz w:val="22"/>
           <w:szCs w:val="22"/>
         </w:rPr>
-        <w:t xml:space="preserve">Those three commands are the entire extension loop: regenerate the index, write the results, then prove the new skill did not steal a neighbor. Set SKILL_ROUTER_ROOT if the checkout is not the working directory, and SKILL_ROUTER_SKILLS_DIR if the skills live somewhere else, such as a user-level skills folder. Set SKILL_ROUTER_FLOOR when you retune.</w:t>
+        <w:t xml:space="preserve">Those three commands are the entire extension loop: regenerate the index, write the results, then prove the new skill did not steal a neighbor. Set </w:t>
+      </w:r>
+      <w:r>
+        <w:rPr>
+          <w:rFonts w:ascii="Menlo" w:cs="Menlo" w:eastAsia="Menlo" w:hAnsi="Menlo"/>
+          <w:b/>
+          <w:bCs/>
+          <w:i w:val="false"/>
+          <w:iCs w:val="false"/>
+          <w:color w:val="1B3A4B"/>
+          <w:sz w:val="22"/>
+          <w:szCs w:val="22"/>
+        </w:rPr>
+        <w:t xml:space="preserve">SKILL_ROUTER_ROOT</w:t>
+      </w:r>
+      <w:r>
+        <w:rPr>
+          <w:rFonts w:ascii="Arial" w:cs="Arial" w:eastAsia="Arial" w:hAnsi="Arial"/>
+          <w:b w:val="false"/>
+          <w:bCs w:val="false"/>
+          <w:i w:val="false"/>
+          <w:iCs w:val="false"/>
+          <w:color w:val="243038"/>
+          <w:sz w:val="22"/>
+          <w:szCs w:val="22"/>
+        </w:rPr>
+        <w:t xml:space="preserve"> if the checkout is not the working directory, and </w:t>
+      </w:r>
+      <w:r>
+        <w:rPr>
+          <w:rFonts w:ascii="Menlo" w:cs="Menlo" w:eastAsia="Menlo" w:hAnsi="Menlo"/>
+          <w:b/>
+          <w:bCs/>
+          <w:i w:val="false"/>
+          <w:iCs w:val="false"/>
+          <w:color w:val="1B3A4B"/>
+          <w:sz w:val="22"/>
+          <w:szCs w:val="22"/>
+        </w:rPr>
+        <w:t xml:space="preserve">SKILL_ROUTER_SKILLS_DIR</w:t>
+      </w:r>
+      <w:r>
+        <w:rPr>
+          <w:rFonts w:ascii="Arial" w:cs="Arial" w:eastAsia="Arial" w:hAnsi="Arial"/>
+          <w:b w:val="false"/>
+          <w:bCs w:val="false"/>
+          <w:i w:val="false"/>
+          <w:iCs w:val="false"/>
+          <w:color w:val="243038"/>
+          <w:sz w:val="22"/>
+          <w:szCs w:val="22"/>
+        </w:rPr>
+        <w:t xml:space="preserve"> if the skills live somewhere else, such as a user-level skills folder. Set </w:t>
+      </w:r>
+      <w:r>
+        <w:rPr>
+          <w:rFonts w:ascii="Menlo" w:cs="Menlo" w:eastAsia="Menlo" w:hAnsi="Menlo"/>
+          <w:b/>
+          <w:bCs/>
+          <w:i w:val="false"/>
+          <w:iCs w:val="false"/>
+          <w:color w:val="1B3A4B"/>
+          <w:sz w:val="22"/>
+          <w:szCs w:val="22"/>
+        </w:rPr>
+        <w:t xml:space="preserve">SKILL_ROUTER_FLOOR</w:t>
+      </w:r>
+      <w:r>
+        <w:rPr>
+          <w:rFonts w:ascii="Arial" w:cs="Arial" w:eastAsia="Arial" w:hAnsi="Arial"/>
+          <w:b w:val="false"/>
+          <w:bCs w:val="false"/>
+          <w:i w:val="false"/>
+          <w:iCs w:val="false"/>
+          <w:color w:val="243038"/>
+          <w:sz w:val="22"/>
+          <w:szCs w:val="22"/>
+        </w:rPr>
+        <w:t xml:space="preserve"> when you retune.</w:t>
       </w:r>
     </w:p>
     <w:p>
@@ -5195,13 +6393,15 @@
         </w:rPr>
         <w:t xml:space="preserve">Reference code: </w:t>
       </w:r>
-      <w:hyperlink w:history="1" r:id="rIdsc_9f0ftfs1nrefab6syf">
+      <w:hyperlink w:history="1" r:id="rIdw9fosrcia-cwvxddjait1">
         <w:r>
           <w:rPr>
             <w:rStyle w:val="Hyperlink"/>
-            <w:rFonts w:ascii="Arial" w:cs="Arial" w:eastAsia="Arial" w:hAnsi="Arial"/>
-            <w:sz w:val="22"/>
-            <w:szCs w:val="22"/>
+            <w:rFonts w:ascii="Menlo" w:cs="Menlo" w:eastAsia="Menlo" w:hAnsi="Menlo"/>
+            <w:b/>
+            <w:bCs/>
+            <w:sz w:val="20"/>
+            <w:szCs w:val="20"/>
           </w:rPr>
           <w:t xml:space="preserve">github.com/Lakshmikanth-Paruchuru/skill-router</w:t>
         </w:r>

</xml_diff>

<commit_message>
Remove the draft banner so the post can be published.
</commit_message>
<xml_diff>
--- a/docs/Load-the-Right-Skill-First.docx
+++ b/docs/Load-the-Right-Skill-First.docx
@@ -2,24 +2,6 @@
 <file path=word/document.xml><?xml version="1.0" encoding="utf-8"?>
 <w:document xmlns:wpc="http://schemas.microsoft.com/office/word/2010/wordprocessingCanvas" xmlns:mc="http://schemas.openxmlformats.org/markup-compatibility/2006" xmlns:o="urn:schemas-microsoft-com:office:office" xmlns:r="http://schemas.openxmlformats.org/officeDocument/2006/relationships" xmlns:m="http://schemas.openxmlformats.org/officeDocument/2006/math" xmlns:v="urn:schemas-microsoft-com:vml" xmlns:wp14="http://schemas.microsoft.com/office/word/2010/wordprocessingDrawing" xmlns:wp="http://schemas.openxmlformats.org/drawingml/2006/wordprocessingDrawing" xmlns:w10="urn:schemas-microsoft-com:office:word" xmlns:w="http://schemas.openxmlformats.org/wordprocessingml/2006/main" xmlns:w14="http://schemas.microsoft.com/office/word/2010/wordml" xmlns:w15="http://schemas.microsoft.com/office/word/2012/wordml" xmlns:wpg="http://schemas.microsoft.com/office/word/2010/wordprocessingGroup" xmlns:wpi="http://schemas.microsoft.com/office/word/2010/wordprocessingInk" xmlns:wne="http://schemas.microsoft.com/office/word/2006/wordml" xmlns:wps="http://schemas.microsoft.com/office/word/2010/wordprocessingShape" xmlns:cx="http://schemas.microsoft.com/office/drawing/2014/chartex" xmlns:cx1="http://schemas.microsoft.com/office/drawing/2015/9/8/chartex" xmlns:cx2="http://schemas.microsoft.com/office/drawing/2015/10/21/chartex" xmlns:cx3="http://schemas.microsoft.com/office/drawing/2016/5/9/chartex" xmlns:cx4="http://schemas.microsoft.com/office/drawing/2016/5/10/chartex" xmlns:cx5="http://schemas.microsoft.com/office/drawing/2016/5/11/chartex" xmlns:cx6="http://schemas.microsoft.com/office/drawing/2016/5/12/chartex" xmlns:cx7="http://schemas.microsoft.com/office/drawing/2016/5/13/chartex" xmlns:cx8="http://schemas.microsoft.com/office/drawing/2016/5/14/chartex" xmlns:aink="http://schemas.microsoft.com/office/drawing/2016/ink" xmlns:am3d="http://schemas.microsoft.com/office/drawing/2017/model3d" xmlns:w16cex="http://schemas.microsoft.com/office/word/2018/wordml/cex" xmlns:w16cid="http://schemas.microsoft.com/office/word/2016/wordml/cid" xmlns:w16="http://schemas.microsoft.com/office/word/2018/wordml" xmlns:w16sdtdh="http://schemas.microsoft.com/office/word/2020/wordml/sdtdatahash" xmlns:w16se="http://schemas.microsoft.com/office/word/2015/wordml/symex" mc:Ignorable="w14 w15 wp14">
   <w:body>
-    <w:p>
-      <w:pPr>
-        <w:spacing w:after="40" w:before="0" w:line="288"/>
-      </w:pPr>
-      <w:r>
-        <w:rPr>
-          <w:rFonts w:ascii="Arial" w:cs="Arial" w:eastAsia="Arial" w:hAnsi="Arial"/>
-          <w:b/>
-          <w:bCs/>
-          <w:i w:val="false"/>
-          <w:iCs w:val="false"/>
-          <w:color w:val="8C6A1A"/>
-          <w:sz w:val="16"/>
-          <w:szCs w:val="16"/>
-        </w:rPr>
-        <w:t xml:space="preserve">DRAFT FOR EXTERNAL PUBLICATION</w:t>
-      </w:r>
-    </w:p>
     <w:p>
       <w:pPr>
         <w:spacing w:after="80" w:before="80"/>
@@ -58,7 +40,7 @@
     </w:p>
     <w:p>
       <w:pPr>
-        <w:spacing w:after="160" w:before="0" w:line="288"/>
+        <w:spacing w:after="200" w:before="0" w:line="288"/>
       </w:pPr>
       <w:r>
         <w:rPr>
@@ -86,424 +68,6 @@
         </w:rPr>
         <w:t xml:space="preserve">   ·   September 30, 2026</w:t>
       </w:r>
-    </w:p>
-    <w:tbl>
-      <w:tblPr>
-        <w:tblW w:type="dxa" w:w="10080"/>
-        <w:tblBorders>
-          <w:top w:val="single" w:color="auto" w:sz="4"/>
-          <w:left w:val="single" w:color="auto" w:sz="4"/>
-          <w:bottom w:val="single" w:color="auto" w:sz="4"/>
-          <w:right w:val="single" w:color="auto" w:sz="4"/>
-          <w:insideH w:val="single" w:color="auto" w:sz="4"/>
-          <w:insideV w:val="single" w:color="auto" w:sz="4"/>
-        </w:tblBorders>
-      </w:tblPr>
-      <w:tblGrid>
-        <w:gridCol w:w="2200"/>
-        <w:gridCol w:w="7880"/>
-      </w:tblGrid>
-      <w:tr>
-        <w:trPr>
-          <w:cantSplit/>
-          <w:tblHeader/>
-        </w:trPr>
-        <w:tc>
-          <w:tcPr>
-            <w:tcW w:type="dxa" w:w="2200"/>
-            <w:tcBorders>
-              <w:top w:val="single" w:color="D5DDE2" w:sz="4"/>
-              <w:left w:val="single" w:color="D5DDE2" w:sz="4"/>
-              <w:bottom w:val="single" w:color="D5DDE2" w:sz="4"/>
-              <w:right w:val="single" w:color="D5DDE2" w:sz="4"/>
-            </w:tcBorders>
-            <w:shd w:fill="1B3A4B" w:val="clear"/>
-            <w:tcMar>
-              <w:top w:type="dxa" w:w="60"/>
-              <w:left w:type="dxa" w:w="80"/>
-              <w:bottom w:type="dxa" w:w="60"/>
-              <w:right w:type="dxa" w:w="80"/>
-            </w:tcMar>
-            <w:vAlign w:val="center"/>
-          </w:tcPr>
-          <w:p>
-            <w:pPr>
-              <w:spacing w:after="0" w:before="0"/>
-            </w:pPr>
-            <w:r>
-              <w:rPr>
-                <w:rFonts w:ascii="Arial" w:cs="Arial" w:eastAsia="Arial" w:hAnsi="Arial"/>
-                <w:b/>
-                <w:bCs/>
-                <w:i w:val="false"/>
-                <w:iCs w:val="false"/>
-                <w:color w:val="FFFFFF"/>
-                <w:sz w:val="18"/>
-                <w:szCs w:val="18"/>
-              </w:rPr>
-              <w:t xml:space="preserve">Field</w:t>
-            </w:r>
-          </w:p>
-        </w:tc>
-        <w:tc>
-          <w:tcPr>
-            <w:tcW w:type="dxa" w:w="7880"/>
-            <w:tcBorders>
-              <w:top w:val="single" w:color="D5DDE2" w:sz="4"/>
-              <w:left w:val="single" w:color="D5DDE2" w:sz="4"/>
-              <w:bottom w:val="single" w:color="D5DDE2" w:sz="4"/>
-              <w:right w:val="single" w:color="D5DDE2" w:sz="4"/>
-            </w:tcBorders>
-            <w:shd w:fill="1B3A4B" w:val="clear"/>
-            <w:tcMar>
-              <w:top w:type="dxa" w:w="60"/>
-              <w:left w:type="dxa" w:w="80"/>
-              <w:bottom w:type="dxa" w:w="60"/>
-              <w:right w:type="dxa" w:w="80"/>
-            </w:tcMar>
-            <w:vAlign w:val="center"/>
-          </w:tcPr>
-          <w:p>
-            <w:pPr>
-              <w:spacing w:after="0" w:before="0"/>
-            </w:pPr>
-            <w:r>
-              <w:rPr>
-                <w:rFonts w:ascii="Arial" w:cs="Arial" w:eastAsia="Arial" w:hAnsi="Arial"/>
-                <w:b/>
-                <w:bCs/>
-                <w:i w:val="false"/>
-                <w:iCs w:val="false"/>
-                <w:color w:val="FFFFFF"/>
-                <w:sz w:val="18"/>
-                <w:szCs w:val="18"/>
-              </w:rPr>
-              <w:t xml:space="preserve">Value</w:t>
-            </w:r>
-          </w:p>
-        </w:tc>
-      </w:tr>
-      <w:tr>
-        <w:trPr>
-          <w:cantSplit/>
-        </w:trPr>
-        <w:tc>
-          <w:tcPr>
-            <w:tcW w:type="dxa" w:w="2200"/>
-            <w:tcBorders>
-              <w:top w:val="single" w:color="D5DDE2" w:sz="4"/>
-              <w:left w:val="single" w:color="D5DDE2" w:sz="4"/>
-              <w:bottom w:val="single" w:color="D5DDE2" w:sz="4"/>
-              <w:right w:val="single" w:color="D5DDE2" w:sz="4"/>
-            </w:tcBorders>
-            <w:shd w:fill="FFFFFF" w:val="clear"/>
-            <w:tcMar>
-              <w:top w:type="dxa" w:w="60"/>
-              <w:left w:type="dxa" w:w="80"/>
-              <w:bottom w:type="dxa" w:w="60"/>
-              <w:right w:type="dxa" w:w="80"/>
-            </w:tcMar>
-            <w:vAlign w:val="center"/>
-          </w:tcPr>
-          <w:p>
-            <w:pPr>
-              <w:spacing w:after="0" w:before="0"/>
-            </w:pPr>
-            <w:r>
-              <w:rPr>
-                <w:rFonts w:ascii="Arial" w:cs="Arial" w:eastAsia="Arial" w:hAnsi="Arial"/>
-                <w:b/>
-                <w:bCs/>
-                <w:i w:val="false"/>
-                <w:iCs w:val="false"/>
-                <w:color w:val="243038"/>
-                <w:sz w:val="18"/>
-                <w:szCs w:val="18"/>
-              </w:rPr>
-              <w:t xml:space="preserve">Suggested slug</w:t>
-            </w:r>
-          </w:p>
-        </w:tc>
-        <w:tc>
-          <w:tcPr>
-            <w:tcW w:type="dxa" w:w="7880"/>
-            <w:tcBorders>
-              <w:top w:val="single" w:color="D5DDE2" w:sz="4"/>
-              <w:left w:val="single" w:color="D5DDE2" w:sz="4"/>
-              <w:bottom w:val="single" w:color="D5DDE2" w:sz="4"/>
-              <w:right w:val="single" w:color="D5DDE2" w:sz="4"/>
-            </w:tcBorders>
-            <w:shd w:fill="FFFFFF" w:val="clear"/>
-            <w:tcMar>
-              <w:top w:type="dxa" w:w="60"/>
-              <w:left w:type="dxa" w:w="80"/>
-              <w:bottom w:type="dxa" w:w="60"/>
-              <w:right w:type="dxa" w:w="80"/>
-            </w:tcMar>
-            <w:vAlign w:val="center"/>
-          </w:tcPr>
-          <w:p>
-            <w:pPr>
-              <w:spacing w:after="0" w:before="0"/>
-            </w:pPr>
-            <w:r>
-              <w:rPr>
-                <w:rFonts w:ascii="Arial" w:cs="Arial" w:eastAsia="Arial" w:hAnsi="Arial"/>
-                <w:b w:val="false"/>
-                <w:bCs w:val="false"/>
-                <w:i w:val="false"/>
-                <w:iCs w:val="false"/>
-                <w:color w:val="243038"/>
-                <w:sz w:val="18"/>
-                <w:szCs w:val="18"/>
-              </w:rPr>
-              <w:t xml:space="preserve">load-the-right-skill-first</w:t>
-            </w:r>
-          </w:p>
-        </w:tc>
-      </w:tr>
-      <w:tr>
-        <w:trPr>
-          <w:cantSplit/>
-        </w:trPr>
-        <w:tc>
-          <w:tcPr>
-            <w:tcW w:type="dxa" w:w="2200"/>
-            <w:tcBorders>
-              <w:top w:val="single" w:color="D5DDE2" w:sz="4"/>
-              <w:left w:val="single" w:color="D5DDE2" w:sz="4"/>
-              <w:bottom w:val="single" w:color="D5DDE2" w:sz="4"/>
-              <w:right w:val="single" w:color="D5DDE2" w:sz="4"/>
-            </w:tcBorders>
-            <w:shd w:fill="F4F7F8" w:val="clear"/>
-            <w:tcMar>
-              <w:top w:type="dxa" w:w="60"/>
-              <w:left w:type="dxa" w:w="80"/>
-              <w:bottom w:type="dxa" w:w="60"/>
-              <w:right w:type="dxa" w:w="80"/>
-            </w:tcMar>
-            <w:vAlign w:val="center"/>
-          </w:tcPr>
-          <w:p>
-            <w:pPr>
-              <w:spacing w:after="0" w:before="0"/>
-            </w:pPr>
-            <w:r>
-              <w:rPr>
-                <w:rFonts w:ascii="Arial" w:cs="Arial" w:eastAsia="Arial" w:hAnsi="Arial"/>
-                <w:b/>
-                <w:bCs/>
-                <w:i w:val="false"/>
-                <w:iCs w:val="false"/>
-                <w:color w:val="243038"/>
-                <w:sz w:val="18"/>
-                <w:szCs w:val="18"/>
-              </w:rPr>
-              <w:t xml:space="preserve">Tags</w:t>
-            </w:r>
-          </w:p>
-        </w:tc>
-        <w:tc>
-          <w:tcPr>
-            <w:tcW w:type="dxa" w:w="7880"/>
-            <w:tcBorders>
-              <w:top w:val="single" w:color="D5DDE2" w:sz="4"/>
-              <w:left w:val="single" w:color="D5DDE2" w:sz="4"/>
-              <w:bottom w:val="single" w:color="D5DDE2" w:sz="4"/>
-              <w:right w:val="single" w:color="D5DDE2" w:sz="4"/>
-            </w:tcBorders>
-            <w:shd w:fill="F4F7F8" w:val="clear"/>
-            <w:tcMar>
-              <w:top w:type="dxa" w:w="60"/>
-              <w:left w:type="dxa" w:w="80"/>
-              <w:bottom w:type="dxa" w:w="60"/>
-              <w:right w:type="dxa" w:w="80"/>
-            </w:tcMar>
-            <w:vAlign w:val="center"/>
-          </w:tcPr>
-          <w:p>
-            <w:pPr>
-              <w:spacing w:after="0" w:before="0"/>
-            </w:pPr>
-            <w:r>
-              <w:rPr>
-                <w:rFonts w:ascii="Arial" w:cs="Arial" w:eastAsia="Arial" w:hAnsi="Arial"/>
-                <w:b w:val="false"/>
-                <w:bCs w:val="false"/>
-                <w:i w:val="false"/>
-                <w:iCs w:val="false"/>
-                <w:color w:val="243038"/>
-                <w:sz w:val="18"/>
-                <w:szCs w:val="18"/>
-              </w:rPr>
-              <w:t xml:space="preserve">AI agents, Salesforce, skill routing, developer tools, Claude, Cursor</w:t>
-            </w:r>
-          </w:p>
-        </w:tc>
-      </w:tr>
-      <w:tr>
-        <w:trPr>
-          <w:cantSplit/>
-        </w:trPr>
-        <w:tc>
-          <w:tcPr>
-            <w:tcW w:type="dxa" w:w="2200"/>
-            <w:tcBorders>
-              <w:top w:val="single" w:color="D5DDE2" w:sz="4"/>
-              <w:left w:val="single" w:color="D5DDE2" w:sz="4"/>
-              <w:bottom w:val="single" w:color="D5DDE2" w:sz="4"/>
-              <w:right w:val="single" w:color="D5DDE2" w:sz="4"/>
-            </w:tcBorders>
-            <w:shd w:fill="FFFFFF" w:val="clear"/>
-            <w:tcMar>
-              <w:top w:type="dxa" w:w="60"/>
-              <w:left w:type="dxa" w:w="80"/>
-              <w:bottom w:type="dxa" w:w="60"/>
-              <w:right w:type="dxa" w:w="80"/>
-            </w:tcMar>
-            <w:vAlign w:val="center"/>
-          </w:tcPr>
-          <w:p>
-            <w:pPr>
-              <w:spacing w:after="0" w:before="0"/>
-            </w:pPr>
-            <w:r>
-              <w:rPr>
-                <w:rFonts w:ascii="Arial" w:cs="Arial" w:eastAsia="Arial" w:hAnsi="Arial"/>
-                <w:b/>
-                <w:bCs/>
-                <w:i w:val="false"/>
-                <w:iCs w:val="false"/>
-                <w:color w:val="243038"/>
-                <w:sz w:val="18"/>
-                <w:szCs w:val="18"/>
-              </w:rPr>
-              <w:t xml:space="preserve">Code</w:t>
-            </w:r>
-          </w:p>
-        </w:tc>
-        <w:tc>
-          <w:tcPr>
-            <w:tcW w:type="dxa" w:w="7880"/>
-            <w:tcBorders>
-              <w:top w:val="single" w:color="D5DDE2" w:sz="4"/>
-              <w:left w:val="single" w:color="D5DDE2" w:sz="4"/>
-              <w:bottom w:val="single" w:color="D5DDE2" w:sz="4"/>
-              <w:right w:val="single" w:color="D5DDE2" w:sz="4"/>
-            </w:tcBorders>
-            <w:shd w:fill="FFFFFF" w:val="clear"/>
-            <w:tcMar>
-              <w:top w:type="dxa" w:w="60"/>
-              <w:left w:type="dxa" w:w="80"/>
-              <w:bottom w:type="dxa" w:w="60"/>
-              <w:right w:type="dxa" w:w="80"/>
-            </w:tcMar>
-            <w:vAlign w:val="center"/>
-          </w:tcPr>
-          <w:p>
-            <w:pPr>
-              <w:spacing w:after="0" w:before="0"/>
-            </w:pPr>
-            <w:r>
-              <w:rPr>
-                <w:rFonts w:ascii="Menlo" w:cs="Menlo" w:eastAsia="Menlo" w:hAnsi="Menlo"/>
-                <w:b/>
-                <w:bCs/>
-                <w:i w:val="false"/>
-                <w:iCs w:val="false"/>
-                <w:color w:val="1B3A4B"/>
-                <w:sz w:val="18"/>
-                <w:szCs w:val="18"/>
-              </w:rPr>
-              <w:t xml:space="preserve">github.com/Lakshmikanth-Paruchuru/skill-router</w:t>
-            </w:r>
-          </w:p>
-        </w:tc>
-      </w:tr>
-      <w:tr>
-        <w:trPr>
-          <w:cantSplit/>
-        </w:trPr>
-        <w:tc>
-          <w:tcPr>
-            <w:tcW w:type="dxa" w:w="2200"/>
-            <w:tcBorders>
-              <w:top w:val="single" w:color="D5DDE2" w:sz="4"/>
-              <w:left w:val="single" w:color="D5DDE2" w:sz="4"/>
-              <w:bottom w:val="single" w:color="D5DDE2" w:sz="4"/>
-              <w:right w:val="single" w:color="D5DDE2" w:sz="4"/>
-            </w:tcBorders>
-            <w:shd w:fill="F4F7F8" w:val="clear"/>
-            <w:tcMar>
-              <w:top w:type="dxa" w:w="60"/>
-              <w:left w:type="dxa" w:w="80"/>
-              <w:bottom w:type="dxa" w:w="60"/>
-              <w:right w:type="dxa" w:w="80"/>
-            </w:tcMar>
-            <w:vAlign w:val="center"/>
-          </w:tcPr>
-          <w:p>
-            <w:pPr>
-              <w:spacing w:after="0" w:before="0"/>
-            </w:pPr>
-            <w:r>
-              <w:rPr>
-                <w:rFonts w:ascii="Arial" w:cs="Arial" w:eastAsia="Arial" w:hAnsi="Arial"/>
-                <w:b/>
-                <w:bCs/>
-                <w:i w:val="false"/>
-                <w:iCs w:val="false"/>
-                <w:color w:val="243038"/>
-                <w:sz w:val="18"/>
-                <w:szCs w:val="18"/>
-              </w:rPr>
-              <w:t xml:space="preserve">Length</w:t>
-            </w:r>
-          </w:p>
-        </w:tc>
-        <w:tc>
-          <w:tcPr>
-            <w:tcW w:type="dxa" w:w="7880"/>
-            <w:tcBorders>
-              <w:top w:val="single" w:color="D5DDE2" w:sz="4"/>
-              <w:left w:val="single" w:color="D5DDE2" w:sz="4"/>
-              <w:bottom w:val="single" w:color="D5DDE2" w:sz="4"/>
-              <w:right w:val="single" w:color="D5DDE2" w:sz="4"/>
-            </w:tcBorders>
-            <w:shd w:fill="F4F7F8" w:val="clear"/>
-            <w:tcMar>
-              <w:top w:type="dxa" w:w="60"/>
-              <w:left w:type="dxa" w:w="80"/>
-              <w:bottom w:type="dxa" w:w="60"/>
-              <w:right w:type="dxa" w:w="80"/>
-            </w:tcMar>
-            <w:vAlign w:val="center"/>
-          </w:tcPr>
-          <w:p>
-            <w:pPr>
-              <w:spacing w:after="0" w:before="0"/>
-            </w:pPr>
-            <w:r>
-              <w:rPr>
-                <w:rFonts w:ascii="Arial" w:cs="Arial" w:eastAsia="Arial" w:hAnsi="Arial"/>
-                <w:b w:val="false"/>
-                <w:bCs w:val="false"/>
-                <w:i w:val="false"/>
-                <w:iCs w:val="false"/>
-                <w:color w:val="243038"/>
-                <w:sz w:val="18"/>
-                <w:szCs w:val="18"/>
-              </w:rPr>
-              <w:t xml:space="preserve">About 2,200 words</w:t>
-            </w:r>
-          </w:p>
-        </w:tc>
-      </w:tr>
-    </w:tbl>
-    <w:p>
-      <w:pPr>
-        <w:spacing w:after="120" w:before="0"/>
-      </w:pPr>
     </w:p>
     <w:p>
       <w:pPr>
@@ -1871,7 +1435,7 @@
           <w:sz w:val="22"/>
           <w:szCs w:val="22"/>
         </w:rPr>
-        <w:t xml:space="preserve">Twelve skills is already enough to collide. “Test” appears in three of them. “Field” appears in two. “Deploy” is a neighbor of “retrieve.” A keyword scan that stops at the first hit will send a coverage question to the skill that generates tests, and a retrieve question to the skill that deploys. The person did not ask for a bigger library. They asked for the prompt to land on the right row.</w:t>
+        <w:t xml:space="preserve">Twelve skills is already enough to collide. “Test” appears in two of them. “Field” appears in two. “Deploy” is a neighbor of “retrieve.” A keyword scan that stops at the first hit will send a coverage question to the skill that generates tests, and a retrieve question to the skill that deploys. The person did not ask for a bigger library. They asked for the prompt to land on the right row.</w:t>
       </w:r>
     </w:p>
     <w:p>
@@ -1925,7 +1489,7 @@
           <w:sz w:val="22"/>
           <w:szCs w:val="22"/>
         </w:rPr>
-        <w:t xml:space="preserve">“Write a SOQL query for accounts created this week.” That is one job. The query skill loads. The deploy skill and the Apex skill stay on disk.</w:t>
+        <w:t xml:space="preserve">“Write a SOQL query for accounts created this week”. That is one job. The query skill loads. The deploy skill and the Apex skill stay on disk.</w:t>
       </w:r>
     </w:p>
     <w:p>
@@ -1948,7 +1512,7 @@
           <w:sz w:val="22"/>
           <w:szCs w:val="22"/>
         </w:rPr>
-        <w:t xml:space="preserve">“Run the Apex tests and tell me the code coverage.” Coverage belongs to the skill that runs tests, not the one that writes a new test. One skill loads: </w:t>
+        <w:t xml:space="preserve">“Run the Apex tests and tell me the code coverage”. Coverage belongs to the skill that runs tests, not the one that writes a new test. One skill loads: </w:t>
       </w:r>
       <w:r>
         <w:rPr>
@@ -1997,7 +1561,7 @@
           <w:sz w:val="22"/>
           <w:szCs w:val="22"/>
         </w:rPr>
-        <w:t xml:space="preserve">“Add a formula field for renewal date and grant field-level security on the sales permission set.” That is two jobs. The field skill and the permission-set skill both load. A prompt that only asks for the formula field loads only the field skill. The permission-set skill does not come along unless the prompt asked for access.</w:t>
+        <w:t xml:space="preserve">“Add a formula field for renewal date and grant field-level security on the sales permission set”. That is two jobs. The field skill and the permission-set skill both load. A prompt that only asks for the formula field loads only the field skill. The permission-set skill does not come along unless the prompt asked for access.</w:t>
       </w:r>
     </w:p>
     <w:p>
@@ -2020,7 +1584,7 @@
           <w:sz w:val="22"/>
           <w:szCs w:val="22"/>
         </w:rPr>
-        <w:t xml:space="preserve">“What is a good lasagna recipe.” Nothing in the library is about dinner. The router returns nothing, and the agent does not invent an Apex procedure.</w:t>
+        <w:t xml:space="preserve">“What is a good lasagna recipe”. Nothing in the library is about dinner. The router returns nothing, and the agent does not invent an Apex procedure.</w:t>
       </w:r>
     </w:p>
     <w:p>
@@ -3411,7 +2975,7 @@
           <w:sz w:val="22"/>
           <w:szCs w:val="22"/>
         </w:rPr>
-        <w:t xml:space="preserve">The body of the skill is not in the index. That choice came from a measurement, which is in the bake-off below. The procedure is loaded later, on purpose, by a separate tool, after the route has already been decided.</w:t>
+        <w:t xml:space="preserve">The body of the skill is not in the index. That choice came from a measurement later in this post. The procedure is loaded later, on purpose, by a separate tool, after the route has already been decided.</w:t>
       </w:r>
     </w:p>
     <w:p>
@@ -4266,7 +3830,7 @@
           <w:sz w:val="22"/>
           <w:szCs w:val="22"/>
         </w:rPr>
-        <w:t xml:space="preserve">, so we can measure the older idea. The first matching phrase wins, and the second job is dropped. On this set that list puts a right skill first 80.0% of the time (60 of 75) and does not answer any of the 10 unrelated prompts. It misses whenever the person does not use the exact phrase. It also misses the second skill on every prompt that needs two. The router that ships does not use that list.</w:t>
+        <w:t xml:space="preserve">, so we can measure the older idea. The first matching phrase wins, and the second job is dropped. On this set that list puts a right skill first 80% of the time (60 of 75) and does not answer any of the 10 unrelated prompts. It misses whenever the person does not use the exact phrase. It also misses the second skill on every prompt that needs two. The router that ships does not use that list.</w:t>
       </w:r>
     </w:p>
     <w:p>
@@ -4669,7 +4233,7 @@
                 <w:sz w:val="18"/>
                 <w:szCs w:val="18"/>
               </w:rPr>
-              <w:t xml:space="preserve">80.0% (60 of 75)</w:t>
+              <w:t xml:space="preserve">80% (60 of 75)</w:t>
             </w:r>
           </w:p>
         </w:tc>
@@ -4822,7 +4386,7 @@
                 <w:sz w:val="18"/>
                 <w:szCs w:val="18"/>
               </w:rPr>
-              <w:t xml:space="preserve">84.0% (63 of 75)</w:t>
+              <w:t xml:space="preserve">84% (63 of 75)</w:t>
             </w:r>
           </w:p>
         </w:tc>
@@ -4975,7 +4539,7 @@
                 <w:sz w:val="18"/>
                 <w:szCs w:val="18"/>
               </w:rPr>
-              <w:t xml:space="preserve">84.0% (63 of 75)</w:t>
+              <w:t xml:space="preserve">84% (63 of 75)</w:t>
             </w:r>
           </w:p>
         </w:tc>
@@ -5012,7 +4576,7 @@
                 <w:sz w:val="18"/>
                 <w:szCs w:val="18"/>
               </w:rPr>
-              <w:t xml:space="preserve">84.0% (63 of 75)</w:t>
+              <w:t xml:space="preserve">84% (63 of 75)</w:t>
             </w:r>
           </w:p>
         </w:tc>
@@ -5128,7 +4692,7 @@
                 <w:sz w:val="18"/>
                 <w:szCs w:val="18"/>
               </w:rPr>
-              <w:t xml:space="preserve">84.0% (63 of 75)</w:t>
+              <w:t xml:space="preserve">84% (63 of 75)</w:t>
             </w:r>
           </w:p>
         </w:tc>
@@ -5165,7 +4729,7 @@
                 <w:sz w:val="18"/>
                 <w:szCs w:val="18"/>
               </w:rPr>
-              <w:t xml:space="preserve">84.0% (63 of 75)</w:t>
+              <w:t xml:space="preserve">84% (63 of 75)</w:t>
             </w:r>
           </w:p>
         </w:tc>
@@ -5228,7 +4792,7 @@
           <w:sz w:val="22"/>
           <w:szCs w:val="22"/>
         </w:rPr>
-        <w:t xml:space="preserve">The shipped approach, matching the name and the one-line description, puts a needed skill first 84.0% of the time (63 of 75) and answers </w:t>
+        <w:t xml:space="preserve">The shipped approach, matching the name and the one-line description, puts a needed skill first 84% of the time (63 of 75) and answers </w:t>
       </w:r>
       <w:r>
         <w:rPr>
@@ -5254,7 +4818,7 @@
           <w:sz w:val="22"/>
           <w:szCs w:val="22"/>
         </w:rPr>
-        <w:t xml:space="preserve"> unrelated prompts. On those same 75 prompts, the skills it returned were exactly the skills the prompt needed 84.0% of the time (63 of 75). Simply counting words in common ties the first-skill number on this small catalog, and then keeps returning neighboring skills the prompt did not ask for. The two also split when we search the body of the skill file.</w:t>
+        <w:t xml:space="preserve"> unrelated prompts. On those same 75 prompts, the skills it returned were exactly the skills the prompt needed 84% of the time (63 of 75). Simply counting words in common ties the first-skill number on this small catalog, and then keeps returning neighboring skills the prompt did not ask for. The two also split when we search the body of the skill file.</w:t>
       </w:r>
     </w:p>
     <w:p>
@@ -5324,7 +4888,7 @@
           <w:sz w:val="22"/>
           <w:szCs w:val="22"/>
         </w:rPr>
-        <w:t xml:space="preserve"> unrelated prompts. Skill files share a lot of ordinary teaching language: “use this skill when the user…” That shared language is enough to answer a prompt that should have been left alone. The one-line description already has the words that matter. The rest of the file is for after the choice.</w:t>
+        <w:t xml:space="preserve"> unrelated prompts. Skill files share ordinary teaching language. Several of the samples open with “Use this skill”. That shared language is enough to answer a prompt that should have been left alone. The one-line description already has the words that matter. The rest of the file is for after the choice.</w:t>
       </w:r>
     </w:p>
     <w:p>
@@ -5444,7 +5008,7 @@
           <w:sz w:val="22"/>
           <w:szCs w:val="22"/>
         </w:rPr>
-        <w:t xml:space="preserve">That 84.0% does not mean the router understands the work. All 63 prompts that used the skills’ own words loaded exactly the skills they asked for, including the prompts that asked for two. Of the 12 prompts that said the same job in different words, 4 returned nothing and 8 returned a different skill. “The suite is red in the org. What failed?” loaded the deploy skill. The list is in </w:t>
+        <w:t xml:space="preserve">That 84% does not mean the router understands the work. All 63 prompts that used the skills’ own words loaded exactly the skills they asked for, including the prompts that asked for two. Of the 12 prompts that said the same job in different words, 4 returned nothing and 8 returned a different skill. “The suite is red in the org. What failed?” loaded the deploy skill. The list is in </w:t>
       </w:r>
       <w:r>
         <w:rPr>
@@ -5698,7 +5262,7 @@
         </w:rPr>
         <w:t xml:space="preserve">The reference implementation is </w:t>
       </w:r>
-      <w:hyperlink w:history="1" r:id="rIdusojhhappmr5xf2_0myr9">
+      <w:hyperlink w:history="1" r:id="rId0ig71jrbogfj4e0xu4a9g">
         <w:r>
           <w:rPr>
             <w:rStyle w:val="Hyperlink"/>
@@ -6292,7 +5856,7 @@
           <w:sz w:val="22"/>
           <w:szCs w:val="22"/>
         </w:rPr>
-        <w:t xml:space="preserve">I would leave the first-match phrase list out of the choice. On the same prompts it is right 80.0% of the time, and it can return only one skill, so a prompt that asks for two jobs loses the second.</w:t>
+        <w:t xml:space="preserve">I would leave the first-match phrase list out of the choice. On the same prompts it is right 80% of the time, and it can return only one skill, so a prompt that asks for two jobs loses the second.</w:t>
       </w:r>
     </w:p>
     <w:p>
@@ -6393,7 +5957,7 @@
         </w:rPr>
         <w:t xml:space="preserve">Reference code: </w:t>
       </w:r>
-      <w:hyperlink w:history="1" r:id="rIdw9fosrcia-cwvxddjait1">
+      <w:hyperlink w:history="1" r:id="rIdurmlbczuzwaa87dnehlcd">
         <w:r>
           <w:rPr>
             <w:rStyle w:val="Hyperlink"/>

</xml_diff>